<commit_message>
Refine growth rate dependencies and heritable adaptation process
Explicitly incorporate time and location into growth rate notation and ensure correct weighted mean calculation. Restructure the description of heritable adaptation to clarify the two-stage process of local adaptation at source locations before larval dispersal and subsequent connectivity-weighted mixing.
</commit_message>
<xml_diff>
--- a/paper/paper.docx
+++ b/paper/paper.docx
@@ -1809,7 +1809,7 @@
         <w:t xml:space="preserve">(42)</w:t>
       </w:r>
       <w:r>
-        <w:t xml:space="preserve">. The heritability coefficient – representing the proportion of trait variance that is explained by additive genetic effects (varied between 0.25-0.50;</w:t>
+        <w:t xml:space="preserve">. The heritability coefficient – representing the proportion of trait variance that is explained by additive genetic effects (fixed at 0.3;</w:t>
       </w:r>
       <w:r>
         <w:t xml:space="preserve"> </w:t>
@@ -6545,6 +6545,15 @@
           </m:e>
           <m:sub>
             <m:r>
+              <m:t>t</m:t>
+            </m:r>
+            <m:r>
+              <m:rPr>
+                <m:sty m:val="p"/>
+              </m:rPr>
+              <m:t>;</m:t>
+            </m:r>
+            <m:r>
               <m:t>g</m:t>
             </m:r>
             <m:r>
@@ -6555,6 +6564,15 @@
             </m:r>
             <m:r>
               <m:t>z</m:t>
+            </m:r>
+            <m:r>
+              <m:rPr>
+                <m:sty m:val="p"/>
+              </m:rPr>
+              <m:t>,</m:t>
+            </m:r>
+            <m:r>
+              <m:t>l</m:t>
             </m:r>
           </m:sub>
         </m:sSub>
@@ -6649,6 +6667,31 @@
       <m:oMath>
         <m:r>
           <m:t>z</m:t>
+        </m:r>
+      </m:oMath>
+      <w:r>
+        <w:t xml:space="preserve">,</w:t>
+      </w:r>
+      <w:r>
+        <w:t xml:space="preserve"> </w:t>
+      </w:r>
+      <m:oMath>
+        <m:r>
+          <m:t>l</m:t>
+        </m:r>
+      </m:oMath>
+      <w:r>
+        <w:t xml:space="preserve"> </w:t>
+      </w:r>
+      <w:r>
+        <w:t xml:space="preserve">and</w:t>
+      </w:r>
+      <w:r>
+        <w:t xml:space="preserve"> </w:t>
+      </w:r>
+      <m:oMath>
+        <m:r>
+          <m:t>t</m:t>
         </m:r>
       </m:oMath>
       <w:r>
@@ -11658,7 +11701,7 @@
         <w:t xml:space="preserve"> </w:t>
       </w:r>
       <w:r>
-        <w:t xml:space="preserve">after a growth event, we only need to update the DHW tolerance distributions for size classes 2 to 7. The distribution means for each functional group, size class, location and timestep are given by a weighted sum of means where the weights (</w:t>
+        <w:t xml:space="preserve">after a growth event, we only need to update the DHW tolerance distributions for size classes 2 to 7. The distribution means for each functional group, size class, location and timestep are given by a weighted mean where the weights (</w:t>
       </w:r>
       <m:oMath>
         <m:r>
@@ -11721,6 +11764,15 @@
           </m:e>
           <m:sub>
             <m:r>
+              <m:t>t</m:t>
+            </m:r>
+            <m:r>
+              <m:rPr>
+                <m:sty m:val="p"/>
+              </m:rPr>
+              <m:t>;</m:t>
+            </m:r>
+            <m:r>
               <m:t>g</m:t>
             </m:r>
             <m:r>
@@ -11731,6 +11783,15 @@
             </m:r>
             <m:r>
               <m:t>z</m:t>
+            </m:r>
+            <m:r>
+              <m:rPr>
+                <m:sty m:val="p"/>
+              </m:rPr>
+              <m:t>,</m:t>
+            </m:r>
+            <m:r>
+              <m:t>l</m:t>
             </m:r>
           </m:sub>
         </m:sSub>
@@ -11985,6 +12046,15 @@
                       </m:e>
                       <m:sub>
                         <m:r>
+                          <m:t>t</m:t>
+                        </m:r>
+                        <m:r>
+                          <m:rPr>
+                            <m:sty m:val="p"/>
+                          </m:rPr>
+                          <m:t>;</m:t>
+                        </m:r>
+                        <m:r>
                           <m:t>g</m:t>
                         </m:r>
                         <m:r>
@@ -12004,6 +12074,15 @@
                         </m:r>
                         <m:r>
                           <m:t>1</m:t>
+                        </m:r>
+                        <m:r>
+                          <m:rPr>
+                            <m:sty m:val="p"/>
+                          </m:rPr>
+                          <m:t>,</m:t>
+                        </m:r>
+                        <m:r>
+                          <m:t>l</m:t>
                         </m:r>
                       </m:sub>
                     </m:sSub>
@@ -12017,6 +12096,15 @@
                       </m:e>
                       <m:sub>
                         <m:r>
+                          <m:t>t</m:t>
+                        </m:r>
+                        <m:r>
+                          <m:rPr>
+                            <m:sty m:val="p"/>
+                          </m:rPr>
+                          <m:t>;</m:t>
+                        </m:r>
+                        <m:r>
                           <m:t>g</m:t>
                         </m:r>
                         <m:r>
@@ -12037,6 +12125,15 @@
                         <m:r>
                           <m:t>1</m:t>
                         </m:r>
+                        <m:r>
+                          <m:rPr>
+                            <m:sty m:val="p"/>
+                          </m:rPr>
+                          <m:t>,</m:t>
+                        </m:r>
+                        <m:r>
+                          <m:t>l</m:t>
+                        </m:r>
                       </m:sub>
                     </m:sSub>
                     <m:r>
@@ -12053,6 +12150,15 @@
                       </m:e>
                       <m:sub>
                         <m:r>
+                          <m:t>t</m:t>
+                        </m:r>
+                        <m:r>
+                          <m:rPr>
+                            <m:sty m:val="p"/>
+                          </m:rPr>
+                          <m:t>;</m:t>
+                        </m:r>
+                        <m:r>
                           <m:t>g</m:t>
                         </m:r>
                         <m:r>
@@ -12063,6 +12169,15 @@
                         </m:r>
                         <m:r>
                           <m:t>z</m:t>
+                        </m:r>
+                        <m:r>
+                          <m:rPr>
+                            <m:sty m:val="p"/>
+                          </m:rPr>
+                          <m:t>,</m:t>
+                        </m:r>
+                        <m:r>
+                          <m:t>l</m:t>
                         </m:r>
                       </m:sub>
                     </m:sSub>
@@ -12294,6 +12409,15 @@
                       </m:e>
                       <m:sub>
                         <m:r>
+                          <m:t>t</m:t>
+                        </m:r>
+                        <m:r>
+                          <m:rPr>
+                            <m:sty m:val="p"/>
+                          </m:rPr>
+                          <m:t>;</m:t>
+                        </m:r>
+                        <m:r>
                           <m:t>g</m:t>
                         </m:r>
                         <m:r>
@@ -12304,6 +12428,15 @@
                         </m:r>
                         <m:r>
                           <m:t>z</m:t>
+                        </m:r>
+                        <m:r>
+                          <m:rPr>
+                            <m:sty m:val="p"/>
+                          </m:rPr>
+                          <m:t>,</m:t>
+                        </m:r>
+                        <m:r>
+                          <m:t>l</m:t>
                         </m:r>
                       </m:sub>
                     </m:sSub>
@@ -12317,6 +12450,15 @@
                       </m:e>
                       <m:sub>
                         <m:r>
+                          <m:t>t</m:t>
+                        </m:r>
+                        <m:r>
+                          <m:rPr>
+                            <m:sty m:val="p"/>
+                          </m:rPr>
+                          <m:t>;</m:t>
+                        </m:r>
+                        <m:r>
                           <m:t>g</m:t>
                         </m:r>
                         <m:r>
@@ -12337,6 +12479,15 @@
                         <m:r>
                           <m:t>1</m:t>
                         </m:r>
+                        <m:r>
+                          <m:rPr>
+                            <m:sty m:val="p"/>
+                          </m:rPr>
+                          <m:t>,</m:t>
+                        </m:r>
+                        <m:r>
+                          <m:t>l</m:t>
+                        </m:r>
                       </m:sub>
                     </m:sSub>
                     <m:r>
@@ -12353,6 +12504,15 @@
                       </m:e>
                       <m:sub>
                         <m:r>
+                          <m:t>t</m:t>
+                        </m:r>
+                        <m:r>
+                          <m:rPr>
+                            <m:sty m:val="p"/>
+                          </m:rPr>
+                          <m:t>;</m:t>
+                        </m:r>
+                        <m:r>
                           <m:t>g</m:t>
                         </m:r>
                         <m:r>
@@ -12363,6 +12523,15 @@
                         </m:r>
                         <m:r>
                           <m:t>z</m:t>
+                        </m:r>
+                        <m:r>
+                          <m:rPr>
+                            <m:sty m:val="p"/>
+                          </m:rPr>
+                          <m:t>,</m:t>
+                        </m:r>
+                        <m:r>
+                          <m:t>l</m:t>
                         </m:r>
                       </m:sub>
                     </m:sSub>
@@ -12446,211 +12615,320 @@
                   </m:rPr>
                   <m:t>≔</m:t>
                 </m:r>
-                <m:sSub>
-                  <m:e>
-                    <m:r>
-                      <m:t>μ</m:t>
-                    </m:r>
-                  </m:e>
-                  <m:sub>
-                    <m:r>
-                      <m:t>t</m:t>
-                    </m:r>
+                <m:f>
+                  <m:fPr>
+                    <m:type m:val="bar"/>
+                  </m:fPr>
+                  <m:num>
+                    <m:sSub>
+                      <m:e>
+                        <m:r>
+                          <m:t>μ</m:t>
+                        </m:r>
+                      </m:e>
+                      <m:sub>
+                        <m:r>
+                          <m:t>t</m:t>
+                        </m:r>
+                        <m:r>
+                          <m:rPr>
+                            <m:sty m:val="p"/>
+                          </m:rPr>
+                          <m:t>;</m:t>
+                        </m:r>
+                        <m:r>
+                          <m:t> </m:t>
+                        </m:r>
+                        <m:r>
+                          <m:t>g</m:t>
+                        </m:r>
+                        <m:r>
+                          <m:rPr>
+                            <m:sty m:val="p"/>
+                          </m:rPr>
+                          <m:t>,</m:t>
+                        </m:r>
+                        <m:r>
+                          <m:t>z</m:t>
+                        </m:r>
+                        <m:r>
+                          <m:rPr>
+                            <m:sty m:val="p"/>
+                          </m:rPr>
+                          <m:t>−</m:t>
+                        </m:r>
+                        <m:r>
+                          <m:t>1</m:t>
+                        </m:r>
+                        <m:r>
+                          <m:rPr>
+                            <m:sty m:val="p"/>
+                          </m:rPr>
+                          <m:t>,</m:t>
+                        </m:r>
+                        <m:r>
+                          <m:t>l</m:t>
+                        </m:r>
+                      </m:sub>
+                    </m:sSub>
                     <m:r>
                       <m:rPr>
                         <m:sty m:val="p"/>
                       </m:rPr>
-                      <m:t>;</m:t>
-                    </m:r>
-                    <m:r>
-                      <m:t> </m:t>
-                    </m:r>
-                    <m:r>
-                      <m:t>g</m:t>
-                    </m:r>
-                    <m:r>
-                      <m:rPr>
-                        <m:sty m:val="p"/>
-                      </m:rPr>
-                      <m:t>,</m:t>
-                    </m:r>
-                    <m:r>
-                      <m:t>z</m:t>
-                    </m:r>
-                    <m:r>
-                      <m:rPr>
-                        <m:sty m:val="p"/>
-                      </m:rPr>
-                      <m:t>−</m:t>
-                    </m:r>
-                    <m:r>
-                      <m:t>1</m:t>
-                    </m:r>
-                    <m:r>
-                      <m:rPr>
-                        <m:sty m:val="p"/>
-                      </m:rPr>
-                      <m:t>,</m:t>
-                    </m:r>
-                    <m:r>
-                      <m:t>l</m:t>
-                    </m:r>
-                  </m:sub>
-                </m:sSub>
-                <m:r>
-                  <m:rPr>
-                    <m:sty m:val="p"/>
-                  </m:rPr>
-                  <m:t>⋅</m:t>
-                </m:r>
-                <m:sSubSup>
-                  <m:e>
-                    <m:r>
-                      <m:t>w</m:t>
-                    </m:r>
-                  </m:e>
-                  <m:sub>
-                    <m:r>
-                      <m:t>t</m:t>
-                    </m:r>
-                    <m:r>
-                      <m:rPr>
-                        <m:sty m:val="p"/>
-                      </m:rPr>
-                      <m:t>;</m:t>
-                    </m:r>
-                    <m:r>
-                      <m:t>g</m:t>
-                    </m:r>
-                    <m:r>
-                      <m:rPr>
-                        <m:sty m:val="p"/>
-                      </m:rPr>
-                      <m:t>,</m:t>
-                    </m:r>
-                    <m:r>
-                      <m:t>z</m:t>
-                    </m:r>
-                    <m:r>
-                      <m:rPr>
-                        <m:sty m:val="p"/>
-                      </m:rPr>
-                      <m:t>,</m:t>
-                    </m:r>
-                    <m:r>
-                      <m:t>l</m:t>
-                    </m:r>
-                  </m:sub>
-                  <m:sup>
-                    <m:r>
-                      <m:rPr>
-                        <m:sty m:val="p"/>
-                      </m:rPr>
-                      <m:t>−</m:t>
-                    </m:r>
-                  </m:sup>
-                </m:sSubSup>
-                <m:r>
-                  <m:rPr>
-                    <m:sty m:val="p"/>
-                  </m:rPr>
-                  <m:t>+</m:t>
-                </m:r>
-                <m:sSub>
-                  <m:e>
-                    <m:r>
-                      <m:t>μ</m:t>
-                    </m:r>
-                  </m:e>
-                  <m:sub>
-                    <m:r>
-                      <m:t>t</m:t>
-                    </m:r>
-                    <m:r>
-                      <m:rPr>
-                        <m:sty m:val="p"/>
-                      </m:rPr>
-                      <m:t>;</m:t>
-                    </m:r>
-                    <m:r>
-                      <m:t>g</m:t>
-                    </m:r>
-                    <m:r>
-                      <m:rPr>
-                        <m:sty m:val="p"/>
-                      </m:rPr>
-                      <m:t>,</m:t>
-                    </m:r>
-                    <m:r>
-                      <m:t> </m:t>
-                    </m:r>
-                    <m:r>
-                      <m:t>z</m:t>
-                    </m:r>
-                    <m:r>
-                      <m:rPr>
-                        <m:sty m:val="p"/>
-                      </m:rPr>
-                      <m:t>,</m:t>
-                    </m:r>
-                    <m:r>
-                      <m:t>l</m:t>
-                    </m:r>
-                  </m:sub>
-                </m:sSub>
-                <m:r>
-                  <m:rPr>
-                    <m:sty m:val="p"/>
-                  </m:rPr>
-                  <m:t>⋅</m:t>
-                </m:r>
-                <m:sSubSup>
-                  <m:e>
-                    <m:r>
-                      <m:t>w</m:t>
-                    </m:r>
-                  </m:e>
-                  <m:sub>
-                    <m:r>
-                      <m:t>t</m:t>
-                    </m:r>
-                    <m:r>
-                      <m:rPr>
-                        <m:sty m:val="p"/>
-                      </m:rPr>
-                      <m:t>;</m:t>
-                    </m:r>
-                    <m:r>
-                      <m:t>g</m:t>
-                    </m:r>
-                    <m:r>
-                      <m:rPr>
-                        <m:sty m:val="p"/>
-                      </m:rPr>
-                      <m:t>,</m:t>
-                    </m:r>
-                    <m:r>
-                      <m:t>z</m:t>
-                    </m:r>
-                    <m:r>
-                      <m:rPr>
-                        <m:sty m:val="p"/>
-                      </m:rPr>
-                      <m:t>,</m:t>
-                    </m:r>
-                    <m:r>
-                      <m:t>l</m:t>
-                    </m:r>
-                  </m:sub>
-                  <m:sup>
+                      <m:t>⋅</m:t>
+                    </m:r>
+                    <m:sSubSup>
+                      <m:e>
+                        <m:r>
+                          <m:t>w</m:t>
+                        </m:r>
+                      </m:e>
+                      <m:sub>
+                        <m:r>
+                          <m:t>t</m:t>
+                        </m:r>
+                        <m:r>
+                          <m:rPr>
+                            <m:sty m:val="p"/>
+                          </m:rPr>
+                          <m:t>;</m:t>
+                        </m:r>
+                        <m:r>
+                          <m:t>g</m:t>
+                        </m:r>
+                        <m:r>
+                          <m:rPr>
+                            <m:sty m:val="p"/>
+                          </m:rPr>
+                          <m:t>,</m:t>
+                        </m:r>
+                        <m:r>
+                          <m:t>z</m:t>
+                        </m:r>
+                        <m:r>
+                          <m:rPr>
+                            <m:sty m:val="p"/>
+                          </m:rPr>
+                          <m:t>,</m:t>
+                        </m:r>
+                        <m:r>
+                          <m:t>l</m:t>
+                        </m:r>
+                      </m:sub>
+                      <m:sup>
+                        <m:r>
+                          <m:rPr>
+                            <m:sty m:val="p"/>
+                          </m:rPr>
+                          <m:t>−</m:t>
+                        </m:r>
+                      </m:sup>
+                    </m:sSubSup>
                     <m:r>
                       <m:rPr>
                         <m:sty m:val="p"/>
                       </m:rPr>
                       <m:t>+</m:t>
                     </m:r>
-                  </m:sup>
-                </m:sSubSup>
+                    <m:sSub>
+                      <m:e>
+                        <m:r>
+                          <m:t>μ</m:t>
+                        </m:r>
+                      </m:e>
+                      <m:sub>
+                        <m:r>
+                          <m:t>t</m:t>
+                        </m:r>
+                        <m:r>
+                          <m:rPr>
+                            <m:sty m:val="p"/>
+                          </m:rPr>
+                          <m:t>;</m:t>
+                        </m:r>
+                        <m:r>
+                          <m:t>g</m:t>
+                        </m:r>
+                        <m:r>
+                          <m:rPr>
+                            <m:sty m:val="p"/>
+                          </m:rPr>
+                          <m:t>,</m:t>
+                        </m:r>
+                        <m:r>
+                          <m:t> </m:t>
+                        </m:r>
+                        <m:r>
+                          <m:t>z</m:t>
+                        </m:r>
+                        <m:r>
+                          <m:rPr>
+                            <m:sty m:val="p"/>
+                          </m:rPr>
+                          <m:t>,</m:t>
+                        </m:r>
+                        <m:r>
+                          <m:t>l</m:t>
+                        </m:r>
+                      </m:sub>
+                    </m:sSub>
+                    <m:r>
+                      <m:rPr>
+                        <m:sty m:val="p"/>
+                      </m:rPr>
+                      <m:t>⋅</m:t>
+                    </m:r>
+                    <m:sSubSup>
+                      <m:e>
+                        <m:r>
+                          <m:t>w</m:t>
+                        </m:r>
+                      </m:e>
+                      <m:sub>
+                        <m:r>
+                          <m:t>t</m:t>
+                        </m:r>
+                        <m:r>
+                          <m:rPr>
+                            <m:sty m:val="p"/>
+                          </m:rPr>
+                          <m:t>;</m:t>
+                        </m:r>
+                        <m:r>
+                          <m:t>g</m:t>
+                        </m:r>
+                        <m:r>
+                          <m:rPr>
+                            <m:sty m:val="p"/>
+                          </m:rPr>
+                          <m:t>,</m:t>
+                        </m:r>
+                        <m:r>
+                          <m:t>z</m:t>
+                        </m:r>
+                        <m:r>
+                          <m:rPr>
+                            <m:sty m:val="p"/>
+                          </m:rPr>
+                          <m:t>,</m:t>
+                        </m:r>
+                        <m:r>
+                          <m:t>l</m:t>
+                        </m:r>
+                      </m:sub>
+                      <m:sup>
+                        <m:r>
+                          <m:rPr>
+                            <m:sty m:val="p"/>
+                          </m:rPr>
+                          <m:t>+</m:t>
+                        </m:r>
+                      </m:sup>
+                    </m:sSubSup>
+                  </m:num>
+                  <m:den>
+                    <m:sSubSup>
+                      <m:e>
+                        <m:r>
+                          <m:t>w</m:t>
+                        </m:r>
+                      </m:e>
+                      <m:sub>
+                        <m:r>
+                          <m:t>t</m:t>
+                        </m:r>
+                        <m:r>
+                          <m:rPr>
+                            <m:sty m:val="p"/>
+                          </m:rPr>
+                          <m:t>;</m:t>
+                        </m:r>
+                        <m:r>
+                          <m:t>g</m:t>
+                        </m:r>
+                        <m:r>
+                          <m:rPr>
+                            <m:sty m:val="p"/>
+                          </m:rPr>
+                          <m:t>,</m:t>
+                        </m:r>
+                        <m:r>
+                          <m:t>z</m:t>
+                        </m:r>
+                        <m:r>
+                          <m:rPr>
+                            <m:sty m:val="p"/>
+                          </m:rPr>
+                          <m:t>,</m:t>
+                        </m:r>
+                        <m:r>
+                          <m:t>l</m:t>
+                        </m:r>
+                      </m:sub>
+                      <m:sup>
+                        <m:r>
+                          <m:rPr>
+                            <m:sty m:val="p"/>
+                          </m:rPr>
+                          <m:t>−</m:t>
+                        </m:r>
+                      </m:sup>
+                    </m:sSubSup>
+                    <m:r>
+                      <m:rPr>
+                        <m:sty m:val="p"/>
+                      </m:rPr>
+                      <m:t>+</m:t>
+                    </m:r>
+                    <m:sSubSup>
+                      <m:e>
+                        <m:r>
+                          <m:t>w</m:t>
+                        </m:r>
+                      </m:e>
+                      <m:sub>
+                        <m:r>
+                          <m:t>t</m:t>
+                        </m:r>
+                        <m:r>
+                          <m:rPr>
+                            <m:sty m:val="p"/>
+                          </m:rPr>
+                          <m:t>;</m:t>
+                        </m:r>
+                        <m:r>
+                          <m:t>g</m:t>
+                        </m:r>
+                        <m:r>
+                          <m:rPr>
+                            <m:sty m:val="p"/>
+                          </m:rPr>
+                          <m:t>,</m:t>
+                        </m:r>
+                        <m:r>
+                          <m:t>z</m:t>
+                        </m:r>
+                        <m:r>
+                          <m:rPr>
+                            <m:sty m:val="p"/>
+                          </m:rPr>
+                          <m:t>,</m:t>
+                        </m:r>
+                        <m:r>
+                          <m:t>l</m:t>
+                        </m:r>
+                      </m:sub>
+                      <m:sup>
+                        <m:r>
+                          <m:rPr>
+                            <m:sty m:val="p"/>
+                          </m:rPr>
+                          <m:t>+</m:t>
+                        </m:r>
+                      </m:sup>
+                    </m:sSubSup>
+                  </m:den>
+                </m:f>
               </m:oMath>
             </m:oMathPara>
           </w:p>
@@ -12999,6 +13277,992 @@
         <w:pStyle w:val="FirstParagraph"/>
       </w:pPr>
       <w:r>
+        <w:t xml:space="preserve">Heritable adaptation is applied locally at each source location, before larvae disperse: at every location</w:t>
+      </w:r>
+      <w:r>
+        <w:t xml:space="preserve"> </w:t>
+      </w:r>
+      <m:oMath>
+        <m:sSup>
+          <m:e>
+            <m:r>
+              <m:t>l</m:t>
+            </m:r>
+          </m:e>
+          <m:sup>
+            <m:r>
+              <m:rPr>
+                <m:sty m:val="p"/>
+              </m:rPr>
+              <m:t>′</m:t>
+            </m:r>
+          </m:sup>
+        </m:sSup>
+      </m:oMath>
+      <w:r>
+        <w:t xml:space="preserve"> </w:t>
+      </w:r>
+      <w:r>
+        <w:t xml:space="preserve">and for every functional group</w:t>
+      </w:r>
+      <w:r>
+        <w:t xml:space="preserve"> </w:t>
+      </w:r>
+      <m:oMath>
+        <m:r>
+          <m:t>g</m:t>
+        </m:r>
+      </m:oMath>
+      <w:r>
+        <w:t xml:space="preserve">, the Breeders’ equation</w:t>
+      </w:r>
+      <w:r>
+        <w:t xml:space="preserve"> </w:t>
+      </w:r>
+      <w:r>
+        <w:t xml:space="preserve">(43, 44, 70–72)</w:t>
+      </w:r>
+      <w:r>
+        <w:t xml:space="preserve"> </w:t>
+      </w:r>
+      <w:r>
+        <w:t xml:space="preserve">shifts each reproductively active size class’s tolerance mean from the previous timestep towards its current-timestep value, scaled by the heritability coefficient</w:t>
+      </w:r>
+      <w:r>
+        <w:t xml:space="preserve"> </w:t>
+      </w:r>
+      <m:oMath>
+        <m:sSup>
+          <m:e>
+            <m:r>
+              <m:t>h</m:t>
+            </m:r>
+          </m:e>
+          <m:sup>
+            <m:r>
+              <m:t>2</m:t>
+            </m:r>
+          </m:sup>
+        </m:sSup>
+      </m:oMath>
+      <w:r>
+        <w:t xml:space="preserve">, and these shifted means are combined across the reproductively active size classes, weighted by their relative cover, into a single tolerance mean representing that location’s contribution to the larval pool:</w:t>
+      </w:r>
+    </w:p>
+    <w:tbl>
+      <w:tblPr>
+        <w:tblStyle w:val="Table"/>
+        <w:tblW w:type="pct" w:w="5000"/>
+        <w:tblLayout w:type="fixed"/>
+        <w:tblLook w:firstRow="0" w:lastRow="0" w:firstColumn="0" w:lastColumn="0" w:noHBand="0" w:noVBand="0" w:val="0000"/>
+      </w:tblPr>
+      <w:tblGrid>
+        <w:gridCol w:w="7128"/>
+        <w:gridCol w:w="792"/>
+      </w:tblGrid>
+      <w:tr>
+        <w:tc>
+          <w:tcPr/>
+          <w:p>
+            <w:pPr>
+              <w:pStyle w:val="Compact"/>
+              <w:jc w:val="center"/>
+            </w:pPr>
+            <m:oMathPara>
+              <m:oMathParaPr>
+                <m:jc m:val="center"/>
+              </m:oMathParaPr>
+              <m:oMath>
+                <m:sSubSup>
+                  <m:e>
+                    <m:r>
+                      <m:t>μ</m:t>
+                    </m:r>
+                  </m:e>
+                  <m:sub>
+                    <m:r>
+                      <m:t>t</m:t>
+                    </m:r>
+                    <m:r>
+                      <m:rPr>
+                        <m:sty m:val="p"/>
+                      </m:rPr>
+                      <m:t>;</m:t>
+                    </m:r>
+                    <m:r>
+                      <m:t>g</m:t>
+                    </m:r>
+                    <m:r>
+                      <m:rPr>
+                        <m:sty m:val="p"/>
+                      </m:rPr>
+                      <m:t>,</m:t>
+                    </m:r>
+                    <m:sSup>
+                      <m:e>
+                        <m:r>
+                          <m:t>l</m:t>
+                        </m:r>
+                      </m:e>
+                      <m:sup>
+                        <m:r>
+                          <m:rPr>
+                            <m:sty m:val="p"/>
+                          </m:rPr>
+                          <m:t>′</m:t>
+                        </m:r>
+                      </m:sup>
+                    </m:sSup>
+                  </m:sub>
+                  <m:sup>
+                    <m:r>
+                      <m:t>s</m:t>
+                    </m:r>
+                    <m:r>
+                      <m:t>e</m:t>
+                    </m:r>
+                    <m:r>
+                      <m:t>t</m:t>
+                    </m:r>
+                    <m:r>
+                      <m:t>t</m:t>
+                    </m:r>
+                    <m:r>
+                      <m:t>l</m:t>
+                    </m:r>
+                    <m:r>
+                      <m:t>e</m:t>
+                    </m:r>
+                    <m:r>
+                      <m:t>r</m:t>
+                    </m:r>
+                  </m:sup>
+                </m:sSubSup>
+                <m:r>
+                  <m:rPr>
+                    <m:sty m:val="p"/>
+                  </m:rPr>
+                  <m:t>=</m:t>
+                </m:r>
+                <m:nary>
+                  <m:naryPr>
+                    <m:chr m:val="∑"/>
+                    <m:limLoc m:val="undOvr"/>
+                    <m:subHide m:val="off"/>
+                    <m:supHide m:val="on"/>
+                  </m:naryPr>
+                  <m:sub>
+                    <m:r>
+                      <m:t>z</m:t>
+                    </m:r>
+                    <m:r>
+                      <m:rPr>
+                        <m:sty m:val="p"/>
+                      </m:rPr>
+                      <m:t>∈</m:t>
+                    </m:r>
+                    <m:sSubSup>
+                      <m:e>
+                        <m:r>
+                          <m:t>Z</m:t>
+                        </m:r>
+                      </m:e>
+                      <m:sub>
+                        <m:r>
+                          <m:t>g</m:t>
+                        </m:r>
+                      </m:sub>
+                      <m:sup>
+                        <m:r>
+                          <m:t>ϕ</m:t>
+                        </m:r>
+                      </m:sup>
+                    </m:sSubSup>
+                  </m:sub>
+                  <m:sup>
+                    <m:r>
+                      <m:t>​</m:t>
+                    </m:r>
+                  </m:sup>
+                  <m:e>
+                    <m:sSub>
+                      <m:e>
+                        <m:r>
+                          <m:t>w</m:t>
+                        </m:r>
+                      </m:e>
+                      <m:sub>
+                        <m:r>
+                          <m:t>t</m:t>
+                        </m:r>
+                        <m:r>
+                          <m:rPr>
+                            <m:sty m:val="p"/>
+                          </m:rPr>
+                          <m:t>;</m:t>
+                        </m:r>
+                        <m:r>
+                          <m:t>g</m:t>
+                        </m:r>
+                        <m:r>
+                          <m:rPr>
+                            <m:sty m:val="p"/>
+                          </m:rPr>
+                          <m:t>,</m:t>
+                        </m:r>
+                        <m:r>
+                          <m:t>z</m:t>
+                        </m:r>
+                        <m:r>
+                          <m:rPr>
+                            <m:sty m:val="p"/>
+                          </m:rPr>
+                          <m:t>,</m:t>
+                        </m:r>
+                        <m:sSup>
+                          <m:e>
+                            <m:r>
+                              <m:t>l</m:t>
+                            </m:r>
+                          </m:e>
+                          <m:sup>
+                            <m:r>
+                              <m:rPr>
+                                <m:sty m:val="p"/>
+                              </m:rPr>
+                              <m:t>′</m:t>
+                            </m:r>
+                          </m:sup>
+                        </m:sSup>
+                      </m:sub>
+                    </m:sSub>
+                    <m:d>
+                      <m:dPr>
+                        <m:begChr m:val="["/>
+                        <m:sepChr m:val=""/>
+                        <m:endChr m:val="]"/>
+                        <m:grow/>
+                      </m:dPr>
+                      <m:e>
+                        <m:sSub>
+                          <m:e>
+                            <m:r>
+                              <m:t>μ</m:t>
+                            </m:r>
+                          </m:e>
+                          <m:sub>
+                            <m:r>
+                              <m:t>t</m:t>
+                            </m:r>
+                            <m:r>
+                              <m:rPr>
+                                <m:sty m:val="p"/>
+                              </m:rPr>
+                              <m:t>−</m:t>
+                            </m:r>
+                            <m:r>
+                              <m:t>1</m:t>
+                            </m:r>
+                            <m:r>
+                              <m:rPr>
+                                <m:sty m:val="p"/>
+                              </m:rPr>
+                              <m:t>;</m:t>
+                            </m:r>
+                            <m:r>
+                              <m:t>g</m:t>
+                            </m:r>
+                            <m:r>
+                              <m:rPr>
+                                <m:sty m:val="p"/>
+                              </m:rPr>
+                              <m:t>,</m:t>
+                            </m:r>
+                            <m:r>
+                              <m:t>z</m:t>
+                            </m:r>
+                            <m:r>
+                              <m:rPr>
+                                <m:sty m:val="p"/>
+                              </m:rPr>
+                              <m:t>,</m:t>
+                            </m:r>
+                            <m:sSup>
+                              <m:e>
+                                <m:r>
+                                  <m:t>l</m:t>
+                                </m:r>
+                              </m:e>
+                              <m:sup>
+                                <m:r>
+                                  <m:rPr>
+                                    <m:sty m:val="p"/>
+                                  </m:rPr>
+                                  <m:t>′</m:t>
+                                </m:r>
+                              </m:sup>
+                            </m:sSup>
+                          </m:sub>
+                        </m:sSub>
+                        <m:r>
+                          <m:rPr>
+                            <m:sty m:val="p"/>
+                          </m:rPr>
+                          <m:t>+</m:t>
+                        </m:r>
+                        <m:d>
+                          <m:dPr>
+                            <m:begChr m:val="("/>
+                            <m:sepChr m:val=""/>
+                            <m:endChr m:val=")"/>
+                            <m:grow/>
+                          </m:dPr>
+                          <m:e>
+                            <m:sSub>
+                              <m:e>
+                                <m:r>
+                                  <m:t>μ</m:t>
+                                </m:r>
+                              </m:e>
+                              <m:sub>
+                                <m:r>
+                                  <m:t>t</m:t>
+                                </m:r>
+                                <m:r>
+                                  <m:rPr>
+                                    <m:sty m:val="p"/>
+                                  </m:rPr>
+                                  <m:t>;</m:t>
+                                </m:r>
+                                <m:r>
+                                  <m:t>g</m:t>
+                                </m:r>
+                                <m:r>
+                                  <m:rPr>
+                                    <m:sty m:val="p"/>
+                                  </m:rPr>
+                                  <m:t>,</m:t>
+                                </m:r>
+                                <m:r>
+                                  <m:t>z</m:t>
+                                </m:r>
+                                <m:r>
+                                  <m:rPr>
+                                    <m:sty m:val="p"/>
+                                  </m:rPr>
+                                  <m:t>,</m:t>
+                                </m:r>
+                                <m:sSup>
+                                  <m:e>
+                                    <m:r>
+                                      <m:t>l</m:t>
+                                    </m:r>
+                                  </m:e>
+                                  <m:sup>
+                                    <m:r>
+                                      <m:rPr>
+                                        <m:sty m:val="p"/>
+                                      </m:rPr>
+                                      <m:t>′</m:t>
+                                    </m:r>
+                                  </m:sup>
+                                </m:sSup>
+                              </m:sub>
+                            </m:sSub>
+                            <m:r>
+                              <m:rPr>
+                                <m:sty m:val="p"/>
+                              </m:rPr>
+                              <m:t>−</m:t>
+                            </m:r>
+                            <m:sSub>
+                              <m:e>
+                                <m:r>
+                                  <m:t>μ</m:t>
+                                </m:r>
+                              </m:e>
+                              <m:sub>
+                                <m:r>
+                                  <m:t>t</m:t>
+                                </m:r>
+                                <m:r>
+                                  <m:rPr>
+                                    <m:sty m:val="p"/>
+                                  </m:rPr>
+                                  <m:t>−</m:t>
+                                </m:r>
+                                <m:r>
+                                  <m:t>1</m:t>
+                                </m:r>
+                                <m:r>
+                                  <m:rPr>
+                                    <m:sty m:val="p"/>
+                                  </m:rPr>
+                                  <m:t>;</m:t>
+                                </m:r>
+                                <m:r>
+                                  <m:t>g</m:t>
+                                </m:r>
+                                <m:r>
+                                  <m:rPr>
+                                    <m:sty m:val="p"/>
+                                  </m:rPr>
+                                  <m:t>,</m:t>
+                                </m:r>
+                                <m:r>
+                                  <m:t>z</m:t>
+                                </m:r>
+                                <m:r>
+                                  <m:rPr>
+                                    <m:sty m:val="p"/>
+                                  </m:rPr>
+                                  <m:t>,</m:t>
+                                </m:r>
+                                <m:sSup>
+                                  <m:e>
+                                    <m:r>
+                                      <m:t>l</m:t>
+                                    </m:r>
+                                  </m:e>
+                                  <m:sup>
+                                    <m:r>
+                                      <m:rPr>
+                                        <m:sty m:val="p"/>
+                                      </m:rPr>
+                                      <m:t>′</m:t>
+                                    </m:r>
+                                  </m:sup>
+                                </m:sSup>
+                              </m:sub>
+                            </m:sSub>
+                          </m:e>
+                        </m:d>
+                        <m:r>
+                          <m:rPr>
+                            <m:sty m:val="p"/>
+                          </m:rPr>
+                          <m:t>⋅</m:t>
+                        </m:r>
+                        <m:sSup>
+                          <m:e>
+                            <m:r>
+                              <m:t>h</m:t>
+                            </m:r>
+                          </m:e>
+                          <m:sup>
+                            <m:r>
+                              <m:t>2</m:t>
+                            </m:r>
+                          </m:sup>
+                        </m:sSup>
+                      </m:e>
+                    </m:d>
+                  </m:e>
+                </m:nary>
+              </m:oMath>
+            </m:oMathPara>
+          </w:p>
+        </w:tc>
+        <w:tc>
+          <w:tcPr/>
+          <w:p>
+            <w:pPr>
+              <w:pStyle w:val="Compact"/>
+              <w:jc w:val="right"/>
+            </w:pPr>
+            <w:r>
+              <w:t xml:space="preserve">(19)</w:t>
+            </w:r>
+          </w:p>
+        </w:tc>
+      </w:tr>
+    </w:tbl>
+    <w:p>
+      <w:pPr>
+        <w:pStyle w:val="BodyText"/>
+      </w:pPr>
+      <w:r>
+        <w:t xml:space="preserve">where</w:t>
+      </w:r>
+      <w:r>
+        <w:t xml:space="preserve"> </w:t>
+      </w:r>
+      <m:oMath>
+        <m:sSubSup>
+          <m:e>
+            <m:r>
+              <m:t>Z</m:t>
+            </m:r>
+          </m:e>
+          <m:sub>
+            <m:r>
+              <m:t>g</m:t>
+            </m:r>
+          </m:sub>
+          <m:sup>
+            <m:r>
+              <m:t>ϕ</m:t>
+            </m:r>
+          </m:sup>
+        </m:sSubSup>
+        <m:r>
+          <m:rPr>
+            <m:sty m:val="p"/>
+          </m:rPr>
+          <m:t>=</m:t>
+        </m:r>
+        <m:d>
+          <m:dPr>
+            <m:begChr m:val="{"/>
+            <m:sepChr m:val=""/>
+            <m:endChr m:val="}"/>
+            <m:grow/>
+          </m:dPr>
+          <m:e>
+            <m:r>
+              <m:t>z</m:t>
+            </m:r>
+            <m:r>
+              <m:rPr>
+                <m:sty m:val="p"/>
+              </m:rPr>
+              <m:t>:</m:t>
+            </m:r>
+            <m:sSub>
+              <m:e>
+                <m:r>
+                  <m:t>ϕ</m:t>
+                </m:r>
+              </m:e>
+              <m:sub>
+                <m:r>
+                  <m:t>g</m:t>
+                </m:r>
+                <m:r>
+                  <m:rPr>
+                    <m:sty m:val="p"/>
+                  </m:rPr>
+                  <m:t>,</m:t>
+                </m:r>
+                <m:r>
+                  <m:t>z</m:t>
+                </m:r>
+              </m:sub>
+            </m:sSub>
+            <m:r>
+              <m:rPr>
+                <m:sty m:val="p"/>
+              </m:rPr>
+              <m:t>&gt;</m:t>
+            </m:r>
+            <m:r>
+              <m:t>0</m:t>
+            </m:r>
+          </m:e>
+        </m:d>
+      </m:oMath>
+      <w:r>
+        <w:t xml:space="preserve"> </w:t>
+      </w:r>
+      <w:r>
+        <w:t xml:space="preserve">is the set of reproductively active size classes for functional group</w:t>
+      </w:r>
+      <w:r>
+        <w:t xml:space="preserve"> </w:t>
+      </w:r>
+      <m:oMath>
+        <m:r>
+          <m:t>g</m:t>
+        </m:r>
+      </m:oMath>
+      <w:r>
+        <w:t xml:space="preserve"> </w:t>
+      </w:r>
+      <w:r>
+        <w:t xml:space="preserve">(see</w:t>
+      </w:r>
+      <w:r>
+        <w:t xml:space="preserve"> </w:t>
+      </w:r>
+      <w:r>
+        <w:t xml:space="preserve">“Coral reproduction”</w:t>
+      </w:r>
+      <w:r>
+        <w:t xml:space="preserve"> </w:t>
+      </w:r>
+      <w:r>
+        <w:t xml:space="preserve">section), and the weights</w:t>
+      </w:r>
+      <w:r>
+        <w:t xml:space="preserve"> </w:t>
+      </w:r>
+      <m:oMath>
+        <m:sSub>
+          <m:e>
+            <m:r>
+              <m:t>w</m:t>
+            </m:r>
+          </m:e>
+          <m:sub>
+            <m:r>
+              <m:t>t</m:t>
+            </m:r>
+            <m:r>
+              <m:rPr>
+                <m:sty m:val="p"/>
+              </m:rPr>
+              <m:t>;</m:t>
+            </m:r>
+            <m:r>
+              <m:t>g</m:t>
+            </m:r>
+            <m:r>
+              <m:rPr>
+                <m:sty m:val="p"/>
+              </m:rPr>
+              <m:t>,</m:t>
+            </m:r>
+            <m:r>
+              <m:t>z</m:t>
+            </m:r>
+            <m:r>
+              <m:rPr>
+                <m:sty m:val="p"/>
+              </m:rPr>
+              <m:t>,</m:t>
+            </m:r>
+            <m:sSup>
+              <m:e>
+                <m:r>
+                  <m:t>l</m:t>
+                </m:r>
+              </m:e>
+              <m:sup>
+                <m:r>
+                  <m:rPr>
+                    <m:sty m:val="p"/>
+                  </m:rPr>
+                  <m:t>′</m:t>
+                </m:r>
+              </m:sup>
+            </m:sSup>
+          </m:sub>
+        </m:sSub>
+      </m:oMath>
+      <w:r>
+        <w:t xml:space="preserve"> </w:t>
+      </w:r>
+      <w:r>
+        <w:t xml:space="preserve">are given by each size class’s relative cover among</w:t>
+      </w:r>
+      <w:r>
+        <w:t xml:space="preserve"> </w:t>
+      </w:r>
+      <m:oMath>
+        <m:sSubSup>
+          <m:e>
+            <m:r>
+              <m:t>Z</m:t>
+            </m:r>
+          </m:e>
+          <m:sub>
+            <m:r>
+              <m:t>g</m:t>
+            </m:r>
+          </m:sub>
+          <m:sup>
+            <m:r>
+              <m:t>ϕ</m:t>
+            </m:r>
+          </m:sup>
+        </m:sSubSup>
+      </m:oMath>
+      <w:r>
+        <w:t xml:space="preserve">:</w:t>
+      </w:r>
+    </w:p>
+    <w:tbl>
+      <w:tblPr>
+        <w:tblStyle w:val="Table"/>
+        <w:tblW w:type="pct" w:w="5000"/>
+        <w:tblLayout w:type="fixed"/>
+        <w:tblLook w:firstRow="0" w:lastRow="0" w:firstColumn="0" w:lastColumn="0" w:noHBand="0" w:noVBand="0" w:val="0000"/>
+      </w:tblPr>
+      <w:tblGrid>
+        <w:gridCol w:w="7128"/>
+        <w:gridCol w:w="792"/>
+      </w:tblGrid>
+      <w:tr>
+        <w:tc>
+          <w:tcPr/>
+          <w:p>
+            <w:pPr>
+              <w:pStyle w:val="Compact"/>
+              <w:jc w:val="center"/>
+            </w:pPr>
+            <m:oMathPara>
+              <m:oMathParaPr>
+                <m:jc m:val="center"/>
+              </m:oMathParaPr>
+              <m:oMath>
+                <m:sSub>
+                  <m:e>
+                    <m:r>
+                      <m:t>w</m:t>
+                    </m:r>
+                  </m:e>
+                  <m:sub>
+                    <m:r>
+                      <m:t>t</m:t>
+                    </m:r>
+                    <m:r>
+                      <m:rPr>
+                        <m:sty m:val="p"/>
+                      </m:rPr>
+                      <m:t>;</m:t>
+                    </m:r>
+                    <m:r>
+                      <m:t>g</m:t>
+                    </m:r>
+                    <m:r>
+                      <m:rPr>
+                        <m:sty m:val="p"/>
+                      </m:rPr>
+                      <m:t>,</m:t>
+                    </m:r>
+                    <m:r>
+                      <m:t>z</m:t>
+                    </m:r>
+                    <m:r>
+                      <m:rPr>
+                        <m:sty m:val="p"/>
+                      </m:rPr>
+                      <m:t>,</m:t>
+                    </m:r>
+                    <m:sSup>
+                      <m:e>
+                        <m:r>
+                          <m:t>l</m:t>
+                        </m:r>
+                      </m:e>
+                      <m:sup>
+                        <m:r>
+                          <m:rPr>
+                            <m:sty m:val="p"/>
+                          </m:rPr>
+                          <m:t>′</m:t>
+                        </m:r>
+                      </m:sup>
+                    </m:sSup>
+                  </m:sub>
+                </m:sSub>
+                <m:r>
+                  <m:rPr>
+                    <m:sty m:val="p"/>
+                  </m:rPr>
+                  <m:t>=</m:t>
+                </m:r>
+                <m:f>
+                  <m:fPr>
+                    <m:type m:val="bar"/>
+                  </m:fPr>
+                  <m:num>
+                    <m:sSub>
+                      <m:e>
+                        <m:r>
+                          <m:t>C</m:t>
+                        </m:r>
+                      </m:e>
+                      <m:sub>
+                        <m:r>
+                          <m:t>t</m:t>
+                        </m:r>
+                        <m:r>
+                          <m:rPr>
+                            <m:sty m:val="p"/>
+                          </m:rPr>
+                          <m:t>;</m:t>
+                        </m:r>
+                        <m:r>
+                          <m:t>g</m:t>
+                        </m:r>
+                        <m:r>
+                          <m:rPr>
+                            <m:sty m:val="p"/>
+                          </m:rPr>
+                          <m:t>,</m:t>
+                        </m:r>
+                        <m:r>
+                          <m:t>z</m:t>
+                        </m:r>
+                        <m:r>
+                          <m:rPr>
+                            <m:sty m:val="p"/>
+                          </m:rPr>
+                          <m:t>,</m:t>
+                        </m:r>
+                        <m:sSup>
+                          <m:e>
+                            <m:r>
+                              <m:t>l</m:t>
+                            </m:r>
+                          </m:e>
+                          <m:sup>
+                            <m:r>
+                              <m:rPr>
+                                <m:sty m:val="p"/>
+                              </m:rPr>
+                              <m:t>′</m:t>
+                            </m:r>
+                          </m:sup>
+                        </m:sSup>
+                      </m:sub>
+                    </m:sSub>
+                  </m:num>
+                  <m:den>
+                    <m:nary>
+                      <m:naryPr>
+                        <m:chr m:val="∑"/>
+                        <m:limLoc m:val="undOvr"/>
+                        <m:subHide m:val="off"/>
+                        <m:supHide m:val="on"/>
+                      </m:naryPr>
+                      <m:sub>
+                        <m:sSup>
+                          <m:e>
+                            <m:r>
+                              <m:t>z</m:t>
+                            </m:r>
+                          </m:e>
+                          <m:sup>
+                            <m:r>
+                              <m:rPr>
+                                <m:sty m:val="p"/>
+                              </m:rPr>
+                              <m:t>′</m:t>
+                            </m:r>
+                          </m:sup>
+                        </m:sSup>
+                        <m:r>
+                          <m:rPr>
+                            <m:sty m:val="p"/>
+                          </m:rPr>
+                          <m:t>∈</m:t>
+                        </m:r>
+                        <m:sSubSup>
+                          <m:e>
+                            <m:r>
+                              <m:t>Z</m:t>
+                            </m:r>
+                          </m:e>
+                          <m:sub>
+                            <m:r>
+                              <m:t>g</m:t>
+                            </m:r>
+                          </m:sub>
+                          <m:sup>
+                            <m:r>
+                              <m:t>ϕ</m:t>
+                            </m:r>
+                          </m:sup>
+                        </m:sSubSup>
+                      </m:sub>
+                      <m:sup>
+                        <m:r>
+                          <m:t>​</m:t>
+                        </m:r>
+                      </m:sup>
+                      <m:e>
+                        <m:sSub>
+                          <m:e>
+                            <m:r>
+                              <m:t>C</m:t>
+                            </m:r>
+                          </m:e>
+                          <m:sub>
+                            <m:r>
+                              <m:t>t</m:t>
+                            </m:r>
+                            <m:r>
+                              <m:rPr>
+                                <m:sty m:val="p"/>
+                              </m:rPr>
+                              <m:t>;</m:t>
+                            </m:r>
+                            <m:r>
+                              <m:t>g</m:t>
+                            </m:r>
+                            <m:r>
+                              <m:rPr>
+                                <m:sty m:val="p"/>
+                              </m:rPr>
+                              <m:t>,</m:t>
+                            </m:r>
+                            <m:sSup>
+                              <m:e>
+                                <m:r>
+                                  <m:t>z</m:t>
+                                </m:r>
+                              </m:e>
+                              <m:sup>
+                                <m:r>
+                                  <m:rPr>
+                                    <m:sty m:val="p"/>
+                                  </m:rPr>
+                                  <m:t>′</m:t>
+                                </m:r>
+                              </m:sup>
+                            </m:sSup>
+                            <m:r>
+                              <m:rPr>
+                                <m:sty m:val="p"/>
+                              </m:rPr>
+                              <m:t>,</m:t>
+                            </m:r>
+                            <m:sSup>
+                              <m:e>
+                                <m:r>
+                                  <m:t>l</m:t>
+                                </m:r>
+                              </m:e>
+                              <m:sup>
+                                <m:r>
+                                  <m:rPr>
+                                    <m:sty m:val="p"/>
+                                  </m:rPr>
+                                  <m:t>′</m:t>
+                                </m:r>
+                              </m:sup>
+                            </m:sSup>
+                          </m:sub>
+                        </m:sSub>
+                      </m:e>
+                    </m:nary>
+                  </m:den>
+                </m:f>
+              </m:oMath>
+            </m:oMathPara>
+          </w:p>
+        </w:tc>
+        <w:tc>
+          <w:tcPr/>
+          <w:p>
+            <w:pPr>
+              <w:pStyle w:val="Compact"/>
+              <w:jc w:val="right"/>
+            </w:pPr>
+            <w:r>
+              <w:t xml:space="preserve">(19b)</w:t>
+            </w:r>
+          </w:p>
+        </w:tc>
+      </w:tr>
+    </w:tbl>
+    <w:p>
+      <w:pPr>
+        <w:pStyle w:val="BodyText"/>
+      </w:pPr>
+      <w:r>
         <w:t xml:space="preserve">The distribution for the newest generation (</w:t>
       </w:r>
       <m:oMath>
@@ -13016,22 +14280,30 @@
         </m:r>
       </m:oMath>
       <w:r>
-        <w:t xml:space="preserve">) is determined by accounting for heritability with the Breeders’ equation</w:t>
-      </w:r>
-      <w:r>
-        <w:t xml:space="preserve"> </w:t>
-      </w:r>
-      <w:r>
-        <w:t xml:space="preserve">(43, 44, 70–72)</w:t>
-      </w:r>
-      <w:r>
-        <w:t xml:space="preserve">. The selection differential (</w:t>
+        <w:t xml:space="preserve">) at each sink location</w:t>
+      </w:r>
+      <w:r>
+        <w:t xml:space="preserve"> </w:t>
       </w:r>
       <m:oMath>
-        <m:sSub>
+        <m:r>
+          <m:t>l</m:t>
+        </m:r>
+      </m:oMath>
+      <w:r>
+        <w:t xml:space="preserve"> </w:t>
+      </w:r>
+      <w:r>
+        <w:t xml:space="preserve">is then given by the connectivity-weighted mean of the source contributions</w:t>
+      </w:r>
+      <w:r>
+        <w:t xml:space="preserve"> </w:t>
+      </w:r>
+      <m:oMath>
+        <m:sSubSup>
           <m:e>
             <m:r>
-              <m:t>S</m:t>
+              <m:t>μ</m:t>
             </m:r>
           </m:e>
           <m:sub>
@@ -13053,6 +14325,82 @@
               </m:rPr>
               <m:t>,</m:t>
             </m:r>
+            <m:sSup>
+              <m:e>
+                <m:r>
+                  <m:t>l</m:t>
+                </m:r>
+              </m:e>
+              <m:sup>
+                <m:r>
+                  <m:rPr>
+                    <m:sty m:val="p"/>
+                  </m:rPr>
+                  <m:t>′</m:t>
+                </m:r>
+              </m:sup>
+            </m:sSup>
+          </m:sub>
+          <m:sup>
+            <m:r>
+              <m:t>s</m:t>
+            </m:r>
+            <m:r>
+              <m:t>e</m:t>
+            </m:r>
+            <m:r>
+              <m:t>t</m:t>
+            </m:r>
+            <m:r>
+              <m:t>t</m:t>
+            </m:r>
+            <m:r>
+              <m:t>l</m:t>
+            </m:r>
+            <m:r>
+              <m:t>e</m:t>
+            </m:r>
+            <m:r>
+              <m:t>r</m:t>
+            </m:r>
+          </m:sup>
+        </m:sSubSup>
+      </m:oMath>
+      <w:r>
+        <w:t xml:space="preserve">, using the same connectivity weights</w:t>
+      </w:r>
+      <w:r>
+        <w:t xml:space="preserve"> </w:t>
+      </w:r>
+      <m:oMath>
+        <m:sSub>
+          <m:e>
+            <m:r>
+              <m:t>P</m:t>
+            </m:r>
+          </m:e>
+          <m:sub>
+            <m:sSup>
+              <m:e>
+                <m:r>
+                  <m:t>l</m:t>
+                </m:r>
+              </m:e>
+              <m:sup>
+                <m:r>
+                  <m:rPr>
+                    <m:sty m:val="p"/>
+                  </m:rPr>
+                  <m:t>′</m:t>
+                </m:r>
+              </m:sup>
+            </m:sSup>
+            <m:r>
+              <m:rPr>
+                <m:sty m:val="p"/>
+              </m:rPr>
+              <m:t>,</m:t>
+            </m:r>
             <m:r>
               <m:t>l</m:t>
             </m:r>
@@ -13060,7 +14408,10 @@
         </m:sSub>
       </m:oMath>
       <w:r>
-        <w:t xml:space="preserve">) described in Breeder’s equation is given by the difference between the mean of the previous timesteps juveniles and a weighted sum of mean tolerances of connected populations,</w:t>
+        <w:t xml:space="preserve"> </w:t>
+      </w:r>
+      <w:r>
+        <w:t xml:space="preserve">as equation (11):</w:t>
       </w:r>
     </w:p>
     <w:tbl>
@@ -13087,390 +14438,6 @@
                 <m:jc m:val="center"/>
               </m:oMathParaPr>
               <m:oMath>
-                <m:sSub>
-                  <m:e>
-                    <m:r>
-                      <m:t>S</m:t>
-                    </m:r>
-                  </m:e>
-                  <m:sub>
-                    <m:r>
-                      <m:t>t</m:t>
-                    </m:r>
-                    <m:r>
-                      <m:rPr>
-                        <m:sty m:val="p"/>
-                      </m:rPr>
-                      <m:t>;</m:t>
-                    </m:r>
-                    <m:r>
-                      <m:t>g</m:t>
-                    </m:r>
-                    <m:r>
-                      <m:rPr>
-                        <m:sty m:val="p"/>
-                      </m:rPr>
-                      <m:t>,</m:t>
-                    </m:r>
-                    <m:r>
-                      <m:t>l</m:t>
-                    </m:r>
-                  </m:sub>
-                </m:sSub>
-                <m:r>
-                  <m:rPr>
-                    <m:sty m:val="p"/>
-                  </m:rPr>
-                  <m:t>=</m:t>
-                </m:r>
-                <m:sSub>
-                  <m:e>
-                    <m:bar>
-                      <m:barPr>
-                        <m:pos m:val="top"/>
-                      </m:barPr>
-                      <m:e>
-                        <m:r>
-                          <m:t>μ</m:t>
-                        </m:r>
-                      </m:e>
-                    </m:bar>
-                  </m:e>
-                  <m:sub>
-                    <m:r>
-                      <m:t>t</m:t>
-                    </m:r>
-                    <m:r>
-                      <m:rPr>
-                        <m:sty m:val="p"/>
-                      </m:rPr>
-                      <m:t>;</m:t>
-                    </m:r>
-                    <m:r>
-                      <m:t>l</m:t>
-                    </m:r>
-                  </m:sub>
-                </m:sSub>
-                <m:r>
-                  <m:rPr>
-                    <m:sty m:val="p"/>
-                  </m:rPr>
-                  <m:t>−</m:t>
-                </m:r>
-                <m:sSub>
-                  <m:e>
-                    <m:bar>
-                      <m:barPr>
-                        <m:pos m:val="top"/>
-                      </m:barPr>
-                      <m:e>
-                        <m:r>
-                          <m:t>μ</m:t>
-                        </m:r>
-                      </m:e>
-                    </m:bar>
-                  </m:e>
-                  <m:sub>
-                    <m:r>
-                      <m:t>t</m:t>
-                    </m:r>
-                    <m:r>
-                      <m:rPr>
-                        <m:sty m:val="p"/>
-                      </m:rPr>
-                      <m:t>;</m:t>
-                    </m:r>
-                    <m:r>
-                      <m:t>g</m:t>
-                    </m:r>
-                    <m:r>
-                      <m:rPr>
-                        <m:sty m:val="p"/>
-                      </m:rPr>
-                      <m:t>,</m:t>
-                    </m:r>
-                    <m:r>
-                      <m:t>1</m:t>
-                    </m:r>
-                    <m:r>
-                      <m:rPr>
-                        <m:sty m:val="p"/>
-                      </m:rPr>
-                      <m:t>,</m:t>
-                    </m:r>
-                    <m:r>
-                      <m:t>l</m:t>
-                    </m:r>
-                  </m:sub>
-                </m:sSub>
-              </m:oMath>
-            </m:oMathPara>
-          </w:p>
-        </w:tc>
-        <w:tc>
-          <w:tcPr/>
-          <w:p>
-            <w:pPr>
-              <w:pStyle w:val="Compact"/>
-              <w:jc w:val="right"/>
-            </w:pPr>
-            <w:r>
-              <w:t xml:space="preserve">(19)</w:t>
-            </w:r>
-          </w:p>
-        </w:tc>
-      </w:tr>
-    </w:tbl>
-    <w:p>
-      <w:pPr>
-        <w:pStyle w:val="BodyText"/>
-      </w:pPr>
-      <w:r>
-        <w:t xml:space="preserve">where</w:t>
-      </w:r>
-      <w:r>
-        <w:t xml:space="preserve"> </w:t>
-      </w:r>
-      <m:oMath>
-        <m:sSub>
-          <m:e>
-            <m:bar>
-              <m:barPr>
-                <m:pos m:val="top"/>
-              </m:barPr>
-              <m:e>
-                <m:r>
-                  <m:t>μ</m:t>
-                </m:r>
-              </m:e>
-            </m:bar>
-          </m:e>
-          <m:sub>
-            <m:r>
-              <m:t>t</m:t>
-            </m:r>
-            <m:r>
-              <m:rPr>
-                <m:sty m:val="p"/>
-              </m:rPr>
-              <m:t>;</m:t>
-            </m:r>
-            <m:r>
-              <m:t>l</m:t>
-            </m:r>
-          </m:sub>
-        </m:sSub>
-      </m:oMath>
-      <w:r>
-        <w:t xml:space="preserve"> </w:t>
-      </w:r>
-      <w:r>
-        <w:t xml:space="preserve">is the weighted mean of thermal tolerance from all source recruitment locations to location</w:t>
-      </w:r>
-      <w:r>
-        <w:t xml:space="preserve"> </w:t>
-      </w:r>
-      <m:oMath>
-        <m:r>
-          <m:t>l</m:t>
-        </m:r>
-      </m:oMath>
-      <w:r>
-        <w:t xml:space="preserve"> </w:t>
-      </w:r>
-      <w:r>
-        <w:t xml:space="preserve">for each functional group and</w:t>
-      </w:r>
-      <w:r>
-        <w:t xml:space="preserve"> </w:t>
-      </w:r>
-      <m:oMath>
-        <m:sSub>
-          <m:e>
-            <m:bar>
-              <m:barPr>
-                <m:pos m:val="top"/>
-              </m:barPr>
-              <m:e>
-                <m:r>
-                  <m:t>μ</m:t>
-                </m:r>
-              </m:e>
-            </m:bar>
-          </m:e>
-          <m:sub>
-            <m:r>
-              <m:t>t</m:t>
-            </m:r>
-            <m:r>
-              <m:rPr>
-                <m:sty m:val="p"/>
-              </m:rPr>
-              <m:t>;</m:t>
-            </m:r>
-            <m:r>
-              <m:t>g</m:t>
-            </m:r>
-            <m:r>
-              <m:rPr>
-                <m:sty m:val="p"/>
-              </m:rPr>
-              <m:t>,</m:t>
-            </m:r>
-            <m:r>
-              <m:t>1</m:t>
-            </m:r>
-            <m:r>
-              <m:rPr>
-                <m:sty m:val="p"/>
-              </m:rPr>
-              <m:t>,</m:t>
-            </m:r>
-            <m:r>
-              <m:t>l</m:t>
-            </m:r>
-          </m:sub>
-        </m:sSub>
-      </m:oMath>
-      <w:r>
-        <w:t xml:space="preserve"> </w:t>
-      </w:r>
-      <w:r>
-        <w:t xml:space="preserve">is the mean thermal tolerance of corals for functional group</w:t>
-      </w:r>
-      <w:r>
-        <w:t xml:space="preserve"> </w:t>
-      </w:r>
-      <m:oMath>
-        <m:r>
-          <m:t>g</m:t>
-        </m:r>
-      </m:oMath>
-      <w:r>
-        <w:t xml:space="preserve"> </w:t>
-      </w:r>
-      <w:r>
-        <w:t xml:space="preserve">and size class</w:t>
-      </w:r>
-      <w:r>
-        <w:t xml:space="preserve"> </w:t>
-      </w:r>
-      <m:oMath>
-        <m:r>
-          <m:t>z</m:t>
-        </m:r>
-        <m:r>
-          <m:rPr>
-            <m:sty m:val="p"/>
-          </m:rPr>
-          <m:t>=</m:t>
-        </m:r>
-        <m:r>
-          <m:t>1</m:t>
-        </m:r>
-      </m:oMath>
-      <w:r>
-        <w:t xml:space="preserve"> </w:t>
-      </w:r>
-      <w:r>
-        <w:t xml:space="preserve">at the location</w:t>
-      </w:r>
-      <w:r>
-        <w:t xml:space="preserve"> </w:t>
-      </w:r>
-      <m:oMath>
-        <m:r>
-          <m:t>l</m:t>
-        </m:r>
-      </m:oMath>
-      <w:r>
-        <w:t xml:space="preserve"> </w:t>
-      </w:r>
-      <w:r>
-        <w:t xml:space="preserve">and timestep</w:t>
-      </w:r>
-      <w:r>
-        <w:t xml:space="preserve"> </w:t>
-      </w:r>
-      <m:oMath>
-        <m:r>
-          <m:t>t</m:t>
-        </m:r>
-      </m:oMath>
-      <w:r>
-        <w:t xml:space="preserve">. The distributions for size class</w:t>
-      </w:r>
-      <w:r>
-        <w:t xml:space="preserve"> </w:t>
-      </w:r>
-      <m:oMath>
-        <m:r>
-          <m:t>z</m:t>
-        </m:r>
-        <m:r>
-          <m:rPr>
-            <m:sty m:val="p"/>
-          </m:rPr>
-          <m:t>=</m:t>
-        </m:r>
-        <m:r>
-          <m:t>1</m:t>
-        </m:r>
-      </m:oMath>
-      <w:r>
-        <w:t xml:space="preserve"> </w:t>
-      </w:r>
-      <w:r>
-        <w:t xml:space="preserve">at timestep</w:t>
-      </w:r>
-      <w:r>
-        <w:t xml:space="preserve"> </w:t>
-      </w:r>
-      <m:oMath>
-        <m:r>
-          <m:t>t</m:t>
-        </m:r>
-        <m:r>
-          <m:rPr>
-            <m:sty m:val="p"/>
-          </m:rPr>
-          <m:t>+</m:t>
-        </m:r>
-        <m:r>
-          <m:t>1</m:t>
-        </m:r>
-      </m:oMath>
-      <w:r>
-        <w:t xml:space="preserve"> </w:t>
-      </w:r>
-      <w:r>
-        <w:t xml:space="preserve">are then updated as:</w:t>
-      </w:r>
-    </w:p>
-    <w:tbl>
-      <w:tblPr>
-        <w:tblStyle w:val="Table"/>
-        <w:tblW w:type="pct" w:w="5000"/>
-        <w:tblLayout w:type="fixed"/>
-        <w:tblLook w:firstRow="0" w:lastRow="0" w:firstColumn="0" w:lastColumn="0" w:noHBand="0" w:noVBand="0" w:val="0000"/>
-      </w:tblPr>
-      <w:tblGrid>
-        <w:gridCol w:w="7128"/>
-        <w:gridCol w:w="792"/>
-      </w:tblGrid>
-      <w:tr>
-        <w:tc>
-          <w:tcPr/>
-          <w:p>
-            <w:pPr>
-              <w:pStyle w:val="Compact"/>
-              <w:jc w:val="center"/>
-            </w:pPr>
-            <m:oMathPara>
-              <m:oMathParaPr>
-                <m:jc m:val="center"/>
-              </m:oMathParaPr>
-              <m:oMath>
                 <m:sSubSup>
                   <m:e>
                     <m:r>
@@ -13542,63 +14509,147 @@
                   </m:rPr>
                   <m:t>=</m:t>
                 </m:r>
-                <m:sSub>
+                <m:nary>
+                  <m:naryPr>
+                    <m:chr m:val="∑"/>
+                    <m:limLoc m:val="undOvr"/>
+                    <m:subHide m:val="off"/>
+                    <m:supHide m:val="on"/>
+                  </m:naryPr>
+                  <m:sub>
+                    <m:sSup>
+                      <m:e>
+                        <m:r>
+                          <m:t>l</m:t>
+                        </m:r>
+                      </m:e>
+                      <m:sup>
+                        <m:r>
+                          <m:rPr>
+                            <m:sty m:val="p"/>
+                          </m:rPr>
+                          <m:t>′</m:t>
+                        </m:r>
+                      </m:sup>
+                    </m:sSup>
+                  </m:sub>
+                  <m:sup>
+                    <m:r>
+                      <m:t>​</m:t>
+                    </m:r>
+                  </m:sup>
                   <m:e>
-                    <m:r>
-                      <m:t>μ</m:t>
-                    </m:r>
-                  </m:e>
-                  <m:sub>
-                    <m:r>
-                      <m:t>t</m:t>
-                    </m:r>
-                    <m:r>
-                      <m:rPr>
-                        <m:sty m:val="p"/>
-                      </m:rPr>
-                      <m:t>;</m:t>
-                    </m:r>
-                    <m:r>
-                      <m:t>g</m:t>
-                    </m:r>
-                    <m:r>
-                      <m:rPr>
-                        <m:sty m:val="p"/>
-                      </m:rPr>
-                      <m:t>,</m:t>
-                    </m:r>
-                    <m:r>
-                      <m:t>1</m:t>
-                    </m:r>
-                    <m:r>
-                      <m:rPr>
-                        <m:sty m:val="p"/>
-                      </m:rPr>
-                      <m:t>,</m:t>
-                    </m:r>
-                    <m:r>
-                      <m:t>l</m:t>
-                    </m:r>
-                  </m:sub>
-                </m:sSub>
-                <m:r>
-                  <m:rPr>
-                    <m:sty m:val="p"/>
-                  </m:rPr>
-                  <m:t>+</m:t>
-                </m:r>
-                <m:d>
-                  <m:dPr>
-                    <m:begChr m:val="("/>
-                    <m:sepChr m:val=""/>
-                    <m:endChr m:val=")"/>
-                    <m:grow/>
-                  </m:dPr>
-                  <m:e>
-                    <m:sSub>
+                    <m:f>
+                      <m:fPr>
+                        <m:type m:val="bar"/>
+                      </m:fPr>
+                      <m:num>
+                        <m:sSub>
+                          <m:e>
+                            <m:r>
+                              <m:t>P</m:t>
+                            </m:r>
+                          </m:e>
+                          <m:sub>
+                            <m:sSup>
+                              <m:e>
+                                <m:r>
+                                  <m:t>l</m:t>
+                                </m:r>
+                              </m:e>
+                              <m:sup>
+                                <m:r>
+                                  <m:rPr>
+                                    <m:sty m:val="p"/>
+                                  </m:rPr>
+                                  <m:t>′</m:t>
+                                </m:r>
+                              </m:sup>
+                            </m:sSup>
+                            <m:r>
+                              <m:rPr>
+                                <m:sty m:val="p"/>
+                              </m:rPr>
+                              <m:t>,</m:t>
+                            </m:r>
+                            <m:r>
+                              <m:t>l</m:t>
+                            </m:r>
+                          </m:sub>
+                        </m:sSub>
+                      </m:num>
+                      <m:den>
+                        <m:nary>
+                          <m:naryPr>
+                            <m:chr m:val="∑"/>
+                            <m:limLoc m:val="undOvr"/>
+                            <m:subHide m:val="off"/>
+                            <m:supHide m:val="on"/>
+                          </m:naryPr>
+                          <m:sub>
+                            <m:sSup>
+                              <m:e>
+                                <m:r>
+                                  <m:t>l</m:t>
+                                </m:r>
+                              </m:e>
+                              <m:sup>
+                                <m:r>
+                                  <m:rPr>
+                                    <m:sty m:val="p"/>
+                                  </m:rPr>
+                                  <m:t>″</m:t>
+                                </m:r>
+                              </m:sup>
+                            </m:sSup>
+                          </m:sub>
+                          <m:sup>
+                            <m:r>
+                              <m:t>​</m:t>
+                            </m:r>
+                          </m:sup>
+                          <m:e>
+                            <m:sSub>
+                              <m:e>
+                                <m:r>
+                                  <m:t>P</m:t>
+                                </m:r>
+                              </m:e>
+                              <m:sub>
+                                <m:sSup>
+                                  <m:e>
+                                    <m:r>
+                                      <m:t>l</m:t>
+                                    </m:r>
+                                  </m:e>
+                                  <m:sup>
+                                    <m:r>
+                                      <m:rPr>
+                                        <m:sty m:val="p"/>
+                                      </m:rPr>
+                                      <m:t>″</m:t>
+                                    </m:r>
+                                  </m:sup>
+                                </m:sSup>
+                                <m:r>
+                                  <m:rPr>
+                                    <m:sty m:val="p"/>
+                                  </m:rPr>
+                                  <m:t>,</m:t>
+                                </m:r>
+                                <m:r>
+                                  <m:t>l</m:t>
+                                </m:r>
+                              </m:sub>
+                            </m:sSub>
+                          </m:e>
+                        </m:nary>
+                      </m:den>
+                    </m:f>
+                    <m:sSubSup>
                       <m:e>
                         <m:r>
-                          <m:t>S</m:t>
+                          <m:t>μ</m:t>
                         </m:r>
                       </m:e>
                       <m:sub>
@@ -13620,31 +14671,48 @@
                           </m:rPr>
                           <m:t>,</m:t>
                         </m:r>
+                        <m:sSup>
+                          <m:e>
+                            <m:r>
+                              <m:t>l</m:t>
+                            </m:r>
+                          </m:e>
+                          <m:sup>
+                            <m:r>
+                              <m:rPr>
+                                <m:sty m:val="p"/>
+                              </m:rPr>
+                              <m:t>′</m:t>
+                            </m:r>
+                          </m:sup>
+                        </m:sSup>
+                      </m:sub>
+                      <m:sup>
+                        <m:r>
+                          <m:t>s</m:t>
+                        </m:r>
+                        <m:r>
+                          <m:t>e</m:t>
+                        </m:r>
+                        <m:r>
+                          <m:t>t</m:t>
+                        </m:r>
+                        <m:r>
+                          <m:t>t</m:t>
+                        </m:r>
                         <m:r>
                           <m:t>l</m:t>
                         </m:r>
-                      </m:sub>
-                    </m:sSub>
-                    <m:r>
-                      <m:rPr>
-                        <m:sty m:val="p"/>
-                      </m:rPr>
-                      <m:t>⋅</m:t>
-                    </m:r>
-                    <m:sSup>
-                      <m:e>
-                        <m:r>
-                          <m:t>h</m:t>
-                        </m:r>
-                      </m:e>
-                      <m:sup>
-                        <m:r>
-                          <m:t>2</m:t>
+                        <m:r>
+                          <m:t>e</m:t>
+                        </m:r>
+                        <m:r>
+                          <m:t>r</m:t>
                         </m:r>
                       </m:sup>
-                    </m:sSup>
+                    </m:sSubSup>
                   </m:e>
-                </m:d>
+                </m:nary>
                 <m:sSubSup>
                   <m:e>
                     <m:r>

</xml_diff>

<commit_message>
Fix Eq. 9 and Eq. 17S algebra errors, document 17S rationale
Eq. 9 had a mis-nested log/division that didn't match the fecundity
code (Corals.jl); rewritten as the plain a*area^b/0.1 form it
actually computes. Eq. 17S's denominator was missing a square (a
dimensional error - C* must be an area, so the growth ratio has to
be dimensionless) and its argmax targeted the wrong quantity;
rewritten to match CoralBlox's _diameter_coef exactly, with a new
sentence explaining why C* is built from the largest per-colony area
growth ratio rather than a diameter sum.
</commit_message>
<xml_diff>
--- a/paper/paper.docx
+++ b/paper/paper.docx
@@ -7695,12 +7695,6 @@
                 <m:jc m:val="center"/>
               </m:oMathParaPr>
               <m:oMath>
-                <m:r>
-                  <m:rPr>
-                    <m:sty m:val="p"/>
-                  </m:rPr>
-                  <m:t>log</m:t>
-                </m:r>
                 <m:sSub>
                   <m:e>
                     <m:r>
@@ -7728,109 +7722,72 @@
                   </m:rPr>
                   <m:t>=</m:t>
                 </m:r>
-                <m:r>
-                  <m:rPr>
-                    <m:sty m:val="p"/>
-                  </m:rPr>
-                  <m:t>(</m:t>
-                </m:r>
-                <m:r>
-                  <m:rPr>
-                    <m:sty m:val="p"/>
-                  </m:rPr>
-                  <m:t>log</m:t>
-                </m:r>
-                <m:sSub>
-                  <m:e>
-                    <m:r>
-                      <m:t>a</m:t>
-                    </m:r>
-                  </m:e>
-                  <m:sub>
-                    <m:r>
-                      <m:t>g</m:t>
-                    </m:r>
-                  </m:sub>
-                </m:sSub>
-                <m:r>
-                  <m:rPr>
-                    <m:sty m:val="p"/>
-                  </m:rPr>
-                  <m:t>+</m:t>
-                </m:r>
-                <m:sSub>
-                  <m:e>
-                    <m:r>
-                      <m:t>b</m:t>
-                    </m:r>
-                  </m:e>
-                  <m:sub>
-                    <m:r>
-                      <m:t>g</m:t>
-                    </m:r>
-                  </m:sub>
-                </m:sSub>
-                <m:r>
-                  <m:rPr>
-                    <m:sty m:val="p"/>
-                  </m:rPr>
-                  <m:t>log</m:t>
-                </m:r>
-                <m:r>
-                  <m:rPr>
-                    <m:sty m:val="p"/>
-                  </m:rPr>
-                  <m:t>(</m:t>
-                </m:r>
-                <m:sSub>
-                  <m:e>
-                    <m:bar>
-                      <m:barPr>
-                        <m:pos m:val="top"/>
-                      </m:barPr>
+                <m:f>
+                  <m:fPr>
+                    <m:type m:val="bar"/>
+                  </m:fPr>
+                  <m:num>
+                    <m:sSub>
                       <m:e>
                         <m:r>
-                          <m:t>α</m:t>
+                          <m:t>a</m:t>
                         </m:r>
                       </m:e>
-                    </m:bar>
-                  </m:e>
-                  <m:sub>
-                    <m:r>
-                      <m:t>g</m:t>
-                    </m:r>
-                    <m:r>
-                      <m:rPr>
-                        <m:sty m:val="p"/>
-                      </m:rPr>
-                      <m:t>,</m:t>
-                    </m:r>
-                    <m:r>
-                      <m:t>z</m:t>
-                    </m:r>
-                  </m:sub>
-                </m:sSub>
-                <m:r>
-                  <m:rPr>
-                    <m:sty m:val="p"/>
-                  </m:rPr>
-                  <m:t>)</m:t>
-                </m:r>
-                <m:r>
-                  <m:rPr>
-                    <m:sty m:val="p"/>
-                  </m:rPr>
-                  <m:t>)</m:t>
-                </m:r>
-                <m:r>
-                  <m:rPr>
-                    <m:sty m:val="p"/>
-                  </m:rPr>
-                  <m:t>/</m:t>
-                </m:r>
-                <m:r>
-                  <m:t>0.1</m:t>
-                </m:r>
+                      <m:sub>
+                        <m:r>
+                          <m:t>g</m:t>
+                        </m:r>
+                      </m:sub>
+                    </m:sSub>
+                    <m:sSubSup>
+                      <m:e>
+                        <m:bar>
+                          <m:barPr>
+                            <m:pos m:val="top"/>
+                          </m:barPr>
+                          <m:e>
+                            <m:r>
+                              <m:t>α</m:t>
+                            </m:r>
+                          </m:e>
+                        </m:bar>
+                      </m:e>
+                      <m:sub>
+                        <m:r>
+                          <m:t>g</m:t>
+                        </m:r>
+                        <m:r>
+                          <m:rPr>
+                            <m:sty m:val="p"/>
+                          </m:rPr>
+                          <m:t>,</m:t>
+                        </m:r>
+                        <m:r>
+                          <m:t>z</m:t>
+                        </m:r>
+                      </m:sub>
+                      <m:sup>
+                        <m:sSub>
+                          <m:e>
+                            <m:r>
+                              <m:t>b</m:t>
+                            </m:r>
+                          </m:e>
+                          <m:sub>
+                            <m:r>
+                              <m:t>g</m:t>
+                            </m:r>
+                          </m:sub>
+                        </m:sSub>
+                      </m:sup>
+                    </m:sSubSup>
+                  </m:num>
+                  <m:den>
+                    <m:r>
+                      <m:t>0.1</m:t>
+                    </m:r>
+                  </m:den>
+                </m:f>
               </m:oMath>
             </m:oMathPara>
           </w:p>
@@ -39294,7 +39251,336 @@
         </m:sSubSup>
       </m:oMath>
       <w:r>
-        <w:t xml:space="preserve">, we chose one that balances accuracy and computation speed.</w:t>
+        <w:t xml:space="preserve">, we chose one that balances accuracy and computation speed:</w:t>
+      </w:r>
+      <w:r>
+        <w:t xml:space="preserve"> </w:t>
+      </w:r>
+      <m:oMath>
+        <m:sSup>
+          <m:e>
+            <m:r>
+              <m:t>C</m:t>
+            </m:r>
+          </m:e>
+          <m:sup>
+            <m:r>
+              <m:rPr>
+                <m:sty m:val="p"/>
+              </m:rPr>
+              <m:t>*</m:t>
+            </m:r>
+          </m:sup>
+        </m:sSup>
+      </m:oMath>
+      <w:r>
+        <w:t xml:space="preserve"> </w:t>
+      </w:r>
+      <w:r>
+        <w:t xml:space="preserve">is obtained by concentrating the entire habitable area</w:t>
+      </w:r>
+      <w:r>
+        <w:t xml:space="preserve"> </w:t>
+      </w:r>
+      <m:oMath>
+        <m:r>
+          <m:t>H</m:t>
+        </m:r>
+      </m:oMath>
+      <w:r>
+        <w:t xml:space="preserve"> </w:t>
+      </w:r>
+      <w:r>
+        <w:t xml:space="preserve">into whichever functional group and size class would see the largest relative increase in colony area over one year of linear extension, and applying that growth factor to</w:t>
+      </w:r>
+      <w:r>
+        <w:t xml:space="preserve"> </w:t>
+      </w:r>
+      <m:oMath>
+        <m:r>
+          <m:t>H</m:t>
+        </m:r>
+      </m:oMath>
+      <w:r>
+        <w:t xml:space="preserve">. Since colony (basal) area scales with the square of colony diameter, the relative area growth of a colony at diameter</w:t>
+      </w:r>
+      <w:r>
+        <w:t xml:space="preserve"> </w:t>
+      </w:r>
+      <m:oMath>
+        <m:sSubSup>
+          <m:e>
+            <m:r>
+              <m:t>d</m:t>
+            </m:r>
+          </m:e>
+          <m:sub>
+            <m:r>
+              <m:t>g</m:t>
+            </m:r>
+            <m:r>
+              <m:rPr>
+                <m:sty m:val="p"/>
+              </m:rPr>
+              <m:t>,</m:t>
+            </m:r>
+            <m:r>
+              <m:t>z</m:t>
+            </m:r>
+          </m:sub>
+          <m:sup>
+            <m:r>
+              <m:rPr>
+                <m:sty m:val="p"/>
+              </m:rPr>
+              <m:t>+</m:t>
+            </m:r>
+          </m:sup>
+        </m:sSubSup>
+      </m:oMath>
+      <w:r>
+        <w:t xml:space="preserve"> </w:t>
+      </w:r>
+      <w:r>
+        <w:t xml:space="preserve">extending by</w:t>
+      </w:r>
+      <w:r>
+        <w:t xml:space="preserve"> </w:t>
+      </w:r>
+      <m:oMath>
+        <m:sSub>
+          <m:e>
+            <m:r>
+              <m:t>γ</m:t>
+            </m:r>
+          </m:e>
+          <m:sub>
+            <m:r>
+              <m:t>g</m:t>
+            </m:r>
+            <m:r>
+              <m:rPr>
+                <m:sty m:val="p"/>
+              </m:rPr>
+              <m:t>,</m:t>
+            </m:r>
+            <m:r>
+              <m:t>z</m:t>
+            </m:r>
+          </m:sub>
+        </m:sSub>
+      </m:oMath>
+      <w:r>
+        <w:t xml:space="preserve"> </w:t>
+      </w:r>
+      <w:r>
+        <w:t xml:space="preserve">is the dimensionless ratio</w:t>
+      </w:r>
+      <w:r>
+        <w:t xml:space="preserve"> </w:t>
+      </w:r>
+      <m:oMath>
+        <m:r>
+          <m:rPr>
+            <m:sty m:val="p"/>
+          </m:rPr>
+          <m:t>(</m:t>
+        </m:r>
+        <m:sSubSup>
+          <m:e>
+            <m:r>
+              <m:t>d</m:t>
+            </m:r>
+          </m:e>
+          <m:sub>
+            <m:r>
+              <m:t>g</m:t>
+            </m:r>
+            <m:r>
+              <m:rPr>
+                <m:sty m:val="p"/>
+              </m:rPr>
+              <m:t>,</m:t>
+            </m:r>
+            <m:r>
+              <m:t>z</m:t>
+            </m:r>
+          </m:sub>
+          <m:sup>
+            <m:r>
+              <m:rPr>
+                <m:sty m:val="p"/>
+              </m:rPr>
+              <m:t>+</m:t>
+            </m:r>
+          </m:sup>
+        </m:sSubSup>
+        <m:r>
+          <m:rPr>
+            <m:sty m:val="p"/>
+          </m:rPr>
+          <m:t>+</m:t>
+        </m:r>
+        <m:sSub>
+          <m:e>
+            <m:r>
+              <m:t>γ</m:t>
+            </m:r>
+          </m:e>
+          <m:sub>
+            <m:r>
+              <m:t>g</m:t>
+            </m:r>
+            <m:r>
+              <m:rPr>
+                <m:sty m:val="p"/>
+              </m:rPr>
+              <m:t>,</m:t>
+            </m:r>
+            <m:r>
+              <m:t>z</m:t>
+            </m:r>
+          </m:sub>
+        </m:sSub>
+        <m:sSup>
+          <m:e>
+            <m:r>
+              <m:rPr>
+                <m:sty m:val="p"/>
+              </m:rPr>
+              <m:t>)</m:t>
+            </m:r>
+          </m:e>
+          <m:sup>
+            <m:r>
+              <m:t>2</m:t>
+            </m:r>
+          </m:sup>
+        </m:sSup>
+        <m:r>
+          <m:rPr>
+            <m:sty m:val="p"/>
+          </m:rPr>
+          <m:t>/</m:t>
+        </m:r>
+        <m:r>
+          <m:rPr>
+            <m:sty m:val="p"/>
+          </m:rPr>
+          <m:t>(</m:t>
+        </m:r>
+        <m:sSubSup>
+          <m:e>
+            <m:r>
+              <m:t>d</m:t>
+            </m:r>
+          </m:e>
+          <m:sub>
+            <m:r>
+              <m:t>g</m:t>
+            </m:r>
+            <m:r>
+              <m:rPr>
+                <m:sty m:val="p"/>
+              </m:rPr>
+              <m:t>,</m:t>
+            </m:r>
+            <m:r>
+              <m:t>z</m:t>
+            </m:r>
+          </m:sub>
+          <m:sup>
+            <m:r>
+              <m:rPr>
+                <m:sty m:val="p"/>
+              </m:rPr>
+              <m:t>+</m:t>
+            </m:r>
+          </m:sup>
+        </m:sSubSup>
+        <m:sSup>
+          <m:e>
+            <m:r>
+              <m:rPr>
+                <m:sty m:val="p"/>
+              </m:rPr>
+              <m:t>)</m:t>
+            </m:r>
+          </m:e>
+          <m:sup>
+            <m:r>
+              <m:t>2</m:t>
+            </m:r>
+          </m:sup>
+        </m:sSup>
+      </m:oMath>
+      <w:r>
+        <w:t xml:space="preserve">; taking the largest such ratio guarantees</w:t>
+      </w:r>
+      <w:r>
+        <w:t xml:space="preserve"> </w:t>
+      </w:r>
+      <m:oMath>
+        <m:sSup>
+          <m:e>
+            <m:r>
+              <m:t>C</m:t>
+            </m:r>
+          </m:e>
+          <m:sup>
+            <m:r>
+              <m:rPr>
+                <m:sty m:val="p"/>
+              </m:rPr>
+              <m:t>*</m:t>
+            </m:r>
+          </m:sup>
+        </m:sSup>
+      </m:oMath>
+      <w:r>
+        <w:t xml:space="preserve"> </w:t>
+      </w:r>
+      <w:r>
+        <w:t xml:space="preserve">is a sufficiently generous bound that</w:t>
+      </w:r>
+      <w:r>
+        <w:t xml:space="preserve"> </w:t>
+      </w:r>
+      <m:oMath>
+        <m:sSubSup>
+          <m:e>
+            <m:r>
+              <m:t>C</m:t>
+            </m:r>
+          </m:e>
+          <m:sub>
+            <m:r>
+              <m:t>t</m:t>
+            </m:r>
+          </m:sub>
+          <m:sup>
+            <m:r>
+              <m:t>A</m:t>
+            </m:r>
+          </m:sup>
+        </m:sSubSup>
+      </m:oMath>
+      <w:r>
+        <w:t xml:space="preserve"> </w:t>
+      </w:r>
+      <w:r>
+        <w:t xml:space="preserve">never exceeds</w:t>
+      </w:r>
+      <w:r>
+        <w:t xml:space="preserve"> </w:t>
+      </w:r>
+      <m:oMath>
+        <m:r>
+          <m:t>H</m:t>
+        </m:r>
+      </m:oMath>
+      <w:r>
+        <w:t xml:space="preserve">.</w:t>
       </w:r>
     </w:p>
     <w:tbl>
@@ -39385,9 +39671,21 @@
                               </m:rPr>
                               <m:t>,</m:t>
                             </m:r>
-                            <m:r>
-                              <m:t>Z</m:t>
-                            </m:r>
+                            <m:sSub>
+                              <m:e>
+                                <m:r>
+                                  <m:t>z</m:t>
+                                </m:r>
+                              </m:e>
+                              <m:sub>
+                                <m:r>
+                                  <m:rPr>
+                                    <m:sty m:val="p"/>
+                                  </m:rPr>
+                                  <m:t>max</m:t>
+                                </m:r>
+                              </m:sub>
+                            </m:sSub>
                           </m:sub>
                           <m:sup>
                             <m:r>
@@ -39432,9 +39730,21 @@
                               </m:rPr>
                               <m:t>,</m:t>
                             </m:r>
-                            <m:r>
-                              <m:t>Z</m:t>
-                            </m:r>
+                            <m:sSub>
+                              <m:e>
+                                <m:r>
+                                  <m:t>z</m:t>
+                                </m:r>
+                              </m:e>
+                              <m:sub>
+                                <m:r>
+                                  <m:rPr>
+                                    <m:sty m:val="p"/>
+                                  </m:rPr>
+                                  <m:t>max</m:t>
+                                </m:r>
+                              </m:sub>
+                            </m:sSub>
                           </m:sub>
                         </m:sSub>
                         <m:r>
@@ -39452,47 +39762,80 @@
                     </m:sSup>
                   </m:num>
                   <m:den>
-                    <m:sSubSup>
+                    <m:sSup>
                       <m:e>
                         <m:r>
-                          <m:t>d</m:t>
-                        </m:r>
-                      </m:e>
-                      <m:sub>
-                        <m:sSub>
+                          <m:rPr>
+                            <m:sty m:val="p"/>
+                          </m:rPr>
+                          <m:t>(</m:t>
+                        </m:r>
+                        <m:sSubSup>
                           <m:e>
                             <m:r>
-                              <m:t>g</m:t>
+                              <m:t>d</m:t>
                             </m:r>
                           </m:e>
                           <m:sub>
+                            <m:sSub>
+                              <m:e>
+                                <m:r>
+                                  <m:t>g</m:t>
+                                </m:r>
+                              </m:e>
+                              <m:sub>
+                                <m:r>
+                                  <m:rPr>
+                                    <m:sty m:val="p"/>
+                                  </m:rPr>
+                                  <m:t>max</m:t>
+                                </m:r>
+                              </m:sub>
+                            </m:sSub>
                             <m:r>
                               <m:rPr>
                                 <m:sty m:val="p"/>
                               </m:rPr>
-                              <m:t>max</m:t>
+                              <m:t>,</m:t>
                             </m:r>
+                            <m:sSub>
+                              <m:e>
+                                <m:r>
+                                  <m:t>z</m:t>
+                                </m:r>
+                              </m:e>
+                              <m:sub>
+                                <m:r>
+                                  <m:rPr>
+                                    <m:sty m:val="p"/>
+                                  </m:rPr>
+                                  <m:t>max</m:t>
+                                </m:r>
+                              </m:sub>
+                            </m:sSub>
                           </m:sub>
-                        </m:sSub>
+                          <m:sup>
+                            <m:r>
+                              <m:rPr>
+                                <m:sty m:val="p"/>
+                              </m:rPr>
+                              <m:t>+</m:t>
+                            </m:r>
+                          </m:sup>
+                        </m:sSubSup>
                         <m:r>
                           <m:rPr>
                             <m:sty m:val="p"/>
                           </m:rPr>
-                          <m:t>,</m:t>
-                        </m:r>
-                        <m:r>
-                          <m:t>Z</m:t>
-                        </m:r>
-                      </m:sub>
+                          <m:t>)</m:t>
+                        </m:r>
+                      </m:e>
                       <m:sup>
                         <m:r>
-                          <m:rPr>
-                            <m:sty m:val="p"/>
-                          </m:rPr>
-                          <m:t>+</m:t>
+                          <m:t>2</m:t>
                         </m:r>
                       </m:sup>
-                    </m:sSubSup>
+                    </m:sSup>
                   </m:den>
                 </m:f>
                 <m:r>
@@ -39554,9 +39897,21 @@
               </m:rPr>
               <m:t>,</m:t>
             </m:r>
-            <m:r>
-              <m:t>Z</m:t>
-            </m:r>
+            <m:sSub>
+              <m:e>
+                <m:r>
+                  <m:t>z</m:t>
+                </m:r>
+              </m:e>
+              <m:sub>
+                <m:r>
+                  <m:rPr>
+                    <m:sty m:val="p"/>
+                  </m:rPr>
+                  <m:t>max</m:t>
+                </m:r>
+              </m:sub>
+            </m:sSub>
           </m:sub>
           <m:sup>
             <m:r>
@@ -39593,25 +39948,34 @@
               </m:e>
               <m:sub>
                 <m:r>
-                  <m:t>m</m:t>
+                  <m:rPr>
+                    <m:sty m:val="p"/>
+                  </m:rPr>
+                  <m:t>max</m:t>
                 </m:r>
+              </m:sub>
+            </m:sSub>
+            <m:r>
+              <m:rPr>
+                <m:sty m:val="p"/>
+              </m:rPr>
+              <m:t>,</m:t>
+            </m:r>
+            <m:sSub>
+              <m:e>
                 <m:r>
-                  <m:t>a</m:t>
+                  <m:t>z</m:t>
                 </m:r>
-                <m:r>
-                  <m:t>x</m:t>
-                </m:r>
+              </m:e>
+              <m:sub>
                 <m:r>
                   <m:rPr>
                     <m:sty m:val="p"/>
                   </m:rPr>
-                  <m:t>,</m:t>
+                  <m:t>max</m:t>
                 </m:r>
               </m:sub>
             </m:sSub>
-            <m:r>
-              <m:t>Z</m:t>
-            </m:r>
           </m:sub>
         </m:sSub>
       </m:oMath>
@@ -39619,28 +39983,210 @@
         <w:t xml:space="preserve"> </w:t>
       </w:r>
       <w:r>
-        <w:t xml:space="preserve">are the upper bound and linear extension of the last size class (</w:t>
+        <w:t xml:space="preserve">are the upper bound and linear extension of the functional group</w:t>
+      </w:r>
+      <w:r>
+        <w:t xml:space="preserve"> </w:t>
+      </w:r>
+      <m:oMath>
+        <m:sSub>
+          <m:e>
+            <m:r>
+              <m:t>g</m:t>
+            </m:r>
+          </m:e>
+          <m:sub>
+            <m:r>
+              <m:rPr>
+                <m:sty m:val="p"/>
+              </m:rPr>
+              <m:t>max</m:t>
+            </m:r>
+          </m:sub>
+        </m:sSub>
+      </m:oMath>
+      <w:r>
+        <w:t xml:space="preserve"> </w:t>
+      </w:r>
+      <w:r>
+        <w:t xml:space="preserve">and size class</w:t>
+      </w:r>
+      <w:r>
+        <w:t xml:space="preserve"> </w:t>
+      </w:r>
+      <m:oMath>
+        <m:sSub>
+          <m:e>
+            <m:r>
+              <m:t>z</m:t>
+            </m:r>
+          </m:e>
+          <m:sub>
+            <m:r>
+              <m:rPr>
+                <m:sty m:val="p"/>
+              </m:rPr>
+              <m:t>max</m:t>
+            </m:r>
+          </m:sub>
+        </m:sSub>
+      </m:oMath>
+      <w:r>
+        <w:t xml:space="preserve"> </w:t>
+      </w:r>
+      <w:r>
+        <w:t xml:space="preserve">that jointly maximize</w:t>
+      </w:r>
+      <w:r>
+        <w:t xml:space="preserve"> </w:t>
       </w:r>
       <m:oMath>
         <m:r>
-          <m:t>z</m:t>
+          <m:rPr>
+            <m:sty m:val="p"/>
+          </m:rPr>
+          <m:t>(</m:t>
+        </m:r>
+        <m:sSubSup>
+          <m:e>
+            <m:r>
+              <m:t>d</m:t>
+            </m:r>
+          </m:e>
+          <m:sub>
+            <m:r>
+              <m:t>g</m:t>
+            </m:r>
+            <m:r>
+              <m:rPr>
+                <m:sty m:val="p"/>
+              </m:rPr>
+              <m:t>,</m:t>
+            </m:r>
+            <m:r>
+              <m:t>z</m:t>
+            </m:r>
+          </m:sub>
+          <m:sup>
+            <m:r>
+              <m:rPr>
+                <m:sty m:val="p"/>
+              </m:rPr>
+              <m:t>+</m:t>
+            </m:r>
+          </m:sup>
+        </m:sSubSup>
+        <m:r>
+          <m:rPr>
+            <m:sty m:val="p"/>
+          </m:rPr>
+          <m:t>+</m:t>
+        </m:r>
+        <m:sSub>
+          <m:e>
+            <m:r>
+              <m:t>γ</m:t>
+            </m:r>
+          </m:e>
+          <m:sub>
+            <m:r>
+              <m:t>g</m:t>
+            </m:r>
+            <m:r>
+              <m:rPr>
+                <m:sty m:val="p"/>
+              </m:rPr>
+              <m:t>,</m:t>
+            </m:r>
+            <m:r>
+              <m:t>z</m:t>
+            </m:r>
+          </m:sub>
+        </m:sSub>
+        <m:sSup>
+          <m:e>
+            <m:r>
+              <m:rPr>
+                <m:sty m:val="p"/>
+              </m:rPr>
+              <m:t>)</m:t>
+            </m:r>
+          </m:e>
+          <m:sup>
+            <m:r>
+              <m:t>2</m:t>
+            </m:r>
+          </m:sup>
+        </m:sSup>
+        <m:r>
+          <m:rPr>
+            <m:sty m:val="p"/>
+          </m:rPr>
+          <m:t>/</m:t>
         </m:r>
         <m:r>
           <m:rPr>
             <m:sty m:val="p"/>
           </m:rPr>
-          <m:t>=</m:t>
+          <m:t>(</m:t>
         </m:r>
-        <m:r>
-          <m:t>Z</m:t>
-        </m:r>
+        <m:sSubSup>
+          <m:e>
+            <m:r>
+              <m:t>d</m:t>
+            </m:r>
+          </m:e>
+          <m:sub>
+            <m:r>
+              <m:t>g</m:t>
+            </m:r>
+            <m:r>
+              <m:rPr>
+                <m:sty m:val="p"/>
+              </m:rPr>
+              <m:t>,</m:t>
+            </m:r>
+            <m:r>
+              <m:t>z</m:t>
+            </m:r>
+          </m:sub>
+          <m:sup>
+            <m:r>
+              <m:rPr>
+                <m:sty m:val="p"/>
+              </m:rPr>
+              <m:t>+</m:t>
+            </m:r>
+          </m:sup>
+        </m:sSubSup>
+        <m:sSup>
+          <m:e>
+            <m:r>
+              <m:rPr>
+                <m:sty m:val="p"/>
+              </m:rPr>
+              <m:t>)</m:t>
+            </m:r>
+          </m:e>
+          <m:sup>
+            <m:r>
+              <m:t>2</m:t>
+            </m:r>
+          </m:sup>
+        </m:sSup>
       </m:oMath>
       <w:r>
-        <w:t xml:space="preserve">) of the functional group</w:t>
+        <w:t xml:space="preserve">, such that</w:t>
+      </w:r>
+      <w:r>
+        <w:t xml:space="preserve"> </w:t>
       </w:r>
       <m:oMath>
         <m:r>
-          <m:t> </m:t>
+          <m:rPr>
+            <m:sty m:val="p"/>
+          </m:rPr>
+          <m:t>(</m:t>
         </m:r>
         <m:sSub>
           <m:e>
@@ -39658,20 +40204,15 @@
           </m:sub>
         </m:sSub>
         <m:r>
-          <m:t> </m:t>
+          <m:rPr>
+            <m:sty m:val="p"/>
+          </m:rPr>
+          <m:t>,</m:t>
         </m:r>
-      </m:oMath>
-      <w:r>
-        <w:t xml:space="preserve">such that</w:t>
-      </w:r>
-      <w:r>
-        <w:t xml:space="preserve"> </w:t>
-      </w:r>
-      <m:oMath>
         <m:sSub>
           <m:e>
             <m:r>
-              <m:t>g</m:t>
+              <m:t>z</m:t>
             </m:r>
           </m:e>
           <m:sub>
@@ -39683,6 +40224,12 @@
             </m:r>
           </m:sub>
         </m:sSub>
+        <m:r>
+          <m:rPr>
+            <m:sty m:val="p"/>
+          </m:rPr>
+          <m:t>)</m:t>
+        </m:r>
         <m:r>
           <m:rPr>
             <m:sty m:val="p"/>
@@ -39708,75 +40255,223 @@
             <m:r>
               <m:t>g</m:t>
             </m:r>
+            <m:r>
+              <m:rPr>
+                <m:sty m:val="p"/>
+              </m:rPr>
+              <m:t>,</m:t>
+            </m:r>
+            <m:r>
+              <m:t>z</m:t>
+            </m:r>
           </m:sub>
         </m:sSub>
+        <m:d>
+          <m:dPr>
+            <m:begChr m:val="["/>
+            <m:sepChr m:val=""/>
+            <m:endChr m:val="]"/>
+            <m:grow/>
+          </m:dPr>
+          <m:e>
+            <m:r>
+              <m:rPr>
+                <m:sty m:val="p"/>
+              </m:rPr>
+              <m:t>(</m:t>
+            </m:r>
+            <m:sSubSup>
+              <m:e>
+                <m:r>
+                  <m:t>d</m:t>
+                </m:r>
+              </m:e>
+              <m:sub>
+                <m:r>
+                  <m:t>g</m:t>
+                </m:r>
+                <m:r>
+                  <m:rPr>
+                    <m:sty m:val="p"/>
+                  </m:rPr>
+                  <m:t>,</m:t>
+                </m:r>
+                <m:r>
+                  <m:t>z</m:t>
+                </m:r>
+              </m:sub>
+              <m:sup>
+                <m:r>
+                  <m:rPr>
+                    <m:sty m:val="p"/>
+                  </m:rPr>
+                  <m:t>+</m:t>
+                </m:r>
+              </m:sup>
+            </m:sSubSup>
+            <m:r>
+              <m:rPr>
+                <m:sty m:val="p"/>
+              </m:rPr>
+              <m:t>+</m:t>
+            </m:r>
+            <m:sSub>
+              <m:e>
+                <m:r>
+                  <m:t>γ</m:t>
+                </m:r>
+              </m:e>
+              <m:sub>
+                <m:r>
+                  <m:t>g</m:t>
+                </m:r>
+                <m:r>
+                  <m:rPr>
+                    <m:sty m:val="p"/>
+                  </m:rPr>
+                  <m:t>,</m:t>
+                </m:r>
+                <m:r>
+                  <m:t>z</m:t>
+                </m:r>
+              </m:sub>
+            </m:sSub>
+            <m:sSup>
+              <m:e>
+                <m:r>
+                  <m:rPr>
+                    <m:sty m:val="p"/>
+                  </m:rPr>
+                  <m:t>)</m:t>
+                </m:r>
+              </m:e>
+              <m:sup>
+                <m:r>
+                  <m:t>2</m:t>
+                </m:r>
+              </m:sup>
+            </m:sSup>
+            <m:r>
+              <m:rPr>
+                <m:sty m:val="p"/>
+              </m:rPr>
+              <m:t>/</m:t>
+            </m:r>
+            <m:r>
+              <m:rPr>
+                <m:sty m:val="p"/>
+              </m:rPr>
+              <m:t>(</m:t>
+            </m:r>
+            <m:sSubSup>
+              <m:e>
+                <m:r>
+                  <m:t>d</m:t>
+                </m:r>
+              </m:e>
+              <m:sub>
+                <m:r>
+                  <m:t>g</m:t>
+                </m:r>
+                <m:r>
+                  <m:rPr>
+                    <m:sty m:val="p"/>
+                  </m:rPr>
+                  <m:t>,</m:t>
+                </m:r>
+                <m:r>
+                  <m:t>z</m:t>
+                </m:r>
+              </m:sub>
+              <m:sup>
+                <m:r>
+                  <m:rPr>
+                    <m:sty m:val="p"/>
+                  </m:rPr>
+                  <m:t>+</m:t>
+                </m:r>
+              </m:sup>
+            </m:sSubSup>
+            <m:sSup>
+              <m:e>
+                <m:r>
+                  <m:rPr>
+                    <m:sty m:val="p"/>
+                  </m:rPr>
+                  <m:t>)</m:t>
+                </m:r>
+              </m:e>
+              <m:sup>
+                <m:r>
+                  <m:t>2</m:t>
+                </m:r>
+              </m:sup>
+            </m:sSup>
+          </m:e>
+        </m:d>
+      </m:oMath>
+      <w:r>
+        <w:t xml:space="preserve">, taken over all functional groups</w:t>
+      </w:r>
+      <w:r>
+        <w:t xml:space="preserve"> </w:t>
+      </w:r>
+      <m:oMath>
+        <m:r>
+          <m:t>g</m:t>
+        </m:r>
+      </m:oMath>
+      <w:r>
+        <w:t xml:space="preserve"> </w:t>
+      </w:r>
+      <w:r>
+        <w:t xml:space="preserve">and non-terminal size classes</w:t>
+      </w:r>
+      <w:r>
+        <w:t xml:space="preserve"> </w:t>
+      </w:r>
+      <m:oMath>
+        <m:r>
+          <m:t>z</m:t>
+        </m:r>
         <m:r>
           <m:rPr>
             <m:sty m:val="p"/>
           </m:rPr>
-          <m:t>(</m:t>
+          <m:t>=</m:t>
         </m:r>
-        <m:sSubSup>
-          <m:e>
-            <m:r>
-              <m:t>d</m:t>
-            </m:r>
-          </m:e>
-          <m:sub>
-            <m:r>
-              <m:t>g</m:t>
-            </m:r>
-            <m:r>
-              <m:rPr>
-                <m:sty m:val="p"/>
-              </m:rPr>
-              <m:t>,</m:t>
-            </m:r>
-            <m:r>
-              <m:t>Z</m:t>
-            </m:r>
-          </m:sub>
-          <m:sup>
-            <m:r>
-              <m:rPr>
-                <m:sty m:val="p"/>
-              </m:rPr>
-              <m:t>+</m:t>
-            </m:r>
-          </m:sup>
-        </m:sSubSup>
+        <m:r>
+          <m:t>1</m:t>
+        </m:r>
         <m:r>
           <m:rPr>
             <m:sty m:val="p"/>
           </m:rPr>
-          <m:t>+</m:t>
+          <m:t>,</m:t>
         </m:r>
-        <m:sSub>
-          <m:e>
-            <m:r>
-              <m:t>γ</m:t>
-            </m:r>
-          </m:e>
-          <m:sub>
-            <m:r>
-              <m:t>g</m:t>
-            </m:r>
-            <m:r>
-              <m:rPr>
-                <m:sty m:val="p"/>
-              </m:rPr>
-              <m:t>,</m:t>
-            </m:r>
-            <m:r>
-              <m:t>Z</m:t>
-            </m:r>
-          </m:sub>
-        </m:sSub>
         <m:r>
           <m:rPr>
             <m:sty m:val="p"/>
           </m:rPr>
-          <m:t>)</m:t>
+          <m:t>…</m:t>
+        </m:r>
+        <m:r>
+          <m:rPr>
+            <m:sty m:val="p"/>
+          </m:rPr>
+          <m:t>,</m:t>
+        </m:r>
+        <m:r>
+          <m:t>Z</m:t>
+        </m:r>
+        <m:r>
+          <m:rPr>
+            <m:sty m:val="p"/>
+          </m:rPr>
+          <m:t>−</m:t>
+        </m:r>
+        <m:r>
+          <m:t>1</m:t>
         </m:r>
       </m:oMath>
       <w:r>

</xml_diff>

<commit_message>
Rewrite Eq. 7 to match the actual smoothed growth-blend and Xi ordering
Eq. 7 described a discrete 0.5-cover switch between ζ and κ; the code
actually uses a smoothed three-zone blend (pure ζ below 0.05, pure κ
above 0.80, linear blend between). It also applied the regional growth
factor Ξ after solving κ, when code folds Ξ into γ before the κ solve.
Rewrote Eq. 7 and the supplementary derivation to match, and explained
why that ordering is required for κ's habitable-area guarantee to hold
- documenting the code's behavior rather than changing it, since Table
S8's calibrated Ξ values were fit against this behavior already.
</commit_message>
<xml_diff>
--- a/paper/paper.docx
+++ b/paper/paper.docx
@@ -5979,7 +5979,42 @@
         </m:sSub>
       </m:oMath>
       <w:r>
-        <w:t xml:space="preserve">, that represents change in diameter for each coral colony over a year. Linear extensions assume constant distinct values for corals within the same functional group</w:t>
+        <w:t xml:space="preserve">, that represents change in diameter for each coral colony over a year, further scaled at each location by the regional growth factor</w:t>
+      </w:r>
+      <w:r>
+        <w:t xml:space="preserve"> </w:t>
+      </w:r>
+      <m:oMath>
+        <m:sSub>
+          <m:e>
+            <m:r>
+              <m:rPr>
+                <m:sty m:val="p"/>
+              </m:rPr>
+              <m:t>Ξ</m:t>
+            </m:r>
+          </m:e>
+          <m:sub>
+            <m:r>
+              <m:t>g</m:t>
+            </m:r>
+            <m:r>
+              <m:rPr>
+                <m:sty m:val="p"/>
+              </m:rPr>
+              <m:t>,</m:t>
+            </m:r>
+            <m:r>
+              <m:t>l</m:t>
+            </m:r>
+          </m:sub>
+        </m:sSub>
+      </m:oMath>
+      <w:r>
+        <w:t xml:space="preserve"> </w:t>
+      </w:r>
+      <w:r>
+        <w:t xml:space="preserve">(see above). Linear extensions assume constant distinct values for corals within the same functional group</w:t>
       </w:r>
       <w:r>
         <w:t xml:space="preserve"> </w:t>
@@ -6085,7 +6120,7 @@
         <w:t xml:space="preserve"> </w:t>
       </w:r>
       <w:r>
-        <w:t xml:space="preserve">and on the linear extensions</w:t>
+        <w:t xml:space="preserve">and on the regionally-scaled linear extensions</w:t>
       </w:r>
       <w:r>
         <w:t xml:space="preserve"> </w:t>
@@ -6109,6 +6144,30 @@
             </m:r>
             <m:r>
               <m:t>z</m:t>
+            </m:r>
+          </m:sub>
+        </m:sSub>
+        <m:sSub>
+          <m:e>
+            <m:r>
+              <m:rPr>
+                <m:sty m:val="p"/>
+              </m:rPr>
+              <m:t>Ξ</m:t>
+            </m:r>
+          </m:e>
+          <m:sub>
+            <m:r>
+              <m:t>g</m:t>
+            </m:r>
+            <m:r>
+              <m:rPr>
+                <m:sty m:val="p"/>
+              </m:rPr>
+              <m:t>,</m:t>
+            </m:r>
+            <m:r>
+              <m:t>l</m:t>
             </m:r>
           </m:sub>
         </m:sSub>
@@ -6187,7 +6246,199 @@
         <w:t xml:space="preserve"> </w:t>
       </w:r>
       <w:r>
-        <w:t xml:space="preserve">in the Supplementary Materials for more details on how these growth coefficients are calculated. The actual growth rate used at each timestep is given by:</w:t>
+        <w:t xml:space="preserve">in the Supplementary Materials for more details on how these growth coefficients are calculated, including why</w:t>
+      </w:r>
+      <w:r>
+        <w:t xml:space="preserve"> </w:t>
+      </w:r>
+      <m:oMath>
+        <m:sSub>
+          <m:e>
+            <m:r>
+              <m:t>κ</m:t>
+            </m:r>
+          </m:e>
+          <m:sub>
+            <m:r>
+              <m:t>t</m:t>
+            </m:r>
+            <m:r>
+              <m:rPr>
+                <m:sty m:val="p"/>
+              </m:rPr>
+              <m:t>;</m:t>
+            </m:r>
+            <m:r>
+              <m:t>l</m:t>
+            </m:r>
+          </m:sub>
+        </m:sSub>
+      </m:oMath>
+      <w:r>
+        <w:t xml:space="preserve"> </w:t>
+      </w:r>
+      <w:r>
+        <w:t xml:space="preserve">must be solved from the regionally-scaled linear extensions rather than</w:t>
+      </w:r>
+      <w:r>
+        <w:t xml:space="preserve"> </w:t>
+      </w:r>
+      <m:oMath>
+        <m:sSub>
+          <m:e>
+            <m:r>
+              <m:t>γ</m:t>
+            </m:r>
+          </m:e>
+          <m:sub>
+            <m:r>
+              <m:t>g</m:t>
+            </m:r>
+            <m:r>
+              <m:rPr>
+                <m:sty m:val="p"/>
+              </m:rPr>
+              <m:t>,</m:t>
+            </m:r>
+            <m:r>
+              <m:t>z</m:t>
+            </m:r>
+          </m:sub>
+        </m:sSub>
+      </m:oMath>
+      <w:r>
+        <w:t xml:space="preserve"> </w:t>
+      </w:r>
+      <w:r>
+        <w:t xml:space="preserve">alone. Rather than switching abruptly between the two coefficients, growth transitions smoothly with cover: locations with low relative cover (</w:t>
+      </w:r>
+      <m:oMath>
+        <m:sSub>
+          <m:e>
+            <m:r>
+              <m:t>C</m:t>
+            </m:r>
+          </m:e>
+          <m:sub>
+            <m:r>
+              <m:t>t</m:t>
+            </m:r>
+            <m:r>
+              <m:rPr>
+                <m:sty m:val="p"/>
+              </m:rPr>
+              <m:t>;</m:t>
+            </m:r>
+            <m:r>
+              <m:t>l</m:t>
+            </m:r>
+          </m:sub>
+        </m:sSub>
+        <m:r>
+          <m:rPr>
+            <m:sty m:val="p"/>
+          </m:rPr>
+          <m:t>&lt;</m:t>
+        </m:r>
+        <m:r>
+          <m:t>0.05</m:t>
+        </m:r>
+      </m:oMath>
+      <w:r>
+        <w:t xml:space="preserve">) grow solely according to</w:t>
+      </w:r>
+      <w:r>
+        <w:t xml:space="preserve"> </w:t>
+      </w:r>
+      <m:oMath>
+        <m:sSub>
+          <m:e>
+            <m:r>
+              <m:t>ζ</m:t>
+            </m:r>
+          </m:e>
+          <m:sub>
+            <m:r>
+              <m:t>t</m:t>
+            </m:r>
+            <m:r>
+              <m:rPr>
+                <m:sty m:val="p"/>
+              </m:rPr>
+              <m:t>;</m:t>
+            </m:r>
+            <m:r>
+              <m:t>l</m:t>
+            </m:r>
+          </m:sub>
+        </m:sSub>
+      </m:oMath>
+      <w:r>
+        <w:t xml:space="preserve">, locations with high relative cover (</w:t>
+      </w:r>
+      <m:oMath>
+        <m:sSub>
+          <m:e>
+            <m:r>
+              <m:t>C</m:t>
+            </m:r>
+          </m:e>
+          <m:sub>
+            <m:r>
+              <m:t>t</m:t>
+            </m:r>
+            <m:r>
+              <m:rPr>
+                <m:sty m:val="p"/>
+              </m:rPr>
+              <m:t>;</m:t>
+            </m:r>
+            <m:r>
+              <m:t>l</m:t>
+            </m:r>
+          </m:sub>
+        </m:sSub>
+        <m:r>
+          <m:rPr>
+            <m:sty m:val="p"/>
+          </m:rPr>
+          <m:t>≥</m:t>
+        </m:r>
+        <m:r>
+          <m:t>0.80</m:t>
+        </m:r>
+      </m:oMath>
+      <w:r>
+        <w:t xml:space="preserve">) grow solely according to</w:t>
+      </w:r>
+      <w:r>
+        <w:t xml:space="preserve"> </w:t>
+      </w:r>
+      <m:oMath>
+        <m:sSub>
+          <m:e>
+            <m:r>
+              <m:t>κ</m:t>
+            </m:r>
+          </m:e>
+          <m:sub>
+            <m:r>
+              <m:t>t</m:t>
+            </m:r>
+            <m:r>
+              <m:rPr>
+                <m:sty m:val="p"/>
+              </m:rPr>
+              <m:t>;</m:t>
+            </m:r>
+            <m:r>
+              <m:t>l</m:t>
+            </m:r>
+          </m:sub>
+        </m:sSub>
+      </m:oMath>
+      <w:r>
+        <w:t xml:space="preserve">, and locations with intermediate cover use a linear blend of the two. The actual growth rate used at each timestep is given by:</w:t>
       </w:r>
     </w:p>
     <w:tbl>
@@ -6259,6 +6510,51 @@
                   </m:rPr>
                   <m:t>=</m:t>
                 </m:r>
+                <m:sSub>
+                  <m:e>
+                    <m:r>
+                      <m:t>γ</m:t>
+                    </m:r>
+                  </m:e>
+                  <m:sub>
+                    <m:r>
+                      <m:t>g</m:t>
+                    </m:r>
+                    <m:r>
+                      <m:rPr>
+                        <m:sty m:val="p"/>
+                      </m:rPr>
+                      <m:t>,</m:t>
+                    </m:r>
+                    <m:r>
+                      <m:t>z</m:t>
+                    </m:r>
+                  </m:sub>
+                </m:sSub>
+                <m:sSub>
+                  <m:e>
+                    <m:r>
+                      <m:rPr>
+                        <m:sty m:val="p"/>
+                      </m:rPr>
+                      <m:t>Ξ</m:t>
+                    </m:r>
+                  </m:e>
+                  <m:sub>
+                    <m:r>
+                      <m:t>g</m:t>
+                    </m:r>
+                    <m:r>
+                      <m:rPr>
+                        <m:sty m:val="p"/>
+                      </m:rPr>
+                      <m:t>,</m:t>
+                    </m:r>
+                    <m:r>
+                      <m:t>l</m:t>
+                    </m:r>
+                  </m:sub>
+                </m:sSub>
                 <m:d>
                   <m:dPr>
                     <m:begChr m:val="{"/>
@@ -6267,247 +6563,314 @@
                     <m:grow/>
                   </m:dPr>
                   <m:e>
-                    <m:eqArr>
-                      <m:e>
-                        <m:sSub>
-                          <m:e>
-                            <m:sSub>
-                              <m:e>
-                                <m:r>
-                                  <m:t>γ</m:t>
-                                </m:r>
-                              </m:e>
-                              <m:sub>
-                                <m:r>
-                                  <m:t>g</m:t>
-                                </m:r>
-                                <m:r>
-                                  <m:rPr>
-                                    <m:sty m:val="p"/>
-                                  </m:rPr>
-                                  <m:t>,</m:t>
-                                </m:r>
-                                <m:r>
-                                  <m:t>z</m:t>
-                                </m:r>
-                              </m:sub>
-                            </m:sSub>
-                            <m:r>
-                              <m:t>ζ</m:t>
-                            </m:r>
-                          </m:e>
-                          <m:sub>
-                            <m:r>
-                              <m:t>t</m:t>
-                            </m:r>
-                            <m:r>
-                              <m:rPr>
-                                <m:sty m:val="p"/>
-                              </m:rPr>
-                              <m:t>;</m:t>
-                            </m:r>
-                            <m:r>
-                              <m:t>l</m:t>
-                            </m:r>
-                          </m:sub>
-                        </m:sSub>
-                        <m:sSub>
-                          <m:e>
-                            <m:r>
-                              <m:rPr>
-                                <m:sty m:val="p"/>
-                              </m:rPr>
-                              <m:t>Ξ</m:t>
-                            </m:r>
-                          </m:e>
-                          <m:sub>
-                            <m:r>
-                              <m:rPr>
-                                <m:scr m:val="script"/>
-                                <m:sty m:val="p"/>
-                              </m:rPr>
-                              <m:t>l</m:t>
-                            </m:r>
-                          </m:sub>
-                        </m:sSub>
-                        <m:r>
-                          <m:rPr>
-                            <m:sty m:val="p"/>
-                          </m:rPr>
-                          <m:t>,</m:t>
-                        </m:r>
-                        <m:r>
-                          <m:t> </m:t>
-                        </m:r>
-                        <m:r>
-                          <m:t> </m:t>
-                        </m:r>
-                        <m:r>
-                          <m:t>&amp;</m:t>
-                        </m:r>
-                        <m:sSub>
-                          <m:e>
-                            <m:r>
-                              <m:t>i</m:t>
-                            </m:r>
-                            <m:r>
-                              <m:t>f</m:t>
-                            </m:r>
-                            <m:r>
-                              <m:t> </m:t>
-                            </m:r>
-                            <m:r>
-                              <m:t>C</m:t>
-                            </m:r>
-                          </m:e>
-                          <m:sub>
-                            <m:r>
-                              <m:t>t</m:t>
-                            </m:r>
-                            <m:r>
-                              <m:rPr>
-                                <m:sty m:val="p"/>
-                              </m:rPr>
-                              <m:t>;</m:t>
-                            </m:r>
-                            <m:r>
-                              <m:t>l</m:t>
-                            </m:r>
-                          </m:sub>
-                        </m:sSub>
-                        <m:r>
-                          <m:rPr>
-                            <m:sty m:val="p"/>
-                          </m:rPr>
-                          <m:t>&lt;</m:t>
-                        </m:r>
-                        <m:r>
-                          <m:t>0.5</m:t>
-                        </m:r>
-                      </m:e>
-                      <m:e>
-                        <m:sSub>
-                          <m:e>
-                            <m:r>
-                              <m:t>γ</m:t>
-                            </m:r>
-                          </m:e>
-                          <m:sub>
-                            <m:r>
-                              <m:t>g</m:t>
-                            </m:r>
-                            <m:r>
-                              <m:rPr>
-                                <m:sty m:val="p"/>
-                              </m:rPr>
-                              <m:t>,</m:t>
-                            </m:r>
-                            <m:r>
-                              <m:t>z</m:t>
-                            </m:r>
-                          </m:sub>
-                        </m:sSub>
-                        <m:sSub>
-                          <m:e>
-                            <m:r>
-                              <m:t>κ</m:t>
-                            </m:r>
-                          </m:e>
-                          <m:sub>
-                            <m:r>
-                              <m:t>t</m:t>
-                            </m:r>
-                            <m:r>
-                              <m:rPr>
-                                <m:sty m:val="p"/>
-                              </m:rPr>
-                              <m:t>;</m:t>
-                            </m:r>
-                            <m:r>
-                              <m:t>l</m:t>
-                            </m:r>
-                          </m:sub>
-                        </m:sSub>
-                        <m:sSub>
-                          <m:e>
-                            <m:r>
-                              <m:rPr>
-                                <m:sty m:val="p"/>
-                              </m:rPr>
-                              <m:t>Ξ</m:t>
-                            </m:r>
-                          </m:e>
-                          <m:sub>
-                            <m:r>
-                              <m:rPr>
-                                <m:scr m:val="script"/>
-                                <m:sty m:val="p"/>
-                              </m:rPr>
-                              <m:t>l</m:t>
-                            </m:r>
-                          </m:sub>
-                        </m:sSub>
-                        <m:r>
-                          <m:rPr>
-                            <m:sty m:val="p"/>
-                          </m:rPr>
-                          <m:t>,</m:t>
-                        </m:r>
-                        <m:r>
-                          <m:t> </m:t>
-                        </m:r>
-                        <m:r>
-                          <m:t> </m:t>
-                        </m:r>
-                        <m:r>
-                          <m:t>&amp;</m:t>
-                        </m:r>
-                        <m:sSub>
-                          <m:e>
-                            <m:r>
-                              <m:t>i</m:t>
-                            </m:r>
-                            <m:r>
-                              <m:t>f</m:t>
-                            </m:r>
-                            <m:r>
-                              <m:t> </m:t>
-                            </m:r>
-                            <m:r>
-                              <m:t>C</m:t>
-                            </m:r>
-                          </m:e>
-                          <m:sub>
-                            <m:r>
-                              <m:t>t</m:t>
-                            </m:r>
-                            <m:r>
-                              <m:rPr>
-                                <m:sty m:val="p"/>
-                              </m:rPr>
-                              <m:t>;</m:t>
-                            </m:r>
-                            <m:r>
-                              <m:t>l</m:t>
-                            </m:r>
-                          </m:sub>
-                        </m:sSub>
-                        <m:r>
-                          <m:rPr>
-                            <m:sty m:val="p"/>
-                          </m:rPr>
-                          <m:t>≥</m:t>
-                        </m:r>
-                        <m:r>
-                          <m:t>0.5</m:t>
-                        </m:r>
-                      </m:e>
-                    </m:eqArr>
+                    <m:m>
+                      <m:mPr>
+                        <m:baseJc m:val="center"/>
+                        <m:plcHide m:val="on"/>
+                        <m:mcs>
+                          <m:mc>
+                            <m:mcPr>
+                              <m:mcJc m:val="left"/>
+                              <m:count m:val="1"/>
+                            </m:mcPr>
+                          </m:mc>
+                          <m:mc>
+                            <m:mcPr>
+                              <m:mcJc m:val="left"/>
+                              <m:count m:val="1"/>
+                            </m:mcPr>
+                          </m:mc>
+                        </m:mcs>
+                      </m:mPr>
+                      <m:mr>
+                        <m:e>
+                          <m:sSub>
+                            <m:e>
+                              <m:r>
+                                <m:t>ζ</m:t>
+                              </m:r>
+                            </m:e>
+                            <m:sub>
+                              <m:r>
+                                <m:t>t</m:t>
+                              </m:r>
+                              <m:r>
+                                <m:rPr>
+                                  <m:sty m:val="p"/>
+                                </m:rPr>
+                                <m:t>;</m:t>
+                              </m:r>
+                              <m:r>
+                                <m:t>l</m:t>
+                              </m:r>
+                            </m:sub>
+                          </m:sSub>
+                          <m:r>
+                            <m:rPr>
+                              <m:sty m:val="p"/>
+                            </m:rPr>
+                            <m:t>,</m:t>
+                          </m:r>
+                        </m:e>
+                        <m:e>
+                          <m:sSub>
+                            <m:e>
+                              <m:r>
+                                <m:t>C</m:t>
+                              </m:r>
+                            </m:e>
+                            <m:sub>
+                              <m:r>
+                                <m:t>t</m:t>
+                              </m:r>
+                              <m:r>
+                                <m:rPr>
+                                  <m:sty m:val="p"/>
+                                </m:rPr>
+                                <m:t>;</m:t>
+                              </m:r>
+                              <m:r>
+                                <m:t>l</m:t>
+                              </m:r>
+                            </m:sub>
+                          </m:sSub>
+                          <m:r>
+                            <m:rPr>
+                              <m:sty m:val="p"/>
+                            </m:rPr>
+                            <m:t>&lt;</m:t>
+                          </m:r>
+                          <m:r>
+                            <m:t>0.05</m:t>
+                          </m:r>
+                        </m:e>
+                      </m:mr>
+                      <m:mr>
+                        <m:e>
+                          <m:sSub>
+                            <m:e>
+                              <m:r>
+                                <m:t>s</m:t>
+                              </m:r>
+                            </m:e>
+                            <m:sub>
+                              <m:r>
+                                <m:t>t</m:t>
+                              </m:r>
+                              <m:r>
+                                <m:rPr>
+                                  <m:sty m:val="p"/>
+                                </m:rPr>
+                                <m:t>;</m:t>
+                              </m:r>
+                              <m:r>
+                                <m:t>l</m:t>
+                              </m:r>
+                            </m:sub>
+                          </m:sSub>
+                          <m:sSub>
+                            <m:e>
+                              <m:r>
+                                <m:t>κ</m:t>
+                              </m:r>
+                            </m:e>
+                            <m:sub>
+                              <m:r>
+                                <m:t>t</m:t>
+                              </m:r>
+                              <m:r>
+                                <m:rPr>
+                                  <m:sty m:val="p"/>
+                                </m:rPr>
+                                <m:t>;</m:t>
+                              </m:r>
+                              <m:r>
+                                <m:t>l</m:t>
+                              </m:r>
+                            </m:sub>
+                          </m:sSub>
+                          <m:r>
+                            <m:rPr>
+                              <m:sty m:val="p"/>
+                            </m:rPr>
+                            <m:t>+</m:t>
+                          </m:r>
+                          <m:d>
+                            <m:dPr>
+                              <m:begChr m:val="("/>
+                              <m:sepChr m:val=""/>
+                              <m:endChr m:val=")"/>
+                              <m:grow/>
+                            </m:dPr>
+                            <m:e>
+                              <m:r>
+                                <m:t>1</m:t>
+                              </m:r>
+                              <m:r>
+                                <m:rPr>
+                                  <m:sty m:val="p"/>
+                                </m:rPr>
+                                <m:t>−</m:t>
+                              </m:r>
+                              <m:sSub>
+                                <m:e>
+                                  <m:r>
+                                    <m:t>s</m:t>
+                                  </m:r>
+                                </m:e>
+                                <m:sub>
+                                  <m:r>
+                                    <m:t>t</m:t>
+                                  </m:r>
+                                  <m:r>
+                                    <m:rPr>
+                                      <m:sty m:val="p"/>
+                                    </m:rPr>
+                                    <m:t>;</m:t>
+                                  </m:r>
+                                  <m:r>
+                                    <m:t>l</m:t>
+                                  </m:r>
+                                </m:sub>
+                              </m:sSub>
+                            </m:e>
+                          </m:d>
+                          <m:sSub>
+                            <m:e>
+                              <m:r>
+                                <m:t>ζ</m:t>
+                              </m:r>
+                            </m:e>
+                            <m:sub>
+                              <m:r>
+                                <m:t>t</m:t>
+                              </m:r>
+                              <m:r>
+                                <m:rPr>
+                                  <m:sty m:val="p"/>
+                                </m:rPr>
+                                <m:t>;</m:t>
+                              </m:r>
+                              <m:r>
+                                <m:t>l</m:t>
+                              </m:r>
+                            </m:sub>
+                          </m:sSub>
+                          <m:r>
+                            <m:rPr>
+                              <m:sty m:val="p"/>
+                            </m:rPr>
+                            <m:t>,</m:t>
+                          </m:r>
+                        </m:e>
+                        <m:e>
+                          <m:r>
+                            <m:t>0.05</m:t>
+                          </m:r>
+                          <m:r>
+                            <m:rPr>
+                              <m:sty m:val="p"/>
+                            </m:rPr>
+                            <m:t>≤</m:t>
+                          </m:r>
+                          <m:sSub>
+                            <m:e>
+                              <m:r>
+                                <m:t>C</m:t>
+                              </m:r>
+                            </m:e>
+                            <m:sub>
+                              <m:r>
+                                <m:t>t</m:t>
+                              </m:r>
+                              <m:r>
+                                <m:rPr>
+                                  <m:sty m:val="p"/>
+                                </m:rPr>
+                                <m:t>;</m:t>
+                              </m:r>
+                              <m:r>
+                                <m:t>l</m:t>
+                              </m:r>
+                            </m:sub>
+                          </m:sSub>
+                          <m:r>
+                            <m:rPr>
+                              <m:sty m:val="p"/>
+                            </m:rPr>
+                            <m:t>&lt;</m:t>
+                          </m:r>
+                          <m:r>
+                            <m:t>0.80</m:t>
+                          </m:r>
+                        </m:e>
+                      </m:mr>
+                      <m:mr>
+                        <m:e>
+                          <m:sSub>
+                            <m:e>
+                              <m:r>
+                                <m:t>κ</m:t>
+                              </m:r>
+                            </m:e>
+                            <m:sub>
+                              <m:r>
+                                <m:t>t</m:t>
+                              </m:r>
+                              <m:r>
+                                <m:rPr>
+                                  <m:sty m:val="p"/>
+                                </m:rPr>
+                                <m:t>;</m:t>
+                              </m:r>
+                              <m:r>
+                                <m:t>l</m:t>
+                              </m:r>
+                            </m:sub>
+                          </m:sSub>
+                          <m:r>
+                            <m:rPr>
+                              <m:sty m:val="p"/>
+                            </m:rPr>
+                            <m:t>,</m:t>
+                          </m:r>
+                        </m:e>
+                        <m:e>
+                          <m:sSub>
+                            <m:e>
+                              <m:r>
+                                <m:t>C</m:t>
+                              </m:r>
+                            </m:e>
+                            <m:sub>
+                              <m:r>
+                                <m:t>t</m:t>
+                              </m:r>
+                              <m:r>
+                                <m:rPr>
+                                  <m:sty m:val="p"/>
+                                </m:rPr>
+                                <m:t>;</m:t>
+                              </m:r>
+                              <m:r>
+                                <m:t>l</m:t>
+                              </m:r>
+                            </m:sub>
+                          </m:sSub>
+                          <m:r>
+                            <m:rPr>
+                              <m:sty m:val="p"/>
+                            </m:rPr>
+                            <m:t>≥</m:t>
+                          </m:r>
+                          <m:r>
+                            <m:t>0.80</m:t>
+                          </m:r>
+                        </m:e>
+                      </m:mr>
+                    </m:m>
                   </m:e>
                 </m:d>
-                <m:r>
-                  <m:t> </m:t>
-                </m:r>
               </m:oMath>
             </m:oMathPara>
           </w:p>
@@ -6526,6 +6889,103 @@
         </w:tc>
       </w:tr>
     </w:tbl>
+    <w:p>
+      <w:pPr>
+        <w:pStyle w:val="BodyText"/>
+      </w:pPr>
+      <w:r>
+        <w:t xml:space="preserve">where</w:t>
+      </w:r>
+      <w:r>
+        <w:t xml:space="preserve"> </w:t>
+      </w:r>
+      <m:oMath>
+        <m:sSub>
+          <m:e>
+            <m:r>
+              <m:t>s</m:t>
+            </m:r>
+          </m:e>
+          <m:sub>
+            <m:r>
+              <m:t>t</m:t>
+            </m:r>
+            <m:r>
+              <m:rPr>
+                <m:sty m:val="p"/>
+              </m:rPr>
+              <m:t>;</m:t>
+            </m:r>
+            <m:r>
+              <m:t>l</m:t>
+            </m:r>
+          </m:sub>
+        </m:sSub>
+        <m:r>
+          <m:rPr>
+            <m:sty m:val="p"/>
+          </m:rPr>
+          <m:t>=</m:t>
+        </m:r>
+        <m:r>
+          <m:rPr>
+            <m:sty m:val="p"/>
+          </m:rPr>
+          <m:t>(</m:t>
+        </m:r>
+        <m:sSub>
+          <m:e>
+            <m:r>
+              <m:t>C</m:t>
+            </m:r>
+          </m:e>
+          <m:sub>
+            <m:r>
+              <m:t>t</m:t>
+            </m:r>
+            <m:r>
+              <m:rPr>
+                <m:sty m:val="p"/>
+              </m:rPr>
+              <m:t>;</m:t>
+            </m:r>
+            <m:r>
+              <m:t>l</m:t>
+            </m:r>
+          </m:sub>
+        </m:sSub>
+        <m:r>
+          <m:rPr>
+            <m:sty m:val="p"/>
+          </m:rPr>
+          <m:t>−</m:t>
+        </m:r>
+        <m:r>
+          <m:t>0.05</m:t>
+        </m:r>
+        <m:r>
+          <m:rPr>
+            <m:sty m:val="p"/>
+          </m:rPr>
+          <m:t>)</m:t>
+        </m:r>
+        <m:r>
+          <m:rPr>
+            <m:sty m:val="p"/>
+          </m:rPr>
+          <m:t>/</m:t>
+        </m:r>
+        <m:r>
+          <m:t>0.75</m:t>
+        </m:r>
+      </m:oMath>
+      <w:r>
+        <w:t xml:space="preserve"> </w:t>
+      </w:r>
+      <w:r>
+        <w:t xml:space="preserve">is the transition weight between the two regimes.</w:t>
+      </w:r>
+    </w:p>
     <w:p>
       <w:pPr>
         <w:pStyle w:val="BodyText"/>
@@ -37298,7 +37758,7 @@
         <w:pStyle w:val="FirstParagraph"/>
       </w:pPr>
       <w:r>
-        <w:t xml:space="preserve">The growth rates used at each timestep are based on the linear extensions</w:t>
+        <w:t xml:space="preserve">The growth rates used at each timestep are based on the regionally-scaled linear extensions</w:t>
       </w:r>
       <w:r>
         <w:t xml:space="preserve"> </w:t>
@@ -37322,6 +37782,30 @@
             </m:r>
             <m:r>
               <m:t>z</m:t>
+            </m:r>
+          </m:sub>
+        </m:sSub>
+        <m:sSub>
+          <m:e>
+            <m:r>
+              <m:rPr>
+                <m:sty m:val="p"/>
+              </m:rPr>
+              <m:t>Ξ</m:t>
+            </m:r>
+          </m:e>
+          <m:sub>
+            <m:r>
+              <m:t>g</m:t>
+            </m:r>
+            <m:r>
+              <m:rPr>
+                <m:sty m:val="p"/>
+              </m:rPr>
+              <m:t>,</m:t>
+            </m:r>
+            <m:r>
+              <m:t>l</m:t>
             </m:r>
           </m:sub>
         </m:sSub>
@@ -38012,6 +38496,30 @@
             </m:r>
           </m:sub>
         </m:sSub>
+        <m:sSub>
+          <m:e>
+            <m:r>
+              <m:rPr>
+                <m:sty m:val="p"/>
+              </m:rPr>
+              <m:t>Ξ</m:t>
+            </m:r>
+          </m:e>
+          <m:sub>
+            <m:r>
+              <m:t>g</m:t>
+            </m:r>
+            <m:r>
+              <m:rPr>
+                <m:sty m:val="p"/>
+              </m:rPr>
+              <m:t>,</m:t>
+            </m:r>
+            <m:r>
+              <m:t>l</m:t>
+            </m:r>
+          </m:sub>
+        </m:sSub>
       </m:oMath>
       <w:r>
         <w:t xml:space="preserve"> </w:t>
@@ -38203,6 +38711,30 @@
         <m:sSub>
           <m:e>
             <m:r>
+              <m:rPr>
+                <m:sty m:val="p"/>
+              </m:rPr>
+              <m:t>Ξ</m:t>
+            </m:r>
+          </m:e>
+          <m:sub>
+            <m:r>
+              <m:t>g</m:t>
+            </m:r>
+            <m:r>
+              <m:rPr>
+                <m:sty m:val="p"/>
+              </m:rPr>
+              <m:t>,</m:t>
+            </m:r>
+            <m:r>
+              <m:t>l</m:t>
+            </m:r>
+          </m:sub>
+        </m:sSub>
+        <m:sSub>
+          <m:e>
+            <m:r>
               <m:t>κ</m:t>
             </m:r>
           </m:e>
@@ -38268,6 +38800,483 @@
             </m:r>
           </m:sup>
         </m:sSubSup>
+      </m:oMath>
+      <w:r>
+        <w:t xml:space="preserve">.</w:t>
+      </w:r>
+    </w:p>
+    <w:p>
+      <w:pPr>
+        <w:pStyle w:val="BodyText"/>
+      </w:pPr>
+      <w:r>
+        <w:t xml:space="preserve">Note that</w:t>
+      </w:r>
+      <w:r>
+        <w:t xml:space="preserve"> </w:t>
+      </w:r>
+      <m:oMath>
+        <m:sSub>
+          <m:e>
+            <m:r>
+              <m:t>γ</m:t>
+            </m:r>
+          </m:e>
+          <m:sub>
+            <m:r>
+              <m:t>g</m:t>
+            </m:r>
+            <m:r>
+              <m:t>z</m:t>
+            </m:r>
+          </m:sub>
+        </m:sSub>
+      </m:oMath>
+      <w:r>
+        <w:t xml:space="preserve"> </w:t>
+      </w:r>
+      <w:r>
+        <w:t xml:space="preserve">is scaled by</w:t>
+      </w:r>
+      <w:r>
+        <w:t xml:space="preserve"> </w:t>
+      </w:r>
+      <m:oMath>
+        <m:sSub>
+          <m:e>
+            <m:r>
+              <m:rPr>
+                <m:sty m:val="p"/>
+              </m:rPr>
+              <m:t>Ξ</m:t>
+            </m:r>
+          </m:e>
+          <m:sub>
+            <m:r>
+              <m:t>g</m:t>
+            </m:r>
+            <m:r>
+              <m:rPr>
+                <m:sty m:val="p"/>
+              </m:rPr>
+              <m:t>,</m:t>
+            </m:r>
+            <m:r>
+              <m:t>l</m:t>
+            </m:r>
+          </m:sub>
+        </m:sSub>
+      </m:oMath>
+      <w:r>
+        <w:t xml:space="preserve"> </w:t>
+      </w:r>
+      <w:r>
+        <w:rPr>
+          <w:i/>
+          <w:iCs/>
+        </w:rPr>
+        <w:t xml:space="preserve">before</w:t>
+      </w:r>
+      <w:r>
+        <w:t xml:space="preserve"> </w:t>
+      </w:r>
+      <w:r>
+        <w:t xml:space="preserve">this three-step derivation, rather than being applied afterwards to the resulting</w:t>
+      </w:r>
+      <w:r>
+        <w:t xml:space="preserve"> </w:t>
+      </w:r>
+      <m:oMath>
+        <m:sSub>
+          <m:e>
+            <m:r>
+              <m:t>ω</m:t>
+            </m:r>
+          </m:e>
+          <m:sub>
+            <m:r>
+              <m:t>g</m:t>
+            </m:r>
+            <m:r>
+              <m:t>z</m:t>
+            </m:r>
+          </m:sub>
+        </m:sSub>
+      </m:oMath>
+      <w:r>
+        <w:t xml:space="preserve">. This ordering is necessary for</w:t>
+      </w:r>
+      <w:r>
+        <w:t xml:space="preserve"> </w:t>
+      </w:r>
+      <m:oMath>
+        <m:sSub>
+          <m:e>
+            <m:r>
+              <m:t>κ</m:t>
+            </m:r>
+          </m:e>
+          <m:sub>
+            <m:r>
+              <m:t>t</m:t>
+            </m:r>
+          </m:sub>
+        </m:sSub>
+      </m:oMath>
+      <w:r>
+        <w:t xml:space="preserve"> </w:t>
+      </w:r>
+      <w:r>
+        <w:t xml:space="preserve">to retain its defining property: since</w:t>
+      </w:r>
+      <w:r>
+        <w:t xml:space="preserve"> </w:t>
+      </w:r>
+      <m:oMath>
+        <m:sSub>
+          <m:e>
+            <m:r>
+              <m:t>κ</m:t>
+            </m:r>
+          </m:e>
+          <m:sub>
+            <m:r>
+              <m:t>t</m:t>
+            </m:r>
+          </m:sub>
+        </m:sSub>
+      </m:oMath>
+      <w:r>
+        <w:t xml:space="preserve"> </w:t>
+      </w:r>
+      <w:r>
+        <w:t xml:space="preserve">is solved so that the growth rate actually applied never lets</w:t>
+      </w:r>
+      <w:r>
+        <w:t xml:space="preserve"> </w:t>
+      </w:r>
+      <m:oMath>
+        <m:sSubSup>
+          <m:e>
+            <m:r>
+              <m:t>C</m:t>
+            </m:r>
+          </m:e>
+          <m:sub>
+            <m:r>
+              <m:t>t</m:t>
+            </m:r>
+          </m:sub>
+          <m:sup>
+            <m:r>
+              <m:t>κ</m:t>
+            </m:r>
+          </m:sup>
+        </m:sSubSup>
+      </m:oMath>
+      <w:r>
+        <w:t xml:space="preserve"> </w:t>
+      </w:r>
+      <w:r>
+        <w:t xml:space="preserve">exceed the habitable area</w:t>
+      </w:r>
+      <w:r>
+        <w:t xml:space="preserve"> </w:t>
+      </w:r>
+      <m:oMath>
+        <m:sSub>
+          <m:e>
+            <m:r>
+              <m:t>H</m:t>
+            </m:r>
+          </m:e>
+          <m:sub>
+            <m:r>
+              <m:t>l</m:t>
+            </m:r>
+          </m:sub>
+        </m:sSub>
+      </m:oMath>
+      <w:r>
+        <w:t xml:space="preserve">, that guarantee only holds if the growth rate used to derive</w:t>
+      </w:r>
+      <w:r>
+        <w:t xml:space="preserve"> </w:t>
+      </w:r>
+      <m:oMath>
+        <m:sSub>
+          <m:e>
+            <m:r>
+              <m:t>κ</m:t>
+            </m:r>
+          </m:e>
+          <m:sub>
+            <m:r>
+              <m:t>t</m:t>
+            </m:r>
+          </m:sub>
+        </m:sSub>
+      </m:oMath>
+      <w:r>
+        <w:t xml:space="preserve"> </w:t>
+      </w:r>
+      <w:r>
+        <w:t xml:space="preserve">(Eqs. (15S)-(20S)) is the same growth rate the population ultimately grows by. Scaling</w:t>
+      </w:r>
+      <w:r>
+        <w:t xml:space="preserve"> </w:t>
+      </w:r>
+      <m:oMath>
+        <m:sSub>
+          <m:e>
+            <m:r>
+              <m:t>γ</m:t>
+            </m:r>
+          </m:e>
+          <m:sub>
+            <m:r>
+              <m:t>g</m:t>
+            </m:r>
+            <m:r>
+              <m:t>z</m:t>
+            </m:r>
+          </m:sub>
+        </m:sSub>
+      </m:oMath>
+      <w:r>
+        <w:t xml:space="preserve"> </w:t>
+      </w:r>
+      <w:r>
+        <w:t xml:space="preserve">by</w:t>
+      </w:r>
+      <w:r>
+        <w:t xml:space="preserve"> </w:t>
+      </w:r>
+      <m:oMath>
+        <m:sSub>
+          <m:e>
+            <m:r>
+              <m:rPr>
+                <m:sty m:val="p"/>
+              </m:rPr>
+              <m:t>Ξ</m:t>
+            </m:r>
+          </m:e>
+          <m:sub>
+            <m:r>
+              <m:t>g</m:t>
+            </m:r>
+            <m:r>
+              <m:rPr>
+                <m:sty m:val="p"/>
+              </m:rPr>
+              <m:t>,</m:t>
+            </m:r>
+            <m:r>
+              <m:t>l</m:t>
+            </m:r>
+          </m:sub>
+        </m:sSub>
+      </m:oMath>
+      <w:r>
+        <w:t xml:space="preserve"> </w:t>
+      </w:r>
+      <w:r>
+        <w:t xml:space="preserve">only after solving for</w:t>
+      </w:r>
+      <w:r>
+        <w:t xml:space="preserve"> </w:t>
+      </w:r>
+      <m:oMath>
+        <m:sSub>
+          <m:e>
+            <m:r>
+              <m:t>κ</m:t>
+            </m:r>
+          </m:e>
+          <m:sub>
+            <m:r>
+              <m:t>t</m:t>
+            </m:r>
+          </m:sub>
+        </m:sSub>
+      </m:oMath>
+      <w:r>
+        <w:t xml:space="preserve"> </w:t>
+      </w:r>
+      <w:r>
+        <w:t xml:space="preserve">would decouple the two, allowing</w:t>
+      </w:r>
+      <w:r>
+        <w:t xml:space="preserve"> </w:t>
+      </w:r>
+      <m:oMath>
+        <m:sSubSup>
+          <m:e>
+            <m:r>
+              <m:t>C</m:t>
+            </m:r>
+          </m:e>
+          <m:sub>
+            <m:r>
+              <m:t>t</m:t>
+            </m:r>
+          </m:sub>
+          <m:sup>
+            <m:r>
+              <m:t>κ</m:t>
+            </m:r>
+          </m:sup>
+        </m:sSubSup>
+      </m:oMath>
+      <w:r>
+        <w:t xml:space="preserve"> </w:t>
+      </w:r>
+      <w:r>
+        <w:t xml:space="preserve">to exceed</w:t>
+      </w:r>
+      <w:r>
+        <w:t xml:space="preserve"> </w:t>
+      </w:r>
+      <m:oMath>
+        <m:sSub>
+          <m:e>
+            <m:r>
+              <m:t>H</m:t>
+            </m:r>
+          </m:e>
+          <m:sub>
+            <m:r>
+              <m:t>l</m:t>
+            </m:r>
+          </m:sub>
+        </m:sSub>
+      </m:oMath>
+      <w:r>
+        <w:t xml:space="preserve"> </w:t>
+      </w:r>
+      <w:r>
+        <w:t xml:space="preserve">whenever</w:t>
+      </w:r>
+      <w:r>
+        <w:t xml:space="preserve"> </w:t>
+      </w:r>
+      <m:oMath>
+        <m:sSub>
+          <m:e>
+            <m:r>
+              <m:rPr>
+                <m:sty m:val="p"/>
+              </m:rPr>
+              <m:t>Ξ</m:t>
+            </m:r>
+          </m:e>
+          <m:sub>
+            <m:r>
+              <m:t>g</m:t>
+            </m:r>
+            <m:r>
+              <m:rPr>
+                <m:sty m:val="p"/>
+              </m:rPr>
+              <m:t>,</m:t>
+            </m:r>
+            <m:r>
+              <m:t>l</m:t>
+            </m:r>
+          </m:sub>
+        </m:sSub>
+        <m:r>
+          <m:rPr>
+            <m:sty m:val="p"/>
+          </m:rPr>
+          <m:t>≠</m:t>
+        </m:r>
+        <m:r>
+          <m:t>1</m:t>
+        </m:r>
+      </m:oMath>
+      <w:r>
+        <w:t xml:space="preserve">. The linear extensions</w:t>
+      </w:r>
+      <w:r>
+        <w:t xml:space="preserve"> </w:t>
+      </w:r>
+      <m:oMath>
+        <m:sSub>
+          <m:e>
+            <m:r>
+              <m:t>γ</m:t>
+            </m:r>
+          </m:e>
+          <m:sub>
+            <m:r>
+              <m:t>g</m:t>
+            </m:r>
+            <m:r>
+              <m:rPr>
+                <m:sty m:val="p"/>
+              </m:rPr>
+              <m:t>,</m:t>
+            </m:r>
+            <m:r>
+              <m:t>z</m:t>
+            </m:r>
+          </m:sub>
+        </m:sSub>
+      </m:oMath>
+      <w:r>
+        <w:t xml:space="preserve"> </w:t>
+      </w:r>
+      <w:r>
+        <w:t xml:space="preserve">appearing in Eqs. (15S) and (18S)-(20S) below are therefore understood to already include this regional scaling, i.e. </w:t>
+      </w:r>
+      <m:oMath>
+        <m:sSub>
+          <m:e>
+            <m:r>
+              <m:t>γ</m:t>
+            </m:r>
+          </m:e>
+          <m:sub>
+            <m:r>
+              <m:t>g</m:t>
+            </m:r>
+            <m:r>
+              <m:rPr>
+                <m:sty m:val="p"/>
+              </m:rPr>
+              <m:t>,</m:t>
+            </m:r>
+            <m:r>
+              <m:t>z</m:t>
+            </m:r>
+          </m:sub>
+        </m:sSub>
+        <m:sSub>
+          <m:e>
+            <m:r>
+              <m:rPr>
+                <m:sty m:val="p"/>
+              </m:rPr>
+              <m:t>Ξ</m:t>
+            </m:r>
+          </m:e>
+          <m:sub>
+            <m:r>
+              <m:t>g</m:t>
+            </m:r>
+            <m:r>
+              <m:rPr>
+                <m:sty m:val="p"/>
+              </m:rPr>
+              <m:t>,</m:t>
+            </m:r>
+            <m:r>
+              <m:t>l</m:t>
+            </m:r>
+          </m:sub>
+        </m:sSub>
       </m:oMath>
       <w:r>
         <w:t xml:space="preserve">.</w:t>

</xml_diff>

<commit_message>
Regenerate paper.docx from latest paper.qmd
</commit_message>
<xml_diff>
--- a/paper/paper.docx
+++ b/paper/paper.docx
@@ -6011,10 +6011,7 @@
         </m:sSub>
       </m:oMath>
       <w:r>
-        <w:t xml:space="preserve"> </w:t>
-      </w:r>
-      <w:r>
-        <w:t xml:space="preserve">(see above). Linear extensions assume constant distinct values for corals within the same functional group</w:t>
+        <w:t xml:space="preserve">. Linear extensions assume constant distinct values for corals within the same functional group</w:t>
       </w:r>
       <w:r>
         <w:t xml:space="preserve"> </w:t>
@@ -16484,7 +16481,17 @@
         <w:pStyle w:val="TableCaption"/>
       </w:pPr>
       <w:r>
-        <w:t xml:space="preserve">. Parameters used in the calibration.</w:t>
+        <w:rPr>
+          <w:b/>
+          <w:bCs/>
+        </w:rPr>
+        <w:t xml:space="preserve">Table 1. Parameters used in the calibration.</w:t>
+      </w:r>
+      <w:r>
+        <w:t xml:space="preserve"> </w:t>
+      </w:r>
+      <w:r>
+        <w:t xml:space="preserve">245 parameters in total.</w:t>
       </w:r>
     </w:p>
     <w:tbl>
@@ -16493,7 +16500,7 @@
         <w:tblW w:type="pct" w:w="4950"/>
         <w:tblLayout w:type="fixed"/>
         <w:tblLook w:firstRow="1" w:lastRow="0" w:firstColumn="0" w:lastColumn="0" w:noHBand="0" w:noVBand="0" w:val="0020"/>
-        <w:tblCaption w:val=". Parameters used in the calibration."/>
+        <w:tblCaption w:val="Table 1. Parameters used in the calibration. 245 parameters in total."/>
       </w:tblPr>
       <w:tblGrid>
         <w:gridCol w:w="3303"/>
@@ -16562,7 +16569,7 @@
               <w:jc w:val="left"/>
             </w:pPr>
             <w:r>
-              <w:t xml:space="preserve">(0.5, 2.0)</w:t>
+              <w:t xml:space="preserve">(0.25, 2.0)</w:t>
             </w:r>
           </w:p>
         </w:tc>
@@ -16647,7 +16654,7 @@
               <w:jc w:val="left"/>
             </w:pPr>
             <w:r>
-              <w:t xml:space="preserve">35 (for each of the 5 functional groups and 7 size classes)</w:t>
+              <w:t xml:space="preserve">30 (for each of the 5 functional groups and 7 size classes, except the last size class, which is fixed at 0)</w:t>
             </w:r>
           </w:p>
         </w:tc>
@@ -16882,29 +16889,69 @@
                     </m:rPr>
                     <m:t>g</m:t>
                   </m:r>
+                </m:sub>
+              </m:sSub>
+              <m:r>
+                <m:rPr>
+                  <m:sty m:val="b"/>
+                </m:rPr>
+                <m:t>)</m:t>
+              </m:r>
+            </m:oMath>
+          </w:p>
+        </w:tc>
+        <w:tc>
+          <w:tcPr/>
+          <w:p>
+            <w:pPr>
+              <w:pStyle w:val="Compact"/>
+              <w:jc w:val="left"/>
+            </w:pPr>
+            <w:r>
+              <w:t xml:space="preserve">+/- 50% of nominal values</w:t>
+            </w:r>
+          </w:p>
+        </w:tc>
+        <w:tc>
+          <w:tcPr/>
+          <w:p>
+            <w:pPr>
+              <w:pStyle w:val="Compact"/>
+              <w:jc w:val="left"/>
+            </w:pPr>
+            <w:r>
+              <w:t xml:space="preserve">5 (one for each functional group; broadcast across all 7 size classes and locations)</w:t>
+            </w:r>
+          </w:p>
+        </w:tc>
+      </w:tr>
+      <w:tr>
+        <w:tc>
+          <w:tcPr/>
+          <w:p>
+            <w:pPr>
+              <w:pStyle w:val="Compact"/>
+              <w:jc w:val="left"/>
+            </w:pPr>
+            <w:r>
+              <w:t xml:space="preserve">Heat tolerance std. deviation (</w:t>
+            </w:r>
+            <m:oMath>
+              <m:sSub>
+                <m:e>
                   <m:r>
                     <m:rPr>
                       <m:sty m:val="b"/>
                     </m:rPr>
-                    <m:t>,</m:t>
+                    <m:t>σ</m:t>
                   </m:r>
+                </m:e>
+                <m:sub>
                   <m:r>
                     <m:rPr>
                       <m:sty m:val="b"/>
                     </m:rPr>
-                    <m:t>z</m:t>
-                  </m:r>
-                  <m:r>
-                    <m:rPr>
-                      <m:sty m:val="b"/>
-                    </m:rPr>
-                    <m:t>,</m:t>
-                  </m:r>
-                  <m:r>
-                    <m:rPr>
-                      <m:sty m:val="b"/>
-                    </m:rPr>
-                    <m:t>l</m:t>
+                    <m:t>g</m:t>
                   </m:r>
                 </m:sub>
               </m:sSub>
@@ -16925,7 +16972,7 @@
               <w:jc w:val="left"/>
             </w:pPr>
             <w:r>
-              <w:t xml:space="preserve">+/- 10% of nominal values</w:t>
+              <w:t xml:space="preserve">+/- 25% of nominal values</w:t>
             </w:r>
           </w:p>
         </w:tc>
@@ -16937,7 +16984,7 @@
               <w:jc w:val="left"/>
             </w:pPr>
             <w:r>
-              <w:t xml:space="preserve">35 (for each of the 5 functional groups and 7 size classes; same for all locations)</w:t>
+              <w:t xml:space="preserve">5 (one for each functional group; broadcast across all 7 size classes and locations)</w:t>
             </w:r>
           </w:p>
         </w:tc>
@@ -24804,7 +24851,7 @@
     </w:p>
     <w:p>
       <w:pPr>
-        <w:pStyle w:val="FirstParagraph"/>
+        <w:pStyle w:val="Compact"/>
       </w:pPr>
       <w:r>
         <w:t xml:space="preserve">P. Ribeiro de Almeida: Writing, review and editing; data collation and analysis; model and software development.</w:t>
@@ -24812,7 +24859,7 @@
     </w:p>
     <w:p>
       <w:pPr>
-        <w:pStyle w:val="BodyText"/>
+        <w:pStyle w:val="Compact"/>
       </w:pPr>
       <w:r>
         <w:t xml:space="preserve">R. J. Crocker: Writing, model development.</w:t>
@@ -24820,7 +24867,7 @@
     </w:p>
     <w:p>
       <w:pPr>
-        <w:pStyle w:val="BodyText"/>
+        <w:pStyle w:val="Compact"/>
       </w:pPr>
       <w:r>
         <w:t xml:space="preserve">D. Tan: Model and software development, in particular improvements to computational performance; data collation and analysis; writing</w:t>
@@ -24828,7 +24875,7 @@
     </w:p>
     <w:p>
       <w:pPr>
-        <w:pStyle w:val="BodyText"/>
+        <w:pStyle w:val="Compact"/>
       </w:pPr>
       <w:r>
         <w:t xml:space="preserve">K.R. Bairos-Novak: Data analysis and assistance in conceptual development to include representation of natural adaptation, selection, and heritability.</w:t>
@@ -24836,7 +24883,7 @@
     </w:p>
     <w:p>
       <w:pPr>
-        <w:pStyle w:val="BodyText"/>
+        <w:pStyle w:val="Compact"/>
       </w:pPr>
       <w:r>
         <w:t xml:space="preserve">C. J. Ani: Development of the connectivity model. Review.</w:t>
@@ -24844,7 +24891,7 @@
     </w:p>
     <w:p>
       <w:pPr>
-        <w:pStyle w:val="BodyText"/>
+        <w:pStyle w:val="Compact"/>
       </w:pPr>
       <w:r>
         <w:t xml:space="preserve">J. Benthuysen: Review; data collation.</w:t>
@@ -24852,7 +24899,7 @@
     </w:p>
     <w:p>
       <w:pPr>
-        <w:pStyle w:val="BodyText"/>
+        <w:pStyle w:val="Compact"/>
       </w:pPr>
       <w:r>
         <w:t xml:space="preserve">B. Robson: Review</w:t>
@@ -24860,7 +24907,7 @@
     </w:p>
     <w:p>
       <w:pPr>
-        <w:pStyle w:val="BodyText"/>
+        <w:pStyle w:val="Compact"/>
       </w:pPr>
       <w:r>
         <w:t xml:space="preserve">S. Matthews: Review</w:t>
@@ -24868,7 +24915,7 @@
     </w:p>
     <w:p>
       <w:pPr>
-        <w:pStyle w:val="BodyText"/>
+        <w:pStyle w:val="Compact"/>
       </w:pPr>
       <w:r>
         <w:t xml:space="preserve">T. Iwanaga: Writing, review and editing. Model development and changes to incorporate natural adaptation and heritability. Software development for usability and computational performance. Conceptualization of research aims and primary draft. Coordinated manuscript efforts.</w:t>
@@ -25052,6 +25099,10 @@
         <w:pStyle w:val="TableCaption"/>
       </w:pPr>
       <w:r>
+        <w:rPr>
+          <w:b/>
+          <w:bCs/>
+        </w:rPr>
         <w:t xml:space="preserve">Table S1. Bootstrapped SRCC with 95% confidence intervals between performance metrics and positions along and across the GBR, as well as maximum DHW.</w:t>
       </w:r>
     </w:p>
@@ -25332,6 +25383,10 @@
         <w:pStyle w:val="TableCaption"/>
       </w:pPr>
       <w:r>
+        <w:rPr>
+          <w:b/>
+          <w:bCs/>
+        </w:rPr>
         <w:t xml:space="preserve">Table S2. Bootstrapped median performance metrics and 95% confidence intervals for calibration and test reefs.</w:t>
       </w:r>
     </w:p>
@@ -25512,6 +25567,10 @@
         <w:pStyle w:val="TableCaption"/>
       </w:pPr>
       <w:r>
+        <w:rPr>
+          <w:b/>
+          <w:bCs/>
+        </w:rPr>
         <w:t xml:space="preserve">Table S3. Size class bin edges (</w:t>
       </w:r>
       <m:oMath>
@@ -25535,12 +25594,24 @@
         </m:sSup>
       </m:oMath>
       <w:r>
-        <w:t xml:space="preserve"> </w:t>
-      </w:r>
-      <w:r>
+        <w:rPr>
+          <w:b/>
+          <w:bCs/>
+        </w:rPr>
+        <w:t xml:space="preserve"> </w:t>
+      </w:r>
+      <w:r>
+        <w:rPr>
+          <w:b/>
+          <w:bCs/>
+        </w:rPr>
         <w:t xml:space="preserve">to</w:t>
       </w:r>
       <w:r>
+        <w:rPr>
+          <w:b/>
+          <w:bCs/>
+        </w:rPr>
         <w:t xml:space="preserve"> </w:t>
       </w:r>
       <m:oMath>
@@ -25564,6 +25635,10 @@
         </m:sSup>
       </m:oMath>
       <w:r>
+        <w:rPr>
+          <w:b/>
+          <w:bCs/>
+        </w:rPr>
         <w:t xml:space="preserve">) for each functional group (columns) and size class (rows) in cm.</w:t>
       </w:r>
     </w:p>
@@ -26296,6 +26371,10 @@
         <w:pStyle w:val="TableCaption"/>
       </w:pPr>
       <w:r>
+        <w:rPr>
+          <w:b/>
+          <w:bCs/>
+        </w:rPr>
         <w:t xml:space="preserve">Table S4. Calibrated values for initial means (</w:t>
       </w:r>
       <m:oMath>
@@ -26327,28 +26406,101 @@
               </m:rPr>
               <m:t>0</m:t>
             </m:r>
+            <m:r>
+              <m:rPr>
+                <m:sty m:val="b"/>
+              </m:rPr>
+              <m:t>,</m:t>
+            </m:r>
+            <m:r>
+              <m:rPr>
+                <m:sty m:val="b"/>
+              </m:rPr>
+              <m:t>g</m:t>
+            </m:r>
           </m:sub>
         </m:sSub>
       </m:oMath>
       <w:r>
-        <w:t xml:space="preserve">) of the truncated normal distributions (TN) of heat tolerance for each functional group (columns) and size class (rows), in Degree Heating Weeks (DHW).</w:t>
+        <w:rPr>
+          <w:b/>
+          <w:bCs/>
+        </w:rPr>
+        <w:t xml:space="preserve">) of the truncated normal distributions (TN) of heat tolerance for each functional group, in Degree Heating Weeks (DHW).</w:t>
+      </w:r>
+      <w:r>
+        <w:t xml:space="preserve"> </w:t>
+      </w:r>
+      <w:r>
+        <w:t xml:space="preserve">As with</w:t>
+      </w:r>
+      <w:r>
+        <w:t xml:space="preserve"> </w:t>
+      </w:r>
+      <m:oMath>
+        <m:sSub>
+          <m:e>
+            <m:r>
+              <m:t>σ</m:t>
+            </m:r>
+          </m:e>
+          <m:sub>
+            <m:r>
+              <m:t>g</m:t>
+            </m:r>
+          </m:sub>
+        </m:sSub>
+      </m:oMath>
+      <w:r>
+        <w:t xml:space="preserve"> </w:t>
+      </w:r>
+      <w:r>
+        <w:t xml:space="preserve">(Table S5),</w:t>
+      </w:r>
+      <w:r>
+        <w:t xml:space="preserve"> </w:t>
+      </w:r>
+      <m:oMath>
+        <m:sSub>
+          <m:e>
+            <m:r>
+              <m:t>μ</m:t>
+            </m:r>
+          </m:e>
+          <m:sub>
+            <m:r>
+              <m:t>t</m:t>
+            </m:r>
+            <m:r>
+              <m:rPr>
+                <m:sty m:val="p"/>
+              </m:rPr>
+              <m:t>=</m:t>
+            </m:r>
+            <m:r>
+              <m:t>0</m:t>
+            </m:r>
+          </m:sub>
+        </m:sSub>
+      </m:oMath>
+      <w:r>
+        <w:t xml:space="preserve"> </w:t>
+      </w:r>
+      <w:r>
+        <w:t xml:space="preserve">is calibrated per functional group and broadcast across all seven size classes and locations, not calibrated independently per size class.</w:t>
       </w:r>
     </w:p>
     <w:tbl>
       <w:tblPr>
         <w:tblStyle w:val="Table"/>
-        <w:tblW w:type="pct" w:w="4921"/>
+        <w:tblW w:type="pct" w:w="4873"/>
         <w:tblLayout w:type="fixed"/>
         <w:tblLook w:firstRow="1" w:lastRow="0" w:firstColumn="0" w:lastColumn="0" w:noHBand="0" w:noVBand="0" w:val="0020"/>
-        <w:tblCaption w:val="Table S4. Calibrated values for initial means (\mathbf{\mu}_{\mathbf{t = 0}}) of the truncated normal distributions (TN) of heat tolerance for each functional group (columns) and size class (rows), in Degree Heating Weeks (DHW)."/>
+        <w:tblCaption w:val="Table S4. Calibrated values for initial means (\mathbf{\mu}_{\mathbf{t = 0,g}}) of the truncated normal distributions (TN) of heat tolerance for each functional group, in Degree Heating Weeks (DHW). As with \sigma_{g} (Table S5), \mu_{t=0} is calibrated per functional group and broadcast across all seven size classes and locations, not calibrated independently per size class."/>
       </w:tblPr>
       <w:tblGrid>
-        <w:gridCol w:w="249"/>
-        <w:gridCol w:w="1496"/>
-        <w:gridCol w:w="1496"/>
-        <w:gridCol w:w="1559"/>
-        <w:gridCol w:w="1496"/>
-        <w:gridCol w:w="1496"/>
+        <w:gridCol w:w="2606"/>
+        <w:gridCol w:w="5112"/>
       </w:tblGrid>
       <w:tr>
         <w:trPr>
@@ -26359,9 +26511,74 @@
           <w:p>
             <w:pPr>
               <w:pStyle w:val="Compact"/>
-            </w:pPr>
-          </w:p>
-        </w:tc>
+              <w:jc w:val="center"/>
+            </w:pPr>
+            <w:r>
+              <w:t xml:space="preserve">Functional Group</w:t>
+            </w:r>
+          </w:p>
+        </w:tc>
+        <w:tc>
+          <w:tcPr/>
+          <w:p>
+            <w:pPr>
+              <w:pStyle w:val="Compact"/>
+              <w:jc w:val="center"/>
+            </w:pPr>
+            <w:r>
+              <w:t xml:space="preserve">Initial Mean (</w:t>
+            </w:r>
+            <m:oMath>
+              <m:sSub>
+                <m:e>
+                  <m:r>
+                    <m:rPr>
+                      <m:sty m:val="b"/>
+                    </m:rPr>
+                    <m:t>μ</m:t>
+                  </m:r>
+                </m:e>
+                <m:sub>
+                  <m:r>
+                    <m:rPr>
+                      <m:sty m:val="b"/>
+                    </m:rPr>
+                    <m:t>t</m:t>
+                  </m:r>
+                  <m:r>
+                    <m:rPr>
+                      <m:sty m:val="b"/>
+                    </m:rPr>
+                    <m:t>=</m:t>
+                  </m:r>
+                  <m:r>
+                    <m:rPr>
+                      <m:sty m:val="b"/>
+                    </m:rPr>
+                    <m:t>0</m:t>
+                  </m:r>
+                  <m:r>
+                    <m:rPr>
+                      <m:sty m:val="b"/>
+                    </m:rPr>
+                    <m:t>,</m:t>
+                  </m:r>
+                  <m:r>
+                    <m:rPr>
+                      <m:sty m:val="b"/>
+                    </m:rPr>
+                    <m:t>g</m:t>
+                  </m:r>
+                </m:sub>
+              </m:sSub>
+            </m:oMath>
+            <w:r>
+              <w:t xml:space="preserve">)</w:t>
+            </w:r>
+          </w:p>
+        </w:tc>
+      </w:tr>
+      <w:tr>
         <w:tc>
           <w:tcPr/>
           <w:p>
@@ -26405,6 +26622,20 @@
               <w:jc w:val="center"/>
             </w:pPr>
             <w:r>
+              <w:t xml:space="preserve">5.63</w:t>
+            </w:r>
+          </w:p>
+        </w:tc>
+      </w:tr>
+      <w:tr>
+        <w:tc>
+          <w:tcPr/>
+          <w:p>
+            <w:pPr>
+              <w:pStyle w:val="Compact"/>
+              <w:jc w:val="center"/>
+            </w:pPr>
+            <w:r>
               <w:t xml:space="preserve">CA (</w:t>
             </w:r>
             <m:oMath>
@@ -26440,6 +26671,20 @@
               <w:jc w:val="center"/>
             </w:pPr>
             <w:r>
+              <w:t xml:space="preserve">6.12</w:t>
+            </w:r>
+          </w:p>
+        </w:tc>
+      </w:tr>
+      <w:tr>
+        <w:tc>
+          <w:tcPr/>
+          <w:p>
+            <w:pPr>
+              <w:pStyle w:val="Compact"/>
+              <w:jc w:val="center"/>
+            </w:pPr>
+            <w:r>
               <w:t xml:space="preserve">NAC (</w:t>
             </w:r>
             <m:oMath>
@@ -26475,6 +26720,20 @@
               <w:jc w:val="center"/>
             </w:pPr>
             <w:r>
+              <w:t xml:space="preserve">6.73</w:t>
+            </w:r>
+          </w:p>
+        </w:tc>
+      </w:tr>
+      <w:tr>
+        <w:tc>
+          <w:tcPr/>
+          <w:p>
+            <w:pPr>
+              <w:pStyle w:val="Compact"/>
+              <w:jc w:val="center"/>
+            </w:pPr>
+            <w:r>
               <w:t xml:space="preserve">SM (</w:t>
             </w:r>
             <m:oMath>
@@ -26510,6 +26769,20 @@
               <w:jc w:val="center"/>
             </w:pPr>
             <w:r>
+              <w:t xml:space="preserve">3.78</w:t>
+            </w:r>
+          </w:p>
+        </w:tc>
+      </w:tr>
+      <w:tr>
+        <w:tc>
+          <w:tcPr/>
+          <w:p>
+            <w:pPr>
+              <w:pStyle w:val="Compact"/>
+              <w:jc w:val="center"/>
+            </w:pPr>
+            <w:r>
               <w:t xml:space="preserve">LM (</w:t>
             </w:r>
             <m:oMath>
@@ -26537,19 +26810,6 @@
             </w:r>
           </w:p>
         </w:tc>
-      </w:tr>
-      <w:tr>
-        <w:tc>
-          <w:tcPr/>
-          <w:p>
-            <w:pPr>
-              <w:pStyle w:val="Compact"/>
-            </w:pPr>
-            <w:r>
-              <w:t xml:space="preserve">1</w:t>
-            </w:r>
-          </w:p>
-        </w:tc>
         <w:tc>
           <w:tcPr/>
           <w:p>
@@ -26558,493 +26818,7 @@
               <w:jc w:val="center"/>
             </w:pPr>
             <w:r>
-              <w:t xml:space="preserve">3.36</w:t>
-            </w:r>
-          </w:p>
-        </w:tc>
-        <w:tc>
-          <w:tcPr/>
-          <w:p>
-            <w:pPr>
-              <w:pStyle w:val="Compact"/>
-              <w:jc w:val="center"/>
-            </w:pPr>
-            <w:r>
-              <w:t xml:space="preserve">3.99</w:t>
-            </w:r>
-          </w:p>
-        </w:tc>
-        <w:tc>
-          <w:tcPr/>
-          <w:p>
-            <w:pPr>
-              <w:pStyle w:val="Compact"/>
-              <w:jc w:val="center"/>
-            </w:pPr>
-            <w:r>
-              <w:t xml:space="preserve">3.81</w:t>
-            </w:r>
-          </w:p>
-        </w:tc>
-        <w:tc>
-          <w:tcPr/>
-          <w:p>
-            <w:pPr>
-              <w:pStyle w:val="Compact"/>
-              <w:jc w:val="center"/>
-            </w:pPr>
-            <w:r>
-              <w:t xml:space="preserve">5.34</w:t>
-            </w:r>
-          </w:p>
-        </w:tc>
-        <w:tc>
-          <w:tcPr/>
-          <w:p>
-            <w:pPr>
-              <w:pStyle w:val="Compact"/>
-              <w:jc w:val="center"/>
-            </w:pPr>
-            <w:r>
-              <w:t xml:space="preserve">6.07</w:t>
-            </w:r>
-          </w:p>
-        </w:tc>
-      </w:tr>
-      <w:tr>
-        <w:tc>
-          <w:tcPr/>
-          <w:p>
-            <w:pPr>
-              <w:pStyle w:val="Compact"/>
-            </w:pPr>
-            <w:r>
-              <w:t xml:space="preserve">2</w:t>
-            </w:r>
-          </w:p>
-        </w:tc>
-        <w:tc>
-          <w:tcPr/>
-          <w:p>
-            <w:pPr>
-              <w:pStyle w:val="Compact"/>
-              <w:jc w:val="center"/>
-            </w:pPr>
-            <w:r>
-              <w:t xml:space="preserve">3.12</w:t>
-            </w:r>
-          </w:p>
-        </w:tc>
-        <w:tc>
-          <w:tcPr/>
-          <w:p>
-            <w:pPr>
-              <w:pStyle w:val="Compact"/>
-              <w:jc w:val="center"/>
-            </w:pPr>
-            <w:r>
-              <w:t xml:space="preserve">3.72</w:t>
-            </w:r>
-          </w:p>
-        </w:tc>
-        <w:tc>
-          <w:tcPr/>
-          <w:p>
-            <w:pPr>
-              <w:pStyle w:val="Compact"/>
-              <w:jc w:val="center"/>
-            </w:pPr>
-            <w:r>
-              <w:t xml:space="preserve">3.83</w:t>
-            </w:r>
-          </w:p>
-        </w:tc>
-        <w:tc>
-          <w:tcPr/>
-          <w:p>
-            <w:pPr>
-              <w:pStyle w:val="Compact"/>
-              <w:jc w:val="center"/>
-            </w:pPr>
-            <w:r>
-              <w:t xml:space="preserve">5.31</w:t>
-            </w:r>
-          </w:p>
-        </w:tc>
-        <w:tc>
-          <w:tcPr/>
-          <w:p>
-            <w:pPr>
-              <w:pStyle w:val="Compact"/>
-              <w:jc w:val="center"/>
-            </w:pPr>
-            <w:r>
-              <w:t xml:space="preserve">6.23</w:t>
-            </w:r>
-          </w:p>
-        </w:tc>
-      </w:tr>
-      <w:tr>
-        <w:tc>
-          <w:tcPr/>
-          <w:p>
-            <w:pPr>
-              <w:pStyle w:val="Compact"/>
-            </w:pPr>
-            <w:r>
-              <w:t xml:space="preserve">3</w:t>
-            </w:r>
-          </w:p>
-        </w:tc>
-        <w:tc>
-          <w:tcPr/>
-          <w:p>
-            <w:pPr>
-              <w:pStyle w:val="Compact"/>
-              <w:jc w:val="center"/>
-            </w:pPr>
-            <w:r>
-              <w:t xml:space="preserve">3.41</w:t>
-            </w:r>
-          </w:p>
-        </w:tc>
-        <w:tc>
-          <w:tcPr/>
-          <w:p>
-            <w:pPr>
-              <w:pStyle w:val="Compact"/>
-              <w:jc w:val="center"/>
-            </w:pPr>
-            <w:r>
-              <w:t xml:space="preserve">3.85</w:t>
-            </w:r>
-          </w:p>
-        </w:tc>
-        <w:tc>
-          <w:tcPr/>
-          <w:p>
-            <w:pPr>
-              <w:pStyle w:val="Compact"/>
-              <w:jc w:val="center"/>
-            </w:pPr>
-            <w:r>
-              <w:t xml:space="preserve">3.86</w:t>
-            </w:r>
-          </w:p>
-        </w:tc>
-        <w:tc>
-          <w:tcPr/>
-          <w:p>
-            <w:pPr>
-              <w:pStyle w:val="Compact"/>
-              <w:jc w:val="center"/>
-            </w:pPr>
-            <w:r>
-              <w:t xml:space="preserve">5.03</w:t>
-            </w:r>
-          </w:p>
-        </w:tc>
-        <w:tc>
-          <w:tcPr/>
-          <w:p>
-            <w:pPr>
-              <w:pStyle w:val="Compact"/>
-              <w:jc w:val="center"/>
-            </w:pPr>
-            <w:r>
-              <w:t xml:space="preserve">5.7</w:t>
-            </w:r>
-          </w:p>
-        </w:tc>
-      </w:tr>
-      <w:tr>
-        <w:tc>
-          <w:tcPr/>
-          <w:p>
-            <w:pPr>
-              <w:pStyle w:val="Compact"/>
-            </w:pPr>
-            <w:r>
-              <w:t xml:space="preserve">4</w:t>
-            </w:r>
-          </w:p>
-        </w:tc>
-        <w:tc>
-          <w:tcPr/>
-          <w:p>
-            <w:pPr>
-              <w:pStyle w:val="Compact"/>
-              <w:jc w:val="center"/>
-            </w:pPr>
-            <w:r>
-              <w:t xml:space="preserve">2.97</w:t>
-            </w:r>
-          </w:p>
-        </w:tc>
-        <w:tc>
-          <w:tcPr/>
-          <w:p>
-            <w:pPr>
-              <w:pStyle w:val="Compact"/>
-              <w:jc w:val="center"/>
-            </w:pPr>
-            <w:r>
-              <w:t xml:space="preserve">3.26</w:t>
-            </w:r>
-          </w:p>
-        </w:tc>
-        <w:tc>
-          <w:tcPr/>
-          <w:p>
-            <w:pPr>
-              <w:pStyle w:val="Compact"/>
-              <w:jc w:val="center"/>
-            </w:pPr>
-            <w:r>
-              <w:t xml:space="preserve">3.79</w:t>
-            </w:r>
-          </w:p>
-        </w:tc>
-        <w:tc>
-          <w:tcPr/>
-          <w:p>
-            <w:pPr>
-              <w:pStyle w:val="Compact"/>
-              <w:jc w:val="center"/>
-            </w:pPr>
-            <w:r>
-              <w:t xml:space="preserve">5.69</w:t>
-            </w:r>
-          </w:p>
-        </w:tc>
-        <w:tc>
-          <w:tcPr/>
-          <w:p>
-            <w:pPr>
-              <w:pStyle w:val="Compact"/>
-              <w:jc w:val="center"/>
-            </w:pPr>
-            <w:r>
-              <w:t xml:space="preserve">5.68</w:t>
-            </w:r>
-          </w:p>
-        </w:tc>
-      </w:tr>
-      <w:tr>
-        <w:tc>
-          <w:tcPr/>
-          <w:p>
-            <w:pPr>
-              <w:pStyle w:val="Compact"/>
-            </w:pPr>
-            <w:r>
-              <w:t xml:space="preserve">5</w:t>
-            </w:r>
-          </w:p>
-        </w:tc>
-        <w:tc>
-          <w:tcPr/>
-          <w:p>
-            <w:pPr>
-              <w:pStyle w:val="Compact"/>
-              <w:jc w:val="center"/>
-            </w:pPr>
-            <w:r>
-              <w:t xml:space="preserve">3.42</w:t>
-            </w:r>
-          </w:p>
-        </w:tc>
-        <w:tc>
-          <w:tcPr/>
-          <w:p>
-            <w:pPr>
-              <w:pStyle w:val="Compact"/>
-              <w:jc w:val="center"/>
-            </w:pPr>
-            <w:r>
-              <w:t xml:space="preserve">3.67</w:t>
-            </w:r>
-          </w:p>
-        </w:tc>
-        <w:tc>
-          <w:tcPr/>
-          <w:p>
-            <w:pPr>
-              <w:pStyle w:val="Compact"/>
-              <w:jc w:val="center"/>
-            </w:pPr>
-            <w:r>
-              <w:t xml:space="preserve">3.65</w:t>
-            </w:r>
-          </w:p>
-        </w:tc>
-        <w:tc>
-          <w:tcPr/>
-          <w:p>
-            <w:pPr>
-              <w:pStyle w:val="Compact"/>
-              <w:jc w:val="center"/>
-            </w:pPr>
-            <w:r>
-              <w:t xml:space="preserve">5.03</w:t>
-            </w:r>
-          </w:p>
-        </w:tc>
-        <w:tc>
-          <w:tcPr/>
-          <w:p>
-            <w:pPr>
-              <w:pStyle w:val="Compact"/>
-              <w:jc w:val="center"/>
-            </w:pPr>
-            <w:r>
-              <w:t xml:space="preserve">5.81</w:t>
-            </w:r>
-          </w:p>
-        </w:tc>
-      </w:tr>
-      <w:tr>
-        <w:tc>
-          <w:tcPr/>
-          <w:p>
-            <w:pPr>
-              <w:pStyle w:val="Compact"/>
-            </w:pPr>
-            <w:r>
-              <w:t xml:space="preserve">6</w:t>
-            </w:r>
-          </w:p>
-        </w:tc>
-        <w:tc>
-          <w:tcPr/>
-          <w:p>
-            <w:pPr>
-              <w:pStyle w:val="Compact"/>
-              <w:jc w:val="center"/>
-            </w:pPr>
-            <w:r>
-              <w:t xml:space="preserve">3.43</w:t>
-            </w:r>
-          </w:p>
-        </w:tc>
-        <w:tc>
-          <w:tcPr/>
-          <w:p>
-            <w:pPr>
-              <w:pStyle w:val="Compact"/>
-              <w:jc w:val="center"/>
-            </w:pPr>
-            <w:r>
-              <w:t xml:space="preserve">3.7</w:t>
-            </w:r>
-          </w:p>
-        </w:tc>
-        <w:tc>
-          <w:tcPr/>
-          <w:p>
-            <w:pPr>
-              <w:pStyle w:val="Compact"/>
-              <w:jc w:val="center"/>
-            </w:pPr>
-            <w:r>
-              <w:t xml:space="preserve">3.65</w:t>
-            </w:r>
-          </w:p>
-        </w:tc>
-        <w:tc>
-          <w:tcPr/>
-          <w:p>
-            <w:pPr>
-              <w:pStyle w:val="Compact"/>
-              <w:jc w:val="center"/>
-            </w:pPr>
-            <w:r>
-              <w:t xml:space="preserve">5.21</w:t>
-            </w:r>
-          </w:p>
-        </w:tc>
-        <w:tc>
-          <w:tcPr/>
-          <w:p>
-            <w:pPr>
-              <w:pStyle w:val="Compact"/>
-              <w:jc w:val="center"/>
-            </w:pPr>
-            <w:r>
-              <w:t xml:space="preserve">6.0</w:t>
-            </w:r>
-          </w:p>
-        </w:tc>
-      </w:tr>
-      <w:tr>
-        <w:tc>
-          <w:tcPr/>
-          <w:p>
-            <w:pPr>
-              <w:pStyle w:val="Compact"/>
-            </w:pPr>
-            <w:r>
-              <w:t xml:space="preserve">7</w:t>
-            </w:r>
-          </w:p>
-        </w:tc>
-        <w:tc>
-          <w:tcPr/>
-          <w:p>
-            <w:pPr>
-              <w:pStyle w:val="Compact"/>
-              <w:jc w:val="center"/>
-            </w:pPr>
-            <w:r>
-              <w:t xml:space="preserve">2.9</w:t>
-            </w:r>
-          </w:p>
-        </w:tc>
-        <w:tc>
-          <w:tcPr/>
-          <w:p>
-            <w:pPr>
-              <w:pStyle w:val="Compact"/>
-              <w:jc w:val="center"/>
-            </w:pPr>
-            <w:r>
-              <w:t xml:space="preserve">3.46</w:t>
-            </w:r>
-          </w:p>
-        </w:tc>
-        <w:tc>
-          <w:tcPr/>
-          <w:p>
-            <w:pPr>
-              <w:pStyle w:val="Compact"/>
-              <w:jc w:val="center"/>
-            </w:pPr>
-            <w:r>
-              <w:t xml:space="preserve">3.81</w:t>
-            </w:r>
-          </w:p>
-        </w:tc>
-        <w:tc>
-          <w:tcPr/>
-          <w:p>
-            <w:pPr>
-              <w:pStyle w:val="Compact"/>
-              <w:jc w:val="center"/>
-            </w:pPr>
-            <w:r>
-              <w:t xml:space="preserve">4.6</w:t>
-            </w:r>
-          </w:p>
-        </w:tc>
-        <w:tc>
-          <w:tcPr/>
-          <w:p>
-            <w:pPr>
-              <w:pStyle w:val="Compact"/>
-              <w:jc w:val="center"/>
-            </w:pPr>
-            <w:r>
-              <w:t xml:space="preserve">5.53</w:t>
+              <w:t xml:space="preserve">3.58</w:t>
             </w:r>
           </w:p>
         </w:tc>
@@ -27063,6 +26837,10 @@
         <w:pStyle w:val="TableCaption"/>
       </w:pPr>
       <w:r>
+        <w:rPr>
+          <w:b/>
+          <w:bCs/>
+        </w:rPr>
         <w:t xml:space="preserve">Table S5. Standard deviation (</w:t>
       </w:r>
       <m:oMath>
@@ -27086,20 +26864,24 @@
         </m:sSub>
       </m:oMath>
       <w:r>
+        <w:rPr>
+          <w:b/>
+          <w:bCs/>
+        </w:rPr>
         <w:t xml:space="preserve">) of the truncated normal distributions of heat tolerance (in DHW) assumed for each functional group.</w:t>
       </w:r>
     </w:p>
     <w:tbl>
       <w:tblPr>
         <w:tblStyle w:val="Table"/>
-        <w:tblW w:type="pct" w:w="4877"/>
+        <w:tblW w:type="pct" w:w="4878"/>
         <w:tblLayout w:type="fixed"/>
         <w:tblLook w:firstRow="1" w:lastRow="0" w:firstColumn="0" w:lastColumn="0" w:noHBand="0" w:noVBand="0" w:val="0020"/>
         <w:tblCaption w:val="Table S5. Standard deviation (\mathbf{\sigma}_{\mathbf{g}}) of the truncated normal distributions of heat tolerance (in DHW) assumed for each functional group."/>
       </w:tblPr>
       <w:tblGrid>
-        <w:gridCol w:w="2444"/>
-        <w:gridCol w:w="5280"/>
+        <w:gridCol w:w="2511"/>
+        <w:gridCol w:w="5215"/>
       </w:tblGrid>
       <w:tr>
         <w:trPr>
@@ -27197,7 +26979,7 @@
               <w:jc w:val="center"/>
             </w:pPr>
             <w:r>
-              <w:t xml:space="preserve">2.90</w:t>
+              <w:t xml:space="preserve">2.50</w:t>
             </w:r>
           </w:p>
         </w:tc>
@@ -27246,7 +27028,7 @@
               <w:jc w:val="center"/>
             </w:pPr>
             <w:r>
-              <w:t xml:space="preserve">3.16</w:t>
+              <w:t xml:space="preserve">3.65</w:t>
             </w:r>
           </w:p>
         </w:tc>
@@ -27295,7 +27077,7 @@
               <w:jc w:val="center"/>
             </w:pPr>
             <w:r>
-              <w:t xml:space="preserve">3.47</w:t>
+              <w:t xml:space="preserve">2.61</w:t>
             </w:r>
           </w:p>
         </w:tc>
@@ -27344,7 +27126,7 @@
               <w:jc w:val="center"/>
             </w:pPr>
             <w:r>
-              <w:t xml:space="preserve">4.77</w:t>
+              <w:t xml:space="preserve">4.18</w:t>
             </w:r>
           </w:p>
         </w:tc>
@@ -27393,7 +27175,7 @@
               <w:jc w:val="center"/>
             </w:pPr>
             <w:r>
-              <w:t xml:space="preserve">5.54</w:t>
+              <w:t xml:space="preserve">4.15</w:t>
             </w:r>
           </w:p>
         </w:tc>
@@ -27412,6 +27194,10 @@
         <w:pStyle w:val="TableCaption"/>
       </w:pPr>
       <w:r>
+        <w:rPr>
+          <w:b/>
+          <w:bCs/>
+        </w:rPr>
         <w:t xml:space="preserve">Table S6. Calibrated base mortality rates (</w:t>
       </w:r>
       <m:oMath>
@@ -27509,24 +27295,28 @@
         </m:sSubSup>
       </m:oMath>
       <w:r>
+        <w:rPr>
+          <w:b/>
+          <w:bCs/>
+        </w:rPr>
         <w:t xml:space="preserve">) for each functional group (columns) and size class (rows).</w:t>
       </w:r>
     </w:p>
     <w:tbl>
       <w:tblPr>
         <w:tblStyle w:val="Table"/>
-        <w:tblW w:type="pct" w:w="4922"/>
+        <w:tblW w:type="pct" w:w="4925"/>
         <w:tblLayout w:type="fixed"/>
         <w:tblLook w:firstRow="1" w:lastRow="0" w:firstColumn="0" w:lastColumn="0" w:noHBand="0" w:noVBand="0" w:val="0020"/>
         <w:tblCaption w:val="Table S6. Calibrated base mortality rates (\mathbf{m}_{\mathbf{g,z}}^{\mathbf{background}}) for each functional group (columns) and size class (rows)."/>
       </w:tblPr>
       <w:tblGrid>
-        <w:gridCol w:w="309"/>
-        <w:gridCol w:w="1485"/>
-        <w:gridCol w:w="1485"/>
-        <w:gridCol w:w="1546"/>
-        <w:gridCol w:w="1485"/>
-        <w:gridCol w:w="1485"/>
+        <w:gridCol w:w="297"/>
+        <w:gridCol w:w="1488"/>
+        <w:gridCol w:w="1488"/>
+        <w:gridCol w:w="1548"/>
+        <w:gridCol w:w="1488"/>
+        <w:gridCol w:w="1488"/>
       </w:tblGrid>
       <w:tr>
         <w:trPr>
@@ -27748,7 +27538,7 @@
               <w:jc w:val="center"/>
             </w:pPr>
             <w:r>
-              <w:t xml:space="preserve">0.22</w:t>
+              <w:t xml:space="preserve">0.25</w:t>
             </w:r>
           </w:p>
         </w:tc>
@@ -27760,7 +27550,7 @@
               <w:jc w:val="center"/>
             </w:pPr>
             <w:r>
-              <w:t xml:space="preserve">0.21</w:t>
+              <w:t xml:space="preserve">0.24</w:t>
             </w:r>
           </w:p>
         </w:tc>
@@ -27772,7 +27562,7 @@
               <w:jc w:val="center"/>
             </w:pPr>
             <w:r>
-              <w:t xml:space="preserve">0.23</w:t>
+              <w:t xml:space="preserve">0.24</w:t>
             </w:r>
           </w:p>
         </w:tc>
@@ -27784,7 +27574,7 @@
               <w:jc w:val="center"/>
             </w:pPr>
             <w:r>
-              <w:t xml:space="preserve">0.29</w:t>
+              <w:t xml:space="preserve">0.31</w:t>
             </w:r>
           </w:p>
         </w:tc>
@@ -27821,7 +27611,7 @@
               <w:jc w:val="center"/>
             </w:pPr>
             <w:r>
-              <w:t xml:space="preserve">0.13</w:t>
+              <w:t xml:space="preserve">0.14</w:t>
             </w:r>
           </w:p>
         </w:tc>
@@ -27833,7 +27623,7 @@
               <w:jc w:val="center"/>
             </w:pPr>
             <w:r>
-              <w:t xml:space="preserve">0.13</w:t>
+              <w:t xml:space="preserve">0.14</w:t>
             </w:r>
           </w:p>
         </w:tc>
@@ -27845,7 +27635,7 @@
               <w:jc w:val="center"/>
             </w:pPr>
             <w:r>
-              <w:t xml:space="preserve">0.08</w:t>
+              <w:t xml:space="preserve">0.09</w:t>
             </w:r>
           </w:p>
         </w:tc>
@@ -27857,7 +27647,7 @@
               <w:jc w:val="center"/>
             </w:pPr>
             <w:r>
-              <w:t xml:space="preserve">0.08</w:t>
+              <w:t xml:space="preserve">0.09</w:t>
             </w:r>
           </w:p>
         </w:tc>
@@ -27882,7 +27672,7 @@
               <w:jc w:val="center"/>
             </w:pPr>
             <w:r>
-              <w:t xml:space="preserve">0.21</w:t>
+              <w:t xml:space="preserve">0.23</w:t>
             </w:r>
           </w:p>
         </w:tc>
@@ -27894,6 +27684,18 @@
               <w:jc w:val="center"/>
             </w:pPr>
             <w:r>
+              <w:t xml:space="preserve">0.10</w:t>
+            </w:r>
+          </w:p>
+        </w:tc>
+        <w:tc>
+          <w:tcPr/>
+          <w:p>
+            <w:pPr>
+              <w:pStyle w:val="Compact"/>
+              <w:jc w:val="center"/>
+            </w:pPr>
+            <w:r>
               <w:t xml:space="preserve">0.09</w:t>
             </w:r>
           </w:p>
@@ -27906,7 +27708,7 @@
               <w:jc w:val="center"/>
             </w:pPr>
             <w:r>
-              <w:t xml:space="preserve">0.07</w:t>
+              <w:t xml:space="preserve">0.05</w:t>
             </w:r>
           </w:p>
         </w:tc>
@@ -27919,18 +27721,6 @@
             </w:pPr>
             <w:r>
               <w:t xml:space="preserve">0.05</w:t>
-            </w:r>
-          </w:p>
-        </w:tc>
-        <w:tc>
-          <w:tcPr/>
-          <w:p>
-            <w:pPr>
-              <w:pStyle w:val="Compact"/>
-              <w:jc w:val="center"/>
-            </w:pPr>
-            <w:r>
-              <w:t xml:space="preserve">0.04</w:t>
             </w:r>
           </w:p>
         </w:tc>
@@ -27955,7 +27745,7 @@
               <w:jc w:val="center"/>
             </w:pPr>
             <w:r>
-              <w:t xml:space="preserve">0.20</w:t>
+              <w:t xml:space="preserve">0.21</w:t>
             </w:r>
           </w:p>
         </w:tc>
@@ -27967,7 +27757,7 @@
               <w:jc w:val="center"/>
             </w:pPr>
             <w:r>
-              <w:t xml:space="preserve">0.12</w:t>
+              <w:t xml:space="preserve">0.14</w:t>
             </w:r>
           </w:p>
         </w:tc>
@@ -28052,7 +27842,7 @@
               <w:jc w:val="center"/>
             </w:pPr>
             <w:r>
-              <w:t xml:space="preserve">0.09</w:t>
+              <w:t xml:space="preserve">0.08</w:t>
             </w:r>
           </w:p>
         </w:tc>
@@ -28101,7 +27891,7 @@
               <w:jc w:val="center"/>
             </w:pPr>
             <w:r>
-              <w:t xml:space="preserve">0.14</w:t>
+              <w:t xml:space="preserve">0.15</w:t>
             </w:r>
           </w:p>
         </w:tc>
@@ -28113,7 +27903,7 @@
               <w:jc w:val="center"/>
             </w:pPr>
             <w:r>
-              <w:t xml:space="preserve">0.11</w:t>
+              <w:t xml:space="preserve">0.10</w:t>
             </w:r>
           </w:p>
         </w:tc>
@@ -28125,7 +27915,7 @@
               <w:jc w:val="center"/>
             </w:pPr>
             <w:r>
-              <w:t xml:space="preserve">0.08</w:t>
+              <w:t xml:space="preserve">0.09</w:t>
             </w:r>
           </w:p>
         </w:tc>
@@ -28137,19 +27927,19 @@
               <w:jc w:val="center"/>
             </w:pPr>
             <w:r>
+              <w:t xml:space="preserve">0.02</w:t>
+            </w:r>
+          </w:p>
+        </w:tc>
+        <w:tc>
+          <w:tcPr/>
+          <w:p>
+            <w:pPr>
+              <w:pStyle w:val="Compact"/>
+              <w:jc w:val="center"/>
+            </w:pPr>
+            <w:r>
               <w:t xml:space="preserve">0.01</w:t>
-            </w:r>
-          </w:p>
-        </w:tc>
-        <w:tc>
-          <w:tcPr/>
-          <w:p>
-            <w:pPr>
-              <w:pStyle w:val="Compact"/>
-              <w:jc w:val="center"/>
-            </w:pPr>
-            <w:r>
-              <w:t xml:space="preserve">0.02</w:t>
             </w:r>
           </w:p>
         </w:tc>
@@ -28186,7 +27976,7 @@
               <w:jc w:val="center"/>
             </w:pPr>
             <w:r>
-              <w:t xml:space="preserve">0.10</w:t>
+              <w:t xml:space="preserve">0.12</w:t>
             </w:r>
           </w:p>
         </w:tc>
@@ -28241,6 +28031,10 @@
         <w:pStyle w:val="TableCaption"/>
       </w:pPr>
       <w:r>
+        <w:rPr>
+          <w:b/>
+          <w:bCs/>
+        </w:rPr>
         <w:t xml:space="preserve">Table S7. Calibrated linear extensions (</w:t>
       </w:r>
       <m:oMath>
@@ -28276,24 +28070,28 @@
         </m:sSub>
       </m:oMath>
       <w:r>
+        <w:rPr>
+          <w:b/>
+          <w:bCs/>
+        </w:rPr>
         <w:t xml:space="preserve">) for each functional group (columns) and size class (rows) in cm/year.</w:t>
       </w:r>
     </w:p>
     <w:tbl>
       <w:tblPr>
         <w:tblStyle w:val="Table"/>
-        <w:tblW w:type="pct" w:w="4922"/>
+        <w:tblW w:type="pct" w:w="4925"/>
         <w:tblLayout w:type="fixed"/>
         <w:tblLook w:firstRow="1" w:lastRow="0" w:firstColumn="0" w:lastColumn="0" w:noHBand="0" w:noVBand="0" w:val="0020"/>
         <w:tblCaption w:val="Table S7. Calibrated linear extensions (\mathbf{\gamma}_{\mathbf{g,z}}) for each functional group (columns) and size class (rows) in cm/year."/>
       </w:tblPr>
       <w:tblGrid>
-        <w:gridCol w:w="309"/>
-        <w:gridCol w:w="1485"/>
-        <w:gridCol w:w="1485"/>
-        <w:gridCol w:w="1546"/>
-        <w:gridCol w:w="1485"/>
-        <w:gridCol w:w="1485"/>
+        <w:gridCol w:w="297"/>
+        <w:gridCol w:w="1488"/>
+        <w:gridCol w:w="1488"/>
+        <w:gridCol w:w="1548"/>
+        <w:gridCol w:w="1488"/>
+        <w:gridCol w:w="1488"/>
       </w:tblGrid>
       <w:tr>
         <w:trPr>
@@ -28503,7 +28301,7 @@
               <w:jc w:val="center"/>
             </w:pPr>
             <w:r>
-              <w:t xml:space="preserve">2.24</w:t>
+              <w:t xml:space="preserve">2.21</w:t>
             </w:r>
           </w:p>
         </w:tc>
@@ -28515,7 +28313,7 @@
               <w:jc w:val="center"/>
             </w:pPr>
             <w:r>
-              <w:t xml:space="preserve">2.43</w:t>
+              <w:t xml:space="preserve">2.19</w:t>
             </w:r>
           </w:p>
         </w:tc>
@@ -28527,7 +28325,7 @@
               <w:jc w:val="center"/>
             </w:pPr>
             <w:r>
-              <w:t xml:space="preserve">1.73</w:t>
+              <w:t xml:space="preserve">1.58</w:t>
             </w:r>
           </w:p>
         </w:tc>
@@ -28539,7 +28337,7 @@
               <w:jc w:val="center"/>
             </w:pPr>
             <w:r>
-              <w:t xml:space="preserve">1.25</w:t>
+              <w:t xml:space="preserve">1.05</w:t>
             </w:r>
           </w:p>
         </w:tc>
@@ -28551,7 +28349,7 @@
               <w:jc w:val="center"/>
             </w:pPr>
             <w:r>
-              <w:t xml:space="preserve">1.2</w:t>
+              <w:t xml:space="preserve">1.08</w:t>
             </w:r>
           </w:p>
         </w:tc>
@@ -28576,7 +28374,7 @@
               <w:jc w:val="center"/>
             </w:pPr>
             <w:r>
-              <w:t xml:space="preserve">4.57</w:t>
+              <w:t xml:space="preserve">4.62</w:t>
             </w:r>
           </w:p>
         </w:tc>
@@ -28588,7 +28386,7 @@
               <w:jc w:val="center"/>
             </w:pPr>
             <w:r>
-              <w:t xml:space="preserve">2.78</w:t>
+              <w:t xml:space="preserve">2.58</w:t>
             </w:r>
           </w:p>
         </w:tc>
@@ -28600,7 +28398,7 @@
               <w:jc w:val="center"/>
             </w:pPr>
             <w:r>
-              <w:t xml:space="preserve">1.58</w:t>
+              <w:t xml:space="preserve">1.52</w:t>
             </w:r>
           </w:p>
         </w:tc>
@@ -28612,7 +28410,7 @@
               <w:jc w:val="center"/>
             </w:pPr>
             <w:r>
-              <w:t xml:space="preserve">0.79</w:t>
+              <w:t xml:space="preserve">0.73</w:t>
             </w:r>
           </w:p>
         </w:tc>
@@ -28624,7 +28422,7 @@
               <w:jc w:val="center"/>
             </w:pPr>
             <w:r>
-              <w:t xml:space="preserve">0.78</w:t>
+              <w:t xml:space="preserve">0.67</w:t>
             </w:r>
           </w:p>
         </w:tc>
@@ -28649,7 +28447,7 @@
               <w:jc w:val="center"/>
             </w:pPr>
             <w:r>
-              <w:t xml:space="preserve">4.55</w:t>
+              <w:t xml:space="preserve">4.53</w:t>
             </w:r>
           </w:p>
         </w:tc>
@@ -28661,7 +28459,7 @@
               <w:jc w:val="center"/>
             </w:pPr>
             <w:r>
-              <w:t xml:space="preserve">2.91</w:t>
+              <w:t xml:space="preserve">2.51</w:t>
             </w:r>
           </w:p>
         </w:tc>
@@ -28673,7 +28471,7 @@
               <w:jc w:val="center"/>
             </w:pPr>
             <w:r>
-              <w:t xml:space="preserve">1.61</w:t>
+              <w:t xml:space="preserve">1.36</w:t>
             </w:r>
           </w:p>
         </w:tc>
@@ -28685,7 +28483,7 @@
               <w:jc w:val="center"/>
             </w:pPr>
             <w:r>
-              <w:t xml:space="preserve">0.74</w:t>
+              <w:t xml:space="preserve">0.68</w:t>
             </w:r>
           </w:p>
         </w:tc>
@@ -28697,7 +28495,7 @@
               <w:jc w:val="center"/>
             </w:pPr>
             <w:r>
-              <w:t xml:space="preserve">0.7</w:t>
+              <w:t xml:space="preserve">0.68</w:t>
             </w:r>
           </w:p>
         </w:tc>
@@ -28722,7 +28520,7 @@
               <w:jc w:val="center"/>
             </w:pPr>
             <w:r>
-              <w:t xml:space="preserve">5.85</w:t>
+              <w:t xml:space="preserve">5.74</w:t>
             </w:r>
           </w:p>
         </w:tc>
@@ -28734,7 +28532,7 @@
               <w:jc w:val="center"/>
             </w:pPr>
             <w:r>
-              <w:t xml:space="preserve">2.96</w:t>
+              <w:t xml:space="preserve">2.57</w:t>
             </w:r>
           </w:p>
         </w:tc>
@@ -28746,7 +28544,7 @@
               <w:jc w:val="center"/>
             </w:pPr>
             <w:r>
-              <w:t xml:space="preserve">1.72</w:t>
+              <w:t xml:space="preserve">1.82</w:t>
             </w:r>
           </w:p>
         </w:tc>
@@ -28758,7 +28556,7 @@
               <w:jc w:val="center"/>
             </w:pPr>
             <w:r>
-              <w:t xml:space="preserve">0.96</w:t>
+              <w:t xml:space="preserve">0.85</w:t>
             </w:r>
           </w:p>
         </w:tc>
@@ -28770,7 +28568,7 @@
               <w:jc w:val="center"/>
             </w:pPr>
             <w:r>
-              <w:t xml:space="preserve">0.95</w:t>
+              <w:t xml:space="preserve">0.85</w:t>
             </w:r>
           </w:p>
         </w:tc>
@@ -28795,7 +28593,7 @@
               <w:jc w:val="center"/>
             </w:pPr>
             <w:r>
-              <w:t xml:space="preserve">6.39</w:t>
+              <w:t xml:space="preserve">6.05</w:t>
             </w:r>
           </w:p>
         </w:tc>
@@ -28807,7 +28605,7 @@
               <w:jc w:val="center"/>
             </w:pPr>
             <w:r>
-              <w:t xml:space="preserve">2.93</w:t>
+              <w:t xml:space="preserve">2.83</w:t>
             </w:r>
           </w:p>
         </w:tc>
@@ -28819,7 +28617,7 @@
               <w:jc w:val="center"/>
             </w:pPr>
             <w:r>
-              <w:t xml:space="preserve">1.58</w:t>
+              <w:t xml:space="preserve">1.82</w:t>
             </w:r>
           </w:p>
         </w:tc>
@@ -28831,7 +28629,7 @@
               <w:jc w:val="center"/>
             </w:pPr>
             <w:r>
-              <w:t xml:space="preserve">1.38</w:t>
+              <w:t xml:space="preserve">1.21</w:t>
             </w:r>
           </w:p>
         </w:tc>
@@ -28843,7 +28641,7 @@
               <w:jc w:val="center"/>
             </w:pPr>
             <w:r>
-              <w:t xml:space="preserve">1.32</w:t>
+              <w:t xml:space="preserve">1.33</w:t>
             </w:r>
           </w:p>
         </w:tc>
@@ -28868,7 +28666,7 @@
               <w:jc w:val="center"/>
             </w:pPr>
             <w:r>
-              <w:t xml:space="preserve">8.49</w:t>
+              <w:t xml:space="preserve">7.02</w:t>
             </w:r>
           </w:p>
         </w:tc>
@@ -28880,7 +28678,7 @@
               <w:jc w:val="center"/>
             </w:pPr>
             <w:r>
-              <w:t xml:space="preserve">3.29</w:t>
+              <w:t xml:space="preserve">3.28</w:t>
             </w:r>
           </w:p>
         </w:tc>
@@ -28892,7 +28690,7 @@
               <w:jc w:val="center"/>
             </w:pPr>
             <w:r>
-              <w:t xml:space="preserve">1.52</w:t>
+              <w:t xml:space="preserve">1.49</w:t>
             </w:r>
           </w:p>
         </w:tc>
@@ -28904,7 +28702,7 @@
               <w:jc w:val="center"/>
             </w:pPr>
             <w:r>
-              <w:t xml:space="preserve">1.36</w:t>
+              <w:t xml:space="preserve">1.27</w:t>
             </w:r>
           </w:p>
         </w:tc>
@@ -28916,7 +28714,7 @@
               <w:jc w:val="center"/>
             </w:pPr>
             <w:r>
-              <w:t xml:space="preserve">1.49</w:t>
+              <w:t xml:space="preserve">1.27</w:t>
             </w:r>
           </w:p>
         </w:tc>
@@ -28941,7 +28739,7 @@
               <w:jc w:val="center"/>
             </w:pPr>
             <w:r>
-              <w:t xml:space="preserve">0.0</w:t>
+              <w:t xml:space="preserve">0.00</w:t>
             </w:r>
           </w:p>
         </w:tc>
@@ -28953,7 +28751,7 @@
               <w:jc w:val="center"/>
             </w:pPr>
             <w:r>
-              <w:t xml:space="preserve">0.0</w:t>
+              <w:t xml:space="preserve">0.00</w:t>
             </w:r>
           </w:p>
         </w:tc>
@@ -28965,7 +28763,7 @@
               <w:jc w:val="center"/>
             </w:pPr>
             <w:r>
-              <w:t xml:space="preserve">0.0</w:t>
+              <w:t xml:space="preserve">0.00</w:t>
             </w:r>
           </w:p>
         </w:tc>
@@ -28977,7 +28775,7 @@
               <w:jc w:val="center"/>
             </w:pPr>
             <w:r>
-              <w:t xml:space="preserve">0.0</w:t>
+              <w:t xml:space="preserve">0.00</w:t>
             </w:r>
           </w:p>
         </w:tc>
@@ -28989,7 +28787,7 @@
               <w:jc w:val="center"/>
             </w:pPr>
             <w:r>
-              <w:t xml:space="preserve">0.0</w:t>
+              <w:t xml:space="preserve">0.00</w:t>
             </w:r>
           </w:p>
         </w:tc>
@@ -29008,6 +28806,10 @@
         <w:pStyle w:val="TableCaption"/>
       </w:pPr>
       <w:r>
+        <w:rPr>
+          <w:b/>
+          <w:bCs/>
+        </w:rPr>
         <w:t xml:space="preserve">Table S8. Calibrated growth regional scale factors (</w:t>
       </w:r>
       <m:oMath>
@@ -29044,24 +28846,28 @@
         </m:sSub>
       </m:oMath>
       <w:r>
+        <w:rPr>
+          <w:b/>
+          <w:bCs/>
+        </w:rPr>
         <w:t xml:space="preserve">) for each reef group (rows) and functional group (columns).</w:t>
       </w:r>
     </w:p>
     <w:tbl>
       <w:tblPr>
         <w:tblStyle w:val="Table"/>
-        <w:tblW w:type="pct" w:w="4922"/>
+        <w:tblW w:type="pct" w:w="4925"/>
         <w:tblLayout w:type="fixed"/>
         <w:tblLook w:firstRow="1" w:lastRow="0" w:firstColumn="0" w:lastColumn="0" w:noHBand="0" w:noVBand="0" w:val="0020"/>
         <w:tblCaption w:val="Table S8. Calibrated growth regional scale factors (\mathbf{\Xi}_{\mathbf{g,}\mathcal{l}}) for each reef group (rows) and functional group (columns)."/>
       </w:tblPr>
       <w:tblGrid>
-        <w:gridCol w:w="309"/>
-        <w:gridCol w:w="1485"/>
-        <w:gridCol w:w="1485"/>
-        <w:gridCol w:w="1546"/>
-        <w:gridCol w:w="1485"/>
-        <w:gridCol w:w="1485"/>
+        <w:gridCol w:w="354"/>
+        <w:gridCol w:w="1477"/>
+        <w:gridCol w:w="1477"/>
+        <w:gridCol w:w="1536"/>
+        <w:gridCol w:w="1477"/>
+        <w:gridCol w:w="1477"/>
       </w:tblGrid>
       <w:tr>
         <w:trPr>
@@ -29271,7 +29077,7 @@
               <w:jc w:val="center"/>
             </w:pPr>
             <w:r>
-              <w:t xml:space="preserve">0.89</w:t>
+              <w:t xml:space="preserve">1.03</w:t>
             </w:r>
           </w:p>
         </w:tc>
@@ -29283,7 +29089,7 @@
               <w:jc w:val="center"/>
             </w:pPr>
             <w:r>
-              <w:t xml:space="preserve">0.95</w:t>
+              <w:t xml:space="preserve">0.72</w:t>
             </w:r>
           </w:p>
         </w:tc>
@@ -29295,7 +29101,7 @@
               <w:jc w:val="center"/>
             </w:pPr>
             <w:r>
-              <w:t xml:space="preserve">1.49</w:t>
+              <w:t xml:space="preserve">1.40</w:t>
             </w:r>
           </w:p>
         </w:tc>
@@ -29307,7 +29113,7 @@
               <w:jc w:val="center"/>
             </w:pPr>
             <w:r>
-              <w:t xml:space="preserve">0.78</w:t>
+              <w:t xml:space="preserve">0.70</w:t>
             </w:r>
           </w:p>
         </w:tc>
@@ -29319,7 +29125,7 @@
               <w:jc w:val="center"/>
             </w:pPr>
             <w:r>
-              <w:t xml:space="preserve">0.75</w:t>
+              <w:t xml:space="preserve">0.70</w:t>
             </w:r>
           </w:p>
         </w:tc>
@@ -29344,7 +29150,7 @@
               <w:jc w:val="center"/>
             </w:pPr>
             <w:r>
-              <w:t xml:space="preserve">1.01</w:t>
+              <w:t xml:space="preserve">1.08</w:t>
             </w:r>
           </w:p>
         </w:tc>
@@ -29356,7 +29162,7 @@
               <w:jc w:val="center"/>
             </w:pPr>
             <w:r>
-              <w:t xml:space="preserve">1.28</w:t>
+              <w:t xml:space="preserve">1.10</w:t>
             </w:r>
           </w:p>
         </w:tc>
@@ -29368,7 +29174,7 @@
               <w:jc w:val="center"/>
             </w:pPr>
             <w:r>
-              <w:t xml:space="preserve">0.8</w:t>
+              <w:t xml:space="preserve">1.27</w:t>
             </w:r>
           </w:p>
         </w:tc>
@@ -29380,7 +29186,7 @@
               <w:jc w:val="center"/>
             </w:pPr>
             <w:r>
-              <w:t xml:space="preserve">0.98</w:t>
+              <w:t xml:space="preserve">0.78</w:t>
             </w:r>
           </w:p>
         </w:tc>
@@ -29392,7 +29198,7 @@
               <w:jc w:val="center"/>
             </w:pPr>
             <w:r>
-              <w:t xml:space="preserve">1.05</w:t>
+              <w:t xml:space="preserve">1.44</w:t>
             </w:r>
           </w:p>
         </w:tc>
@@ -29417,7 +29223,7 @@
               <w:jc w:val="center"/>
             </w:pPr>
             <w:r>
-              <w:t xml:space="preserve">0.92</w:t>
+              <w:t xml:space="preserve">1.08</w:t>
             </w:r>
           </w:p>
         </w:tc>
@@ -29429,7 +29235,7 @@
               <w:jc w:val="center"/>
             </w:pPr>
             <w:r>
-              <w:t xml:space="preserve">1.47</w:t>
+              <w:t xml:space="preserve">1.24</w:t>
             </w:r>
           </w:p>
         </w:tc>
@@ -29441,7 +29247,7 @@
               <w:jc w:val="center"/>
             </w:pPr>
             <w:r>
-              <w:t xml:space="preserve">1.04</w:t>
+              <w:t xml:space="preserve">1.11</w:t>
             </w:r>
           </w:p>
         </w:tc>
@@ -29453,7 +29259,7 @@
               <w:jc w:val="center"/>
             </w:pPr>
             <w:r>
-              <w:t xml:space="preserve">1.26</w:t>
+              <w:t xml:space="preserve">0.70</w:t>
             </w:r>
           </w:p>
         </w:tc>
@@ -29465,7 +29271,7 @@
               <w:jc w:val="center"/>
             </w:pPr>
             <w:r>
-              <w:t xml:space="preserve">1.35</w:t>
+              <w:t xml:space="preserve">0.77</w:t>
             </w:r>
           </w:p>
         </w:tc>
@@ -29490,7 +29296,7 @@
               <w:jc w:val="center"/>
             </w:pPr>
             <w:r>
-              <w:t xml:space="preserve">0.9</w:t>
+              <w:t xml:space="preserve">0.98</w:t>
             </w:r>
           </w:p>
         </w:tc>
@@ -29502,6 +29308,18 @@
               <w:jc w:val="center"/>
             </w:pPr>
             <w:r>
+              <w:t xml:space="preserve">1.37</w:t>
+            </w:r>
+          </w:p>
+        </w:tc>
+        <w:tc>
+          <w:tcPr/>
+          <w:p>
+            <w:pPr>
+              <w:pStyle w:val="Compact"/>
+              <w:jc w:val="center"/>
+            </w:pPr>
+            <w:r>
               <w:t xml:space="preserve">0.74</w:t>
             </w:r>
           </w:p>
@@ -29514,7 +29332,7 @@
               <w:jc w:val="center"/>
             </w:pPr>
             <w:r>
-              <w:t xml:space="preserve">1.01</w:t>
+              <w:t xml:space="preserve">1.38</w:t>
             </w:r>
           </w:p>
         </w:tc>
@@ -29526,19 +29344,7 @@
               <w:jc w:val="center"/>
             </w:pPr>
             <w:r>
-              <w:t xml:space="preserve">1.31</w:t>
-            </w:r>
-          </w:p>
-        </w:tc>
-        <w:tc>
-          <w:tcPr/>
-          <w:p>
-            <w:pPr>
-              <w:pStyle w:val="Compact"/>
-              <w:jc w:val="center"/>
-            </w:pPr>
-            <w:r>
-              <w:t xml:space="preserve">1.49</w:t>
+              <w:t xml:space="preserve">1.50</w:t>
             </w:r>
           </w:p>
         </w:tc>
@@ -29563,7 +29369,7 @@
               <w:jc w:val="center"/>
             </w:pPr>
             <w:r>
-              <w:t xml:space="preserve">0.88</w:t>
+              <w:t xml:space="preserve">0.72</w:t>
             </w:r>
           </w:p>
         </w:tc>
@@ -29575,7 +29381,7 @@
               <w:jc w:val="center"/>
             </w:pPr>
             <w:r>
-              <w:t xml:space="preserve">0.81</w:t>
+              <w:t xml:space="preserve">0.90</w:t>
             </w:r>
           </w:p>
         </w:tc>
@@ -29587,7 +29393,7 @@
               <w:jc w:val="center"/>
             </w:pPr>
             <w:r>
-              <w:t xml:space="preserve">0.84</w:t>
+              <w:t xml:space="preserve">0.73</w:t>
             </w:r>
           </w:p>
         </w:tc>
@@ -29599,7 +29405,7 @@
               <w:jc w:val="center"/>
             </w:pPr>
             <w:r>
-              <w:t xml:space="preserve">0.92</w:t>
+              <w:t xml:space="preserve">1.24</w:t>
             </w:r>
           </w:p>
         </w:tc>
@@ -29611,7 +29417,7 @@
               <w:jc w:val="center"/>
             </w:pPr>
             <w:r>
-              <w:t xml:space="preserve">1.0</w:t>
+              <w:t xml:space="preserve">1.18</w:t>
             </w:r>
           </w:p>
         </w:tc>
@@ -29636,7 +29442,7 @@
               <w:jc w:val="center"/>
             </w:pPr>
             <w:r>
-              <w:t xml:space="preserve">1.01</w:t>
+              <w:t xml:space="preserve">0.88</w:t>
             </w:r>
           </w:p>
         </w:tc>
@@ -29648,7 +29454,7 @@
               <w:jc w:val="center"/>
             </w:pPr>
             <w:r>
-              <w:t xml:space="preserve">0.71</w:t>
+              <w:t xml:space="preserve">0.70</w:t>
             </w:r>
           </w:p>
         </w:tc>
@@ -29660,7 +29466,7 @@
               <w:jc w:val="center"/>
             </w:pPr>
             <w:r>
-              <w:t xml:space="preserve">0.88</w:t>
+              <w:t xml:space="preserve">0.89</w:t>
             </w:r>
           </w:p>
         </w:tc>
@@ -29672,7 +29478,7 @@
               <w:jc w:val="center"/>
             </w:pPr>
             <w:r>
-              <w:t xml:space="preserve">0.89</w:t>
+              <w:t xml:space="preserve">1.09</w:t>
             </w:r>
           </w:p>
         </w:tc>
@@ -29684,7 +29490,7 @@
               <w:jc w:val="center"/>
             </w:pPr>
             <w:r>
-              <w:t xml:space="preserve">0.82</w:t>
+              <w:t xml:space="preserve">0.79</w:t>
             </w:r>
           </w:p>
         </w:tc>
@@ -29709,7 +29515,7 @@
               <w:jc w:val="center"/>
             </w:pPr>
             <w:r>
-              <w:t xml:space="preserve">0.97</w:t>
+              <w:t xml:space="preserve">0.84</w:t>
             </w:r>
           </w:p>
         </w:tc>
@@ -29721,7 +29527,7 @@
               <w:jc w:val="center"/>
             </w:pPr>
             <w:r>
-              <w:t xml:space="preserve">1.23</w:t>
+              <w:t xml:space="preserve">0.88</w:t>
             </w:r>
           </w:p>
         </w:tc>
@@ -29733,7 +29539,7 @@
               <w:jc w:val="center"/>
             </w:pPr>
             <w:r>
-              <w:t xml:space="preserve">1.28</w:t>
+              <w:t xml:space="preserve">0.86</w:t>
             </w:r>
           </w:p>
         </w:tc>
@@ -29745,7 +29551,7 @@
               <w:jc w:val="center"/>
             </w:pPr>
             <w:r>
-              <w:t xml:space="preserve">1.16</w:t>
+              <w:t xml:space="preserve">0.87</w:t>
             </w:r>
           </w:p>
         </w:tc>
@@ -29757,7 +29563,7 @@
               <w:jc w:val="center"/>
             </w:pPr>
             <w:r>
-              <w:t xml:space="preserve">0.73</w:t>
+              <w:t xml:space="preserve">0.70</w:t>
             </w:r>
           </w:p>
         </w:tc>
@@ -29782,7 +29588,7 @@
               <w:jc w:val="center"/>
             </w:pPr>
             <w:r>
-              <w:t xml:space="preserve">0.91</w:t>
+              <w:t xml:space="preserve">0.90</w:t>
             </w:r>
           </w:p>
         </w:tc>
@@ -29794,7 +29600,7 @@
               <w:jc w:val="center"/>
             </w:pPr>
             <w:r>
-              <w:t xml:space="preserve">0.83</w:t>
+              <w:t xml:space="preserve">0.85</w:t>
             </w:r>
           </w:p>
         </w:tc>
@@ -29806,7 +29612,7 @@
               <w:jc w:val="center"/>
             </w:pPr>
             <w:r>
-              <w:t xml:space="preserve">0.86</w:t>
+              <w:t xml:space="preserve">0.75</w:t>
             </w:r>
           </w:p>
         </w:tc>
@@ -29818,7 +29624,7 @@
               <w:jc w:val="center"/>
             </w:pPr>
             <w:r>
-              <w:t xml:space="preserve">1.26</w:t>
+              <w:t xml:space="preserve">0.78</w:t>
             </w:r>
           </w:p>
         </w:tc>
@@ -29830,7 +29636,7 @@
               <w:jc w:val="center"/>
             </w:pPr>
             <w:r>
-              <w:t xml:space="preserve">1.06</w:t>
+              <w:t xml:space="preserve">1.09</w:t>
             </w:r>
           </w:p>
         </w:tc>
@@ -29855,6 +29661,30 @@
               <w:jc w:val="center"/>
             </w:pPr>
             <w:r>
+              <w:t xml:space="preserve">1.06</w:t>
+            </w:r>
+          </w:p>
+        </w:tc>
+        <w:tc>
+          <w:tcPr/>
+          <w:p>
+            <w:pPr>
+              <w:pStyle w:val="Compact"/>
+              <w:jc w:val="center"/>
+            </w:pPr>
+            <w:r>
+              <w:t xml:space="preserve">1.00</w:t>
+            </w:r>
+          </w:p>
+        </w:tc>
+        <w:tc>
+          <w:tcPr/>
+          <w:p>
+            <w:pPr>
+              <w:pStyle w:val="Compact"/>
+              <w:jc w:val="center"/>
+            </w:pPr>
+            <w:r>
               <w:t xml:space="preserve">0.87</w:t>
             </w:r>
           </w:p>
@@ -29867,7 +29697,7 @@
               <w:jc w:val="center"/>
             </w:pPr>
             <w:r>
-              <w:t xml:space="preserve">0.87</w:t>
+              <w:t xml:space="preserve">1.03</w:t>
             </w:r>
           </w:p>
         </w:tc>
@@ -29879,31 +29709,7 @@
               <w:jc w:val="center"/>
             </w:pPr>
             <w:r>
-              <w:t xml:space="preserve">0.81</w:t>
-            </w:r>
-          </w:p>
-        </w:tc>
-        <w:tc>
-          <w:tcPr/>
-          <w:p>
-            <w:pPr>
-              <w:pStyle w:val="Compact"/>
-              <w:jc w:val="center"/>
-            </w:pPr>
-            <w:r>
-              <w:t xml:space="preserve">0.86</w:t>
-            </w:r>
-          </w:p>
-        </w:tc>
-        <w:tc>
-          <w:tcPr/>
-          <w:p>
-            <w:pPr>
-              <w:pStyle w:val="Compact"/>
-              <w:jc w:val="center"/>
-            </w:pPr>
-            <w:r>
-              <w:t xml:space="preserve">0.84</w:t>
+              <w:t xml:space="preserve">0.76</w:t>
             </w:r>
           </w:p>
         </w:tc>
@@ -29928,7 +29734,7 @@
               <w:jc w:val="center"/>
             </w:pPr>
             <w:r>
-              <w:t xml:space="preserve">1.03</w:t>
+              <w:t xml:space="preserve">1.08</w:t>
             </w:r>
           </w:p>
         </w:tc>
@@ -29940,7 +29746,7 @@
               <w:jc w:val="center"/>
             </w:pPr>
             <w:r>
-              <w:t xml:space="preserve">1.22</w:t>
+              <w:t xml:space="preserve">0.98</w:t>
             </w:r>
           </w:p>
         </w:tc>
@@ -29952,7 +29758,7 @@
               <w:jc w:val="center"/>
             </w:pPr>
             <w:r>
-              <w:t xml:space="preserve">0.81</w:t>
+              <w:t xml:space="preserve">1.18</w:t>
             </w:r>
           </w:p>
         </w:tc>
@@ -29964,7 +29770,7 @@
               <w:jc w:val="center"/>
             </w:pPr>
             <w:r>
-              <w:t xml:space="preserve">0.93</w:t>
+              <w:t xml:space="preserve">1.37</w:t>
             </w:r>
           </w:p>
         </w:tc>
@@ -29976,7 +29782,7 @@
               <w:jc w:val="center"/>
             </w:pPr>
             <w:r>
-              <w:t xml:space="preserve">0.77</w:t>
+              <w:t xml:space="preserve">0.83</w:t>
             </w:r>
           </w:p>
         </w:tc>
@@ -30001,7 +29807,7 @@
               <w:jc w:val="center"/>
             </w:pPr>
             <w:r>
-              <w:t xml:space="preserve">1.04</w:t>
+              <w:t xml:space="preserve">0.71</w:t>
             </w:r>
           </w:p>
         </w:tc>
@@ -30013,7 +29819,7 @@
               <w:jc w:val="center"/>
             </w:pPr>
             <w:r>
-              <w:t xml:space="preserve">0.85</w:t>
+              <w:t xml:space="preserve">0.79</w:t>
             </w:r>
           </w:p>
         </w:tc>
@@ -30025,6 +29831,18 @@
               <w:jc w:val="center"/>
             </w:pPr>
             <w:r>
+              <w:t xml:space="preserve">0.78</w:t>
+            </w:r>
+          </w:p>
+        </w:tc>
+        <w:tc>
+          <w:tcPr/>
+          <w:p>
+            <w:pPr>
+              <w:pStyle w:val="Compact"/>
+              <w:jc w:val="center"/>
+            </w:pPr>
+            <w:r>
               <w:t xml:space="preserve">0.74</w:t>
             </w:r>
           </w:p>
@@ -30037,19 +29855,7 @@
               <w:jc w:val="center"/>
             </w:pPr>
             <w:r>
-              <w:t xml:space="preserve">0.91</w:t>
-            </w:r>
-          </w:p>
-        </w:tc>
-        <w:tc>
-          <w:tcPr/>
-          <w:p>
-            <w:pPr>
-              <w:pStyle w:val="Compact"/>
-              <w:jc w:val="center"/>
-            </w:pPr>
-            <w:r>
-              <w:t xml:space="preserve">0.99</w:t>
+              <w:t xml:space="preserve">0.72</w:t>
             </w:r>
           </w:p>
         </w:tc>
@@ -30074,7 +29880,7 @@
               <w:jc w:val="center"/>
             </w:pPr>
             <w:r>
-              <w:t xml:space="preserve">1.0</w:t>
+              <w:t xml:space="preserve">1.06</w:t>
             </w:r>
           </w:p>
         </w:tc>
@@ -30086,7 +29892,7 @@
               <w:jc w:val="center"/>
             </w:pPr>
             <w:r>
-              <w:t xml:space="preserve">1.05</w:t>
+              <w:t xml:space="preserve">0.86</w:t>
             </w:r>
           </w:p>
         </w:tc>
@@ -30098,7 +29904,7 @@
               <w:jc w:val="center"/>
             </w:pPr>
             <w:r>
-              <w:t xml:space="preserve">0.94</w:t>
+              <w:t xml:space="preserve">0.82</w:t>
             </w:r>
           </w:p>
         </w:tc>
@@ -30110,7 +29916,7 @@
               <w:jc w:val="center"/>
             </w:pPr>
             <w:r>
-              <w:t xml:space="preserve">1.0</w:t>
+              <w:t xml:space="preserve">0.70</w:t>
             </w:r>
           </w:p>
         </w:tc>
@@ -30122,7 +29928,7 @@
               <w:jc w:val="center"/>
             </w:pPr>
             <w:r>
-              <w:t xml:space="preserve">0.84</w:t>
+              <w:t xml:space="preserve">0.91</w:t>
             </w:r>
           </w:p>
         </w:tc>
@@ -30141,6 +29947,10 @@
         <w:pStyle w:val="TableCaption"/>
       </w:pPr>
       <w:r>
+        <w:rPr>
+          <w:b/>
+          <w:bCs/>
+        </w:rPr>
         <w:t xml:space="preserve">Table S9. Calibrated background mortality scale factors (</w:t>
       </w:r>
       <m:oMath>
@@ -30177,24 +29987,28 @@
         </m:sSub>
       </m:oMath>
       <w:r>
+        <w:rPr>
+          <w:b/>
+          <w:bCs/>
+        </w:rPr>
         <w:t xml:space="preserve">) for each reef group (rows) and functional group (columns).</w:t>
       </w:r>
     </w:p>
     <w:tbl>
       <w:tblPr>
         <w:tblStyle w:val="Table"/>
-        <w:tblW w:type="pct" w:w="4922"/>
+        <w:tblW w:type="pct" w:w="4925"/>
         <w:tblLayout w:type="fixed"/>
         <w:tblLook w:firstRow="1" w:lastRow="0" w:firstColumn="0" w:lastColumn="0" w:noHBand="0" w:noVBand="0" w:val="0020"/>
         <w:tblCaption w:val="Table S9. Calibrated background mortality scale factors (\mathbf{\Upsilon}_{\mathbf{g,}\mathcal{l}}) for each reef group (rows) and functional group (columns)."/>
       </w:tblPr>
       <w:tblGrid>
-        <w:gridCol w:w="309"/>
-        <w:gridCol w:w="1485"/>
-        <w:gridCol w:w="1485"/>
-        <w:gridCol w:w="1546"/>
-        <w:gridCol w:w="1485"/>
-        <w:gridCol w:w="1485"/>
+        <w:gridCol w:w="354"/>
+        <w:gridCol w:w="1477"/>
+        <w:gridCol w:w="1477"/>
+        <w:gridCol w:w="1536"/>
+        <w:gridCol w:w="1477"/>
+        <w:gridCol w:w="1477"/>
       </w:tblGrid>
       <w:tr>
         <w:trPr>
@@ -30404,7 +30218,7 @@
               <w:jc w:val="center"/>
             </w:pPr>
             <w:r>
-              <w:t xml:space="preserve">0.18</w:t>
+              <w:t xml:space="preserve">-0.66</w:t>
             </w:r>
           </w:p>
         </w:tc>
@@ -30416,7 +30230,7 @@
               <w:jc w:val="center"/>
             </w:pPr>
             <w:r>
-              <w:t xml:space="preserve">-0.16</w:t>
+              <w:t xml:space="preserve">-0.66</w:t>
             </w:r>
           </w:p>
         </w:tc>
@@ -30428,7 +30242,7 @@
               <w:jc w:val="center"/>
             </w:pPr>
             <w:r>
-              <w:t xml:space="preserve">0.76</w:t>
+              <w:t xml:space="preserve">-0.47</w:t>
             </w:r>
           </w:p>
         </w:tc>
@@ -30440,7 +30254,7 @@
               <w:jc w:val="center"/>
             </w:pPr>
             <w:r>
-              <w:t xml:space="preserve">0.6</w:t>
+              <w:t xml:space="preserve">0.02</w:t>
             </w:r>
           </w:p>
         </w:tc>
@@ -30452,7 +30266,7 @@
               <w:jc w:val="center"/>
             </w:pPr>
             <w:r>
-              <w:t xml:space="preserve">0.29</w:t>
+              <w:t xml:space="preserve">0.26</w:t>
             </w:r>
           </w:p>
         </w:tc>
@@ -30477,7 +30291,7 @@
               <w:jc w:val="center"/>
             </w:pPr>
             <w:r>
-              <w:t xml:space="preserve">0.52</w:t>
+              <w:t xml:space="preserve">1.00</w:t>
             </w:r>
           </w:p>
         </w:tc>
@@ -30489,7 +30303,7 @@
               <w:jc w:val="center"/>
             </w:pPr>
             <w:r>
-              <w:t xml:space="preserve">-0.56</w:t>
+              <w:t xml:space="preserve">0.47</w:t>
             </w:r>
           </w:p>
         </w:tc>
@@ -30501,7 +30315,7 @@
               <w:jc w:val="center"/>
             </w:pPr>
             <w:r>
-              <w:t xml:space="preserve">0.59</w:t>
+              <w:t xml:space="preserve">0.80</w:t>
             </w:r>
           </w:p>
         </w:tc>
@@ -30513,7 +30327,7 @@
               <w:jc w:val="center"/>
             </w:pPr>
             <w:r>
-              <w:t xml:space="preserve">0.12</w:t>
+              <w:t xml:space="preserve">0.65</w:t>
             </w:r>
           </w:p>
         </w:tc>
@@ -30525,7 +30339,7 @@
               <w:jc w:val="center"/>
             </w:pPr>
             <w:r>
-              <w:t xml:space="preserve">-0.39</w:t>
+              <w:t xml:space="preserve">-0.81</w:t>
             </w:r>
           </w:p>
         </w:tc>
@@ -30550,7 +30364,7 @@
               <w:jc w:val="center"/>
             </w:pPr>
             <w:r>
-              <w:t xml:space="preserve">0.97</w:t>
+              <w:t xml:space="preserve">1.00</w:t>
             </w:r>
           </w:p>
         </w:tc>
@@ -30562,7 +30376,7 @@
               <w:jc w:val="center"/>
             </w:pPr>
             <w:r>
-              <w:t xml:space="preserve">0.99</w:t>
+              <w:t xml:space="preserve">0.83</w:t>
             </w:r>
           </w:p>
         </w:tc>
@@ -30574,7 +30388,7 @@
               <w:jc w:val="center"/>
             </w:pPr>
             <w:r>
-              <w:t xml:space="preserve">-0.41</w:t>
+              <w:t xml:space="preserve">-0.40</w:t>
             </w:r>
           </w:p>
         </w:tc>
@@ -30586,7 +30400,7 @@
               <w:jc w:val="center"/>
             </w:pPr>
             <w:r>
-              <w:t xml:space="preserve">0.36</w:t>
+              <w:t xml:space="preserve">-0.80</w:t>
             </w:r>
           </w:p>
         </w:tc>
@@ -30598,7 +30412,7 @@
               <w:jc w:val="center"/>
             </w:pPr>
             <w:r>
-              <w:t xml:space="preserve">0.23</w:t>
+              <w:t xml:space="preserve">-0.36</w:t>
             </w:r>
           </w:p>
         </w:tc>
@@ -30623,7 +30437,7 @@
               <w:jc w:val="center"/>
             </w:pPr>
             <w:r>
-              <w:t xml:space="preserve">-0.62</w:t>
+              <w:t xml:space="preserve">0.20</w:t>
             </w:r>
           </w:p>
         </w:tc>
@@ -30635,7 +30449,7 @@
               <w:jc w:val="center"/>
             </w:pPr>
             <w:r>
-              <w:t xml:space="preserve">-0.27</w:t>
+              <w:t xml:space="preserve">-0.16</w:t>
             </w:r>
           </w:p>
         </w:tc>
@@ -30647,7 +30461,7 @@
               <w:jc w:val="center"/>
             </w:pPr>
             <w:r>
-              <w:t xml:space="preserve">0.05</w:t>
+              <w:t xml:space="preserve">-0.30</w:t>
             </w:r>
           </w:p>
         </w:tc>
@@ -30659,7 +30473,7 @@
               <w:jc w:val="center"/>
             </w:pPr>
             <w:r>
-              <w:t xml:space="preserve">-0.64</w:t>
+              <w:t xml:space="preserve">0.53</w:t>
             </w:r>
           </w:p>
         </w:tc>
@@ -30671,7 +30485,7 @@
               <w:jc w:val="center"/>
             </w:pPr>
             <w:r>
-              <w:t xml:space="preserve">-0.05</w:t>
+              <w:t xml:space="preserve">0.76</w:t>
             </w:r>
           </w:p>
         </w:tc>
@@ -30696,7 +30510,7 @@
               <w:jc w:val="center"/>
             </w:pPr>
             <w:r>
-              <w:t xml:space="preserve">-0.44</w:t>
+              <w:t xml:space="preserve">-0.28</w:t>
             </w:r>
           </w:p>
         </w:tc>
@@ -30708,7 +30522,7 @@
               <w:jc w:val="center"/>
             </w:pPr>
             <w:r>
-              <w:t xml:space="preserve">-0.76</w:t>
+              <w:t xml:space="preserve">-0.65</w:t>
             </w:r>
           </w:p>
         </w:tc>
@@ -30720,7 +30534,7 @@
               <w:jc w:val="center"/>
             </w:pPr>
             <w:r>
-              <w:t xml:space="preserve">0.24</w:t>
+              <w:t xml:space="preserve">-0.51</w:t>
             </w:r>
           </w:p>
         </w:tc>
@@ -30732,7 +30546,7 @@
               <w:jc w:val="center"/>
             </w:pPr>
             <w:r>
-              <w:t xml:space="preserve">-0.92</w:t>
+              <w:t xml:space="preserve">-0.98</w:t>
             </w:r>
           </w:p>
         </w:tc>
@@ -30744,7 +30558,7 @@
               <w:jc w:val="center"/>
             </w:pPr>
             <w:r>
-              <w:t xml:space="preserve">-0.01</w:t>
+              <w:t xml:space="preserve">-0.15</w:t>
             </w:r>
           </w:p>
         </w:tc>
@@ -30769,7 +30583,7 @@
               <w:jc w:val="center"/>
             </w:pPr>
             <w:r>
-              <w:t xml:space="preserve">-0.94</w:t>
+              <w:t xml:space="preserve">-0.59</w:t>
             </w:r>
           </w:p>
         </w:tc>
@@ -30781,7 +30595,7 @@
               <w:jc w:val="center"/>
             </w:pPr>
             <w:r>
-              <w:t xml:space="preserve">-0.89</w:t>
+              <w:t xml:space="preserve">-0.47</w:t>
             </w:r>
           </w:p>
         </w:tc>
@@ -30793,7 +30607,7 @@
               <w:jc w:val="center"/>
             </w:pPr>
             <w:r>
-              <w:t xml:space="preserve">0.33</w:t>
+              <w:t xml:space="preserve">-0.68</w:t>
             </w:r>
           </w:p>
         </w:tc>
@@ -30805,7 +30619,7 @@
               <w:jc w:val="center"/>
             </w:pPr>
             <w:r>
-              <w:t xml:space="preserve">0.83</w:t>
+              <w:t xml:space="preserve">0.10</w:t>
             </w:r>
           </w:p>
         </w:tc>
@@ -30817,7 +30631,7 @@
               <w:jc w:val="center"/>
             </w:pPr>
             <w:r>
-              <w:t xml:space="preserve">-0.59</w:t>
+              <w:t xml:space="preserve">-0.73</w:t>
             </w:r>
           </w:p>
         </w:tc>
@@ -30842,7 +30656,7 @@
               <w:jc w:val="center"/>
             </w:pPr>
             <w:r>
-              <w:t xml:space="preserve">-0.2</w:t>
+              <w:t xml:space="preserve">-0.21</w:t>
             </w:r>
           </w:p>
         </w:tc>
@@ -30854,7 +30668,7 @@
               <w:jc w:val="center"/>
             </w:pPr>
             <w:r>
-              <w:t xml:space="preserve">0.25</w:t>
+              <w:t xml:space="preserve">-0.27</w:t>
             </w:r>
           </w:p>
         </w:tc>
@@ -30866,7 +30680,7 @@
               <w:jc w:val="center"/>
             </w:pPr>
             <w:r>
-              <w:t xml:space="preserve">-0.8</w:t>
+              <w:t xml:space="preserve">0.62</w:t>
             </w:r>
           </w:p>
         </w:tc>
@@ -30878,7 +30692,7 @@
               <w:jc w:val="center"/>
             </w:pPr>
             <w:r>
-              <w:t xml:space="preserve">0.8</w:t>
+              <w:t xml:space="preserve">1.00</w:t>
             </w:r>
           </w:p>
         </w:tc>
@@ -30890,7 +30704,7 @@
               <w:jc w:val="center"/>
             </w:pPr>
             <w:r>
-              <w:t xml:space="preserve">0.31</w:t>
+              <w:t xml:space="preserve">0.84</w:t>
             </w:r>
           </w:p>
         </w:tc>
@@ -30915,7 +30729,7 @@
               <w:jc w:val="center"/>
             </w:pPr>
             <w:r>
-              <w:t xml:space="preserve">-0.61</w:t>
+              <w:t xml:space="preserve">-1.00</w:t>
             </w:r>
           </w:p>
         </w:tc>
@@ -30927,7 +30741,7 @@
               <w:jc w:val="center"/>
             </w:pPr>
             <w:r>
-              <w:t xml:space="preserve">0.71</w:t>
+              <w:t xml:space="preserve">-0.69</w:t>
             </w:r>
           </w:p>
         </w:tc>
@@ -30939,7 +30753,7 @@
               <w:jc w:val="center"/>
             </w:pPr>
             <w:r>
-              <w:t xml:space="preserve">-0.56</w:t>
+              <w:t xml:space="preserve">-0.79</w:t>
             </w:r>
           </w:p>
         </w:tc>
@@ -30951,7 +30765,7 @@
               <w:jc w:val="center"/>
             </w:pPr>
             <w:r>
-              <w:t xml:space="preserve">-0.2</w:t>
+              <w:t xml:space="preserve">0.96</w:t>
             </w:r>
           </w:p>
         </w:tc>
@@ -30963,7 +30777,7 @@
               <w:jc w:val="center"/>
             </w:pPr>
             <w:r>
-              <w:t xml:space="preserve">0.98</w:t>
+              <w:t xml:space="preserve">0.83</w:t>
             </w:r>
           </w:p>
         </w:tc>
@@ -30988,7 +30802,7 @@
               <w:jc w:val="center"/>
             </w:pPr>
             <w:r>
-              <w:t xml:space="preserve">-0.03</w:t>
+              <w:t xml:space="preserve">-0.14</w:t>
             </w:r>
           </w:p>
         </w:tc>
@@ -31000,7 +30814,7 @@
               <w:jc w:val="center"/>
             </w:pPr>
             <w:r>
-              <w:t xml:space="preserve">0.29</w:t>
+              <w:t xml:space="preserve">-0.07</w:t>
             </w:r>
           </w:p>
         </w:tc>
@@ -31012,7 +30826,7 @@
               <w:jc w:val="center"/>
             </w:pPr>
             <w:r>
-              <w:t xml:space="preserve">-0.26</w:t>
+              <w:t xml:space="preserve">0.24</w:t>
             </w:r>
           </w:p>
         </w:tc>
@@ -31024,7 +30838,7 @@
               <w:jc w:val="center"/>
             </w:pPr>
             <w:r>
-              <w:t xml:space="preserve">-0.29</w:t>
+              <w:t xml:space="preserve">-0.09</w:t>
             </w:r>
           </w:p>
         </w:tc>
@@ -31036,7 +30850,7 @@
               <w:jc w:val="center"/>
             </w:pPr>
             <w:r>
-              <w:t xml:space="preserve">-0.87</w:t>
+              <w:t xml:space="preserve">-0.57</w:t>
             </w:r>
           </w:p>
         </w:tc>
@@ -31061,7 +30875,7 @@
               <w:jc w:val="center"/>
             </w:pPr>
             <w:r>
-              <w:t xml:space="preserve">0.75</w:t>
+              <w:t xml:space="preserve">0.99</w:t>
             </w:r>
           </w:p>
         </w:tc>
@@ -31073,7 +30887,7 @@
               <w:jc w:val="center"/>
             </w:pPr>
             <w:r>
-              <w:t xml:space="preserve">0.27</w:t>
+              <w:t xml:space="preserve">1.00</w:t>
             </w:r>
           </w:p>
         </w:tc>
@@ -31085,7 +30899,7 @@
               <w:jc w:val="center"/>
             </w:pPr>
             <w:r>
-              <w:t xml:space="preserve">0.46</w:t>
+              <w:t xml:space="preserve">0.32</w:t>
             </w:r>
           </w:p>
         </w:tc>
@@ -31097,7 +30911,7 @@
               <w:jc w:val="center"/>
             </w:pPr>
             <w:r>
-              <w:t xml:space="preserve">0.55</w:t>
+              <w:t xml:space="preserve">-0.36</w:t>
             </w:r>
           </w:p>
         </w:tc>
@@ -31109,7 +30923,7 @@
               <w:jc w:val="center"/>
             </w:pPr>
             <w:r>
-              <w:t xml:space="preserve">0.47</w:t>
+              <w:t xml:space="preserve">-0.16</w:t>
             </w:r>
           </w:p>
         </w:tc>
@@ -31134,7 +30948,7 @@
               <w:jc w:val="center"/>
             </w:pPr>
             <w:r>
-              <w:t xml:space="preserve">-0.78</w:t>
+              <w:t xml:space="preserve">-0.60</w:t>
             </w:r>
           </w:p>
         </w:tc>
@@ -31146,7 +30960,7 @@
               <w:jc w:val="center"/>
             </w:pPr>
             <w:r>
-              <w:t xml:space="preserve">-0.37</w:t>
+              <w:t xml:space="preserve">-0.88</w:t>
             </w:r>
           </w:p>
         </w:tc>
@@ -31158,7 +30972,7 @@
               <w:jc w:val="center"/>
             </w:pPr>
             <w:r>
-              <w:t xml:space="preserve">-0.3</w:t>
+              <w:t xml:space="preserve">-0.43</w:t>
             </w:r>
           </w:p>
         </w:tc>
@@ -31182,7 +30996,7 @@
               <w:jc w:val="center"/>
             </w:pPr>
             <w:r>
-              <w:t xml:space="preserve">-0.82</w:t>
+              <w:t xml:space="preserve">-0.93</w:t>
             </w:r>
           </w:p>
         </w:tc>
@@ -31207,7 +31021,7 @@
               <w:jc w:val="center"/>
             </w:pPr>
             <w:r>
-              <w:t xml:space="preserve">0.61</w:t>
+              <w:t xml:space="preserve">-0.32</w:t>
             </w:r>
           </w:p>
         </w:tc>
@@ -31219,7 +31033,7 @@
               <w:jc w:val="center"/>
             </w:pPr>
             <w:r>
-              <w:t xml:space="preserve">0.16</w:t>
+              <w:t xml:space="preserve">0.96</w:t>
             </w:r>
           </w:p>
         </w:tc>
@@ -31231,7 +31045,7 @@
               <w:jc w:val="center"/>
             </w:pPr>
             <w:r>
-              <w:t xml:space="preserve">-0.41</w:t>
+              <w:t xml:space="preserve">1.00</w:t>
             </w:r>
           </w:p>
         </w:tc>
@@ -31243,7 +31057,7 @@
               <w:jc w:val="center"/>
             </w:pPr>
             <w:r>
-              <w:t xml:space="preserve">-0.24</w:t>
+              <w:t xml:space="preserve">-0.99</w:t>
             </w:r>
           </w:p>
         </w:tc>
@@ -31255,7 +31069,7 @@
               <w:jc w:val="center"/>
             </w:pPr>
             <w:r>
-              <w:t xml:space="preserve">0.9</w:t>
+              <w:t xml:space="preserve">0.44</w:t>
             </w:r>
           </w:p>
         </w:tc>
@@ -31274,6 +31088,10 @@
         <w:pStyle w:val="TableCaption"/>
       </w:pPr>
       <w:r>
+        <w:rPr>
+          <w:b/>
+          <w:bCs/>
+        </w:rPr>
         <w:t xml:space="preserve">Table S10. Calibrated growth acceleration parameters (</w:t>
       </w:r>
       <m:oMath>
@@ -31305,6 +31123,10 @@
         </m:sSubSup>
       </m:oMath>
       <w:r>
+        <w:rPr>
+          <w:b/>
+          <w:bCs/>
+        </w:rPr>
         <w:t xml:space="preserve">,</w:t>
       </w:r>
       <m:oMath>
@@ -31336,12 +31158,24 @@
         </m:sSubSup>
       </m:oMath>
       <w:r>
-        <w:t xml:space="preserve"> </w:t>
-      </w:r>
-      <w:r>
+        <w:rPr>
+          <w:b/>
+          <w:bCs/>
+        </w:rPr>
+        <w:t xml:space="preserve"> </w:t>
+      </w:r>
+      <w:r>
+        <w:rPr>
+          <w:b/>
+          <w:bCs/>
+        </w:rPr>
         <w:t xml:space="preserve">and</w:t>
       </w:r>
       <w:r>
+        <w:rPr>
+          <w:b/>
+          <w:bCs/>
+        </w:rPr>
         <w:t xml:space="preserve"> </w:t>
       </w:r>
       <m:oMath>
@@ -31373,20 +31207,24 @@
         </m:sSubSup>
       </m:oMath>
       <w:r>
+        <w:rPr>
+          <w:b/>
+          <w:bCs/>
+        </w:rPr>
         <w:t xml:space="preserve">) for each reef group (rows).</w:t>
       </w:r>
     </w:p>
     <w:tbl>
       <w:tblPr>
         <w:tblStyle w:val="Table"/>
-        <w:tblW w:type="pct" w:w="2847"/>
+        <w:tblW w:type="pct" w:w="2778"/>
         <w:tblLayout w:type="fixed"/>
         <w:tblLook w:firstRow="1" w:lastRow="0" w:firstColumn="0" w:lastColumn="0" w:noHBand="0" w:noVBand="0" w:val="0020"/>
         <w:tblCaption w:val="Table S10. Calibrated growth acceleration parameters (\mathbf{\zeta}_{\mathbf{l}}^{\mathbf{h}},\mathbf{\zeta}_{\mathbf{l}}^{\mathbf{m}} and \mathbf{\zeta}_{\mathbf{l}}^{\mathbf{s}}) for each reef group (rows)."/>
       </w:tblPr>
       <w:tblGrid>
-        <w:gridCol w:w="550"/>
-        <w:gridCol w:w="1320"/>
+        <w:gridCol w:w="660"/>
+        <w:gridCol w:w="1100"/>
         <w:gridCol w:w="1320"/>
         <w:gridCol w:w="1320"/>
       </w:tblGrid>
@@ -31459,7 +31297,7 @@
               <w:jc w:val="center"/>
             </w:pPr>
             <w:r>
-              <w:t xml:space="preserve">1.42</w:t>
+              <w:t xml:space="preserve">1.06</w:t>
             </w:r>
           </w:p>
         </w:tc>
@@ -31471,7 +31309,7 @@
               <w:jc w:val="center"/>
             </w:pPr>
             <w:r>
-              <w:t xml:space="preserve">0.24</w:t>
+              <w:t xml:space="preserve">0.07</w:t>
             </w:r>
           </w:p>
         </w:tc>
@@ -31483,7 +31321,7 @@
               <w:jc w:val="center"/>
             </w:pPr>
             <w:r>
-              <w:t xml:space="preserve">-17.15</w:t>
+              <w:t xml:space="preserve">-20.00</w:t>
             </w:r>
           </w:p>
         </w:tc>
@@ -31508,7 +31346,7 @@
               <w:jc w:val="center"/>
             </w:pPr>
             <w:r>
-              <w:t xml:space="preserve">0.05</w:t>
+              <w:t xml:space="preserve">0.00</w:t>
             </w:r>
           </w:p>
         </w:tc>
@@ -31520,7 +31358,7 @@
               <w:jc w:val="center"/>
             </w:pPr>
             <w:r>
-              <w:t xml:space="preserve">0.07</w:t>
+              <w:t xml:space="preserve">0.08</w:t>
             </w:r>
           </w:p>
         </w:tc>
@@ -31532,7 +31370,7 @@
               <w:jc w:val="center"/>
             </w:pPr>
             <w:r>
-              <w:t xml:space="preserve">-16.86</w:t>
+              <w:t xml:space="preserve">-15.42</w:t>
             </w:r>
           </w:p>
         </w:tc>
@@ -31557,7 +31395,7 @@
               <w:jc w:val="center"/>
             </w:pPr>
             <w:r>
-              <w:t xml:space="preserve">0.46</w:t>
+              <w:t xml:space="preserve">0.00</w:t>
             </w:r>
           </w:p>
         </w:tc>
@@ -31569,7 +31407,7 @@
               <w:jc w:val="center"/>
             </w:pPr>
             <w:r>
-              <w:t xml:space="preserve">0.05</w:t>
+              <w:t xml:space="preserve">0.10</w:t>
             </w:r>
           </w:p>
         </w:tc>
@@ -31581,7 +31419,7 @@
               <w:jc w:val="center"/>
             </w:pPr>
             <w:r>
-              <w:t xml:space="preserve">-18.33</w:t>
+              <w:t xml:space="preserve">-19.79</w:t>
             </w:r>
           </w:p>
         </w:tc>
@@ -31606,7 +31444,7 @@
               <w:jc w:val="center"/>
             </w:pPr>
             <w:r>
-              <w:t xml:space="preserve">1.84</w:t>
+              <w:t xml:space="preserve">2.00</w:t>
             </w:r>
           </w:p>
         </w:tc>
@@ -31618,7 +31456,7 @@
               <w:jc w:val="center"/>
             </w:pPr>
             <w:r>
-              <w:t xml:space="preserve">0.16</w:t>
+              <w:t xml:space="preserve">0.21</w:t>
             </w:r>
           </w:p>
         </w:tc>
@@ -31630,7 +31468,7 @@
               <w:jc w:val="center"/>
             </w:pPr>
             <w:r>
-              <w:t xml:space="preserve">-16.82</w:t>
+              <w:t xml:space="preserve">-19.95</w:t>
             </w:r>
           </w:p>
         </w:tc>
@@ -31655,7 +31493,7 @@
               <w:jc w:val="center"/>
             </w:pPr>
             <w:r>
-              <w:t xml:space="preserve">0.27</w:t>
+              <w:t xml:space="preserve">0.01</w:t>
             </w:r>
           </w:p>
         </w:tc>
@@ -31667,7 +31505,7 @@
               <w:jc w:val="center"/>
             </w:pPr>
             <w:r>
-              <w:t xml:space="preserve">0.19</w:t>
+              <w:t xml:space="preserve">0.02</w:t>
             </w:r>
           </w:p>
         </w:tc>
@@ -31679,7 +31517,7 @@
               <w:jc w:val="center"/>
             </w:pPr>
             <w:r>
-              <w:t xml:space="preserve">-18.19</w:t>
+              <w:t xml:space="preserve">-17.27</w:t>
             </w:r>
           </w:p>
         </w:tc>
@@ -31704,7 +31542,7 @@
               <w:jc w:val="center"/>
             </w:pPr>
             <w:r>
-              <w:t xml:space="preserve">0.11</w:t>
+              <w:t xml:space="preserve">1.26</w:t>
             </w:r>
           </w:p>
         </w:tc>
@@ -31716,7 +31554,7 @@
               <w:jc w:val="center"/>
             </w:pPr>
             <w:r>
-              <w:t xml:space="preserve">0.03</w:t>
+              <w:t xml:space="preserve">0.09</w:t>
             </w:r>
           </w:p>
         </w:tc>
@@ -31728,7 +31566,7 @@
               <w:jc w:val="center"/>
             </w:pPr>
             <w:r>
-              <w:t xml:space="preserve">-16.91</w:t>
+              <w:t xml:space="preserve">-19.96</w:t>
             </w:r>
           </w:p>
         </w:tc>
@@ -31753,7 +31591,7 @@
               <w:jc w:val="center"/>
             </w:pPr>
             <w:r>
-              <w:t xml:space="preserve">0.16</w:t>
+              <w:t xml:space="preserve">0.00</w:t>
             </w:r>
           </w:p>
         </w:tc>
@@ -31765,7 +31603,7 @@
               <w:jc w:val="center"/>
             </w:pPr>
             <w:r>
-              <w:t xml:space="preserve">0.05</w:t>
+              <w:t xml:space="preserve">0.03</w:t>
             </w:r>
           </w:p>
         </w:tc>
@@ -31777,7 +31615,7 @@
               <w:jc w:val="center"/>
             </w:pPr>
             <w:r>
-              <w:t xml:space="preserve">-17.55</w:t>
+              <w:t xml:space="preserve">-16.96</w:t>
             </w:r>
           </w:p>
         </w:tc>
@@ -31802,7 +31640,7 @@
               <w:jc w:val="center"/>
             </w:pPr>
             <w:r>
-              <w:t xml:space="preserve">0.33</w:t>
+              <w:t xml:space="preserve">0.00</w:t>
             </w:r>
           </w:p>
         </w:tc>
@@ -31814,7 +31652,7 @@
               <w:jc w:val="center"/>
             </w:pPr>
             <w:r>
-              <w:t xml:space="preserve">0.12</w:t>
+              <w:t xml:space="preserve">0.00</w:t>
             </w:r>
           </w:p>
         </w:tc>
@@ -31826,7 +31664,7 @@
               <w:jc w:val="center"/>
             </w:pPr>
             <w:r>
-              <w:t xml:space="preserve">-18.33</w:t>
+              <w:t xml:space="preserve">-19.33</w:t>
             </w:r>
           </w:p>
         </w:tc>
@@ -31851,7 +31689,7 @@
               <w:jc w:val="center"/>
             </w:pPr>
             <w:r>
-              <w:t xml:space="preserve">0.06</w:t>
+              <w:t xml:space="preserve">0.00</w:t>
             </w:r>
           </w:p>
         </w:tc>
@@ -31863,7 +31701,7 @@
               <w:jc w:val="center"/>
             </w:pPr>
             <w:r>
-              <w:t xml:space="preserve">0.21</w:t>
+              <w:t xml:space="preserve">0.01</w:t>
             </w:r>
           </w:p>
         </w:tc>
@@ -31875,7 +31713,7 @@
               <w:jc w:val="center"/>
             </w:pPr>
             <w:r>
-              <w:t xml:space="preserve">-17.55</w:t>
+              <w:t xml:space="preserve">-16.98</w:t>
             </w:r>
           </w:p>
         </w:tc>
@@ -31900,7 +31738,7 @@
               <w:jc w:val="center"/>
             </w:pPr>
             <w:r>
-              <w:t xml:space="preserve">0.5</w:t>
+              <w:t xml:space="preserve">0.00</w:t>
             </w:r>
           </w:p>
         </w:tc>
@@ -31912,7 +31750,7 @@
               <w:jc w:val="center"/>
             </w:pPr>
             <w:r>
-              <w:t xml:space="preserve">0.08</w:t>
+              <w:t xml:space="preserve">0.07</w:t>
             </w:r>
           </w:p>
         </w:tc>
@@ -31924,7 +31762,7 @@
               <w:jc w:val="center"/>
             </w:pPr>
             <w:r>
-              <w:t xml:space="preserve">-15.43</w:t>
+              <w:t xml:space="preserve">-18.72</w:t>
             </w:r>
           </w:p>
         </w:tc>
@@ -31949,7 +31787,7 @@
               <w:jc w:val="center"/>
             </w:pPr>
             <w:r>
-              <w:t xml:space="preserve">0.37</w:t>
+              <w:t xml:space="preserve">0.53</w:t>
             </w:r>
           </w:p>
         </w:tc>
@@ -31961,7 +31799,7 @@
               <w:jc w:val="center"/>
             </w:pPr>
             <w:r>
-              <w:t xml:space="preserve">0.02</w:t>
+              <w:t xml:space="preserve">0.23</w:t>
             </w:r>
           </w:p>
         </w:tc>
@@ -31973,7 +31811,7 @@
               <w:jc w:val="center"/>
             </w:pPr>
             <w:r>
-              <w:t xml:space="preserve">-16.16</w:t>
+              <w:t xml:space="preserve">-20.00</w:t>
             </w:r>
           </w:p>
         </w:tc>
@@ -31998,7 +31836,7 @@
               <w:jc w:val="center"/>
             </w:pPr>
             <w:r>
-              <w:t xml:space="preserve">1.54</w:t>
+              <w:t xml:space="preserve">0.05</w:t>
             </w:r>
           </w:p>
         </w:tc>
@@ -32010,7 +31848,7 @@
               <w:jc w:val="center"/>
             </w:pPr>
             <w:r>
-              <w:t xml:space="preserve">0.15</w:t>
+              <w:t xml:space="preserve">0.03</w:t>
             </w:r>
           </w:p>
         </w:tc>
@@ -32022,7 +31860,7 @@
               <w:jc w:val="center"/>
             </w:pPr>
             <w:r>
-              <w:t xml:space="preserve">-18.59</w:t>
+              <w:t xml:space="preserve">-19.86</w:t>
             </w:r>
           </w:p>
         </w:tc>
@@ -33137,11 +32975,13 @@
     <w:tbl>
       <w:tblPr>
         <w:tblStyle w:val="Table"/>
-        <w:tblW w:type="auto" w:w="0"/>
+        <w:tblW w:type="pct" w:w="5000"/>
+        <w:tblLayout w:type="fixed"/>
         <w:tblLook w:firstRow="0" w:lastRow="0" w:firstColumn="0" w:lastColumn="0" w:noHBand="0" w:noVBand="0" w:val="0000"/>
       </w:tblPr>
       <w:tblGrid>
-        <w:gridCol w:w="7920"/>
+        <w:gridCol w:w="6649"/>
+        <w:gridCol w:w="1270"/>
       </w:tblGrid>
       <w:tr>
         <w:tc>
@@ -33149,7 +32989,6 @@
           <w:p>
             <w:pPr>
               <w:pStyle w:val="Compact"/>
-              <w:jc w:val="left"/>
             </w:pPr>
             <m:oMathPara>
               <m:oMathParaPr>
@@ -33461,10 +33300,12 @@
               </m:oMath>
             </m:oMathPara>
           </w:p>
-          <w:p>
-            <w:pPr>
-              <w:pStyle w:val="Compact"/>
-              <w:jc w:val="left"/>
+        </w:tc>
+        <w:tc>
+          <w:tcPr/>
+          <w:p>
+            <w:pPr>
+              <w:pStyle w:val="Compact"/>
             </w:pPr>
             <w:r>
               <w:t xml:space="preserve">(1S)</w:t>
@@ -33474,15 +33315,8 @@
       </w:tr>
     </w:tbl>
     <w:p>
-      <w:r>
-        <w:pict>
-          <v:rect style="width:0;height:1.5pt" o:hralign="center" o:hrstd="t" o:hr="t"/>
-        </w:pict>
-      </w:r>
-    </w:p>
-    <w:p>
       <w:pPr>
-        <w:pStyle w:val="FirstParagraph"/>
+        <w:pStyle w:val="BodyText"/>
       </w:pPr>
       <w:r>
         <w:t xml:space="preserve">Note that, since</w:t>
@@ -44560,6 +44394,10 @@
         <w:pStyle w:val="TableCaption"/>
       </w:pPr>
       <w:r>
+        <w:rPr>
+          <w:b/>
+          <w:bCs/>
+        </w:rPr>
         <w:t xml:space="preserve">Table S11. 218 factors included in the sensitivity analysis and their respective sampling bounds.</w:t>
       </w:r>
     </w:p>

</xml_diff>

<commit_message>
Fix remaining Section E cosmetic issues
Eq. (3)'s Upsilon subscript now matches Eq. (7)'s already-fixed
g,l form. Table S3 had two stray typos (7.5 misread as 75). Added
explicit row-index headers to Tables S3/S6/S7 (z) and S8/S9/S10
(the calligraphic l already used for calibration reef groups
elsewhere in the paper, distinct from both the digit rows and the
plain l used for individual locations) so the row axis is
self-evident without cross-referencing the caption text.
</commit_message>
<xml_diff>
--- a/paper/paper.docx
+++ b/paper/paper.docx
@@ -4403,10 +4403,15 @@
                       </m:e>
                       <m:sub>
                         <m:r>
+                          <m:t>g</m:t>
+                        </m:r>
+                        <m:r>
                           <m:rPr>
-                            <m:scr m:val="script"/>
                             <m:sty m:val="p"/>
                           </m:rPr>
+                          <m:t>,</m:t>
+                        </m:r>
+                        <m:r>
                           <m:t>l</m:t>
                         </m:r>
                       </m:sub>
@@ -25667,7 +25672,13 @@
           <w:p>
             <w:pPr>
               <w:pStyle w:val="Compact"/>
-            </w:pPr>
+              <w:jc w:val="left"/>
+            </w:pPr>
+            <m:oMath>
+              <m:r>
+                <m:t>z</m:t>
+              </m:r>
+            </m:oMath>
           </w:p>
         </w:tc>
         <w:tc>
@@ -25852,6 +25863,7 @@
           <w:p>
             <w:pPr>
               <w:pStyle w:val="Compact"/>
+              <w:jc w:val="left"/>
             </w:pPr>
             <w:r>
               <w:t xml:space="preserve">1</w:t>
@@ -25878,7 +25890,7 @@
               <w:jc w:val="center"/>
             </w:pPr>
             <w:r>
-              <w:t xml:space="preserve">2.5 to 75.</w:t>
+              <w:t xml:space="preserve">2.5 to 7.5</w:t>
             </w:r>
           </w:p>
         </w:tc>
@@ -25925,6 +25937,7 @@
           <w:p>
             <w:pPr>
               <w:pStyle w:val="Compact"/>
+              <w:jc w:val="left"/>
             </w:pPr>
             <w:r>
               <w:t xml:space="preserve">2</w:t>
@@ -25975,7 +25988,7 @@
               <w:jc w:val="center"/>
             </w:pPr>
             <w:r>
-              <w:t xml:space="preserve">5.0 to 75</w:t>
+              <w:t xml:space="preserve">5.0 to 7.5</w:t>
             </w:r>
           </w:p>
         </w:tc>
@@ -25998,6 +26011,7 @@
           <w:p>
             <w:pPr>
               <w:pStyle w:val="Compact"/>
+              <w:jc w:val="left"/>
             </w:pPr>
             <w:r>
               <w:t xml:space="preserve">3</w:t>
@@ -26071,6 +26085,7 @@
           <w:p>
             <w:pPr>
               <w:pStyle w:val="Compact"/>
+              <w:jc w:val="left"/>
             </w:pPr>
             <w:r>
               <w:t xml:space="preserve">4</w:t>
@@ -26144,6 +26159,7 @@
           <w:p>
             <w:pPr>
               <w:pStyle w:val="Compact"/>
+              <w:jc w:val="left"/>
             </w:pPr>
             <w:r>
               <w:t xml:space="preserve">5</w:t>
@@ -26217,6 +26233,7 @@
           <w:p>
             <w:pPr>
               <w:pStyle w:val="Compact"/>
+              <w:jc w:val="left"/>
             </w:pPr>
             <w:r>
               <w:t xml:space="preserve">6</w:t>
@@ -26290,6 +26307,7 @@
           <w:p>
             <w:pPr>
               <w:pStyle w:val="Compact"/>
+              <w:jc w:val="left"/>
             </w:pPr>
             <w:r>
               <w:t xml:space="preserve">7</w:t>
@@ -27328,6 +27346,11 @@
             <w:pPr>
               <w:pStyle w:val="Compact"/>
             </w:pPr>
+            <m:oMath>
+              <m:r>
+                <m:t>z</m:t>
+              </m:r>
+            </m:oMath>
           </w:p>
         </w:tc>
         <w:tc>
@@ -28103,6 +28126,11 @@
             <w:pPr>
               <w:pStyle w:val="Compact"/>
             </w:pPr>
+            <m:oMath>
+              <m:r>
+                <m:t>z</m:t>
+              </m:r>
+            </m:oMath>
           </w:p>
         </w:tc>
         <w:tc>
@@ -28856,18 +28884,18 @@
     <w:tbl>
       <w:tblPr>
         <w:tblStyle w:val="Table"/>
-        <w:tblW w:type="pct" w:w="4925"/>
+        <w:tblW w:type="pct" w:w="4931"/>
         <w:tblLayout w:type="fixed"/>
         <w:tblLook w:firstRow="1" w:lastRow="0" w:firstColumn="0" w:lastColumn="0" w:noHBand="0" w:noVBand="0" w:val="0020"/>
         <w:tblCaption w:val="Table S8. Calibrated growth regional scale factors (\mathbf{\Xi}_{\mathbf{g,}\mathcal{l}}) for each reef group (rows) and functional group (columns)."/>
       </w:tblPr>
       <w:tblGrid>
-        <w:gridCol w:w="354"/>
-        <w:gridCol w:w="1477"/>
-        <w:gridCol w:w="1477"/>
-        <w:gridCol w:w="1536"/>
-        <w:gridCol w:w="1477"/>
-        <w:gridCol w:w="1477"/>
+        <w:gridCol w:w="928"/>
+        <w:gridCol w:w="1365"/>
+        <w:gridCol w:w="1365"/>
+        <w:gridCol w:w="1420"/>
+        <w:gridCol w:w="1365"/>
+        <w:gridCol w:w="1365"/>
       </w:tblGrid>
       <w:tr>
         <w:trPr>
@@ -28878,7 +28906,17 @@
           <w:p>
             <w:pPr>
               <w:pStyle w:val="Compact"/>
-            </w:pPr>
+              <w:jc w:val="center"/>
+            </w:pPr>
+            <m:oMath>
+              <m:r>
+                <m:rPr>
+                  <m:scr m:val="script"/>
+                  <m:sty m:val="p"/>
+                </m:rPr>
+                <m:t>l</m:t>
+              </m:r>
+            </m:oMath>
           </w:p>
         </w:tc>
         <w:tc>
@@ -29063,6 +29101,7 @@
           <w:p>
             <w:pPr>
               <w:pStyle w:val="Compact"/>
+              <w:jc w:val="center"/>
             </w:pPr>
             <w:r>
               <w:t xml:space="preserve">1</w:t>
@@ -29136,6 +29175,7 @@
           <w:p>
             <w:pPr>
               <w:pStyle w:val="Compact"/>
+              <w:jc w:val="center"/>
             </w:pPr>
             <w:r>
               <w:t xml:space="preserve">2</w:t>
@@ -29209,6 +29249,7 @@
           <w:p>
             <w:pPr>
               <w:pStyle w:val="Compact"/>
+              <w:jc w:val="center"/>
             </w:pPr>
             <w:r>
               <w:t xml:space="preserve">3</w:t>
@@ -29282,6 +29323,7 @@
           <w:p>
             <w:pPr>
               <w:pStyle w:val="Compact"/>
+              <w:jc w:val="center"/>
             </w:pPr>
             <w:r>
               <w:t xml:space="preserve">4</w:t>
@@ -29355,6 +29397,7 @@
           <w:p>
             <w:pPr>
               <w:pStyle w:val="Compact"/>
+              <w:jc w:val="center"/>
             </w:pPr>
             <w:r>
               <w:t xml:space="preserve">5</w:t>
@@ -29428,6 +29471,7 @@
           <w:p>
             <w:pPr>
               <w:pStyle w:val="Compact"/>
+              <w:jc w:val="center"/>
             </w:pPr>
             <w:r>
               <w:t xml:space="preserve">6</w:t>
@@ -29501,6 +29545,7 @@
           <w:p>
             <w:pPr>
               <w:pStyle w:val="Compact"/>
+              <w:jc w:val="center"/>
             </w:pPr>
             <w:r>
               <w:t xml:space="preserve">7</w:t>
@@ -29574,6 +29619,7 @@
           <w:p>
             <w:pPr>
               <w:pStyle w:val="Compact"/>
+              <w:jc w:val="center"/>
             </w:pPr>
             <w:r>
               <w:t xml:space="preserve">8</w:t>
@@ -29647,6 +29693,7 @@
           <w:p>
             <w:pPr>
               <w:pStyle w:val="Compact"/>
+              <w:jc w:val="center"/>
             </w:pPr>
             <w:r>
               <w:t xml:space="preserve">9</w:t>
@@ -29720,6 +29767,7 @@
           <w:p>
             <w:pPr>
               <w:pStyle w:val="Compact"/>
+              <w:jc w:val="center"/>
             </w:pPr>
             <w:r>
               <w:t xml:space="preserve">10</w:t>
@@ -29793,6 +29841,7 @@
           <w:p>
             <w:pPr>
               <w:pStyle w:val="Compact"/>
+              <w:jc w:val="center"/>
             </w:pPr>
             <w:r>
               <w:t xml:space="preserve">11</w:t>
@@ -29866,6 +29915,7 @@
           <w:p>
             <w:pPr>
               <w:pStyle w:val="Compact"/>
+              <w:jc w:val="center"/>
             </w:pPr>
             <w:r>
               <w:t xml:space="preserve">12</w:t>
@@ -29997,18 +30047,18 @@
     <w:tbl>
       <w:tblPr>
         <w:tblStyle w:val="Table"/>
-        <w:tblW w:type="pct" w:w="4925"/>
+        <w:tblW w:type="pct" w:w="4931"/>
         <w:tblLayout w:type="fixed"/>
         <w:tblLook w:firstRow="1" w:lastRow="0" w:firstColumn="0" w:lastColumn="0" w:noHBand="0" w:noVBand="0" w:val="0020"/>
         <w:tblCaption w:val="Table S9. Calibrated background mortality scale factors (\mathbf{\Upsilon}_{\mathbf{g,}\mathcal{l}}) for each reef group (rows) and functional group (columns)."/>
       </w:tblPr>
       <w:tblGrid>
-        <w:gridCol w:w="354"/>
-        <w:gridCol w:w="1477"/>
-        <w:gridCol w:w="1477"/>
-        <w:gridCol w:w="1536"/>
-        <w:gridCol w:w="1477"/>
-        <w:gridCol w:w="1477"/>
+        <w:gridCol w:w="928"/>
+        <w:gridCol w:w="1365"/>
+        <w:gridCol w:w="1365"/>
+        <w:gridCol w:w="1420"/>
+        <w:gridCol w:w="1365"/>
+        <w:gridCol w:w="1365"/>
       </w:tblGrid>
       <w:tr>
         <w:trPr>
@@ -30019,7 +30069,17 @@
           <w:p>
             <w:pPr>
               <w:pStyle w:val="Compact"/>
-            </w:pPr>
+              <w:jc w:val="center"/>
+            </w:pPr>
+            <m:oMath>
+              <m:r>
+                <m:rPr>
+                  <m:scr m:val="script"/>
+                  <m:sty m:val="p"/>
+                </m:rPr>
+                <m:t>l</m:t>
+              </m:r>
+            </m:oMath>
           </w:p>
         </w:tc>
         <w:tc>
@@ -30204,6 +30264,7 @@
           <w:p>
             <w:pPr>
               <w:pStyle w:val="Compact"/>
+              <w:jc w:val="center"/>
             </w:pPr>
             <w:r>
               <w:t xml:space="preserve">1</w:t>
@@ -30277,6 +30338,7 @@
           <w:p>
             <w:pPr>
               <w:pStyle w:val="Compact"/>
+              <w:jc w:val="center"/>
             </w:pPr>
             <w:r>
               <w:t xml:space="preserve">2</w:t>
@@ -30350,6 +30412,7 @@
           <w:p>
             <w:pPr>
               <w:pStyle w:val="Compact"/>
+              <w:jc w:val="center"/>
             </w:pPr>
             <w:r>
               <w:t xml:space="preserve">3</w:t>
@@ -30423,6 +30486,7 @@
           <w:p>
             <w:pPr>
               <w:pStyle w:val="Compact"/>
+              <w:jc w:val="center"/>
             </w:pPr>
             <w:r>
               <w:t xml:space="preserve">4</w:t>
@@ -30496,6 +30560,7 @@
           <w:p>
             <w:pPr>
               <w:pStyle w:val="Compact"/>
+              <w:jc w:val="center"/>
             </w:pPr>
             <w:r>
               <w:t xml:space="preserve">5</w:t>
@@ -30569,6 +30634,7 @@
           <w:p>
             <w:pPr>
               <w:pStyle w:val="Compact"/>
+              <w:jc w:val="center"/>
             </w:pPr>
             <w:r>
               <w:t xml:space="preserve">6</w:t>
@@ -30642,6 +30708,7 @@
           <w:p>
             <w:pPr>
               <w:pStyle w:val="Compact"/>
+              <w:jc w:val="center"/>
             </w:pPr>
             <w:r>
               <w:t xml:space="preserve">7</w:t>
@@ -30715,6 +30782,7 @@
           <w:p>
             <w:pPr>
               <w:pStyle w:val="Compact"/>
+              <w:jc w:val="center"/>
             </w:pPr>
             <w:r>
               <w:t xml:space="preserve">8</w:t>
@@ -30788,6 +30856,7 @@
           <w:p>
             <w:pPr>
               <w:pStyle w:val="Compact"/>
+              <w:jc w:val="center"/>
             </w:pPr>
             <w:r>
               <w:t xml:space="preserve">9</w:t>
@@ -30861,6 +30930,7 @@
           <w:p>
             <w:pPr>
               <w:pStyle w:val="Compact"/>
+              <w:jc w:val="center"/>
             </w:pPr>
             <w:r>
               <w:t xml:space="preserve">10</w:t>
@@ -30934,6 +31004,7 @@
           <w:p>
             <w:pPr>
               <w:pStyle w:val="Compact"/>
+              <w:jc w:val="center"/>
             </w:pPr>
             <w:r>
               <w:t xml:space="preserve">11</w:t>
@@ -31007,6 +31078,7 @@
           <w:p>
             <w:pPr>
               <w:pStyle w:val="Compact"/>
+              <w:jc w:val="center"/>
             </w:pPr>
             <w:r>
               <w:t xml:space="preserve">12</w:t>
@@ -31217,13 +31289,13 @@
     <w:tbl>
       <w:tblPr>
         <w:tblStyle w:val="Table"/>
-        <w:tblW w:type="pct" w:w="2778"/>
+        <w:tblW w:type="pct" w:w="3542"/>
         <w:tblLayout w:type="fixed"/>
         <w:tblLook w:firstRow="1" w:lastRow="0" w:firstColumn="0" w:lastColumn="0" w:noHBand="0" w:noVBand="0" w:val="0020"/>
         <w:tblCaption w:val="Table S10. Calibrated growth acceleration parameters (\mathbf{\zeta}_{\mathbf{l}}^{\mathbf{h}},\mathbf{\zeta}_{\mathbf{l}}^{\mathbf{m}} and \mathbf{\zeta}_{\mathbf{l}}^{\mathbf{s}}) for each reef group (rows)."/>
       </w:tblPr>
       <w:tblGrid>
-        <w:gridCol w:w="660"/>
+        <w:gridCol w:w="1870"/>
         <w:gridCol w:w="1100"/>
         <w:gridCol w:w="1320"/>
         <w:gridCol w:w="1320"/>
@@ -31237,7 +31309,17 @@
           <w:p>
             <w:pPr>
               <w:pStyle w:val="Compact"/>
-            </w:pPr>
+              <w:jc w:val="center"/>
+            </w:pPr>
+            <m:oMath>
+              <m:r>
+                <m:rPr>
+                  <m:scr m:val="script"/>
+                  <m:sty m:val="p"/>
+                </m:rPr>
+                <m:t>l</m:t>
+              </m:r>
+            </m:oMath>
           </w:p>
         </w:tc>
         <w:tc>
@@ -31283,6 +31365,7 @@
           <w:p>
             <w:pPr>
               <w:pStyle w:val="Compact"/>
+              <w:jc w:val="center"/>
             </w:pPr>
             <w:r>
               <w:t xml:space="preserve">1</w:t>
@@ -31332,6 +31415,7 @@
           <w:p>
             <w:pPr>
               <w:pStyle w:val="Compact"/>
+              <w:jc w:val="center"/>
             </w:pPr>
             <w:r>
               <w:t xml:space="preserve">2</w:t>
@@ -31381,6 +31465,7 @@
           <w:p>
             <w:pPr>
               <w:pStyle w:val="Compact"/>
+              <w:jc w:val="center"/>
             </w:pPr>
             <w:r>
               <w:t xml:space="preserve">3</w:t>
@@ -31430,6 +31515,7 @@
           <w:p>
             <w:pPr>
               <w:pStyle w:val="Compact"/>
+              <w:jc w:val="center"/>
             </w:pPr>
             <w:r>
               <w:t xml:space="preserve">4</w:t>
@@ -31479,6 +31565,7 @@
           <w:p>
             <w:pPr>
               <w:pStyle w:val="Compact"/>
+              <w:jc w:val="center"/>
             </w:pPr>
             <w:r>
               <w:t xml:space="preserve">5</w:t>
@@ -31528,6 +31615,7 @@
           <w:p>
             <w:pPr>
               <w:pStyle w:val="Compact"/>
+              <w:jc w:val="center"/>
             </w:pPr>
             <w:r>
               <w:t xml:space="preserve">6</w:t>
@@ -31577,6 +31665,7 @@
           <w:p>
             <w:pPr>
               <w:pStyle w:val="Compact"/>
+              <w:jc w:val="center"/>
             </w:pPr>
             <w:r>
               <w:t xml:space="preserve">7</w:t>
@@ -31626,6 +31715,7 @@
           <w:p>
             <w:pPr>
               <w:pStyle w:val="Compact"/>
+              <w:jc w:val="center"/>
             </w:pPr>
             <w:r>
               <w:t xml:space="preserve">8</w:t>
@@ -31675,6 +31765,7 @@
           <w:p>
             <w:pPr>
               <w:pStyle w:val="Compact"/>
+              <w:jc w:val="center"/>
             </w:pPr>
             <w:r>
               <w:t xml:space="preserve">9</w:t>
@@ -31724,6 +31815,7 @@
           <w:p>
             <w:pPr>
               <w:pStyle w:val="Compact"/>
+              <w:jc w:val="center"/>
             </w:pPr>
             <w:r>
               <w:t xml:space="preserve">10</w:t>
@@ -31773,6 +31865,7 @@
           <w:p>
             <w:pPr>
               <w:pStyle w:val="Compact"/>
+              <w:jc w:val="center"/>
             </w:pPr>
             <w:r>
               <w:t xml:space="preserve">11</w:t>
@@ -31822,6 +31915,7 @@
           <w:p>
             <w:pPr>
               <w:pStyle w:val="Compact"/>
+              <w:jc w:val="center"/>
             </w:pPr>
             <w:r>
               <w:t xml:space="preserve">12</w:t>

</xml_diff>

<commit_message>
Document bootstrap uncertainty quantification for calibration metrics
Adds a Methods paragraph describing the two-level bootstrap (per-location
block/iid resampling, then aggregate-median resampling) used for RMSE and
SRCC confidence intervals, citing Bootstrap.jl.
</commit_message>
<xml_diff>
--- a/paper/paper.docx
+++ b/paper/paper.docx
@@ -17488,13 +17488,30 @@
         <w:pStyle w:val="BodyText"/>
       </w:pPr>
       <w:r>
+        <w:t xml:space="preserve">Uncertainty in these metrics was quantified via bootstrap resampling, using the Bootstrap.jl Julia package</w:t>
+      </w:r>
+      <w:r>
+        <w:t xml:space="preserve"> </w:t>
+      </w:r>
+      <w:r>
+        <w:t xml:space="preserve">(73)</w:t>
+      </w:r>
+      <w:r>
+        <w:t xml:space="preserve">. For each location, confidence intervals were obtained by resampling its paired modelled/observed annual values with replacement: locations with five or more years of observations used a circular block bootstrap (block lengths of two to three years, to preserve year-to-year autocorrelation in the error series), while locations with the minimum of four observed years used a standard independent-and-identically-distributed (iid) bootstrap. Both used 2,000 resamples and 95% percentile confidence intervals. The median ΔRMSE and SRCC reported for the calibration and test sets were themselves bootstrapped. This second-stage bootstrap resampled which locations’ point estimates were included and took the median across 2,000 such resamples. Only locations eligible for the block bootstrap were included, so locations with just four years of data contribute a per-location estimate but do not influence the aggregate median’s uncertainty.</w:t>
+      </w:r>
+    </w:p>
+    <w:p>
+      <w:pPr>
+        <w:pStyle w:val="BodyText"/>
+      </w:pPr>
+      <w:r>
         <w:t xml:space="preserve">We conducted an additional analysis of the model's performance metrics, focusing on spatial and heat-stress correlations for both dataset splits and both metrics. We categorized spatial correlations into correlations along and across the GBR. For each category, we calculated the SRCC between each reef’s position and each of its performance metrics. For the position along the GBR, we used distance to the northernmost reef, following the definition from</w:t>
       </w:r>
       <w:r>
         <w:t xml:space="preserve"> </w:t>
       </w:r>
       <w:r>
-        <w:t xml:space="preserve">(73)</w:t>
+        <w:t xml:space="preserve">(74)</w:t>
       </w:r>
       <w:r>
         <w:t xml:space="preserve">. For the position across the GBR, we used the haversine distance between each reef and the coast, which was approximated by the minimum of the distances between that reef and each point of the Great Barrier Reef mainland polygon</w:t>
@@ -17512,7 +17529,7 @@
         <w:t xml:space="preserve"> </w:t>
       </w:r>
       <w:r>
-        <w:t xml:space="preserve">(74)</w:t>
+        <w:t xml:space="preserve">(75)</w:t>
       </w:r>
       <w:r>
         <w:t xml:space="preserve">. For the heat-stress correlations, we calculated the SRCC between each reefs’ performance metric and the maximum cumulative thermal exposure, measured in DHW.</w:t>
@@ -17520,7 +17537,7 @@
     </w:p>
     <w:bookmarkEnd w:id="44"/>
     <w:bookmarkEnd w:id="45"/>
-    <w:bookmarkStart w:id="198" w:name="references"/>
+    <w:bookmarkStart w:id="200" w:name="references"/>
     <w:p>
       <w:pPr>
         <w:pStyle w:val="Heading1"/>
@@ -17529,7 +17546,7 @@
         <w:t xml:space="preserve">5. References</w:t>
       </w:r>
     </w:p>
-    <w:bookmarkStart w:id="197" w:name="refs"/>
+    <w:bookmarkStart w:id="199" w:name="refs"/>
     <w:bookmarkStart w:id="47" w:name="Xde36db15281cb3982e812d3bce55723a74767a0"/>
     <w:p>
       <w:pPr>
@@ -24013,13 +24030,52 @@
       </w:r>
     </w:p>
     <w:bookmarkEnd w:id="186"/>
-    <w:bookmarkStart w:id="187" w:name="Xa83e23e167102cfe0c1fea1f6db60356621499d"/>
+    <w:bookmarkStart w:id="188" w:name="ref-gehringJuliangehringBootstrapjl2023"/>
     <w:p>
       <w:pPr>
         <w:pStyle w:val="Bibliography"/>
       </w:pPr>
       <w:r>
         <w:t xml:space="preserve">73.</w:t>
+      </w:r>
+      <w:r>
+        <w:t xml:space="preserve"> </w:t>
+      </w:r>
+      <w:r>
+        <w:t xml:space="preserve">	</w:t>
+      </w:r>
+      <w:r>
+        <w:t xml:space="preserve">J. Gehring, D. Widmann, D. Kleinschmidt, R. Finnegan, B. Kamiński, C. Bowers, H. Perez, M. Molignano, M. Bouchet-Valat, P. K. Mogensen, T. Kelman, N. Ignatiadis, Juliangehring/</w:t>
+      </w:r>
+      <w:r>
+        <w:t xml:space="preserve">Bootstrap</w:t>
+      </w:r>
+      <w:r>
+        <w:t xml:space="preserve">.jl (2023).</w:t>
+      </w:r>
+      <w:r>
+        <w:t xml:space="preserve"> </w:t>
+      </w:r>
+      <w:hyperlink r:id="rId187">
+        <w:r>
+          <w:rPr>
+            <w:rStyle w:val="Hyperlink"/>
+          </w:rPr>
+          <w:t xml:space="preserve">https://doi.org/10.5281/zenodo.596080</w:t>
+        </w:r>
+      </w:hyperlink>
+      <w:r>
+        <w:t xml:space="preserve">.</w:t>
+      </w:r>
+    </w:p>
+    <w:bookmarkEnd w:id="188"/>
+    <w:bookmarkStart w:id="189" w:name="Xa83e23e167102cfe0c1fea1f6db60356621499d"/>
+    <w:p>
+      <w:pPr>
+        <w:pStyle w:val="Bibliography"/>
+      </w:pPr>
+      <w:r>
+        <w:t xml:space="preserve">74.</w:t>
       </w:r>
       <w:r>
         <w:t xml:space="preserve"> </w:t>
@@ -24142,14 +24198,14 @@
         <w:t xml:space="preserve">, E. Wolanski, Ed. (CRC Press, Boca Raton, 1st Edition., 2000), p. 376.</w:t>
       </w:r>
     </w:p>
-    <w:bookmarkEnd w:id="187"/>
-    <w:bookmarkStart w:id="189" w:name="X90d60492b4d63718ae429e70f3313976dfb865b"/>
+    <w:bookmarkEnd w:id="189"/>
+    <w:bookmarkStart w:id="191" w:name="X90d60492b4d63718ae429e70f3313976dfb865b"/>
     <w:p>
       <w:pPr>
         <w:pStyle w:val="Bibliography"/>
       </w:pPr>
       <w:r>
-        <w:t xml:space="preserve">74.</w:t>
+        <w:t xml:space="preserve">75.</w:t>
       </w:r>
       <w:r>
         <w:t xml:space="preserve"> </w:t>
@@ -24178,7 +24234,7 @@
       <w:r>
         <w:t xml:space="preserve"> </w:t>
       </w:r>
-      <w:hyperlink r:id="rId188">
+      <w:hyperlink r:id="rId190">
         <w:r>
           <w:rPr>
             <w:rStyle w:val="Hyperlink"/>
@@ -24190,14 +24246,14 @@
         <w:t xml:space="preserve">.</w:t>
       </w:r>
     </w:p>
-    <w:bookmarkEnd w:id="189"/>
-    <w:bookmarkStart w:id="191" w:name="X81557c63b0289a9098c577f968c772c4fd97fd1"/>
+    <w:bookmarkEnd w:id="191"/>
+    <w:bookmarkStart w:id="193" w:name="X81557c63b0289a9098c577f968c772c4fd97fd1"/>
     <w:p>
       <w:pPr>
         <w:pStyle w:val="Bibliography"/>
       </w:pPr>
       <w:r>
-        <w:t xml:space="preserve">75.</w:t>
+        <w:t xml:space="preserve">76.</w:t>
       </w:r>
       <w:r>
         <w:t xml:space="preserve"> </w:t>
@@ -24255,7 +24311,7 @@
       <w:r>
         <w:t xml:space="preserve"> </w:t>
       </w:r>
-      <w:hyperlink r:id="rId190">
+      <w:hyperlink r:id="rId192">
         <w:r>
           <w:rPr>
             <w:rStyle w:val="Hyperlink"/>
@@ -24322,14 +24378,14 @@
         <w:t xml:space="preserve">.</w:t>
       </w:r>
     </w:p>
-    <w:bookmarkEnd w:id="191"/>
-    <w:bookmarkStart w:id="193" w:name="ref-feldtRobertfeldtBlackBoxOptimjl2023"/>
+    <w:bookmarkEnd w:id="193"/>
+    <w:bookmarkStart w:id="195" w:name="ref-feldtRobertfeldtBlackBoxOptimjl2023"/>
     <w:p>
       <w:pPr>
         <w:pStyle w:val="Bibliography"/>
       </w:pPr>
       <w:r>
-        <w:t xml:space="preserve">76.</w:t>
+        <w:t xml:space="preserve">77.</w:t>
       </w:r>
       <w:r>
         <w:t xml:space="preserve"> </w:t>
@@ -24349,7 +24405,7 @@
       <w:r>
         <w:t xml:space="preserve"> </w:t>
       </w:r>
-      <w:hyperlink r:id="rId192">
+      <w:hyperlink r:id="rId194">
         <w:r>
           <w:rPr>
             <w:rStyle w:val="Hyperlink"/>
@@ -24361,14 +24417,14 @@
         <w:t xml:space="preserve">.</w:t>
       </w:r>
     </w:p>
-    <w:bookmarkEnd w:id="193"/>
-    <w:bookmarkStart w:id="195" w:name="ref-skirvingCoralTempCoralReef2020"/>
+    <w:bookmarkEnd w:id="195"/>
+    <w:bookmarkStart w:id="197" w:name="ref-skirvingCoralTempCoralReef2020"/>
     <w:p>
       <w:pPr>
         <w:pStyle w:val="Bibliography"/>
       </w:pPr>
       <w:r>
-        <w:t xml:space="preserve">77.</w:t>
+        <w:t xml:space="preserve">78.</w:t>
       </w:r>
       <w:r>
         <w:t xml:space="preserve"> </w:t>
@@ -24382,7 +24438,7 @@
       <w:r>
         <w:t xml:space="preserve"> </w:t>
       </w:r>
-      <w:hyperlink r:id="rId194">
+      <w:hyperlink r:id="rId196">
         <w:r>
           <w:rPr>
             <w:rStyle w:val="Hyperlink"/>
@@ -24561,14 +24617,14 @@
         <w:t xml:space="preserve">, 3856 (2020).</w:t>
       </w:r>
     </w:p>
-    <w:bookmarkEnd w:id="195"/>
-    <w:bookmarkStart w:id="196" w:name="ref-NOAACoralReef"/>
+    <w:bookmarkEnd w:id="197"/>
+    <w:bookmarkStart w:id="198" w:name="ref-NOAACoralReef"/>
     <w:p>
       <w:pPr>
         <w:pStyle w:val="Bibliography"/>
       </w:pPr>
       <w:r>
-        <w:t xml:space="preserve">78.</w:t>
+        <w:t xml:space="preserve">79.</w:t>
       </w:r>
       <w:r>
         <w:t xml:space="preserve"> </w:t>
@@ -24799,10 +24855,10 @@
         <w:t xml:space="preserve">set accessed 2026-02-24 at https://coralreefwatch.noaa.gov/product/vs/data.php.</w:t>
       </w:r>
     </w:p>
-    <w:bookmarkEnd w:id="196"/>
-    <w:bookmarkEnd w:id="197"/>
     <w:bookmarkEnd w:id="198"/>
-    <w:bookmarkStart w:id="207" w:name="acknowledgements"/>
+    <w:bookmarkEnd w:id="199"/>
+    <w:bookmarkEnd w:id="200"/>
+    <w:bookmarkStart w:id="209" w:name="acknowledgements"/>
     <w:p>
       <w:pPr>
         <w:pStyle w:val="Heading1"/>
@@ -24827,7 +24883,7 @@
         <w:t xml:space="preserve">The authors would like to thank Yves-Marie Bozec, Arne Adam for advice, comments and suggestions provided during the development of the model and earlier forms of this manuscript. The authors would like to additionally thank Ken Anthony for discussions around coral ecology and early conceptualization of what would eventually become CoralBlox.</w:t>
       </w:r>
     </w:p>
-    <w:bookmarkStart w:id="199" w:name="funding"/>
+    <w:bookmarkStart w:id="201" w:name="funding"/>
     <w:p>
       <w:pPr>
         <w:pStyle w:val="Heading2"/>
@@ -24844,8 +24900,8 @@
         <w:t xml:space="preserve">This work is part of The Reef Restoration and Adaptation Program which is funded by the partnership between the Australian Government’s Reef Trust and the Great Barrier Reef Foundation.</w:t>
       </w:r>
     </w:p>
-    <w:bookmarkEnd w:id="199"/>
-    <w:bookmarkStart w:id="200" w:name="author-contributions"/>
+    <w:bookmarkEnd w:id="201"/>
+    <w:bookmarkStart w:id="202" w:name="author-contributions"/>
     <w:p>
       <w:pPr>
         <w:pStyle w:val="Heading2"/>
@@ -24926,8 +24982,8 @@
         <w:t xml:space="preserve">T. Iwanaga: Writing, review and editing. Model development and changes to incorporate natural adaptation and heritability. Software development for usability and computational performance. Conceptualization of research aims and primary draft. Coordinated manuscript efforts.</w:t>
       </w:r>
     </w:p>
-    <w:bookmarkEnd w:id="200"/>
-    <w:bookmarkStart w:id="201" w:name="competing-interests"/>
+    <w:bookmarkEnd w:id="202"/>
+    <w:bookmarkStart w:id="203" w:name="competing-interests"/>
     <w:p>
       <w:pPr>
         <w:pStyle w:val="Heading2"/>
@@ -24944,8 +25000,8 @@
         <w:t xml:space="preserve">The authors declare no competing interests.</w:t>
       </w:r>
     </w:p>
-    <w:bookmarkEnd w:id="201"/>
-    <w:bookmarkStart w:id="206" w:name="data-and-materials-availability"/>
+    <w:bookmarkEnd w:id="203"/>
+    <w:bookmarkStart w:id="208" w:name="data-and-materials-availability"/>
     <w:p>
       <w:pPr>
         <w:pStyle w:val="Heading2"/>
@@ -24976,7 +25032,7 @@
       <w:r>
         <w:t xml:space="preserve"> </w:t>
       </w:r>
-      <w:hyperlink r:id="rId202">
+      <w:hyperlink r:id="rId204">
         <w:r>
           <w:rPr>
             <w:rStyle w:val="Hyperlink"/>
@@ -24990,7 +25046,7 @@
       <w:r>
         <w:t xml:space="preserve"> </w:t>
       </w:r>
-      <w:hyperlink r:id="rId203">
+      <w:hyperlink r:id="rId205">
         <w:r>
           <w:rPr>
             <w:rStyle w:val="Hyperlink"/>
@@ -25009,7 +25065,7 @@
       <w:r>
         <w:t xml:space="preserve">AIMS Long-Term Monitoring Program (LTMP) (</w:t>
       </w:r>
-      <w:hyperlink r:id="rId204">
+      <w:hyperlink r:id="rId206">
         <w:r>
           <w:rPr>
             <w:rStyle w:val="Hyperlink"/>
@@ -25045,7 +25101,7 @@
       <w:r>
         <w:t xml:space="preserve">Observed annual maximum degree heating weeks (DHWs) data was derived from daily DHWs provided by the NOAA CoralTempv3.1 product at (</w:t>
       </w:r>
-      <w:hyperlink r:id="rId205">
+      <w:hyperlink r:id="rId207">
         <w:r>
           <w:rPr>
             <w:rStyle w:val="Hyperlink"/>
@@ -25057,9 +25113,9 @@
         <w:t xml:space="preserve">). Annual values are based on 1 July from the year prior to 30 June.</w:t>
       </w:r>
     </w:p>
-    <w:bookmarkEnd w:id="206"/>
-    <w:bookmarkEnd w:id="207"/>
-    <w:bookmarkStart w:id="235" w:name="supplementary-materials"/>
+    <w:bookmarkEnd w:id="208"/>
+    <w:bookmarkEnd w:id="209"/>
+    <w:bookmarkStart w:id="237" w:name="supplementary-materials"/>
     <w:p>
       <w:pPr>
         <w:pStyle w:val="Heading1"/>
@@ -25068,7 +25124,7 @@
         <w:t xml:space="preserve">7. Supplementary Materials</w:t>
       </w:r>
     </w:p>
-    <w:bookmarkStart w:id="208" w:name="parameter-values"/>
+    <w:bookmarkStart w:id="210" w:name="parameter-values"/>
     <w:p>
       <w:pPr>
         <w:pStyle w:val="Heading2"/>
@@ -25089,8 +25145,8 @@
         <w:t xml:space="preserve">Heritability = 0.3</w:t>
       </w:r>
     </w:p>
-    <w:bookmarkEnd w:id="208"/>
-    <w:bookmarkStart w:id="209" w:name="tables"/>
+    <w:bookmarkEnd w:id="210"/>
+    <w:bookmarkStart w:id="211" w:name="tables"/>
     <w:p>
       <w:pPr>
         <w:pStyle w:val="Heading2"/>
@@ -31960,8 +32016,8 @@
         </w:tc>
       </w:tr>
     </w:tbl>
-    <w:bookmarkEnd w:id="209"/>
-    <w:bookmarkStart w:id="210" w:name="coral-block-movement"/>
+    <w:bookmarkEnd w:id="211"/>
+    <w:bookmarkStart w:id="212" w:name="coral-block-movement"/>
     <w:p>
       <w:pPr>
         <w:pStyle w:val="Heading2"/>
@@ -37671,8 +37727,8 @@
         </w:tc>
       </w:tr>
     </w:tbl>
-    <w:bookmarkEnd w:id="210"/>
-    <w:bookmarkStart w:id="216" w:name="coral-growth-and-mortality"/>
+    <w:bookmarkEnd w:id="212"/>
+    <w:bookmarkStart w:id="218" w:name="coral-growth-and-mortality"/>
     <w:p>
       <w:pPr>
         <w:pStyle w:val="Heading2"/>
@@ -37745,7 +37801,7 @@
         <w:t xml:space="preserve">and are rescaled by the coral growth and the spatial competition coefficients, as per Eq (7). This section presents details on these two coefficients calculations.</w:t>
       </w:r>
     </w:p>
-    <w:bookmarkStart w:id="211" w:name="low-cover-growth-acceleration"/>
+    <w:bookmarkStart w:id="213" w:name="low-cover-growth-acceleration"/>
     <w:p>
       <w:pPr>
         <w:pStyle w:val="Heading3"/>
@@ -38204,8 +38260,8 @@
         <w:t xml:space="preserve">.</w:t>
       </w:r>
     </w:p>
-    <w:bookmarkEnd w:id="211"/>
-    <w:bookmarkStart w:id="212" w:name="coral-growth-and-spatial-competition"/>
+    <w:bookmarkEnd w:id="213"/>
+    <w:bookmarkStart w:id="214" w:name="coral-growth-and-spatial-competition"/>
     <w:p>
       <w:pPr>
         <w:pStyle w:val="Heading3"/>
@@ -39210,8 +39266,8 @@
         <w:t xml:space="preserve">.</w:t>
       </w:r>
     </w:p>
-    <w:bookmarkEnd w:id="212"/>
-    <w:bookmarkStart w:id="213" w:name="projected-cover"/>
+    <w:bookmarkEnd w:id="214"/>
+    <w:bookmarkStart w:id="215" w:name="projected-cover"/>
     <w:p>
       <w:pPr>
         <w:pStyle w:val="Heading3"/>
@@ -39841,8 +39897,8 @@
         </w:tc>
       </w:tr>
     </w:tbl>
-    <w:bookmarkEnd w:id="213"/>
-    <w:bookmarkStart w:id="214" w:name="adjusted-projected-cover"/>
+    <w:bookmarkEnd w:id="215"/>
+    <w:bookmarkStart w:id="216" w:name="adjusted-projected-cover"/>
     <w:p>
       <w:pPr>
         <w:pStyle w:val="Heading3"/>
@@ -41580,8 +41636,8 @@
         <w:t xml:space="preserve">, which means the adjusted projected cover will never outgrow the habitable area.</w:t>
       </w:r>
     </w:p>
-    <w:bookmarkEnd w:id="214"/>
-    <w:bookmarkStart w:id="215" w:name="spatial-competition-coefficient"/>
+    <w:bookmarkEnd w:id="216"/>
+    <w:bookmarkStart w:id="217" w:name="spatial-competition-coefficient"/>
     <w:p>
       <w:pPr>
         <w:pStyle w:val="Heading3"/>
@@ -42952,9 +43008,9 @@
         </w:tc>
       </w:tr>
     </w:tbl>
-    <w:bookmarkEnd w:id="215"/>
-    <w:bookmarkEnd w:id="216"/>
-    <w:bookmarkStart w:id="230" w:name="model-calibration-and-testing-1"/>
+    <w:bookmarkEnd w:id="217"/>
+    <w:bookmarkEnd w:id="218"/>
+    <w:bookmarkStart w:id="232" w:name="model-calibration-and-testing-1"/>
     <w:p>
       <w:pPr>
         <w:pStyle w:val="Heading2"/>
@@ -42974,7 +43030,7 @@
         <w:t xml:space="preserve"> </w:t>
       </w:r>
       <w:r>
-        <w:t xml:space="preserve">(75)</w:t>
+        <w:t xml:space="preserve">(76)</w:t>
       </w:r>
       <w:r>
         <w:t xml:space="preserve">, implemented in the BlackBoxOptim.jl Julia package</w:t>
@@ -42983,13 +43039,13 @@
         <w:t xml:space="preserve"> </w:t>
       </w:r>
       <w:r>
-        <w:t xml:space="preserve">(76)</w:t>
+        <w:t xml:space="preserve">(77)</w:t>
       </w:r>
       <w:r>
         <w:t xml:space="preserve">. The parameter bound settings, data split and objective function are described in more detail in the following sections</w:t>
       </w:r>
     </w:p>
-    <w:bookmarkStart w:id="220" w:name="data-split-and-reef-groups"/>
+    <w:bookmarkStart w:id="222" w:name="data-split-and-reef-groups"/>
     <w:p>
       <w:pPr>
         <w:pStyle w:val="Heading3"/>
@@ -43032,18 +43088,18 @@
           <wp:inline>
             <wp:extent cx="3493698" cy="4425642"/>
             <wp:effectExtent b="0" l="0" r="0" t="0"/>
-            <wp:docPr descr="A map of the country AI-generated content may be incorrect." title="" id="218" name="Picture"/>
+            <wp:docPr descr="A map of the country AI-generated content may be incorrect." title="" id="220" name="Picture"/>
             <a:graphic>
               <a:graphicData uri="http://schemas.openxmlformats.org/drawingml/2006/picture">
                 <pic:pic>
                   <pic:nvPicPr>
-                    <pic:cNvPr descr="media/image7.png" id="219" name="Picture"/>
+                    <pic:cNvPr descr="media/image7.png" id="221" name="Picture"/>
                     <pic:cNvPicPr>
                       <a:picLocks noChangeArrowheads="1" noChangeAspect="1"/>
                     </pic:cNvPicPr>
                   </pic:nvPicPr>
                   <pic:blipFill>
-                    <a:blip r:embed="rId217"/>
+                    <a:blip r:embed="rId219"/>
                     <a:stretch>
                       <a:fillRect/>
                     </a:stretch>
@@ -43082,8 +43138,8 @@
         <w:t xml:space="preserve">Figure S1. Each of the 12 reef groups used in the calibration.</w:t>
       </w:r>
     </w:p>
-    <w:bookmarkEnd w:id="220"/>
-    <w:bookmarkStart w:id="221" w:name="objective-function"/>
+    <w:bookmarkEnd w:id="222"/>
+    <w:bookmarkStart w:id="223" w:name="objective-function"/>
     <w:p>
       <w:pPr>
         <w:pStyle w:val="Heading3"/>
@@ -44079,8 +44135,8 @@
         <w:t xml:space="preserve">are the weights given to each part of the objective function and are 1, 2, and 2 respectively.</w:t>
       </w:r>
     </w:p>
-    <w:bookmarkEnd w:id="221"/>
-    <w:bookmarkStart w:id="225" w:name="disturbances-datasets"/>
+    <w:bookmarkEnd w:id="223"/>
+    <w:bookmarkStart w:id="227" w:name="disturbances-datasets"/>
     <w:p>
       <w:pPr>
         <w:pStyle w:val="Heading3"/>
@@ -44100,7 +44156,7 @@
         <w:t xml:space="preserve"> </w:t>
       </w:r>
       <w:r>
-        <w:t xml:space="preserve">(77, 78)</w:t>
+        <w:t xml:space="preserve">(78, 79)</w:t>
       </w:r>
       <w:r>
         <w:t xml:space="preserve"> </w:t>
@@ -44128,18 +44184,18 @@
           <wp:inline>
             <wp:extent cx="5731510" cy="4298632"/>
             <wp:effectExtent b="0" l="0" r="0" t="0"/>
-            <wp:docPr descr="Figure S2. Degree heating weeks (DHW) trajectories for each reef group along the GBR. Individual lines correspond to values at individual reefs within a reef group." title="" id="223" name="Picture"/>
+            <wp:docPr descr="Figure S2. Degree heating weeks (DHW) trajectories for each reef group along the GBR. Individual lines correspond to values at individual reefs within a reef group." title="" id="225" name="Picture"/>
             <a:graphic>
               <a:graphicData uri="http://schemas.openxmlformats.org/drawingml/2006/picture">
                 <pic:pic>
                   <pic:nvPicPr>
-                    <pic:cNvPr descr="../figures/S02_dhw_per_reef_group.png" id="224" name="Picture"/>
+                    <pic:cNvPr descr="../figures/S02_dhw_per_reef_group.png" id="226" name="Picture"/>
                     <pic:cNvPicPr>
                       <a:picLocks noChangeArrowheads="1" noChangeAspect="1"/>
                     </pic:cNvPicPr>
                   </pic:nvPicPr>
                   <pic:blipFill>
-                    <a:blip r:embed="rId222"/>
+                    <a:blip r:embed="rId224"/>
                     <a:stretch>
                       <a:fillRect/>
                     </a:stretch>
@@ -44184,8 +44240,8 @@
         <w:t xml:space="preserve">Individual lines correspond to values at individual reefs within a reef group.</w:t>
       </w:r>
     </w:p>
-    <w:bookmarkEnd w:id="225"/>
-    <w:bookmarkStart w:id="229" w:name="depth-attenuation-of-dhw"/>
+    <w:bookmarkEnd w:id="227"/>
+    <w:bookmarkStart w:id="231" w:name="depth-attenuation-of-dhw"/>
     <w:p>
       <w:pPr>
         <w:pStyle w:val="Heading3"/>
@@ -44272,18 +44328,18 @@
           <wp:inline>
             <wp:extent cx="5731510" cy="4298632"/>
             <wp:effectExtent b="0" l="0" r="0" t="0"/>
-            <wp:docPr descr="Figure S3. Effective DHW as a function of surface DHW, at four representative depths, using the calibrated \eta^{base} and \eta^{mix} values. The dotted line shows the 1:1 reference (no attenuation, i.e. surface conditions)." title="" id="227" name="Picture"/>
+            <wp:docPr descr="Figure S3. Effective DHW as a function of surface DHW, at four representative depths, using the calibrated \eta^{base} and \eta^{mix} values. The dotted line shows the 1:1 reference (no attenuation, i.e. surface conditions)." title="" id="229" name="Picture"/>
             <a:graphic>
               <a:graphicData uri="http://schemas.openxmlformats.org/drawingml/2006/picture">
                 <pic:pic>
                   <pic:nvPicPr>
-                    <pic:cNvPr descr="../figures/S03_effective_dhw_depth_attenuation.png" id="228" name="Picture"/>
+                    <pic:cNvPr descr="../figures/S03_effective_dhw_depth_attenuation.png" id="230" name="Picture"/>
                     <pic:cNvPicPr>
                       <a:picLocks noChangeArrowheads="1" noChangeAspect="1"/>
                     </pic:cNvPicPr>
                   </pic:nvPicPr>
                   <pic:blipFill>
-                    <a:blip r:embed="rId226"/>
+                    <a:blip r:embed="rId228"/>
                     <a:stretch>
                       <a:fillRect/>
                     </a:stretch>
@@ -44413,9 +44469,9 @@
         <w:t xml:space="preserve">The dotted line shows the 1:1 reference (no attenuation, i.e. surface conditions).</w:t>
       </w:r>
     </w:p>
-    <w:bookmarkEnd w:id="229"/>
-    <w:bookmarkEnd w:id="230"/>
-    <w:bookmarkStart w:id="234" w:name="convergence-analysis"/>
+    <w:bookmarkEnd w:id="231"/>
+    <w:bookmarkEnd w:id="232"/>
+    <w:bookmarkStart w:id="236" w:name="convergence-analysis"/>
     <w:p>
       <w:pPr>
         <w:pStyle w:val="Heading2"/>
@@ -44433,18 +44489,18 @@
           <wp:inline>
             <wp:extent cx="5731510" cy="5731510"/>
             <wp:effectExtent b="0" l="0" r="0" t="0"/>
-            <wp:docPr descr="Figure S4. Convergence analysis for each DHW range and metric." title="" id="232" name="Picture"/>
+            <wp:docPr descr="Figure S4. Convergence analysis for each DHW range and metric." title="" id="234" name="Picture"/>
             <a:graphic>
               <a:graphicData uri="http://schemas.openxmlformats.org/drawingml/2006/picture">
                 <pic:pic>
                   <pic:nvPicPr>
-                    <pic:cNvPr descr="media/image9.png" id="233" name="Picture"/>
+                    <pic:cNvPr descr="media/image9.png" id="235" name="Picture"/>
                     <pic:cNvPicPr>
                       <a:picLocks noChangeArrowheads="1" noChangeAspect="1"/>
                     </pic:cNvPicPr>
                   </pic:nvPicPr>
                   <pic:blipFill>
-                    <a:blip r:embed="rId231"/>
+                    <a:blip r:embed="rId233"/>
                     <a:stretch>
                       <a:fillRect/>
                     </a:stretch>
@@ -45395,8 +45451,8 @@
         <w:t xml:space="preserve">* - The last size class is assumed to have linear extension = 0.</w:t>
       </w:r>
     </w:p>
-    <w:bookmarkEnd w:id="234"/>
-    <w:bookmarkEnd w:id="235"/>
+    <w:bookmarkEnd w:id="236"/>
+    <w:bookmarkEnd w:id="237"/>
     <w:sectPr>
       <w:footnotePr>
         <w:numRestart w:val="eachSect"/>

</xml_diff>

<commit_message>
Document tol_ceil hard clamp on DHW tolerance mean in Eqs. 17 and 20
Growth-blend and reproduction/connectivity updates were silently capped
at each size class's tolerance ceiling in code but not in the manuscript;
Eqs. 17 and 20 now show the min(., f+) clamp and explain why it's needed
even though the underlying blends are convex combinations.
</commit_message>
<xml_diff>
--- a/paper/paper.docx
+++ b/paper/paper.docx
@@ -13034,185 +13034,350 @@
                   </m:rPr>
                   <m:t>≔</m:t>
                 </m:r>
-                <m:f>
-                  <m:fPr>
-                    <m:type m:val="bar"/>
-                  </m:fPr>
-                  <m:num>
-                    <m:sSub>
-                      <m:e>
-                        <m:r>
-                          <m:t>μ</m:t>
-                        </m:r>
-                      </m:e>
-                      <m:sub>
-                        <m:r>
-                          <m:t>t</m:t>
-                        </m:r>
+                <m:r>
+                  <m:rPr>
+                    <m:sty m:val="p"/>
+                  </m:rPr>
+                  <m:t>min</m:t>
+                </m:r>
+                <m:d>
+                  <m:dPr>
+                    <m:begChr m:val="("/>
+                    <m:sepChr m:val=""/>
+                    <m:endChr m:val=")"/>
+                    <m:grow/>
+                  </m:dPr>
+                  <m:e>
+                    <m:f>
+                      <m:fPr>
+                        <m:type m:val="bar"/>
+                      </m:fPr>
+                      <m:num>
+                        <m:sSub>
+                          <m:e>
+                            <m:r>
+                              <m:t>μ</m:t>
+                            </m:r>
+                          </m:e>
+                          <m:sub>
+                            <m:r>
+                              <m:t>t</m:t>
+                            </m:r>
+                            <m:r>
+                              <m:rPr>
+                                <m:sty m:val="p"/>
+                              </m:rPr>
+                              <m:t>;</m:t>
+                            </m:r>
+                            <m:r>
+                              <m:t> </m:t>
+                            </m:r>
+                            <m:r>
+                              <m:t>g</m:t>
+                            </m:r>
+                            <m:r>
+                              <m:rPr>
+                                <m:sty m:val="p"/>
+                              </m:rPr>
+                              <m:t>,</m:t>
+                            </m:r>
+                            <m:r>
+                              <m:t>z</m:t>
+                            </m:r>
+                            <m:r>
+                              <m:rPr>
+                                <m:sty m:val="p"/>
+                              </m:rPr>
+                              <m:t>−</m:t>
+                            </m:r>
+                            <m:r>
+                              <m:t>1</m:t>
+                            </m:r>
+                            <m:r>
+                              <m:rPr>
+                                <m:sty m:val="p"/>
+                              </m:rPr>
+                              <m:t>,</m:t>
+                            </m:r>
+                            <m:r>
+                              <m:t>l</m:t>
+                            </m:r>
+                          </m:sub>
+                        </m:sSub>
                         <m:r>
                           <m:rPr>
                             <m:sty m:val="p"/>
                           </m:rPr>
-                          <m:t>;</m:t>
+                          <m:t>⋅</m:t>
                         </m:r>
-                        <m:r>
-                          <m:t> </m:t>
-                        </m:r>
-                        <m:r>
-                          <m:t>g</m:t>
-                        </m:r>
+                        <m:sSubSup>
+                          <m:e>
+                            <m:r>
+                              <m:t>w</m:t>
+                            </m:r>
+                          </m:e>
+                          <m:sub>
+                            <m:r>
+                              <m:t>t</m:t>
+                            </m:r>
+                            <m:r>
+                              <m:rPr>
+                                <m:sty m:val="p"/>
+                              </m:rPr>
+                              <m:t>;</m:t>
+                            </m:r>
+                            <m:r>
+                              <m:t>g</m:t>
+                            </m:r>
+                            <m:r>
+                              <m:rPr>
+                                <m:sty m:val="p"/>
+                              </m:rPr>
+                              <m:t>,</m:t>
+                            </m:r>
+                            <m:r>
+                              <m:t>z</m:t>
+                            </m:r>
+                            <m:r>
+                              <m:rPr>
+                                <m:sty m:val="p"/>
+                              </m:rPr>
+                              <m:t>,</m:t>
+                            </m:r>
+                            <m:r>
+                              <m:t>l</m:t>
+                            </m:r>
+                          </m:sub>
+                          <m:sup>
+                            <m:r>
+                              <m:rPr>
+                                <m:sty m:val="p"/>
+                              </m:rPr>
+                              <m:t>−</m:t>
+                            </m:r>
+                          </m:sup>
+                        </m:sSubSup>
                         <m:r>
                           <m:rPr>
                             <m:sty m:val="p"/>
                           </m:rPr>
-                          <m:t>,</m:t>
+                          <m:t>+</m:t>
                         </m:r>
-                        <m:r>
-                          <m:t>z</m:t>
-                        </m:r>
+                        <m:sSub>
+                          <m:e>
+                            <m:r>
+                              <m:t>μ</m:t>
+                            </m:r>
+                          </m:e>
+                          <m:sub>
+                            <m:r>
+                              <m:t>t</m:t>
+                            </m:r>
+                            <m:r>
+                              <m:rPr>
+                                <m:sty m:val="p"/>
+                              </m:rPr>
+                              <m:t>;</m:t>
+                            </m:r>
+                            <m:r>
+                              <m:t>g</m:t>
+                            </m:r>
+                            <m:r>
+                              <m:rPr>
+                                <m:sty m:val="p"/>
+                              </m:rPr>
+                              <m:t>,</m:t>
+                            </m:r>
+                            <m:r>
+                              <m:t> </m:t>
+                            </m:r>
+                            <m:r>
+                              <m:t>z</m:t>
+                            </m:r>
+                            <m:r>
+                              <m:rPr>
+                                <m:sty m:val="p"/>
+                              </m:rPr>
+                              <m:t>,</m:t>
+                            </m:r>
+                            <m:r>
+                              <m:t>l</m:t>
+                            </m:r>
+                          </m:sub>
+                        </m:sSub>
                         <m:r>
                           <m:rPr>
                             <m:sty m:val="p"/>
                           </m:rPr>
-                          <m:t>−</m:t>
+                          <m:t>⋅</m:t>
                         </m:r>
-                        <m:r>
-                          <m:t>1</m:t>
-                        </m:r>
+                        <m:sSubSup>
+                          <m:e>
+                            <m:r>
+                              <m:t>w</m:t>
+                            </m:r>
+                          </m:e>
+                          <m:sub>
+                            <m:r>
+                              <m:t>t</m:t>
+                            </m:r>
+                            <m:r>
+                              <m:rPr>
+                                <m:sty m:val="p"/>
+                              </m:rPr>
+                              <m:t>;</m:t>
+                            </m:r>
+                            <m:r>
+                              <m:t>g</m:t>
+                            </m:r>
+                            <m:r>
+                              <m:rPr>
+                                <m:sty m:val="p"/>
+                              </m:rPr>
+                              <m:t>,</m:t>
+                            </m:r>
+                            <m:r>
+                              <m:t>z</m:t>
+                            </m:r>
+                            <m:r>
+                              <m:rPr>
+                                <m:sty m:val="p"/>
+                              </m:rPr>
+                              <m:t>,</m:t>
+                            </m:r>
+                            <m:r>
+                              <m:t>l</m:t>
+                            </m:r>
+                          </m:sub>
+                          <m:sup>
+                            <m:r>
+                              <m:rPr>
+                                <m:sty m:val="p"/>
+                              </m:rPr>
+                              <m:t>+</m:t>
+                            </m:r>
+                          </m:sup>
+                        </m:sSubSup>
+                      </m:num>
+                      <m:den>
+                        <m:sSubSup>
+                          <m:e>
+                            <m:r>
+                              <m:t>w</m:t>
+                            </m:r>
+                          </m:e>
+                          <m:sub>
+                            <m:r>
+                              <m:t>t</m:t>
+                            </m:r>
+                            <m:r>
+                              <m:rPr>
+                                <m:sty m:val="p"/>
+                              </m:rPr>
+                              <m:t>;</m:t>
+                            </m:r>
+                            <m:r>
+                              <m:t>g</m:t>
+                            </m:r>
+                            <m:r>
+                              <m:rPr>
+                                <m:sty m:val="p"/>
+                              </m:rPr>
+                              <m:t>,</m:t>
+                            </m:r>
+                            <m:r>
+                              <m:t>z</m:t>
+                            </m:r>
+                            <m:r>
+                              <m:rPr>
+                                <m:sty m:val="p"/>
+                              </m:rPr>
+                              <m:t>,</m:t>
+                            </m:r>
+                            <m:r>
+                              <m:t>l</m:t>
+                            </m:r>
+                          </m:sub>
+                          <m:sup>
+                            <m:r>
+                              <m:rPr>
+                                <m:sty m:val="p"/>
+                              </m:rPr>
+                              <m:t>−</m:t>
+                            </m:r>
+                          </m:sup>
+                        </m:sSubSup>
                         <m:r>
                           <m:rPr>
                             <m:sty m:val="p"/>
                           </m:rPr>
-                          <m:t>,</m:t>
+                          <m:t>+</m:t>
                         </m:r>
-                        <m:r>
-                          <m:t>l</m:t>
-                        </m:r>
-                      </m:sub>
-                    </m:sSub>
+                        <m:sSubSup>
+                          <m:e>
+                            <m:r>
+                              <m:t>w</m:t>
+                            </m:r>
+                          </m:e>
+                          <m:sub>
+                            <m:r>
+                              <m:t>t</m:t>
+                            </m:r>
+                            <m:r>
+                              <m:rPr>
+                                <m:sty m:val="p"/>
+                              </m:rPr>
+                              <m:t>;</m:t>
+                            </m:r>
+                            <m:r>
+                              <m:t>g</m:t>
+                            </m:r>
+                            <m:r>
+                              <m:rPr>
+                                <m:sty m:val="p"/>
+                              </m:rPr>
+                              <m:t>,</m:t>
+                            </m:r>
+                            <m:r>
+                              <m:t>z</m:t>
+                            </m:r>
+                            <m:r>
+                              <m:rPr>
+                                <m:sty m:val="p"/>
+                              </m:rPr>
+                              <m:t>,</m:t>
+                            </m:r>
+                            <m:r>
+                              <m:t>l</m:t>
+                            </m:r>
+                          </m:sub>
+                          <m:sup>
+                            <m:r>
+                              <m:rPr>
+                                <m:sty m:val="p"/>
+                              </m:rPr>
+                              <m:t>+</m:t>
+                            </m:r>
+                          </m:sup>
+                        </m:sSubSup>
+                      </m:den>
+                    </m:f>
                     <m:r>
                       <m:rPr>
                         <m:sty m:val="p"/>
                       </m:rPr>
-                      <m:t>⋅</m:t>
+                      <m:t>,</m:t>
+                    </m:r>
+                    <m:r>
+                      <m:t> </m:t>
                     </m:r>
                     <m:sSubSup>
                       <m:e>
                         <m:r>
-                          <m:t>w</m:t>
+                          <m:t>f</m:t>
                         </m:r>
                       </m:e>
                       <m:sub>
-                        <m:r>
-                          <m:t>t</m:t>
-                        </m:r>
-                        <m:r>
-                          <m:rPr>
-                            <m:sty m:val="p"/>
-                          </m:rPr>
-                          <m:t>;</m:t>
-                        </m:r>
-                        <m:r>
-                          <m:t>g</m:t>
-                        </m:r>
-                        <m:r>
-                          <m:rPr>
-                            <m:sty m:val="p"/>
-                          </m:rPr>
-                          <m:t>,</m:t>
-                        </m:r>
-                        <m:r>
-                          <m:t>z</m:t>
-                        </m:r>
-                        <m:r>
-                          <m:rPr>
-                            <m:sty m:val="p"/>
-                          </m:rPr>
-                          <m:t>,</m:t>
-                        </m:r>
-                        <m:r>
-                          <m:t>l</m:t>
-                        </m:r>
-                      </m:sub>
-                      <m:sup>
-                        <m:r>
-                          <m:rPr>
-                            <m:sty m:val="p"/>
-                          </m:rPr>
-                          <m:t>−</m:t>
-                        </m:r>
-                      </m:sup>
-                    </m:sSubSup>
-                    <m:r>
-                      <m:rPr>
-                        <m:sty m:val="p"/>
-                      </m:rPr>
-                      <m:t>+</m:t>
-                    </m:r>
-                    <m:sSub>
-                      <m:e>
-                        <m:r>
-                          <m:t>μ</m:t>
-                        </m:r>
-                      </m:e>
-                      <m:sub>
-                        <m:r>
-                          <m:t>t</m:t>
-                        </m:r>
-                        <m:r>
-                          <m:rPr>
-                            <m:sty m:val="p"/>
-                          </m:rPr>
-                          <m:t>;</m:t>
-                        </m:r>
-                        <m:r>
-                          <m:t>g</m:t>
-                        </m:r>
-                        <m:r>
-                          <m:rPr>
-                            <m:sty m:val="p"/>
-                          </m:rPr>
-                          <m:t>,</m:t>
-                        </m:r>
-                        <m:r>
-                          <m:t> </m:t>
-                        </m:r>
-                        <m:r>
-                          <m:t>z</m:t>
-                        </m:r>
-                        <m:r>
-                          <m:rPr>
-                            <m:sty m:val="p"/>
-                          </m:rPr>
-                          <m:t>,</m:t>
-                        </m:r>
-                        <m:r>
-                          <m:t>l</m:t>
-                        </m:r>
-                      </m:sub>
-                    </m:sSub>
-                    <m:r>
-                      <m:rPr>
-                        <m:sty m:val="p"/>
-                      </m:rPr>
-                      <m:t>⋅</m:t>
-                    </m:r>
-                    <m:sSubSup>
-                      <m:e>
-                        <m:r>
-                          <m:t>w</m:t>
-                        </m:r>
-                      </m:e>
-                      <m:sub>
-                        <m:r>
-                          <m:t>t</m:t>
-                        </m:r>
-                        <m:r>
-                          <m:rPr>
-                            <m:sty m:val="p"/>
-                          </m:rPr>
-                          <m:t>;</m:t>
-                        </m:r>
                         <m:r>
                           <m:t>g</m:t>
                         </m:r>
@@ -13244,110 +13409,8 @@
                         </m:r>
                       </m:sup>
                     </m:sSubSup>
-                  </m:num>
-                  <m:den>
-                    <m:sSubSup>
-                      <m:e>
-                        <m:r>
-                          <m:t>w</m:t>
-                        </m:r>
-                      </m:e>
-                      <m:sub>
-                        <m:r>
-                          <m:t>t</m:t>
-                        </m:r>
-                        <m:r>
-                          <m:rPr>
-                            <m:sty m:val="p"/>
-                          </m:rPr>
-                          <m:t>;</m:t>
-                        </m:r>
-                        <m:r>
-                          <m:t>g</m:t>
-                        </m:r>
-                        <m:r>
-                          <m:rPr>
-                            <m:sty m:val="p"/>
-                          </m:rPr>
-                          <m:t>,</m:t>
-                        </m:r>
-                        <m:r>
-                          <m:t>z</m:t>
-                        </m:r>
-                        <m:r>
-                          <m:rPr>
-                            <m:sty m:val="p"/>
-                          </m:rPr>
-                          <m:t>,</m:t>
-                        </m:r>
-                        <m:r>
-                          <m:t>l</m:t>
-                        </m:r>
-                      </m:sub>
-                      <m:sup>
-                        <m:r>
-                          <m:rPr>
-                            <m:sty m:val="p"/>
-                          </m:rPr>
-                          <m:t>−</m:t>
-                        </m:r>
-                      </m:sup>
-                    </m:sSubSup>
-                    <m:r>
-                      <m:rPr>
-                        <m:sty m:val="p"/>
-                      </m:rPr>
-                      <m:t>+</m:t>
-                    </m:r>
-                    <m:sSubSup>
-                      <m:e>
-                        <m:r>
-                          <m:t>w</m:t>
-                        </m:r>
-                      </m:e>
-                      <m:sub>
-                        <m:r>
-                          <m:t>t</m:t>
-                        </m:r>
-                        <m:r>
-                          <m:rPr>
-                            <m:sty m:val="p"/>
-                          </m:rPr>
-                          <m:t>;</m:t>
-                        </m:r>
-                        <m:r>
-                          <m:t>g</m:t>
-                        </m:r>
-                        <m:r>
-                          <m:rPr>
-                            <m:sty m:val="p"/>
-                          </m:rPr>
-                          <m:t>,</m:t>
-                        </m:r>
-                        <m:r>
-                          <m:t>z</m:t>
-                        </m:r>
-                        <m:r>
-                          <m:rPr>
-                            <m:sty m:val="p"/>
-                          </m:rPr>
-                          <m:t>,</m:t>
-                        </m:r>
-                        <m:r>
-                          <m:t>l</m:t>
-                        </m:r>
-                      </m:sub>
-                      <m:sup>
-                        <m:r>
-                          <m:rPr>
-                            <m:sty m:val="p"/>
-                          </m:rPr>
-                          <m:t>+</m:t>
-                        </m:r>
-                      </m:sup>
-                    </m:sSubSup>
-                  </m:den>
-                </m:f>
+                  </m:e>
+                </m:d>
               </m:oMath>
             </m:oMathPara>
           </w:p>
@@ -13371,7 +13434,136 @@
         <w:pStyle w:val="BodyText"/>
       </w:pPr>
       <w:r>
-        <w:t xml:space="preserve">Thus, the updated mean is assumed to be informed by the relative contributions towards the increase in coral cover after growth. The DHW tolerance distributions after the growth event can be written with equations (13) and (17) as:</w:t>
+        <w:t xml:space="preserve">Thus, the updated mean is assumed to be informed by the relative contributions towards the increase in coral cover after growth. Because the ceiling</w:t>
+      </w:r>
+      <w:r>
+        <w:t xml:space="preserve"> </w:t>
+      </w:r>
+      <m:oMath>
+        <m:sSubSup>
+          <m:e>
+            <m:r>
+              <m:t>f</m:t>
+            </m:r>
+          </m:e>
+          <m:sub>
+            <m:r>
+              <m:t>g</m:t>
+            </m:r>
+            <m:r>
+              <m:rPr>
+                <m:sty m:val="p"/>
+              </m:rPr>
+              <m:t>,</m:t>
+            </m:r>
+            <m:r>
+              <m:t>z</m:t>
+            </m:r>
+            <m:r>
+              <m:rPr>
+                <m:sty m:val="p"/>
+              </m:rPr>
+              <m:t>,</m:t>
+            </m:r>
+            <m:r>
+              <m:t>l</m:t>
+            </m:r>
+          </m:sub>
+          <m:sup>
+            <m:r>
+              <m:rPr>
+                <m:sty m:val="p"/>
+              </m:rPr>
+              <m:t>+</m:t>
+            </m:r>
+          </m:sup>
+        </m:sSubSup>
+      </m:oMath>
+      <w:r>
+        <w:t xml:space="preserve"> </w:t>
+      </w:r>
+      <w:r>
+        <w:t xml:space="preserve">is anchored to each size class’s own initial mean, it can differ between size classes</w:t>
+      </w:r>
+      <w:r>
+        <w:t xml:space="preserve"> </w:t>
+      </w:r>
+      <m:oMath>
+        <m:r>
+          <m:t>z</m:t>
+        </m:r>
+        <m:r>
+          <m:rPr>
+            <m:sty m:val="p"/>
+          </m:rPr>
+          <m:t>−</m:t>
+        </m:r>
+        <m:r>
+          <m:t>1</m:t>
+        </m:r>
+      </m:oMath>
+      <w:r>
+        <w:t xml:space="preserve"> </w:t>
+      </w:r>
+      <w:r>
+        <w:t xml:space="preserve">and</w:t>
+      </w:r>
+      <w:r>
+        <w:t xml:space="preserve"> </w:t>
+      </w:r>
+      <m:oMath>
+        <m:r>
+          <m:t>z</m:t>
+        </m:r>
+      </m:oMath>
+      <w:r>
+        <w:t xml:space="preserve">; the resulting blend is therefore capped at</w:t>
+      </w:r>
+      <w:r>
+        <w:t xml:space="preserve"> </w:t>
+      </w:r>
+      <m:oMath>
+        <m:sSubSup>
+          <m:e>
+            <m:r>
+              <m:t>f</m:t>
+            </m:r>
+          </m:e>
+          <m:sub>
+            <m:r>
+              <m:t>g</m:t>
+            </m:r>
+            <m:r>
+              <m:rPr>
+                <m:sty m:val="p"/>
+              </m:rPr>
+              <m:t>,</m:t>
+            </m:r>
+            <m:r>
+              <m:t>z</m:t>
+            </m:r>
+            <m:r>
+              <m:rPr>
+                <m:sty m:val="p"/>
+              </m:rPr>
+              <m:t>,</m:t>
+            </m:r>
+            <m:r>
+              <m:t>l</m:t>
+            </m:r>
+          </m:sub>
+          <m:sup>
+            <m:r>
+              <m:rPr>
+                <m:sty m:val="p"/>
+              </m:rPr>
+              <m:t>+</m:t>
+            </m:r>
+          </m:sup>
+        </m:sSubSup>
+      </m:oMath>
+      <w:r>
+        <w:t xml:space="preserve">, the ceiling of the size class it is now assigned to, so that blending across size classes cannot itself push the mean past that size class’s ceiling. The DHW tolerance distributions after the growth event can be written with equations (13) and (17) as:</w:t>
       </w:r>
     </w:p>
     <w:tbl>
@@ -14928,106 +15120,55 @@
                   </m:rPr>
                   <m:t>=</m:t>
                 </m:r>
-                <m:nary>
-                  <m:naryPr>
-                    <m:chr m:val="∑"/>
-                    <m:limLoc m:val="undOvr"/>
-                    <m:subHide m:val="off"/>
-                    <m:supHide m:val="on"/>
-                  </m:naryPr>
-                  <m:sub>
-                    <m:sSup>
-                      <m:e>
-                        <m:r>
-                          <m:t>l</m:t>
-                        </m:r>
-                      </m:e>
-                      <m:sup>
-                        <m:r>
-                          <m:rPr>
-                            <m:sty m:val="p"/>
-                          </m:rPr>
-                          <m:t>′</m:t>
-                        </m:r>
-                      </m:sup>
-                    </m:sSup>
-                  </m:sub>
-                  <m:sup>
-                    <m:r>
-                      <m:t>​</m:t>
-                    </m:r>
-                  </m:sup>
+                <m:r>
+                  <m:rPr>
+                    <m:sty m:val="p"/>
+                  </m:rPr>
+                  <m:t>min</m:t>
+                </m:r>
+                <m:d>
+                  <m:dPr>
+                    <m:begChr m:val="("/>
+                    <m:sepChr m:val=""/>
+                    <m:endChr m:val=")"/>
+                    <m:grow/>
+                  </m:dPr>
                   <m:e>
-                    <m:f>
-                      <m:fPr>
-                        <m:type m:val="bar"/>
-                      </m:fPr>
-                      <m:num>
-                        <m:sSub>
+                    <m:nary>
+                      <m:naryPr>
+                        <m:chr m:val="∑"/>
+                        <m:limLoc m:val="undOvr"/>
+                        <m:subHide m:val="off"/>
+                        <m:supHide m:val="on"/>
+                      </m:naryPr>
+                      <m:sub>
+                        <m:sSup>
                           <m:e>
                             <m:r>
-                              <m:t>P</m:t>
+                              <m:t>l</m:t>
                             </m:r>
                           </m:e>
-                          <m:sub>
-                            <m:sSup>
-                              <m:e>
-                                <m:r>
-                                  <m:t>l</m:t>
-                                </m:r>
-                              </m:e>
-                              <m:sup>
-                                <m:r>
-                                  <m:rPr>
-                                    <m:sty m:val="p"/>
-                                  </m:rPr>
-                                  <m:t>′</m:t>
-                                </m:r>
-                              </m:sup>
-                            </m:sSup>
+                          <m:sup>
                             <m:r>
                               <m:rPr>
                                 <m:sty m:val="p"/>
                               </m:rPr>
-                              <m:t>,</m:t>
-                            </m:r>
-                            <m:r>
-                              <m:t>l</m:t>
-                            </m:r>
-                          </m:sub>
-                        </m:sSub>
-                      </m:num>
-                      <m:den>
-                        <m:nary>
-                          <m:naryPr>
-                            <m:chr m:val="∑"/>
-                            <m:limLoc m:val="undOvr"/>
-                            <m:subHide m:val="off"/>
-                            <m:supHide m:val="on"/>
-                          </m:naryPr>
-                          <m:sub>
-                            <m:sSup>
-                              <m:e>
-                                <m:r>
-                                  <m:t>l</m:t>
-                                </m:r>
-                              </m:e>
-                              <m:sup>
-                                <m:r>
-                                  <m:rPr>
-                                    <m:sty m:val="p"/>
-                                  </m:rPr>
-                                  <m:t>″</m:t>
-                                </m:r>
-                              </m:sup>
-                            </m:sSup>
-                          </m:sub>
-                          <m:sup>
-                            <m:r>
-                              <m:t>​</m:t>
+                              <m:t>′</m:t>
                             </m:r>
                           </m:sup>
-                          <m:e>
+                        </m:sSup>
+                      </m:sub>
+                      <m:sup>
+                        <m:r>
+                          <m:t>​</m:t>
+                        </m:r>
+                      </m:sup>
+                      <m:e>
+                        <m:f>
+                          <m:fPr>
+                            <m:type m:val="bar"/>
+                          </m:fPr>
+                          <m:num>
                             <m:sSub>
                               <m:e>
                                 <m:r>
@@ -15046,7 +15187,7 @@
                                       <m:rPr>
                                         <m:sty m:val="p"/>
                                       </m:rPr>
-                                      <m:t>″</m:t>
+                                      <m:t>′</m:t>
                                     </m:r>
                                   </m:sup>
                                 </m:sSup>
@@ -15061,26 +15202,158 @@
                                 </m:r>
                               </m:sub>
                             </m:sSub>
+                          </m:num>
+                          <m:den>
+                            <m:nary>
+                              <m:naryPr>
+                                <m:chr m:val="∑"/>
+                                <m:limLoc m:val="undOvr"/>
+                                <m:subHide m:val="off"/>
+                                <m:supHide m:val="on"/>
+                              </m:naryPr>
+                              <m:sub>
+                                <m:sSup>
+                                  <m:e>
+                                    <m:r>
+                                      <m:t>l</m:t>
+                                    </m:r>
+                                  </m:e>
+                                  <m:sup>
+                                    <m:r>
+                                      <m:rPr>
+                                        <m:sty m:val="p"/>
+                                      </m:rPr>
+                                      <m:t>″</m:t>
+                                    </m:r>
+                                  </m:sup>
+                                </m:sSup>
+                              </m:sub>
+                              <m:sup>
+                                <m:r>
+                                  <m:t>​</m:t>
+                                </m:r>
+                              </m:sup>
+                              <m:e>
+                                <m:sSub>
+                                  <m:e>
+                                    <m:r>
+                                      <m:t>P</m:t>
+                                    </m:r>
+                                  </m:e>
+                                  <m:sub>
+                                    <m:sSup>
+                                      <m:e>
+                                        <m:r>
+                                          <m:t>l</m:t>
+                                        </m:r>
+                                      </m:e>
+                                      <m:sup>
+                                        <m:r>
+                                          <m:rPr>
+                                            <m:sty m:val="p"/>
+                                          </m:rPr>
+                                          <m:t>″</m:t>
+                                        </m:r>
+                                      </m:sup>
+                                    </m:sSup>
+                                    <m:r>
+                                      <m:rPr>
+                                        <m:sty m:val="p"/>
+                                      </m:rPr>
+                                      <m:t>,</m:t>
+                                    </m:r>
+                                    <m:r>
+                                      <m:t>l</m:t>
+                                    </m:r>
+                                  </m:sub>
+                                </m:sSub>
+                              </m:e>
+                            </m:nary>
+                          </m:den>
+                        </m:f>
+                        <m:sSubSup>
+                          <m:e>
+                            <m:r>
+                              <m:t>μ</m:t>
+                            </m:r>
                           </m:e>
-                        </m:nary>
-                      </m:den>
-                    </m:f>
+                          <m:sub>
+                            <m:r>
+                              <m:t>t</m:t>
+                            </m:r>
+                            <m:r>
+                              <m:rPr>
+                                <m:sty m:val="p"/>
+                              </m:rPr>
+                              <m:t>;</m:t>
+                            </m:r>
+                            <m:r>
+                              <m:t>g</m:t>
+                            </m:r>
+                            <m:r>
+                              <m:rPr>
+                                <m:sty m:val="p"/>
+                              </m:rPr>
+                              <m:t>,</m:t>
+                            </m:r>
+                            <m:sSup>
+                              <m:e>
+                                <m:r>
+                                  <m:t>l</m:t>
+                                </m:r>
+                              </m:e>
+                              <m:sup>
+                                <m:r>
+                                  <m:rPr>
+                                    <m:sty m:val="p"/>
+                                  </m:rPr>
+                                  <m:t>′</m:t>
+                                </m:r>
+                              </m:sup>
+                            </m:sSup>
+                          </m:sub>
+                          <m:sup>
+                            <m:r>
+                              <m:t>s</m:t>
+                            </m:r>
+                            <m:r>
+                              <m:t>e</m:t>
+                            </m:r>
+                            <m:r>
+                              <m:t>t</m:t>
+                            </m:r>
+                            <m:r>
+                              <m:t>t</m:t>
+                            </m:r>
+                            <m:r>
+                              <m:t>l</m:t>
+                            </m:r>
+                            <m:r>
+                              <m:t>e</m:t>
+                            </m:r>
+                            <m:r>
+                              <m:t>r</m:t>
+                            </m:r>
+                          </m:sup>
+                        </m:sSubSup>
+                      </m:e>
+                    </m:nary>
+                    <m:r>
+                      <m:rPr>
+                        <m:sty m:val="p"/>
+                      </m:rPr>
+                      <m:t>,</m:t>
+                    </m:r>
+                    <m:r>
+                      <m:t> </m:t>
+                    </m:r>
                     <m:sSubSup>
                       <m:e>
                         <m:r>
-                          <m:t>μ</m:t>
+                          <m:t>f</m:t>
                         </m:r>
                       </m:e>
                       <m:sub>
-                        <m:r>
-                          <m:t>t</m:t>
-                        </m:r>
-                        <m:r>
-                          <m:rPr>
-                            <m:sty m:val="p"/>
-                          </m:rPr>
-                          <m:t>;</m:t>
-                        </m:r>
                         <m:r>
                           <m:t>g</m:t>
                         </m:r>
@@ -15090,48 +15363,30 @@
                           </m:rPr>
                           <m:t>,</m:t>
                         </m:r>
-                        <m:sSup>
-                          <m:e>
-                            <m:r>
-                              <m:t>l</m:t>
-                            </m:r>
-                          </m:e>
-                          <m:sup>
-                            <m:r>
-                              <m:rPr>
-                                <m:sty m:val="p"/>
-                              </m:rPr>
-                              <m:t>′</m:t>
-                            </m:r>
-                          </m:sup>
-                        </m:sSup>
-                      </m:sub>
-                      <m:sup>
                         <m:r>
-                          <m:t>s</m:t>
+                          <m:t>1</m:t>
                         </m:r>
                         <m:r>
-                          <m:t>e</m:t>
-                        </m:r>
-                        <m:r>
-                          <m:t>t</m:t>
-                        </m:r>
-                        <m:r>
-                          <m:t>t</m:t>
+                          <m:rPr>
+                            <m:sty m:val="p"/>
+                          </m:rPr>
+                          <m:t>,</m:t>
                         </m:r>
                         <m:r>
                           <m:t>l</m:t>
                         </m:r>
+                      </m:sub>
+                      <m:sup>
                         <m:r>
-                          <m:t>e</m:t>
-                        </m:r>
-                        <m:r>
-                          <m:t>r</m:t>
+                          <m:rPr>
+                            <m:sty m:val="p"/>
+                          </m:rPr>
+                          <m:t>+</m:t>
                         </m:r>
                       </m:sup>
                     </m:sSubSup>
                   </m:e>
-                </m:nary>
+                </m:d>
                 <m:sSubSup>
                   <m:e>
                     <m:r>
@@ -15415,7 +15670,208 @@
         <w:t xml:space="preserve"> </w:t>
       </w:r>
       <w:r>
-        <w:t xml:space="preserve">is assumed to have a nominal value of 0.3.</w:t>
+        <w:t xml:space="preserve">is assumed to have a nominal value of 0.3. Because the heritable shift in equation (19) can push</w:t>
+      </w:r>
+      <w:r>
+        <w:t xml:space="preserve"> </w:t>
+      </w:r>
+      <m:oMath>
+        <m:sSubSup>
+          <m:e>
+            <m:r>
+              <m:t>μ</m:t>
+            </m:r>
+          </m:e>
+          <m:sub>
+            <m:r>
+              <m:t>t</m:t>
+            </m:r>
+            <m:r>
+              <m:rPr>
+                <m:sty m:val="p"/>
+              </m:rPr>
+              <m:t>;</m:t>
+            </m:r>
+            <m:r>
+              <m:t>g</m:t>
+            </m:r>
+            <m:r>
+              <m:rPr>
+                <m:sty m:val="p"/>
+              </m:rPr>
+              <m:t>,</m:t>
+            </m:r>
+            <m:sSup>
+              <m:e>
+                <m:r>
+                  <m:t>l</m:t>
+                </m:r>
+              </m:e>
+              <m:sup>
+                <m:r>
+                  <m:rPr>
+                    <m:sty m:val="p"/>
+                  </m:rPr>
+                  <m:t>′</m:t>
+                </m:r>
+              </m:sup>
+            </m:sSup>
+          </m:sub>
+          <m:sup>
+            <m:r>
+              <m:t>s</m:t>
+            </m:r>
+            <m:r>
+              <m:t>e</m:t>
+            </m:r>
+            <m:r>
+              <m:t>t</m:t>
+            </m:r>
+            <m:r>
+              <m:t>t</m:t>
+            </m:r>
+            <m:r>
+              <m:t>l</m:t>
+            </m:r>
+            <m:r>
+              <m:t>e</m:t>
+            </m:r>
+            <m:r>
+              <m:t>r</m:t>
+            </m:r>
+          </m:sup>
+        </m:sSubSup>
+      </m:oMath>
+      <w:r>
+        <w:t xml:space="preserve"> </w:t>
+      </w:r>
+      <w:r>
+        <w:t xml:space="preserve">above the source location’s own ceiling, and the connectivity-weighted combination in equation (20) can compound this across source locations,</w:t>
+      </w:r>
+      <w:r>
+        <w:t xml:space="preserve"> </w:t>
+      </w:r>
+      <m:oMath>
+        <m:sSubSup>
+          <m:e>
+            <m:r>
+              <m:t>μ</m:t>
+            </m:r>
+          </m:e>
+          <m:sub>
+            <m:r>
+              <m:t>t</m:t>
+            </m:r>
+            <m:r>
+              <m:rPr>
+                <m:sty m:val="p"/>
+              </m:rPr>
+              <m:t>;</m:t>
+            </m:r>
+            <m:r>
+              <m:t>g</m:t>
+            </m:r>
+            <m:r>
+              <m:rPr>
+                <m:sty m:val="p"/>
+              </m:rPr>
+              <m:t>,</m:t>
+            </m:r>
+            <m:r>
+              <m:t>1</m:t>
+            </m:r>
+            <m:r>
+              <m:rPr>
+                <m:sty m:val="p"/>
+              </m:rPr>
+              <m:t>,</m:t>
+            </m:r>
+            <m:r>
+              <m:t>l</m:t>
+            </m:r>
+          </m:sub>
+          <m:sup>
+            <m:r>
+              <m:t>r</m:t>
+            </m:r>
+            <m:r>
+              <m:t>e</m:t>
+            </m:r>
+            <m:r>
+              <m:t>p</m:t>
+            </m:r>
+            <m:r>
+              <m:t>r</m:t>
+            </m:r>
+            <m:r>
+              <m:t>o</m:t>
+            </m:r>
+            <m:r>
+              <m:t>d</m:t>
+            </m:r>
+            <m:r>
+              <m:rPr>
+                <m:sty m:val="p"/>
+              </m:rPr>
+              <m:t>.</m:t>
+            </m:r>
+          </m:sup>
+        </m:sSubSup>
+      </m:oMath>
+      <w:r>
+        <w:t xml:space="preserve"> </w:t>
+      </w:r>
+      <w:r>
+        <w:t xml:space="preserve">is capped at the sink size class’s ceiling</w:t>
+      </w:r>
+      <w:r>
+        <w:t xml:space="preserve"> </w:t>
+      </w:r>
+      <m:oMath>
+        <m:sSubSup>
+          <m:e>
+            <m:r>
+              <m:t>f</m:t>
+            </m:r>
+          </m:e>
+          <m:sub>
+            <m:r>
+              <m:t>g</m:t>
+            </m:r>
+            <m:r>
+              <m:rPr>
+                <m:sty m:val="p"/>
+              </m:rPr>
+              <m:t>,</m:t>
+            </m:r>
+            <m:r>
+              <m:t>1</m:t>
+            </m:r>
+            <m:r>
+              <m:rPr>
+                <m:sty m:val="p"/>
+              </m:rPr>
+              <m:t>,</m:t>
+            </m:r>
+            <m:r>
+              <m:t>l</m:t>
+            </m:r>
+          </m:sub>
+          <m:sup>
+            <m:r>
+              <m:rPr>
+                <m:sty m:val="p"/>
+              </m:rPr>
+              <m:t>+</m:t>
+            </m:r>
+          </m:sup>
+        </m:sSubSup>
+      </m:oMath>
+      <w:r>
+        <w:t xml:space="preserve"> </w:t>
+      </w:r>
+      <w:r>
+        <w:t xml:space="preserve">before being used as the mean of the truncated normal.</w:t>
       </w:r>
     </w:p>
     <w:bookmarkEnd w:id="41"/>

</xml_diff>

<commit_message>
Document disturbance mortality derivation in Disturbances datasets
Expands the one-line description to cover the counterfactual
undisturbed-growth correction, the population-level (not per-group)
background growth fitting, and how unmapped "unknown" disturbances are
excluded here and down-weighted in calibration instead.
</commit_message>
<xml_diff>
--- a/paper/paper.docx
+++ b/paper/paper.docx
@@ -13563,7 +13563,7 @@
         </m:sSubSup>
       </m:oMath>
       <w:r>
-        <w:t xml:space="preserve">, the ceiling of the size class it is now assigned to, so that blending across size classes cannot itself push the mean past that size class’s ceiling. The DHW tolerance distributions after the growth event can be written with equations (13) and (17) as:</w:t>
+        <w:t xml:space="preserve">, the ceiling of the size class it is now assigned to, so that blending across size classes does not push the mean past that size class’s ceiling. The DHW tolerance distributions after the growth event can be written with equations (13) and (17) as:</w:t>
       </w:r>
     </w:p>
     <w:tbl>
@@ -44606,7 +44606,7 @@
         <w:pStyle w:val="FirstParagraph"/>
       </w:pPr>
       <w:r>
-        <w:t xml:space="preserve">We used two separate disturbance datasets in calibration: maximum historical DHW values and cyclone/storm mortality rates. The former was derived from observed maximum Degree Heating Weeks (DHWs) data provided by NOAA’s CoralTempv3.1 product</w:t>
+        <w:t xml:space="preserve">To account for heat stress mortality, we used a historical DHW dataset, derived from observed maximum Degree Heating Weeks (DHWs) data provided by NOAA’s CoralTempv3.1 product</w:t>
       </w:r>
       <w:r>
         <w:t xml:space="preserve"> </w:t>
@@ -44628,7 +44628,19 @@
         <w:t xml:space="preserve">Figure S2</w:t>
       </w:r>
       <w:r>
-        <w:t xml:space="preserve">). The latter was estimated by matching LTMP disturbance records (year and type of disturbance) with coral cover and benthic composition data to calculate mortality rates per functional group for each year and reef.</w:t>
+        <w:t xml:space="preserve">). To account for cyclone/storm and COTS mortality, we derived a separate mortality dataset from LTMP disturbance records (year and type of disturbance) with coral cover and benthic composition data. Because coral cover grows naturally between surveys, survival was calculated against a counterfactual undisturbed growth projection of the pre-disturbance cover. This background growth rate was estimated once from each reef’s total cover, then split into per functional group mortality rates using benthic composition data. Locations with disturbances flagged as</w:t>
+      </w:r>
+      <w:r>
+        <w:t xml:space="preserve"> </w:t>
+      </w:r>
+      <w:r>
+        <w:t xml:space="preserve">“unknown”</w:t>
+      </w:r>
+      <w:r>
+        <w:t xml:space="preserve"> </w:t>
+      </w:r>
+      <w:r>
+        <w:t xml:space="preserve">were not included in this mortality-rate calculation.</w:t>
       </w:r>
     </w:p>
     <w:p>

</xml_diff>

<commit_message>
Document penalty for invalid parameter sets in objective function
</commit_message>
<xml_diff>
--- a/paper/paper.docx
+++ b/paper/paper.docx
@@ -44589,6 +44589,14 @@
       </w:r>
       <w:r>
         <w:t xml:space="preserve">are the weights given to each part of the objective function and are 1, 2, and 2 respectively.</w:t>
+      </w:r>
+    </w:p>
+    <w:p>
+      <w:pPr>
+        <w:pStyle w:val="BodyText"/>
+      </w:pPr>
+      <w:r>
+        <w:t xml:space="preserve">Candidate parameter sets that violate parameter-bound constraints or produce an invalid model run (e.g. a negative recruitment scale factor) are assigned a large fixed penalty instead of being scored by the equations above.</w:t>
       </w:r>
     </w:p>
     <w:bookmarkEnd w:id="223"/>

</xml_diff>

<commit_message>
Rewrite calibration objective function equations to match current code
Eqs 21S-25S described an obsolete MAEE/Pearson-correlation formulation
with weights 1,2,2. Replaces them with the current year-weighted MAE,
peak/trough terms, and Bray-Curtis composition error (weights 1,0.5,0.5,2),
and documents the hard penalty applied to invalid candidate parameter sets.
</commit_message>
<xml_diff>
--- a/paper/paper.docx
+++ b/paper/paper.docx
@@ -43609,7 +43609,7 @@
         <w:pStyle w:val="FirstParagraph"/>
       </w:pPr>
       <w:r>
-        <w:t xml:space="preserve">The objective function used to optimize the parameterization of CoralBlox has two components, corresponding to the total cover error and to the coral composition error. The total cover error captures the difference between modelled and observed total coral cover and the coral composition error captures differences between modelled and observed coral composition. AIMS’ Long Term Monitoring Program (LTMP) Manta Tow data was used as the target reef coral cover levels and modelled coral composition data derived from AIMS’ LTMP photogrammetry data was used as target coral composition levels.</w:t>
+        <w:t xml:space="preserve">The objective function used to optimize the parameterization of CoralBlox has two components: a total cover error and a coral composition error. AIMS’ Long Term Monitoring Program (LTMP) Manta Tow data was used as the target reef coral cover levels, and coral composition data derived from AIMS’ LTMP photogrammetry data was used as the target coral composition levels.</w:t>
       </w:r>
     </w:p>
     <w:p>
@@ -43617,7 +43617,103 @@
         <w:pStyle w:val="BodyText"/>
       </w:pPr>
       <w:r>
-        <w:t xml:space="preserve">The Mean Absolute Exponential Error (MAEE) between coral cover observed estimates and model outputs was calculated for each timestep of the historical period where data was available. The MAEE for each timestep is given below</w:t>
+        <w:t xml:space="preserve">The total cover error combines a year-weighted mean absolute error over the calibration period with two further terms scoring how well each reef’s observed peak and trough in coral cover are reproduced. The per-year error, calculated across all reefs</w:t>
+      </w:r>
+      <w:r>
+        <w:t xml:space="preserve"> </w:t>
+      </w:r>
+      <m:oMath>
+        <m:r>
+          <m:t>l</m:t>
+        </m:r>
+      </m:oMath>
+      <w:r>
+        <w:t xml:space="preserve"> </w:t>
+      </w:r>
+      <w:r>
+        <w:t xml:space="preserve">with an observed value at year</w:t>
+      </w:r>
+      <w:r>
+        <w:t xml:space="preserve"> </w:t>
+      </w:r>
+      <m:oMath>
+        <m:r>
+          <m:t>t</m:t>
+        </m:r>
+      </m:oMath>
+      <w:r>
+        <w:t xml:space="preserve"> </w:t>
+      </w:r>
+      <w:r>
+        <w:t xml:space="preserve">(</w:t>
+      </w:r>
+      <m:oMath>
+        <m:sSub>
+          <m:e>
+            <m:r>
+              <m:t>L</m:t>
+            </m:r>
+          </m:e>
+          <m:sub>
+            <m:r>
+              <m:t>t</m:t>
+            </m:r>
+          </m:sub>
+        </m:sSub>
+      </m:oMath>
+      <w:r>
+        <w:t xml:space="preserve">, with</w:t>
+      </w:r>
+      <w:r>
+        <w:t xml:space="preserve"> </w:t>
+      </w:r>
+      <m:oMath>
+        <m:sSub>
+          <m:e>
+            <m:r>
+              <m:t>N</m:t>
+            </m:r>
+          </m:e>
+          <m:sub>
+            <m:r>
+              <m:t>t</m:t>
+            </m:r>
+          </m:sub>
+        </m:sSub>
+        <m:r>
+          <m:rPr>
+            <m:sty m:val="p"/>
+          </m:rPr>
+          <m:t>=</m:t>
+        </m:r>
+        <m:d>
+          <m:dPr>
+            <m:begChr m:val="|"/>
+            <m:sepChr m:val=""/>
+            <m:endChr m:val="|"/>
+            <m:grow/>
+          </m:dPr>
+          <m:e>
+            <m:sSub>
+              <m:e>
+                <m:r>
+                  <m:t>L</m:t>
+                </m:r>
+              </m:e>
+              <m:sub>
+                <m:r>
+                  <m:t>t</m:t>
+                </m:r>
+              </m:sub>
+            </m:sSub>
+          </m:e>
+        </m:d>
+      </m:oMath>
+      <w:r>
+        <w:t xml:space="preserve"> </w:t>
+      </w:r>
+      <w:r>
+        <w:t xml:space="preserve">reefs), is given by:</w:t>
       </w:r>
     </w:p>
     <w:tbl>
@@ -43643,19 +43739,16 @@
                 <m:jc m:val="center"/>
               </m:oMathParaPr>
               <m:oMath>
+                <m:r>
+                  <m:t>E</m:t>
+                </m:r>
+                <m:r>
+                  <m:t>r</m:t>
+                </m:r>
                 <m:sSub>
                   <m:e>
                     <m:r>
-                      <m:t>M</m:t>
-                    </m:r>
-                    <m:r>
-                      <m:t>A</m:t>
-                    </m:r>
-                    <m:r>
-                      <m:t>E</m:t>
-                    </m:r>
-                    <m:r>
-                      <m:t>E</m:t>
+                      <m:t>r</m:t>
                     </m:r>
                   </m:e>
                   <m:sub>
@@ -43670,22 +43763,65 @@
                   </m:rPr>
                   <m:t>=</m:t>
                 </m:r>
-                <m:r>
-                  <m:t> </m:t>
-                </m:r>
-                <m:r>
-                  <m:rPr>
-                    <m:sty m:val="p"/>
-                  </m:rPr>
-                  <m:t>exp</m:t>
-                </m:r>
-                <m:d>
-                  <m:dPr>
-                    <m:begChr m:val="("/>
-                    <m:sepChr m:val=""/>
-                    <m:endChr m:val=")"/>
-                    <m:grow/>
-                  </m:dPr>
+                <m:f>
+                  <m:fPr>
+                    <m:type m:val="bar"/>
+                  </m:fPr>
+                  <m:num>
+                    <m:r>
+                      <m:t>1</m:t>
+                    </m:r>
+                  </m:num>
+                  <m:den>
+                    <m:sSub>
+                      <m:e>
+                        <m:r>
+                          <m:t>N</m:t>
+                        </m:r>
+                      </m:e>
+                      <m:sub>
+                        <m:r>
+                          <m:t>t</m:t>
+                        </m:r>
+                      </m:sub>
+                    </m:sSub>
+                  </m:den>
+                </m:f>
+                <m:nary>
+                  <m:naryPr>
+                    <m:chr m:val="∑"/>
+                    <m:limLoc m:val="undOvr"/>
+                    <m:subHide m:val="off"/>
+                    <m:supHide m:val="on"/>
+                  </m:naryPr>
+                  <m:sub>
+                    <m:r>
+                      <m:t>l</m:t>
+                    </m:r>
+                    <m:r>
+                      <m:rPr>
+                        <m:sty m:val="p"/>
+                      </m:rPr>
+                      <m:t>∈</m:t>
+                    </m:r>
+                    <m:sSub>
+                      <m:e>
+                        <m:r>
+                          <m:t>L</m:t>
+                        </m:r>
+                      </m:e>
+                      <m:sub>
+                        <m:r>
+                          <m:t>t</m:t>
+                        </m:r>
+                      </m:sub>
+                    </m:sSub>
+                  </m:sub>
+                  <m:sup>
+                    <m:r>
+                      <m:t>​</m:t>
+                    </m:r>
+                  </m:sup>
                   <m:e>
                     <m:d>
                       <m:dPr>
@@ -43695,76 +43831,35 @@
                         <m:grow/>
                       </m:dPr>
                       <m:e>
-                        <m:r>
-                          <m:t>y</m:t>
-                        </m:r>
+                        <m:sSub>
+                          <m:e>
+                            <m:r>
+                              <m:t>y</m:t>
+                            </m:r>
+                          </m:e>
+                          <m:sub>
+                            <m:r>
+                              <m:t>t</m:t>
+                            </m:r>
+                            <m:r>
+                              <m:rPr>
+                                <m:sty m:val="p"/>
+                              </m:rPr>
+                              <m:t>,</m:t>
+                            </m:r>
+                            <m:r>
+                              <m:t>l</m:t>
+                            </m:r>
+                          </m:sub>
+                        </m:sSub>
                         <m:r>
                           <m:rPr>
                             <m:sty m:val="p"/>
                           </m:rPr>
                           <m:t>−</m:t>
                         </m:r>
-                        <m:r>
-                          <m:t> </m:t>
-                        </m:r>
-                        <m:acc>
-                          <m:accPr>
-                            <m:chr m:val="̂"/>
-                          </m:accPr>
+                        <m:sSub>
                           <m:e>
-                            <m:r>
-                              <m:t>y</m:t>
-                            </m:r>
-                          </m:e>
-                        </m:acc>
-                      </m:e>
-                    </m:d>
-                    <m:r>
-                      <m:rPr>
-                        <m:sty m:val="p"/>
-                      </m:rPr>
-                      <m:t>•</m:t>
-                    </m:r>
-                    <m:d>
-                      <m:dPr>
-                        <m:begChr m:val="("/>
-                        <m:sepChr m:val=""/>
-                        <m:endChr m:val=")"/>
-                        <m:grow/>
-                      </m:dPr>
-                      <m:e>
-                        <m:r>
-                          <m:t>1</m:t>
-                        </m:r>
-                        <m:r>
-                          <m:rPr>
-                            <m:sty m:val="p"/>
-                          </m:rPr>
-                          <m:t>+</m:t>
-                        </m:r>
-                        <m:r>
-                          <m:t> </m:t>
-                        </m:r>
-                        <m:d>
-                          <m:dPr>
-                            <m:begChr m:val="|"/>
-                            <m:sepChr m:val=""/>
-                            <m:endChr m:val="|"/>
-                            <m:grow/>
-                          </m:dPr>
-                          <m:e>
-                            <m:r>
-                              <m:t>y</m:t>
-                            </m:r>
-                            <m:r>
-                              <m:rPr>
-                                <m:sty m:val="p"/>
-                              </m:rPr>
-                              <m:t>−</m:t>
-                            </m:r>
-                            <m:r>
-                              <m:t> </m:t>
-                            </m:r>
                             <m:acc>
                               <m:accPr>
                                 <m:chr m:val="̂"/>
@@ -43776,20 +43871,25 @@
                               </m:e>
                             </m:acc>
                           </m:e>
-                        </m:d>
+                          <m:sub>
+                            <m:r>
+                              <m:t>t</m:t>
+                            </m:r>
+                            <m:r>
+                              <m:rPr>
+                                <m:sty m:val="p"/>
+                              </m:rPr>
+                              <m:t>,</m:t>
+                            </m:r>
+                            <m:r>
+                              <m:t>l</m:t>
+                            </m:r>
+                          </m:sub>
+                        </m:sSub>
                       </m:e>
                     </m:d>
                   </m:e>
-                </m:d>
-                <m:r>
-                  <m:rPr>
-                    <m:sty m:val="p"/>
-                  </m:rPr>
-                  <m:t>−</m:t>
-                </m:r>
-                <m:r>
-                  <m:t>1</m:t>
-                </m:r>
+                </m:nary>
               </m:oMath>
             </m:oMathPara>
           </w:p>
@@ -43812,44 +43912,7 @@
         <w:pStyle w:val="BodyText"/>
       </w:pPr>
       <w:r>
-        <w:t xml:space="preserve">where y and</w:t>
-      </w:r>
-      <w:r>
-        <w:t xml:space="preserve"> </w:t>
-      </w:r>
-      <m:oMath>
-        <m:acc>
-          <m:accPr>
-            <m:chr m:val="̂"/>
-          </m:accPr>
-          <m:e>
-            <m:r>
-              <m:t>y</m:t>
-            </m:r>
-          </m:e>
-        </m:acc>
-      </m:oMath>
-      <w:r>
-        <w:t xml:space="preserve"> </w:t>
-      </w:r>
-      <w:r>
-        <w:t xml:space="preserve">are the target LTMP data and modelled outputs respectively.</w:t>
-      </w:r>
-    </w:p>
-    <w:p>
-      <w:pPr>
-        <w:pStyle w:val="BodyText"/>
-      </w:pPr>
-      <w:r>
-        <w:t xml:space="preserve">Furthermore, the years where minimum and maximum levels of coral cover were recorded were weighted by a factor of two to encourage the calibration to capture this trend in the target data.</w:t>
-      </w:r>
-    </w:p>
-    <w:p>
-      <w:pPr>
-        <w:pStyle w:val="BodyText"/>
-      </w:pPr>
-      <w:r>
-        <w:t xml:space="preserve">The objective function considers the temporal variability of MAEE to ensure the mean error between observed LTMP estimates and modelled coral cover are both minimized and not highly variable over time. The temporal variability of MAEE is given as</w:t>
+        <w:t xml:space="preserve">Because CoralBlox is run forward from its initial cover without re-anchoring to observations, error compounds over the course of a simulation. Later years, and years with more reporting reefs, are therefore weighted more heavily when combining the per-year errors into a single reef performance error:</w:t>
       </w:r>
     </w:p>
     <w:tbl>
@@ -43875,19 +43938,30 @@
                 <m:jc m:val="center"/>
               </m:oMathParaPr>
               <m:oMath>
+                <m:r>
+                  <m:t>E</m:t>
+                </m:r>
+                <m:r>
+                  <m:t>r</m:t>
+                </m:r>
                 <m:sSub>
                   <m:e>
                     <m:r>
-                      <m:rPr>
-                        <m:nor/>
-                        <m:sty m:val="p"/>
-                      </m:rPr>
-                      <m:t>MAEE</m:t>
+                      <m:t>r</m:t>
                     </m:r>
                   </m:e>
                   <m:sub>
                     <m:r>
-                      <m:t>σ</m:t>
+                      <m:t>r</m:t>
+                    </m:r>
+                    <m:r>
+                      <m:t>e</m:t>
+                    </m:r>
+                    <m:r>
+                      <m:t>e</m:t>
+                    </m:r>
+                    <m:r>
+                      <m:t>f</m:t>
                     </m:r>
                   </m:sub>
                 </m:sSub>
@@ -43897,39 +43971,212 @@
                   </m:rPr>
                   <m:t>=</m:t>
                 </m:r>
-                <m:sSub>
-                  <m:e>
-                    <m:r>
-                      <m:t>μ</m:t>
-                    </m:r>
-                  </m:e>
-                  <m:sub>
-                    <m:r>
-                      <m:t>t</m:t>
-                    </m:r>
-                  </m:sub>
-                </m:sSub>
-                <m:d>
-                  <m:dPr>
-                    <m:begChr m:val="("/>
-                    <m:sepChr m:val=""/>
-                    <m:endChr m:val=")"/>
-                    <m:grow/>
-                  </m:dPr>
-                  <m:e>
-                    <m:sSub>
-                      <m:e>
+                <m:f>
+                  <m:fPr>
+                    <m:type m:val="bar"/>
+                  </m:fPr>
+                  <m:num>
+                    <m:nary>
+                      <m:naryPr>
+                        <m:chr m:val="∑"/>
+                        <m:limLoc m:val="undOvr"/>
+                        <m:subHide m:val="off"/>
+                        <m:supHide m:val="on"/>
+                      </m:naryPr>
+                      <m:sub>
                         <m:r>
-                          <m:t>M</m:t>
+                          <m:t>t</m:t>
                         </m:r>
                         <m:r>
-                          <m:t>A</m:t>
+                          <m:rPr>
+                            <m:sty m:val="p"/>
+                          </m:rPr>
+                          <m:t>:</m:t>
+                        </m:r>
+                        <m:r>
+                          <m:t> </m:t>
+                        </m:r>
+                        <m:sSub>
+                          <m:e>
+                            <m:r>
+                              <m:t>N</m:t>
+                            </m:r>
+                          </m:e>
+                          <m:sub>
+                            <m:r>
+                              <m:t>t</m:t>
+                            </m:r>
+                          </m:sub>
+                        </m:sSub>
+                        <m:r>
+                          <m:rPr>
+                            <m:sty m:val="p"/>
+                          </m:rPr>
+                          <m:t>&gt;</m:t>
+                        </m:r>
+                        <m:r>
+                          <m:t>0</m:t>
+                        </m:r>
+                      </m:sub>
+                      <m:sup>
+                        <m:r>
+                          <m:t>​</m:t>
+                        </m:r>
+                      </m:sup>
+                      <m:e>
+                        <m:sSub>
+                          <m:e>
+                            <m:r>
+                              <m:t>w</m:t>
+                            </m:r>
+                          </m:e>
+                          <m:sub>
+                            <m:r>
+                              <m:t>t</m:t>
+                            </m:r>
+                          </m:sub>
+                        </m:sSub>
+                        <m:r>
+                          <m:rPr>
+                            <m:sty m:val="p"/>
+                          </m:rPr>
+                          <m:t>⋅</m:t>
                         </m:r>
                         <m:r>
                           <m:t>E</m:t>
                         </m:r>
                         <m:r>
-                          <m:t>E</m:t>
+                          <m:t>r</m:t>
+                        </m:r>
+                        <m:sSub>
+                          <m:e>
+                            <m:r>
+                              <m:t>r</m:t>
+                            </m:r>
+                          </m:e>
+                          <m:sub>
+                            <m:r>
+                              <m:t>t</m:t>
+                            </m:r>
+                          </m:sub>
+                        </m:sSub>
+                      </m:e>
+                    </m:nary>
+                  </m:num>
+                  <m:den>
+                    <m:nary>
+                      <m:naryPr>
+                        <m:chr m:val="∑"/>
+                        <m:limLoc m:val="undOvr"/>
+                        <m:subHide m:val="off"/>
+                        <m:supHide m:val="on"/>
+                      </m:naryPr>
+                      <m:sub>
+                        <m:r>
+                          <m:t>t</m:t>
+                        </m:r>
+                        <m:r>
+                          <m:rPr>
+                            <m:sty m:val="p"/>
+                          </m:rPr>
+                          <m:t>:</m:t>
+                        </m:r>
+                        <m:r>
+                          <m:t> </m:t>
+                        </m:r>
+                        <m:sSub>
+                          <m:e>
+                            <m:r>
+                              <m:t>N</m:t>
+                            </m:r>
+                          </m:e>
+                          <m:sub>
+                            <m:r>
+                              <m:t>t</m:t>
+                            </m:r>
+                          </m:sub>
+                        </m:sSub>
+                        <m:r>
+                          <m:rPr>
+                            <m:sty m:val="p"/>
+                          </m:rPr>
+                          <m:t>&gt;</m:t>
+                        </m:r>
+                        <m:r>
+                          <m:t>0</m:t>
+                        </m:r>
+                      </m:sub>
+                      <m:sup>
+                        <m:r>
+                          <m:t>​</m:t>
+                        </m:r>
+                      </m:sup>
+                      <m:e>
+                        <m:sSub>
+                          <m:e>
+                            <m:r>
+                              <m:t>w</m:t>
+                            </m:r>
+                          </m:e>
+                          <m:sub>
+                            <m:r>
+                              <m:t>t</m:t>
+                            </m:r>
+                          </m:sub>
+                        </m:sSub>
+                      </m:e>
+                    </m:nary>
+                  </m:den>
+                </m:f>
+              </m:oMath>
+            </m:oMathPara>
+          </w:p>
+          <w:p>
+            <w:pPr>
+              <w:pStyle w:val="Compact"/>
+            </w:pPr>
+            <m:oMathPara>
+              <m:oMathParaPr>
+                <m:jc m:val="center"/>
+              </m:oMathParaPr>
+              <m:oMath>
+                <m:sSub>
+                  <m:e>
+                    <m:r>
+                      <m:t>w</m:t>
+                    </m:r>
+                  </m:e>
+                  <m:sub>
+                    <m:r>
+                      <m:t>t</m:t>
+                    </m:r>
+                  </m:sub>
+                </m:sSub>
+                <m:r>
+                  <m:rPr>
+                    <m:sty m:val="p"/>
+                  </m:rPr>
+                  <m:t>=</m:t>
+                </m:r>
+                <m:r>
+                  <m:t>t</m:t>
+                </m:r>
+                <m:r>
+                  <m:rPr>
+                    <m:sty m:val="p"/>
+                  </m:rPr>
+                  <m:t>⋅</m:t>
+                </m:r>
+                <m:rad>
+                  <m:radPr>
+                    <m:degHide m:val="on"/>
+                  </m:radPr>
+                  <m:deg/>
+                  <m:e>
+                    <m:sSub>
+                      <m:e>
+                        <m:r>
+                          <m:t>N</m:t>
                         </m:r>
                       </m:e>
                       <m:sub>
@@ -43939,74 +44186,7 @@
                       </m:sub>
                     </m:sSub>
                   </m:e>
-                </m:d>
-                <m:r>
-                  <m:rPr>
-                    <m:sty m:val="p"/>
-                  </m:rPr>
-                  <m:t>⋅</m:t>
-                </m:r>
-                <m:r>
-                  <m:t>0.9</m:t>
-                </m:r>
-                <m:r>
-                  <m:rPr>
-                    <m:sty m:val="p"/>
-                  </m:rPr>
-                  <m:t>+</m:t>
-                </m:r>
-                <m:sSub>
-                  <m:e>
-                    <m:r>
-                      <m:t>σ</m:t>
-                    </m:r>
-                  </m:e>
-                  <m:sub>
-                    <m:r>
-                      <m:t>t</m:t>
-                    </m:r>
-                  </m:sub>
-                </m:sSub>
-                <m:d>
-                  <m:dPr>
-                    <m:begChr m:val="("/>
-                    <m:sepChr m:val=""/>
-                    <m:endChr m:val=")"/>
-                    <m:grow/>
-                  </m:dPr>
-                  <m:e>
-                    <m:sSub>
-                      <m:e>
-                        <m:r>
-                          <m:t>M</m:t>
-                        </m:r>
-                        <m:r>
-                          <m:t>A</m:t>
-                        </m:r>
-                        <m:r>
-                          <m:t>E</m:t>
-                        </m:r>
-                        <m:r>
-                          <m:t>E</m:t>
-                        </m:r>
-                      </m:e>
-                      <m:sub>
-                        <m:r>
-                          <m:t>t</m:t>
-                        </m:r>
-                      </m:sub>
-                    </m:sSub>
-                  </m:e>
-                </m:d>
-                <m:r>
-                  <m:rPr>
-                    <m:sty m:val="p"/>
-                  </m:rPr>
-                  <m:t>⋅</m:t>
-                </m:r>
-                <m:r>
-                  <m:t>0.1</m:t>
-                </m:r>
+                </m:rad>
               </m:oMath>
             </m:oMathPara>
           </w:p>
@@ -44035,10 +44215,24 @@
         <w:t xml:space="preserve"> </w:t>
       </w:r>
       <m:oMath>
+        <m:r>
+          <m:t>t</m:t>
+        </m:r>
+      </m:oMath>
+      <w:r>
+        <w:t xml:space="preserve"> </w:t>
+      </w:r>
+      <w:r>
+        <w:t xml:space="preserve">is the year index (1 for the first calibration year, increasing thereafter), and reefs surveyed in the same year are assumed not to fail independently of one another, so</w:t>
+      </w:r>
+      <w:r>
+        <w:t xml:space="preserve"> </w:t>
+      </w:r>
+      <m:oMath>
         <m:sSub>
           <m:e>
             <m:r>
-              <m:t>μ</m:t>
+              <m:t>N</m:t>
             </m:r>
           </m:e>
           <m:sub>
@@ -44052,30 +44246,38 @@
         <w:t xml:space="preserve"> </w:t>
       </w:r>
       <w:r>
-        <w:t xml:space="preserve">and</w:t>
+        <w:t xml:space="preserve">enters as</w:t>
       </w:r>
       <w:r>
         <w:t xml:space="preserve"> </w:t>
       </w:r>
       <m:oMath>
-        <m:sSub>
+        <m:rad>
+          <m:radPr>
+            <m:degHide m:val="on"/>
+          </m:radPr>
+          <m:deg/>
           <m:e>
-            <m:r>
-              <m:t>σ</m:t>
-            </m:r>
+            <m:sSub>
+              <m:e>
+                <m:r>
+                  <m:t>N</m:t>
+                </m:r>
+              </m:e>
+              <m:sub>
+                <m:r>
+                  <m:t>t</m:t>
+                </m:r>
+              </m:sub>
+            </m:sSub>
           </m:e>
-          <m:sub>
-            <m:r>
-              <m:t>t</m:t>
-            </m:r>
-          </m:sub>
-        </m:sSub>
+        </m:rad>
       </m:oMath>
       <w:r>
         <w:t xml:space="preserve"> </w:t>
       </w:r>
       <w:r>
-        <w:t xml:space="preserve">are the mean and standard deviation functions taken over timesteps.</w:t>
+        <w:t xml:space="preserve">rather than linearly. Years with no reporting reefs are excluded from equation (22S).</w:t>
       </w:r>
     </w:p>
     <w:p>
@@ -44083,7 +44285,95 @@
         <w:pStyle w:val="BodyText"/>
       </w:pPr>
       <w:r>
-        <w:t xml:space="preserve">Modelled coral composition data derived from LTMP photogrammetry data was used to inform the initial coral composition and data at specific locations and as the target coral composition for subsequent historic years. Coral composition data was not recorded at all locations where manta tow coral cover levels are recorded. To account for the misalignment between Manta Tow observations and modelled coral composition cover values, Pearson’s Correlation Coefficient was incorporated in the objective function to match ADRIA-mod’s modelled coral composition to observations. The assumption being that coral composition at fixed site photogrammetry observations are representative of coral composition at manta tow locations, whilst this is not true, it is a limitation provided by a lack of data. The Coral Composition Error (CCE) was calculated for each timestep where data was available as follows</w:t>
+        <w:t xml:space="preserve">Modelled coral composition data derived from LTMP photogrammetry data was used to inform the initial coral composition at specific locations and as the target coral composition for subsequent historic years. Coral composition data was not recorded at all locations where manta tow coral cover levels are recorded; the assumption is that composition at fixed-site photogrammetry locations is representative of composition at nearby manta tow locations. Compositional mismatch between simulated and observed functional group cover was calculated using Bray-Curtis dissimilarity between the observed (</w:t>
+      </w:r>
+      <m:oMath>
+        <m:sSub>
+          <m:e>
+            <m:r>
+              <m:t>c</m:t>
+            </m:r>
+          </m:e>
+          <m:sub>
+            <m:r>
+              <m:t>t</m:t>
+            </m:r>
+            <m:r>
+              <m:rPr>
+                <m:sty m:val="p"/>
+              </m:rPr>
+              <m:t>,</m:t>
+            </m:r>
+            <m:r>
+              <m:t>g</m:t>
+            </m:r>
+            <m:r>
+              <m:rPr>
+                <m:sty m:val="p"/>
+              </m:rPr>
+              <m:t>,</m:t>
+            </m:r>
+            <m:r>
+              <m:t>l</m:t>
+            </m:r>
+          </m:sub>
+        </m:sSub>
+      </m:oMath>
+      <w:r>
+        <w:t xml:space="preserve">) and modelled (</w:t>
+      </w:r>
+      <m:oMath>
+        <m:sSub>
+          <m:e>
+            <m:acc>
+              <m:accPr>
+                <m:chr m:val="̂"/>
+              </m:accPr>
+              <m:e>
+                <m:r>
+                  <m:t>c</m:t>
+                </m:r>
+              </m:e>
+            </m:acc>
+          </m:e>
+          <m:sub>
+            <m:r>
+              <m:t>t</m:t>
+            </m:r>
+            <m:r>
+              <m:rPr>
+                <m:sty m:val="p"/>
+              </m:rPr>
+              <m:t>,</m:t>
+            </m:r>
+            <m:r>
+              <m:t>g</m:t>
+            </m:r>
+            <m:r>
+              <m:rPr>
+                <m:sty m:val="p"/>
+              </m:rPr>
+              <m:t>,</m:t>
+            </m:r>
+            <m:r>
+              <m:t>l</m:t>
+            </m:r>
+          </m:sub>
+        </m:sSub>
+      </m:oMath>
+      <w:r>
+        <w:t xml:space="preserve">) proportional cover of each functional group</w:t>
+      </w:r>
+      <w:r>
+        <w:t xml:space="preserve"> </w:t>
+      </w:r>
+      <m:oMath>
+        <m:r>
+          <m:t>g</m:t>
+        </m:r>
+      </m:oMath>
+      <w:r>
+        <w:t xml:space="preserve">, and averaged into a single Coral Composition Error (CCE). Bray-Curtis dissimilarity was used in preference to a correlation-based measure for two reasons: a correlation coefficient computed across only five functional groups is statistically unstable, and functional group proportions are compositional (closure-bound, summing to one), which makes correlation among them prone to spurious signal regardless of sample size. Bray-Curtis compares the two composition vectors directly, without any correlation or sampling estimation step, so neither issue applies:</w:t>
       </w:r>
     </w:p>
     <w:tbl>
@@ -44109,19 +44399,27 @@
                 <m:jc m:val="center"/>
               </m:oMathParaPr>
               <m:oMath>
+                <m:r>
+                  <m:t>B</m:t>
+                </m:r>
                 <m:sSub>
                   <m:e>
                     <m:r>
+                      <m:t>C</m:t>
+                    </m:r>
+                  </m:e>
+                  <m:sub>
+                    <m:r>
+                      <m:t>t</m:t>
+                    </m:r>
+                    <m:r>
                       <m:rPr>
-                        <m:nor/>
                         <m:sty m:val="p"/>
                       </m:rPr>
-                      <m:t>CCE</m:t>
-                    </m:r>
-                  </m:e>
-                  <m:sub>
-                    <m:r>
-                      <m:t>t</m:t>
+                      <m:t>,</m:t>
+                    </m:r>
+                    <m:r>
+                      <m:t>l</m:t>
                     </m:r>
                   </m:sub>
                 </m:sSub>
@@ -44131,53 +44429,356 @@
                   </m:rPr>
                   <m:t>=</m:t>
                 </m:r>
+                <m:f>
+                  <m:fPr>
+                    <m:type m:val="bar"/>
+                  </m:fPr>
+                  <m:num>
+                    <m:nary>
+                      <m:naryPr>
+                        <m:chr m:val="∑"/>
+                        <m:limLoc m:val="undOvr"/>
+                        <m:subHide m:val="off"/>
+                        <m:supHide m:val="on"/>
+                      </m:naryPr>
+                      <m:sub>
+                        <m:r>
+                          <m:t>g</m:t>
+                        </m:r>
+                      </m:sub>
+                      <m:sup>
+                        <m:r>
+                          <m:t>​</m:t>
+                        </m:r>
+                      </m:sup>
+                      <m:e>
+                        <m:d>
+                          <m:dPr>
+                            <m:begChr m:val="|"/>
+                            <m:sepChr m:val=""/>
+                            <m:endChr m:val="|"/>
+                            <m:grow/>
+                          </m:dPr>
+                          <m:e>
+                            <m:sSub>
+                              <m:e>
+                                <m:r>
+                                  <m:t>c</m:t>
+                                </m:r>
+                              </m:e>
+                              <m:sub>
+                                <m:r>
+                                  <m:t>t</m:t>
+                                </m:r>
+                                <m:r>
+                                  <m:rPr>
+                                    <m:sty m:val="p"/>
+                                  </m:rPr>
+                                  <m:t>,</m:t>
+                                </m:r>
+                                <m:r>
+                                  <m:t>g</m:t>
+                                </m:r>
+                                <m:r>
+                                  <m:rPr>
+                                    <m:sty m:val="p"/>
+                                  </m:rPr>
+                                  <m:t>,</m:t>
+                                </m:r>
+                                <m:r>
+                                  <m:t>l</m:t>
+                                </m:r>
+                              </m:sub>
+                            </m:sSub>
+                            <m:r>
+                              <m:rPr>
+                                <m:sty m:val="p"/>
+                              </m:rPr>
+                              <m:t>−</m:t>
+                            </m:r>
+                            <m:sSub>
+                              <m:e>
+                                <m:acc>
+                                  <m:accPr>
+                                    <m:chr m:val="̂"/>
+                                  </m:accPr>
+                                  <m:e>
+                                    <m:r>
+                                      <m:t>c</m:t>
+                                    </m:r>
+                                  </m:e>
+                                </m:acc>
+                              </m:e>
+                              <m:sub>
+                                <m:r>
+                                  <m:t>t</m:t>
+                                </m:r>
+                                <m:r>
+                                  <m:rPr>
+                                    <m:sty m:val="p"/>
+                                  </m:rPr>
+                                  <m:t>,</m:t>
+                                </m:r>
+                                <m:r>
+                                  <m:t>g</m:t>
+                                </m:r>
+                                <m:r>
+                                  <m:rPr>
+                                    <m:sty m:val="p"/>
+                                  </m:rPr>
+                                  <m:t>,</m:t>
+                                </m:r>
+                                <m:r>
+                                  <m:t>l</m:t>
+                                </m:r>
+                              </m:sub>
+                            </m:sSub>
+                          </m:e>
+                        </m:d>
+                      </m:e>
+                    </m:nary>
+                  </m:num>
+                  <m:den>
+                    <m:nary>
+                      <m:naryPr>
+                        <m:chr m:val="∑"/>
+                        <m:limLoc m:val="undOvr"/>
+                        <m:subHide m:val="off"/>
+                        <m:supHide m:val="on"/>
+                      </m:naryPr>
+                      <m:sub>
+                        <m:r>
+                          <m:t>g</m:t>
+                        </m:r>
+                      </m:sub>
+                      <m:sup>
+                        <m:r>
+                          <m:t>​</m:t>
+                        </m:r>
+                      </m:sup>
+                      <m:e>
+                        <m:d>
+                          <m:dPr>
+                            <m:begChr m:val="("/>
+                            <m:sepChr m:val=""/>
+                            <m:endChr m:val=")"/>
+                            <m:grow/>
+                          </m:dPr>
+                          <m:e>
+                            <m:sSub>
+                              <m:e>
+                                <m:r>
+                                  <m:t>c</m:t>
+                                </m:r>
+                              </m:e>
+                              <m:sub>
+                                <m:r>
+                                  <m:t>t</m:t>
+                                </m:r>
+                                <m:r>
+                                  <m:rPr>
+                                    <m:sty m:val="p"/>
+                                  </m:rPr>
+                                  <m:t>,</m:t>
+                                </m:r>
+                                <m:r>
+                                  <m:t>g</m:t>
+                                </m:r>
+                                <m:r>
+                                  <m:rPr>
+                                    <m:sty m:val="p"/>
+                                  </m:rPr>
+                                  <m:t>,</m:t>
+                                </m:r>
+                                <m:r>
+                                  <m:t>l</m:t>
+                                </m:r>
+                              </m:sub>
+                            </m:sSub>
+                            <m:r>
+                              <m:rPr>
+                                <m:sty m:val="p"/>
+                              </m:rPr>
+                              <m:t>+</m:t>
+                            </m:r>
+                            <m:sSub>
+                              <m:e>
+                                <m:acc>
+                                  <m:accPr>
+                                    <m:chr m:val="̂"/>
+                                  </m:accPr>
+                                  <m:e>
+                                    <m:r>
+                                      <m:t>c</m:t>
+                                    </m:r>
+                                  </m:e>
+                                </m:acc>
+                              </m:e>
+                              <m:sub>
+                                <m:r>
+                                  <m:t>t</m:t>
+                                </m:r>
+                                <m:r>
+                                  <m:rPr>
+                                    <m:sty m:val="p"/>
+                                  </m:rPr>
+                                  <m:t>,</m:t>
+                                </m:r>
+                                <m:r>
+                                  <m:t>g</m:t>
+                                </m:r>
+                                <m:r>
+                                  <m:rPr>
+                                    <m:sty m:val="p"/>
+                                  </m:rPr>
+                                  <m:t>,</m:t>
+                                </m:r>
+                                <m:r>
+                                  <m:t>l</m:t>
+                                </m:r>
+                              </m:sub>
+                            </m:sSub>
+                          </m:e>
+                        </m:d>
+                      </m:e>
+                    </m:nary>
+                  </m:den>
+                </m:f>
+              </m:oMath>
+            </m:oMathPara>
+          </w:p>
+          <w:p>
+            <w:pPr>
+              <w:pStyle w:val="Compact"/>
+            </w:pPr>
+            <m:oMathPara>
+              <m:oMathParaPr>
+                <m:jc m:val="center"/>
+              </m:oMathParaPr>
+              <m:oMath>
                 <m:r>
-                  <m:t>1</m:t>
+                  <m:t>C</m:t>
+                </m:r>
+                <m:r>
+                  <m:t>C</m:t>
+                </m:r>
+                <m:r>
+                  <m:t>E</m:t>
                 </m:r>
                 <m:r>
                   <m:rPr>
                     <m:sty m:val="p"/>
                   </m:rPr>
-                  <m:t>−</m:t>
+                  <m:t>=</m:t>
                 </m:r>
-                <m:r>
-                  <m:t>c</m:t>
-                </m:r>
-                <m:r>
-                  <m:t>o</m:t>
-                </m:r>
-                <m:r>
-                  <m:t>r</m:t>
-                </m:r>
-                <m:d>
-                  <m:dPr>
-                    <m:begChr m:val="("/>
-                    <m:sepChr m:val=""/>
-                    <m:endChr m:val=")"/>
-                    <m:grow/>
-                  </m:dPr>
-                  <m:e>
-                    <m:r>
-                      <m:t>y</m:t>
+                <m:f>
+                  <m:fPr>
+                    <m:type m:val="bar"/>
+                  </m:fPr>
+                  <m:num>
+                    <m:r>
+                      <m:t>1</m:t>
+                    </m:r>
+                  </m:num>
+                  <m:den>
+                    <m:d>
+                      <m:dPr>
+                        <m:begChr m:val="|"/>
+                        <m:sepChr m:val=""/>
+                        <m:endChr m:val="|"/>
+                        <m:grow/>
+                      </m:dPr>
+                      <m:e>
+                        <m:sSup>
+                          <m:e>
+                            <m:r>
+                              <m:t>L</m:t>
+                            </m:r>
+                          </m:e>
+                          <m:sup>
+                            <m:r>
+                              <m:t>c</m:t>
+                            </m:r>
+                            <m:r>
+                              <m:t>o</m:t>
+                            </m:r>
+                            <m:r>
+                              <m:t>m</m:t>
+                            </m:r>
+                            <m:r>
+                              <m:t>p</m:t>
+                            </m:r>
+                          </m:sup>
+                        </m:sSup>
+                      </m:e>
+                    </m:d>
+                  </m:den>
+                </m:f>
+                <m:nary>
+                  <m:naryPr>
+                    <m:chr m:val="∑"/>
+                    <m:limLoc m:val="undOvr"/>
+                    <m:subHide m:val="off"/>
+                    <m:supHide m:val="on"/>
+                  </m:naryPr>
+                  <m:sub>
+                    <m:r>
+                      <m:t>l</m:t>
                     </m:r>
                     <m:r>
                       <m:rPr>
                         <m:sty m:val="p"/>
                       </m:rPr>
-                      <m:t>,</m:t>
-                    </m:r>
-                    <m:acc>
-                      <m:accPr>
-                        <m:chr m:val="̂"/>
-                      </m:accPr>
+                      <m:t>∈</m:t>
+                    </m:r>
+                    <m:sSup>
                       <m:e>
                         <m:r>
-                          <m:t>y</m:t>
+                          <m:t>L</m:t>
                         </m:r>
                       </m:e>
-                    </m:acc>
+                      <m:sup>
+                        <m:r>
+                          <m:t>c</m:t>
+                        </m:r>
+                        <m:r>
+                          <m:t>o</m:t>
+                        </m:r>
+                        <m:r>
+                          <m:t>m</m:t>
+                        </m:r>
+                        <m:r>
+                          <m:t>p</m:t>
+                        </m:r>
+                      </m:sup>
+                    </m:sSup>
+                  </m:sub>
+                  <m:sup>
+                    <m:r>
+                      <m:t>​</m:t>
+                    </m:r>
+                  </m:sup>
+                  <m:e>
+                    <m:r>
+                      <m:t>C</m:t>
+                    </m:r>
+                    <m:r>
+                      <m:t>C</m:t>
+                    </m:r>
+                    <m:sSub>
+                      <m:e>
+                        <m:r>
+                          <m:t>E</m:t>
+                        </m:r>
+                      </m:e>
+                      <m:sub>
+                        <m:r>
+                          <m:t>l</m:t>
+                        </m:r>
+                      </m:sub>
+                    </m:sSub>
                   </m:e>
-                </m:d>
+                </m:nary>
               </m:oMath>
             </m:oMathPara>
           </w:p>
@@ -44200,7 +44801,259 @@
         <w:pStyle w:val="BodyText"/>
       </w:pPr>
       <w:r>
-        <w:t xml:space="preserve">Finally, emphasis is placed on minimizing error on the beginning and end of calibration data as well as the peaks and the troughs of calibration data. Given that the ecological model is relatively simple, the objective function should prioritize matching the overall trend of calibration data. The calibration error at these characteristics points is calculated using mean absolute error</w:t>
+        <w:t xml:space="preserve">where</w:t>
+      </w:r>
+      <w:r>
+        <w:t xml:space="preserve"> </w:t>
+      </w:r>
+      <m:oMath>
+        <m:r>
+          <m:t>C</m:t>
+        </m:r>
+        <m:r>
+          <m:t>C</m:t>
+        </m:r>
+        <m:sSub>
+          <m:e>
+            <m:r>
+              <m:t>E</m:t>
+            </m:r>
+          </m:e>
+          <m:sub>
+            <m:r>
+              <m:t>l</m:t>
+            </m:r>
+          </m:sub>
+        </m:sSub>
+      </m:oMath>
+      <w:r>
+        <w:t xml:space="preserve"> </w:t>
+      </w:r>
+      <w:r>
+        <w:t xml:space="preserve">is the mean of</w:t>
+      </w:r>
+      <w:r>
+        <w:t xml:space="preserve"> </w:t>
+      </w:r>
+      <m:oMath>
+        <m:r>
+          <m:t>B</m:t>
+        </m:r>
+        <m:sSub>
+          <m:e>
+            <m:r>
+              <m:t>C</m:t>
+            </m:r>
+          </m:e>
+          <m:sub>
+            <m:r>
+              <m:t>t</m:t>
+            </m:r>
+            <m:r>
+              <m:rPr>
+                <m:sty m:val="p"/>
+              </m:rPr>
+              <m:t>,</m:t>
+            </m:r>
+            <m:r>
+              <m:t>l</m:t>
+            </m:r>
+          </m:sub>
+        </m:sSub>
+      </m:oMath>
+      <w:r>
+        <w:t xml:space="preserve"> </w:t>
+      </w:r>
+      <w:r>
+        <w:t xml:space="preserve">over the years at reef</w:t>
+      </w:r>
+      <w:r>
+        <w:t xml:space="preserve"> </w:t>
+      </w:r>
+      <m:oMath>
+        <m:r>
+          <m:t>l</m:t>
+        </m:r>
+      </m:oMath>
+      <w:r>
+        <w:t xml:space="preserve"> </w:t>
+      </w:r>
+      <w:r>
+        <w:t xml:space="preserve">where all functional groups’ composition was observed, and</w:t>
+      </w:r>
+      <w:r>
+        <w:t xml:space="preserve"> </w:t>
+      </w:r>
+      <m:oMath>
+        <m:sSup>
+          <m:e>
+            <m:r>
+              <m:t>L</m:t>
+            </m:r>
+          </m:e>
+          <m:sup>
+            <m:r>
+              <m:t>c</m:t>
+            </m:r>
+            <m:r>
+              <m:t>o</m:t>
+            </m:r>
+            <m:r>
+              <m:t>m</m:t>
+            </m:r>
+            <m:r>
+              <m:t>p</m:t>
+            </m:r>
+          </m:sup>
+        </m:sSup>
+      </m:oMath>
+      <w:r>
+        <w:t xml:space="preserve"> </w:t>
+      </w:r>
+      <w:r>
+        <w:t xml:space="preserve">is the set of reefs with composition data. Reefs with no year of fully observed composition data are assigned a neutral</w:t>
+      </w:r>
+      <w:r>
+        <w:t xml:space="preserve"> </w:t>
+      </w:r>
+      <m:oMath>
+        <m:r>
+          <m:t>C</m:t>
+        </m:r>
+        <m:r>
+          <m:t>C</m:t>
+        </m:r>
+        <m:sSub>
+          <m:e>
+            <m:r>
+              <m:t>E</m:t>
+            </m:r>
+          </m:e>
+          <m:sub>
+            <m:r>
+              <m:t>l</m:t>
+            </m:r>
+          </m:sub>
+        </m:sSub>
+      </m:oMath>
+      <w:r>
+        <w:t xml:space="preserve"> </w:t>
+      </w:r>
+      <w:r>
+        <w:t xml:space="preserve">of 0.5 rather than being excluded from the mean.</w:t>
+      </w:r>
+    </w:p>
+    <w:p>
+      <w:pPr>
+        <w:pStyle w:val="BodyText"/>
+      </w:pPr>
+      <w:r>
+        <w:t xml:space="preserve">Finally, emphasis is placed on minimizing error at the peak and trough of each reef’s observed coral cover trajectory. For each reef</w:t>
+      </w:r>
+      <w:r>
+        <w:t xml:space="preserve"> </w:t>
+      </w:r>
+      <m:oMath>
+        <m:r>
+          <m:t>l</m:t>
+        </m:r>
+      </m:oMath>
+      <w:r>
+        <w:t xml:space="preserve">, let</w:t>
+      </w:r>
+      <w:r>
+        <w:t xml:space="preserve"> </w:t>
+      </w:r>
+      <m:oMath>
+        <m:sSubSup>
+          <m:e>
+            <m:r>
+              <m:t>t</m:t>
+            </m:r>
+          </m:e>
+          <m:sub>
+            <m:r>
+              <m:t>l</m:t>
+            </m:r>
+          </m:sub>
+          <m:sup>
+            <m:r>
+              <m:t>p</m:t>
+            </m:r>
+            <m:r>
+              <m:t>e</m:t>
+            </m:r>
+            <m:r>
+              <m:t>a</m:t>
+            </m:r>
+            <m:r>
+              <m:t>k</m:t>
+            </m:r>
+          </m:sup>
+        </m:sSubSup>
+      </m:oMath>
+      <w:r>
+        <w:t xml:space="preserve"> </w:t>
+      </w:r>
+      <w:r>
+        <w:t xml:space="preserve">and</w:t>
+      </w:r>
+      <w:r>
+        <w:t xml:space="preserve"> </w:t>
+      </w:r>
+      <m:oMath>
+        <m:sSubSup>
+          <m:e>
+            <m:r>
+              <m:t>t</m:t>
+            </m:r>
+          </m:e>
+          <m:sub>
+            <m:r>
+              <m:t>l</m:t>
+            </m:r>
+          </m:sub>
+          <m:sup>
+            <m:r>
+              <m:t>t</m:t>
+            </m:r>
+            <m:r>
+              <m:t>r</m:t>
+            </m:r>
+            <m:r>
+              <m:t>o</m:t>
+            </m:r>
+            <m:r>
+              <m:t>u</m:t>
+            </m:r>
+            <m:r>
+              <m:t>g</m:t>
+            </m:r>
+            <m:r>
+              <m:t>h</m:t>
+            </m:r>
+          </m:sup>
+        </m:sSubSup>
+      </m:oMath>
+      <w:r>
+        <w:t xml:space="preserve"> </w:t>
+      </w:r>
+      <w:r>
+        <w:t xml:space="preserve">be the years of that reef’s highest and lowest observed coral cover, respectively; the error at these points is calculated using mean absolute error across all reefs</w:t>
+      </w:r>
+      <w:r>
+        <w:t xml:space="preserve"> </w:t>
+      </w:r>
+      <m:oMath>
+        <m:r>
+          <m:t>L</m:t>
+        </m:r>
+      </m:oMath>
+      <w:r>
+        <w:t xml:space="preserve"> </w:t>
+      </w:r>
+      <w:r>
+        <w:t xml:space="preserve">with at least one observation:</w:t>
       </w:r>
     </w:p>
     <w:tbl>
@@ -44240,7 +45093,7 @@
                   </m:e>
                   <m:sub>
                     <m:r>
-                      <m:t>p</m:t>
+                      <m:t>c</m:t>
                     </m:r>
                   </m:sub>
                 </m:sSub>
@@ -44250,25 +45103,57 @@
                   </m:rPr>
                   <m:t>=</m:t>
                 </m:r>
-                <m:sSub>
-                  <m:e>
-                    <m:r>
-                      <m:t>μ</m:t>
-                    </m:r>
-                  </m:e>
+                <m:f>
+                  <m:fPr>
+                    <m:type m:val="bar"/>
+                  </m:fPr>
+                  <m:num>
+                    <m:r>
+                      <m:t>1</m:t>
+                    </m:r>
+                  </m:num>
+                  <m:den>
+                    <m:d>
+                      <m:dPr>
+                        <m:begChr m:val="|"/>
+                        <m:sepChr m:val=""/>
+                        <m:endChr m:val="|"/>
+                        <m:grow/>
+                      </m:dPr>
+                      <m:e>
+                        <m:r>
+                          <m:t>L</m:t>
+                        </m:r>
+                      </m:e>
+                    </m:d>
+                  </m:den>
+                </m:f>
+                <m:nary>
+                  <m:naryPr>
+                    <m:chr m:val="∑"/>
+                    <m:limLoc m:val="undOvr"/>
+                    <m:subHide m:val="off"/>
+                    <m:supHide m:val="on"/>
+                  </m:naryPr>
                   <m:sub>
                     <m:r>
-                      <m:t>p</m:t>
+                      <m:t>l</m:t>
+                    </m:r>
+                    <m:r>
+                      <m:rPr>
+                        <m:sty m:val="p"/>
+                      </m:rPr>
+                      <m:t>∈</m:t>
+                    </m:r>
+                    <m:r>
+                      <m:t>L</m:t>
                     </m:r>
                   </m:sub>
-                </m:sSub>
-                <m:d>
-                  <m:dPr>
-                    <m:begChr m:val="("/>
-                    <m:sepChr m:val=""/>
-                    <m:endChr m:val=")"/>
-                    <m:grow/>
-                  </m:dPr>
+                  <m:sup>
+                    <m:r>
+                      <m:t>​</m:t>
+                    </m:r>
+                  </m:sup>
                   <m:e>
                     <m:d>
                       <m:dPr>
@@ -44278,27 +45163,161 @@
                         <m:grow/>
                       </m:dPr>
                       <m:e>
-                        <m:acc>
-                          <m:accPr>
-                            <m:chr m:val="̂"/>
-                          </m:accPr>
+                        <m:sSub>
                           <m:e>
+                            <m:acc>
+                              <m:accPr>
+                                <m:chr m:val="̂"/>
+                              </m:accPr>
+                              <m:e>
+                                <m:r>
+                                  <m:t>y</m:t>
+                                </m:r>
+                              </m:e>
+                            </m:acc>
+                          </m:e>
+                          <m:sub>
+                            <m:sSubSup>
+                              <m:e>
+                                <m:r>
+                                  <m:t>t</m:t>
+                                </m:r>
+                              </m:e>
+                              <m:sub>
+                                <m:r>
+                                  <m:t>l</m:t>
+                                </m:r>
+                              </m:sub>
+                              <m:sup>
+                                <m:r>
+                                  <m:t>c</m:t>
+                                </m:r>
+                              </m:sup>
+                            </m:sSubSup>
                             <m:r>
-                              <m:t>y</m:t>
+                              <m:rPr>
+                                <m:sty m:val="p"/>
+                              </m:rPr>
+                              <m:t>,</m:t>
                             </m:r>
-                          </m:e>
-                        </m:acc>
+                            <m:r>
+                              <m:t>l</m:t>
+                            </m:r>
+                          </m:sub>
+                        </m:sSub>
                         <m:r>
                           <m:rPr>
                             <m:sty m:val="p"/>
                           </m:rPr>
                           <m:t>−</m:t>
                         </m:r>
-                        <m:r>
-                          <m:t>y</m:t>
-                        </m:r>
+                        <m:sSub>
+                          <m:e>
+                            <m:r>
+                              <m:t>y</m:t>
+                            </m:r>
+                          </m:e>
+                          <m:sub>
+                            <m:sSubSup>
+                              <m:e>
+                                <m:r>
+                                  <m:t>t</m:t>
+                                </m:r>
+                              </m:e>
+                              <m:sub>
+                                <m:r>
+                                  <m:t>l</m:t>
+                                </m:r>
+                              </m:sub>
+                              <m:sup>
+                                <m:r>
+                                  <m:t>c</m:t>
+                                </m:r>
+                              </m:sup>
+                            </m:sSubSup>
+                            <m:r>
+                              <m:rPr>
+                                <m:sty m:val="p"/>
+                              </m:rPr>
+                              <m:t>,</m:t>
+                            </m:r>
+                            <m:r>
+                              <m:t>l</m:t>
+                            </m:r>
+                          </m:sub>
+                        </m:sSub>
                       </m:e>
                     </m:d>
+                  </m:e>
+                </m:nary>
+                <m:r>
+                  <m:rPr>
+                    <m:sty m:val="p"/>
+                  </m:rPr>
+                  <m:t>,</m:t>
+                </m:r>
+                <m:r>
+                  <m:t> </m:t>
+                </m:r>
+                <m:r>
+                  <m:t> </m:t>
+                </m:r>
+                <m:r>
+                  <m:t>c</m:t>
+                </m:r>
+                <m:r>
+                  <m:rPr>
+                    <m:sty m:val="p"/>
+                  </m:rPr>
+                  <m:t>∈</m:t>
+                </m:r>
+                <m:d>
+                  <m:dPr>
+                    <m:begChr m:val="{"/>
+                    <m:sepChr m:val=""/>
+                    <m:endChr m:val="}"/>
+                    <m:grow/>
+                  </m:dPr>
+                  <m:e>
+                    <m:r>
+                      <m:t>p</m:t>
+                    </m:r>
+                    <m:r>
+                      <m:t>e</m:t>
+                    </m:r>
+                    <m:r>
+                      <m:t>a</m:t>
+                    </m:r>
+                    <m:r>
+                      <m:t>k</m:t>
+                    </m:r>
+                    <m:r>
+                      <m:rPr>
+                        <m:sty m:val="p"/>
+                      </m:rPr>
+                      <m:t>,</m:t>
+                    </m:r>
+                    <m:r>
+                      <m:t> </m:t>
+                    </m:r>
+                    <m:r>
+                      <m:t>t</m:t>
+                    </m:r>
+                    <m:r>
+                      <m:t>r</m:t>
+                    </m:r>
+                    <m:r>
+                      <m:t>o</m:t>
+                    </m:r>
+                    <m:r>
+                      <m:t>u</m:t>
+                    </m:r>
+                    <m:r>
+                      <m:t>g</m:t>
+                    </m:r>
+                    <m:r>
+                      <m:t>h</m:t>
+                    </m:r>
                   </m:e>
                 </m:d>
               </m:oMath>
@@ -44323,38 +45342,7 @@
         <w:pStyle w:val="BodyText"/>
       </w:pPr>
       <w:r>
-        <w:t xml:space="preserve">where</w:t>
-      </w:r>
-      <w:r>
-        <w:t xml:space="preserve"> </w:t>
-      </w:r>
-      <m:oMath>
-        <m:sSub>
-          <m:e>
-            <m:r>
-              <m:t>μ</m:t>
-            </m:r>
-          </m:e>
-          <m:sub>
-            <m:r>
-              <m:t>p</m:t>
-            </m:r>
-          </m:sub>
-        </m:sSub>
-      </m:oMath>
-      <w:r>
-        <w:t xml:space="preserve"> </w:t>
-      </w:r>
-      <w:r>
-        <w:t xml:space="preserve">is the mean function over all peaks, troughs, beginning and ending timesteps.</w:t>
-      </w:r>
-    </w:p>
-    <w:p>
-      <w:pPr>
-        <w:pStyle w:val="BodyText"/>
-      </w:pPr>
-      <w:r>
-        <w:t xml:space="preserve">Finally, the objective function is given as</w:t>
+        <w:t xml:space="preserve">The objective function is then given as</w:t>
       </w:r>
     </w:p>
     <w:tbl>
@@ -44380,77 +45368,30 @@
                 <m:jc m:val="center"/>
               </m:oMathParaPr>
               <m:oMath>
-                <m:sSub>
-                  <m:e>
-                    <m:r>
-                      <m:rPr>
-                        <m:nor/>
-                        <m:sty m:val="p"/>
-                      </m:rPr>
-                      <m:t>MAEE</m:t>
-                    </m:r>
-                  </m:e>
-                  <m:sub>
-                    <m:r>
-                      <m:t>σ</m:t>
-                    </m:r>
-                  </m:sub>
-                </m:sSub>
                 <m:r>
-                  <m:rPr>
-                    <m:sty m:val="p"/>
-                  </m:rPr>
-                  <m:t>⋅</m:t>
+                  <m:t>E</m:t>
+                </m:r>
+                <m:r>
+                  <m:t>r</m:t>
                 </m:r>
                 <m:sSub>
                   <m:e>
                     <m:r>
-                      <m:t>w</m:t>
+                      <m:t>r</m:t>
                     </m:r>
                   </m:e>
                   <m:sub>
                     <m:r>
-                      <m:t>1</m:t>
-                    </m:r>
-                  </m:sub>
-                </m:sSub>
-                <m:r>
-                  <m:rPr>
-                    <m:sty m:val="p"/>
-                  </m:rPr>
-                  <m:t>+</m:t>
-                </m:r>
-                <m:sSub>
-                  <m:e>
-                    <m:r>
-                      <m:rPr>
-                        <m:nor/>
-                        <m:sty m:val="p"/>
-                      </m:rPr>
-                      <m:t>CCE</m:t>
-                    </m:r>
-                  </m:e>
-                  <m:sub>
-                    <m:r>
-                      <m:t>t</m:t>
-                    </m:r>
-                  </m:sub>
-                </m:sSub>
-                <m:r>
-                  <m:rPr>
-                    <m:sty m:val="p"/>
-                  </m:rPr>
-                  <m:t>⋅</m:t>
-                </m:r>
-                <m:sSub>
-                  <m:e>
-                    <m:r>
-                      <m:t>w</m:t>
-                    </m:r>
-                  </m:e>
-                  <m:sub>
-                    <m:r>
-                      <m:t>c</m:t>
+                      <m:t>r</m:t>
+                    </m:r>
+                    <m:r>
+                      <m:t>e</m:t>
+                    </m:r>
+                    <m:r>
+                      <m:t>e</m:t>
+                    </m:r>
+                    <m:r>
+                      <m:t>f</m:t>
                     </m:r>
                   </m:sub>
                 </m:sSub>
@@ -44461,6 +45402,15 @@
                   <m:t>+</m:t>
                 </m:r>
                 <m:r>
+                  <m:t>0.5</m:t>
+                </m:r>
+                <m:r>
+                  <m:rPr>
+                    <m:sty m:val="p"/>
+                  </m:rPr>
+                  <m:t>⋅</m:t>
+                </m:r>
+                <m:r>
                   <m:t>E</m:t>
                 </m:r>
                 <m:r>
@@ -44476,26 +45426,89 @@
                     <m:r>
                       <m:t>p</m:t>
                     </m:r>
+                    <m:r>
+                      <m:t>e</m:t>
+                    </m:r>
+                    <m:r>
+                      <m:t>a</m:t>
+                    </m:r>
+                    <m:r>
+                      <m:t>k</m:t>
+                    </m:r>
                   </m:sub>
                 </m:sSub>
                 <m:r>
                   <m:rPr>
                     <m:sty m:val="p"/>
                   </m:rPr>
+                  <m:t>+</m:t>
+                </m:r>
+                <m:r>
+                  <m:t>0.5</m:t>
+                </m:r>
+                <m:r>
+                  <m:rPr>
+                    <m:sty m:val="p"/>
+                  </m:rPr>
                   <m:t>⋅</m:t>
+                </m:r>
+                <m:r>
+                  <m:t>E</m:t>
+                </m:r>
+                <m:r>
+                  <m:t>r</m:t>
                 </m:r>
                 <m:sSub>
                   <m:e>
                     <m:r>
-                      <m:t>w</m:t>
+                      <m:t>r</m:t>
                     </m:r>
                   </m:e>
                   <m:sub>
                     <m:r>
-                      <m:t>p</m:t>
+                      <m:t>t</m:t>
+                    </m:r>
+                    <m:r>
+                      <m:t>r</m:t>
+                    </m:r>
+                    <m:r>
+                      <m:t>o</m:t>
+                    </m:r>
+                    <m:r>
+                      <m:t>u</m:t>
+                    </m:r>
+                    <m:r>
+                      <m:t>g</m:t>
+                    </m:r>
+                    <m:r>
+                      <m:t>h</m:t>
                     </m:r>
                   </m:sub>
                 </m:sSub>
+                <m:r>
+                  <m:rPr>
+                    <m:sty m:val="p"/>
+                  </m:rPr>
+                  <m:t>+</m:t>
+                </m:r>
+                <m:r>
+                  <m:t>2.0</m:t>
+                </m:r>
+                <m:r>
+                  <m:rPr>
+                    <m:sty m:val="p"/>
+                  </m:rPr>
+                  <m:t>⋅</m:t>
+                </m:r>
+                <m:r>
+                  <m:t>C</m:t>
+                </m:r>
+                <m:r>
+                  <m:t>C</m:t>
+                </m:r>
+                <m:r>
+                  <m:t>E</m:t>
+                </m:r>
               </m:oMath>
             </m:oMathPara>
           </w:p>
@@ -44513,84 +45526,6 @@
         </w:tc>
       </w:tr>
     </w:tbl>
-    <w:p>
-      <w:pPr>
-        <w:pStyle w:val="BodyText"/>
-      </w:pPr>
-      <w:r>
-        <w:t xml:space="preserve">where</w:t>
-      </w:r>
-      <w:r>
-        <w:t xml:space="preserve"> </w:t>
-      </w:r>
-      <m:oMath>
-        <m:sSub>
-          <m:e>
-            <m:r>
-              <m:t>w</m:t>
-            </m:r>
-          </m:e>
-          <m:sub>
-            <m:r>
-              <m:t>1</m:t>
-            </m:r>
-          </m:sub>
-        </m:sSub>
-        <m:r>
-          <m:rPr>
-            <m:sty m:val="p"/>
-          </m:rPr>
-          <m:t>,</m:t>
-        </m:r>
-        <m:sSub>
-          <m:e>
-            <m:r>
-              <m:t>w</m:t>
-            </m:r>
-          </m:e>
-          <m:sub>
-            <m:r>
-              <m:t>c</m:t>
-            </m:r>
-          </m:sub>
-        </m:sSub>
-        <m:r>
-          <m:rPr>
-            <m:sty m:val="p"/>
-          </m:rPr>
-          <m:t>,</m:t>
-        </m:r>
-      </m:oMath>
-      <w:r>
-        <w:t xml:space="preserve"> </w:t>
-      </w:r>
-      <w:r>
-        <w:t xml:space="preserve">and</w:t>
-      </w:r>
-      <w:r>
-        <w:t xml:space="preserve"> </w:t>
-      </w:r>
-      <m:oMath>
-        <m:sSub>
-          <m:e>
-            <m:r>
-              <m:t>w</m:t>
-            </m:r>
-          </m:e>
-          <m:sub>
-            <m:r>
-              <m:t>p</m:t>
-            </m:r>
-          </m:sub>
-        </m:sSub>
-      </m:oMath>
-      <w:r>
-        <w:t xml:space="preserve"> </w:t>
-      </w:r>
-      <w:r>
-        <w:t xml:space="preserve">are the weights given to each part of the objective function and are 1, 2, and 2 respectively.</w:t>
-      </w:r>
-    </w:p>
     <w:p>
       <w:pPr>
         <w:pStyle w:val="BodyText"/>

</xml_diff>

<commit_message>
Bold text-word sub/superscripts across all equations
Applies the existing DHW^{\textbf{eff}} convention consistently: any
sub/superscript that is a text label (growth, background, settler, ...)
is now bold, distinguishing it from single-letter index sub/superscripts
(t, l, g, z, ...) which are left unbolded.
</commit_message>
<xml_diff>
--- a/paper/paper.docx
+++ b/paper/paper.docx
@@ -3556,28 +3556,11 @@
                           </m:sub>
                           <m:sup>
                             <m:r>
-                              <m:t>r</m:t>
-                            </m:r>
-                            <m:r>
-                              <m:t>e</m:t>
-                            </m:r>
-                            <m:r>
-                              <m:t>c</m:t>
-                            </m:r>
-                            <m:r>
-                              <m:t>r</m:t>
-                            </m:r>
-                            <m:r>
-                              <m:t>u</m:t>
-                            </m:r>
-                            <m:r>
-                              <m:t>i</m:t>
-                            </m:r>
-                            <m:r>
-                              <m:t>t</m:t>
-                            </m:r>
-                            <m:r>
-                              <m:t>s</m:t>
+                              <m:rPr>
+                                <m:nor/>
+                                <m:sty m:val="b"/>
+                              </m:rPr>
+                              <m:t>recruits</m:t>
                             </m:r>
                           </m:sup>
                         </m:sSubSup>
@@ -3665,22 +3648,11 @@
                                   </m:sub>
                                   <m:sup>
                                     <m:r>
-                                      <m:t>g</m:t>
-                                    </m:r>
-                                    <m:r>
-                                      <m:t>r</m:t>
-                                    </m:r>
-                                    <m:r>
-                                      <m:t>o</m:t>
-                                    </m:r>
-                                    <m:r>
-                                      <m:t>w</m:t>
-                                    </m:r>
-                                    <m:r>
-                                      <m:t>t</m:t>
-                                    </m:r>
-                                    <m:r>
-                                      <m:t>h</m:t>
+                                      <m:rPr>
+                                        <m:nor/>
+                                        <m:sty m:val="b"/>
+                                      </m:rPr>
+                                      <m:t>growth</m:t>
                                     </m:r>
                                   </m:sup>
                                 </m:sSubSup>
@@ -3721,34 +3693,11 @@
                                   </m:sub>
                                   <m:sup>
                                     <m:r>
-                                      <m:t>b</m:t>
-                                    </m:r>
-                                    <m:r>
-                                      <m:t>a</m:t>
-                                    </m:r>
-                                    <m:r>
-                                      <m:t>c</m:t>
-                                    </m:r>
-                                    <m:r>
-                                      <m:t>k</m:t>
-                                    </m:r>
-                                    <m:r>
-                                      <m:t>g</m:t>
-                                    </m:r>
-                                    <m:r>
-                                      <m:t>r</m:t>
-                                    </m:r>
-                                    <m:r>
-                                      <m:t>o</m:t>
-                                    </m:r>
-                                    <m:r>
-                                      <m:t>u</m:t>
-                                    </m:r>
-                                    <m:r>
-                                      <m:t>n</m:t>
-                                    </m:r>
-                                    <m:r>
-                                      <m:t>d</m:t>
+                                      <m:rPr>
+                                        <m:nor/>
+                                        <m:sty m:val="b"/>
+                                      </m:rPr>
+                                      <m:t>background</m:t>
                                     </m:r>
                                   </m:sup>
                                 </m:sSubSup>
@@ -3801,31 +3750,11 @@
                                   </m:sub>
                                   <m:sup>
                                     <m:r>
-                                      <m:t>b</m:t>
-                                    </m:r>
-                                    <m:r>
-                                      <m:t>l</m:t>
-                                    </m:r>
-                                    <m:r>
-                                      <m:t>e</m:t>
-                                    </m:r>
-                                    <m:r>
-                                      <m:t>a</m:t>
-                                    </m:r>
-                                    <m:r>
-                                      <m:t>c</m:t>
-                                    </m:r>
-                                    <m:r>
-                                      <m:t>h</m:t>
-                                    </m:r>
-                                    <m:r>
-                                      <m:t>i</m:t>
-                                    </m:r>
-                                    <m:r>
-                                      <m:t>n</m:t>
-                                    </m:r>
-                                    <m:r>
-                                      <m:t>g</m:t>
+                                      <m:rPr>
+                                        <m:nor/>
+                                        <m:sty m:val="b"/>
+                                      </m:rPr>
+                                      <m:t>bleaching</m:t>
                                     </m:r>
                                   </m:sup>
                                 </m:sSubSup>
@@ -3992,28 +3921,11 @@
           </m:sub>
           <m:sup>
             <m:r>
-              <m:t>r</m:t>
-            </m:r>
-            <m:r>
-              <m:t>e</m:t>
-            </m:r>
-            <m:r>
-              <m:t>c</m:t>
-            </m:r>
-            <m:r>
-              <m:t>r</m:t>
-            </m:r>
-            <m:r>
-              <m:t>u</m:t>
-            </m:r>
-            <m:r>
-              <m:t>i</m:t>
-            </m:r>
-            <m:r>
-              <m:t>t</m:t>
-            </m:r>
-            <m:r>
-              <m:t>s</m:t>
+              <m:rPr>
+                <m:nor/>
+                <m:sty m:val="b"/>
+              </m:rPr>
+              <m:t>recruits</m:t>
             </m:r>
           </m:sup>
         </m:sSubSup>
@@ -4083,22 +3995,11 @@
           </m:sub>
           <m:sup>
             <m:r>
-              <m:t>g</m:t>
-            </m:r>
-            <m:r>
-              <m:t>r</m:t>
-            </m:r>
-            <m:r>
-              <m:t>o</m:t>
-            </m:r>
-            <m:r>
-              <m:t>w</m:t>
-            </m:r>
-            <m:r>
-              <m:t>t</m:t>
-            </m:r>
-            <m:r>
-              <m:t>h</m:t>
+              <m:rPr>
+                <m:nor/>
+                <m:sty m:val="b"/>
+              </m:rPr>
+              <m:t>growth</m:t>
             </m:r>
           </m:sup>
         </m:sSubSup>
@@ -4215,34 +4116,11 @@
           </m:sub>
           <m:sup>
             <m:r>
-              <m:t>b</m:t>
-            </m:r>
-            <m:r>
-              <m:t>a</m:t>
-            </m:r>
-            <m:r>
-              <m:t>c</m:t>
-            </m:r>
-            <m:r>
-              <m:t>k</m:t>
-            </m:r>
-            <m:r>
-              <m:t>g</m:t>
-            </m:r>
-            <m:r>
-              <m:t>r</m:t>
-            </m:r>
-            <m:r>
-              <m:t>o</m:t>
-            </m:r>
-            <m:r>
-              <m:t>u</m:t>
-            </m:r>
-            <m:r>
-              <m:t>n</m:t>
-            </m:r>
-            <m:r>
-              <m:t>d</m:t>
+              <m:rPr>
+                <m:nor/>
+                <m:sty m:val="b"/>
+              </m:rPr>
+              <m:t>background</m:t>
             </m:r>
           </m:sup>
         </m:sSubSup>
@@ -4306,34 +4184,11 @@
                   </m:sub>
                   <m:sup>
                     <m:r>
-                      <m:t>b</m:t>
-                    </m:r>
-                    <m:r>
-                      <m:t>a</m:t>
-                    </m:r>
-                    <m:r>
-                      <m:t>c</m:t>
-                    </m:r>
-                    <m:r>
-                      <m:t>k</m:t>
-                    </m:r>
-                    <m:r>
-                      <m:t>g</m:t>
-                    </m:r>
-                    <m:r>
-                      <m:t>r</m:t>
-                    </m:r>
-                    <m:r>
-                      <m:t>o</m:t>
-                    </m:r>
-                    <m:r>
-                      <m:t>u</m:t>
-                    </m:r>
-                    <m:r>
-                      <m:t>n</m:t>
-                    </m:r>
-                    <m:r>
-                      <m:t>d</m:t>
+                      <m:rPr>
+                        <m:nor/>
+                        <m:sty m:val="b"/>
+                      </m:rPr>
+                      <m:t>background</m:t>
                     </m:r>
                   </m:sup>
                 </m:sSubSup>
@@ -4518,31 +4373,11 @@
           </m:sub>
           <m:sup>
             <m:r>
-              <m:t>b</m:t>
-            </m:r>
-            <m:r>
-              <m:t>l</m:t>
-            </m:r>
-            <m:r>
-              <m:t>e</m:t>
-            </m:r>
-            <m:r>
-              <m:t>a</m:t>
-            </m:r>
-            <m:r>
-              <m:t>c</m:t>
-            </m:r>
-            <m:r>
-              <m:t>h</m:t>
-            </m:r>
-            <m:r>
-              <m:t>i</m:t>
-            </m:r>
-            <m:r>
-              <m:t>n</m:t>
-            </m:r>
-            <m:r>
-              <m:t>g</m:t>
+              <m:rPr>
+                <m:nor/>
+                <m:sty m:val="b"/>
+              </m:rPr>
+              <m:t>bleaching</m:t>
             </m:r>
           </m:sup>
         </m:sSubSup>
@@ -7459,22 +7294,11 @@
           </m:sub>
           <m:sup>
             <m:r>
-              <m:t>g</m:t>
-            </m:r>
-            <m:r>
-              <m:t>r</m:t>
-            </m:r>
-            <m:r>
-              <m:t>o</m:t>
-            </m:r>
-            <m:r>
-              <m:t>w</m:t>
-            </m:r>
-            <m:r>
-              <m:t>t</m:t>
-            </m:r>
-            <m:r>
-              <m:t>h</m:t>
+              <m:rPr>
+                <m:nor/>
+                <m:sty m:val="b"/>
+              </m:rPr>
+              <m:t>growth</m:t>
             </m:r>
           </m:sup>
         </m:sSubSup>
@@ -7588,22 +7412,11 @@
                   </m:sub>
                   <m:sup>
                     <m:r>
-                      <m:t>g</m:t>
-                    </m:r>
-                    <m:r>
-                      <m:t>r</m:t>
-                    </m:r>
-                    <m:r>
-                      <m:t>o</m:t>
-                    </m:r>
-                    <m:r>
-                      <m:t>w</m:t>
-                    </m:r>
-                    <m:r>
-                      <m:t>t</m:t>
-                    </m:r>
-                    <m:r>
-                      <m:t>h</m:t>
+                      <m:rPr>
+                        <m:nor/>
+                        <m:sty m:val="b"/>
+                      </m:rPr>
+                      <m:t>growth</m:t>
                     </m:r>
                   </m:sup>
                 </m:sSubSup>
@@ -11170,16 +10983,11 @@
                                 </m:e>
                                 <m:sup>
                                   <m:r>
-                                    <m:t>b</m:t>
-                                  </m:r>
-                                  <m:r>
-                                    <m:t>a</m:t>
-                                  </m:r>
-                                  <m:r>
-                                    <m:t>s</m:t>
-                                  </m:r>
-                                  <m:r>
-                                    <m:t>e</m:t>
+                                    <m:rPr>
+                                      <m:nor/>
+                                      <m:sty m:val="b"/>
+                                    </m:rPr>
+                                    <m:t>base</m:t>
                                   </m:r>
                                 </m:sup>
                               </m:sSup>
@@ -11235,13 +11043,11 @@
                                 </m:e>
                                 <m:sup>
                                   <m:r>
-                                    <m:t>m</m:t>
-                                  </m:r>
-                                  <m:r>
-                                    <m:t>i</m:t>
-                                  </m:r>
-                                  <m:r>
-                                    <m:t>x</m:t>
+                                    <m:rPr>
+                                      <m:nor/>
+                                      <m:sty m:val="b"/>
+                                    </m:rPr>
+                                    <m:t>mix</m:t>
                                   </m:r>
                                 </m:sup>
                               </m:sSup>
@@ -11263,13 +11069,11 @@
                             </m:e>
                             <m:sup>
                               <m:r>
-                                <m:t>m</m:t>
-                              </m:r>
-                              <m:r>
-                                <m:t>i</m:t>
-                              </m:r>
-                              <m:r>
-                                <m:t>x</m:t>
+                                <m:rPr>
+                                  <m:nor/>
+                                  <m:sty m:val="b"/>
+                                </m:rPr>
+                                <m:t>mix</m:t>
                               </m:r>
                             </m:sup>
                           </m:sSup>
@@ -11305,13 +11109,11 @@
                             </m:e>
                             <m:sup>
                               <m:r>
-                                <m:t>m</m:t>
-                              </m:r>
-                              <m:r>
-                                <m:t>i</m:t>
-                              </m:r>
-                              <m:r>
-                                <m:t>x</m:t>
+                                <m:rPr>
+                                  <m:nor/>
+                                  <m:sty m:val="b"/>
+                                </m:rPr>
+                                <m:t>mix</m:t>
                               </m:r>
                             </m:sup>
                           </m:sSup>
@@ -11389,16 +11191,11 @@
           </m:e>
           <m:sup>
             <m:r>
-              <m:t>b</m:t>
-            </m:r>
-            <m:r>
-              <m:t>a</m:t>
-            </m:r>
-            <m:r>
-              <m:t>s</m:t>
-            </m:r>
-            <m:r>
-              <m:t>e</m:t>
+              <m:rPr>
+                <m:nor/>
+                <m:sty m:val="b"/>
+              </m:rPr>
+              <m:t>base</m:t>
             </m:r>
           </m:sup>
         </m:sSup>
@@ -11438,13 +11235,11 @@
           </m:e>
           <m:sup>
             <m:r>
-              <m:t>m</m:t>
-            </m:r>
-            <m:r>
-              <m:t>i</m:t>
-            </m:r>
-            <m:r>
-              <m:t>x</m:t>
+              <m:rPr>
+                <m:nor/>
+                <m:sty m:val="b"/>
+              </m:rPr>
+              <m:t>mix</m:t>
             </m:r>
           </m:sup>
         </m:sSup>
@@ -11541,16 +11336,11 @@
           </m:e>
           <m:sup>
             <m:r>
-              <m:t>b</m:t>
-            </m:r>
-            <m:r>
-              <m:t>a</m:t>
-            </m:r>
-            <m:r>
-              <m:t>s</m:t>
-            </m:r>
-            <m:r>
-              <m:t>e</m:t>
+              <m:rPr>
+                <m:nor/>
+                <m:sty m:val="b"/>
+              </m:rPr>
+              <m:t>base</m:t>
             </m:r>
           </m:sup>
         </m:sSup>
@@ -11640,13 +11430,11 @@
           </m:e>
           <m:sup>
             <m:r>
-              <m:t>m</m:t>
-            </m:r>
-            <m:r>
-              <m:t>i</m:t>
-            </m:r>
-            <m:r>
-              <m:t>x</m:t>
+              <m:rPr>
+                <m:nor/>
+                <m:sty m:val="b"/>
+              </m:rPr>
+              <m:t>mix</m:t>
             </m:r>
           </m:sup>
         </m:sSup>
@@ -11754,31 +11542,11 @@
                   </m:sub>
                   <m:sup>
                     <m:r>
-                      <m:t>b</m:t>
-                    </m:r>
-                    <m:r>
-                      <m:t>l</m:t>
-                    </m:r>
-                    <m:r>
-                      <m:t>e</m:t>
-                    </m:r>
-                    <m:r>
-                      <m:t>a</m:t>
-                    </m:r>
-                    <m:r>
-                      <m:t>c</m:t>
-                    </m:r>
-                    <m:r>
-                      <m:t>h</m:t>
-                    </m:r>
-                    <m:r>
-                      <m:t>i</m:t>
-                    </m:r>
-                    <m:r>
-                      <m:t>n</m:t>
-                    </m:r>
-                    <m:r>
-                      <m:t>g</m:t>
+                      <m:rPr>
+                        <m:nor/>
+                        <m:sty m:val="b"/>
+                      </m:rPr>
+                      <m:t>bleaching</m:t>
                     </m:r>
                   </m:sup>
                 </m:sSubSup>
@@ -13009,22 +12777,11 @@
                   </m:sub>
                   <m:sup>
                     <m:r>
-                      <m:t>g</m:t>
-                    </m:r>
-                    <m:r>
-                      <m:t>r</m:t>
-                    </m:r>
-                    <m:r>
-                      <m:t>o</m:t>
-                    </m:r>
-                    <m:r>
-                      <m:t>w</m:t>
-                    </m:r>
-                    <m:r>
-                      <m:t>t</m:t>
-                    </m:r>
-                    <m:r>
-                      <m:t>h</m:t>
+                      <m:rPr>
+                        <m:nor/>
+                        <m:sty m:val="b"/>
+                      </m:rPr>
+                      <m:t>growth</m:t>
                     </m:r>
                   </m:sup>
                 </m:sSubSup>
@@ -13633,22 +13390,11 @@
                   </m:sub>
                   <m:sup>
                     <m:r>
-                      <m:t>g</m:t>
-                    </m:r>
-                    <m:r>
-                      <m:t>r</m:t>
-                    </m:r>
-                    <m:r>
-                      <m:t>o</m:t>
-                    </m:r>
-                    <m:r>
-                      <m:t>w</m:t>
-                    </m:r>
-                    <m:r>
-                      <m:t>t</m:t>
-                    </m:r>
-                    <m:r>
-                      <m:t>h</m:t>
+                      <m:rPr>
+                        <m:nor/>
+                        <m:sty m:val="b"/>
+                      </m:rPr>
+                      <m:t>growth</m:t>
                     </m:r>
                   </m:sup>
                 </m:sSubSup>
@@ -13712,22 +13458,11 @@
                       </m:sub>
                       <m:sup>
                         <m:r>
-                          <m:t>g</m:t>
-                        </m:r>
-                        <m:r>
-                          <m:t>r</m:t>
-                        </m:r>
-                        <m:r>
-                          <m:t>o</m:t>
-                        </m:r>
-                        <m:r>
-                          <m:t>w</m:t>
-                        </m:r>
-                        <m:r>
-                          <m:t>t</m:t>
-                        </m:r>
-                        <m:r>
-                          <m:t>h</m:t>
+                          <m:rPr>
+                            <m:nor/>
+                            <m:sty m:val="b"/>
+                          </m:rPr>
+                          <m:t>growth</m:t>
                         </m:r>
                       </m:sup>
                     </m:sSubSup>
@@ -14027,25 +13762,11 @@
                   </m:sub>
                   <m:sup>
                     <m:r>
-                      <m:t>s</m:t>
-                    </m:r>
-                    <m:r>
-                      <m:t>e</m:t>
-                    </m:r>
-                    <m:r>
-                      <m:t>t</m:t>
-                    </m:r>
-                    <m:r>
-                      <m:t>t</m:t>
-                    </m:r>
-                    <m:r>
-                      <m:t>l</m:t>
-                    </m:r>
-                    <m:r>
-                      <m:t>e</m:t>
-                    </m:r>
-                    <m:r>
-                      <m:t>r</m:t>
+                      <m:rPr>
+                        <m:nor/>
+                        <m:sty m:val="b"/>
+                      </m:rPr>
+                      <m:t>settler</m:t>
                     </m:r>
                   </m:sup>
                 </m:sSubSup>
@@ -14954,25 +14675,11 @@
           </m:sub>
           <m:sup>
             <m:r>
-              <m:t>s</m:t>
-            </m:r>
-            <m:r>
-              <m:t>e</m:t>
-            </m:r>
-            <m:r>
-              <m:t>t</m:t>
-            </m:r>
-            <m:r>
-              <m:t>t</m:t>
-            </m:r>
-            <m:r>
-              <m:t>l</m:t>
-            </m:r>
-            <m:r>
-              <m:t>e</m:t>
-            </m:r>
-            <m:r>
-              <m:t>r</m:t>
+              <m:rPr>
+                <m:nor/>
+                <m:sty m:val="b"/>
+              </m:rPr>
+              <m:t>settler</m:t>
             </m:r>
           </m:sup>
         </m:sSubSup>
@@ -15089,28 +14796,11 @@
                   </m:sub>
                   <m:sup>
                     <m:r>
-                      <m:t>r</m:t>
-                    </m:r>
-                    <m:r>
-                      <m:t>e</m:t>
-                    </m:r>
-                    <m:r>
-                      <m:t>p</m:t>
-                    </m:r>
-                    <m:r>
-                      <m:t>r</m:t>
-                    </m:r>
-                    <m:r>
-                      <m:t>o</m:t>
-                    </m:r>
-                    <m:r>
-                      <m:t>d</m:t>
-                    </m:r>
-                    <m:r>
                       <m:rPr>
-                        <m:sty m:val="p"/>
+                        <m:nor/>
+                        <m:sty m:val="b"/>
                       </m:rPr>
-                      <m:t>.</m:t>
+                      <m:t>reprod.</m:t>
                     </m:r>
                   </m:sup>
                 </m:sSubSup>
@@ -15314,25 +15004,11 @@
                           </m:sub>
                           <m:sup>
                             <m:r>
-                              <m:t>s</m:t>
-                            </m:r>
-                            <m:r>
-                              <m:t>e</m:t>
-                            </m:r>
-                            <m:r>
-                              <m:t>t</m:t>
-                            </m:r>
-                            <m:r>
-                              <m:t>t</m:t>
-                            </m:r>
-                            <m:r>
-                              <m:t>l</m:t>
-                            </m:r>
-                            <m:r>
-                              <m:t>e</m:t>
-                            </m:r>
-                            <m:r>
-                              <m:t>r</m:t>
+                              <m:rPr>
+                                <m:nor/>
+                                <m:sty m:val="b"/>
+                              </m:rPr>
+                              <m:t>settler</m:t>
                             </m:r>
                           </m:sup>
                         </m:sSubSup>
@@ -15430,28 +15106,11 @@
                   </m:sub>
                   <m:sup>
                     <m:r>
-                      <m:t>r</m:t>
-                    </m:r>
-                    <m:r>
-                      <m:t>e</m:t>
-                    </m:r>
-                    <m:r>
-                      <m:t>p</m:t>
-                    </m:r>
-                    <m:r>
-                      <m:t>r</m:t>
-                    </m:r>
-                    <m:r>
-                      <m:t>o</m:t>
-                    </m:r>
-                    <m:r>
-                      <m:t>d</m:t>
-                    </m:r>
-                    <m:r>
                       <m:rPr>
-                        <m:sty m:val="p"/>
+                        <m:nor/>
+                        <m:sty m:val="b"/>
                       </m:rPr>
-                      <m:t>.</m:t>
+                      <m:t>reprod.</m:t>
                     </m:r>
                   </m:sup>
                 </m:sSubSup>
@@ -15513,28 +15172,11 @@
                   </m:sub>
                   <m:sup>
                     <m:r>
-                      <m:t>r</m:t>
-                    </m:r>
-                    <m:r>
-                      <m:t>e</m:t>
-                    </m:r>
-                    <m:r>
-                      <m:t>p</m:t>
-                    </m:r>
-                    <m:r>
-                      <m:t>r</m:t>
-                    </m:r>
-                    <m:r>
-                      <m:t>o</m:t>
-                    </m:r>
-                    <m:r>
-                      <m:t>d</m:t>
-                    </m:r>
-                    <m:r>
                       <m:rPr>
-                        <m:sty m:val="p"/>
+                        <m:nor/>
+                        <m:sty m:val="b"/>
                       </m:rPr>
-                      <m:t>.</m:t>
+                      <m:t>reprod.</m:t>
                     </m:r>
                   </m:sup>
                 </m:sSubSup>
@@ -15719,25 +15361,11 @@
           </m:sub>
           <m:sup>
             <m:r>
-              <m:t>s</m:t>
-            </m:r>
-            <m:r>
-              <m:t>e</m:t>
-            </m:r>
-            <m:r>
-              <m:t>t</m:t>
-            </m:r>
-            <m:r>
-              <m:t>t</m:t>
-            </m:r>
-            <m:r>
-              <m:t>l</m:t>
-            </m:r>
-            <m:r>
-              <m:t>e</m:t>
-            </m:r>
-            <m:r>
-              <m:t>r</m:t>
+              <m:rPr>
+                <m:nor/>
+                <m:sty m:val="b"/>
+              </m:rPr>
+              <m:t>settler</m:t>
             </m:r>
           </m:sup>
         </m:sSubSup>
@@ -15792,28 +15420,11 @@
           </m:sub>
           <m:sup>
             <m:r>
-              <m:t>r</m:t>
-            </m:r>
-            <m:r>
-              <m:t>e</m:t>
-            </m:r>
-            <m:r>
-              <m:t>p</m:t>
-            </m:r>
-            <m:r>
-              <m:t>r</m:t>
-            </m:r>
-            <m:r>
-              <m:t>o</m:t>
-            </m:r>
-            <m:r>
-              <m:t>d</m:t>
-            </m:r>
-            <m:r>
               <m:rPr>
-                <m:sty m:val="p"/>
+                <m:nor/>
+                <m:sty m:val="b"/>
               </m:rPr>
-              <m:t>.</m:t>
+              <m:t>reprod.</m:t>
             </m:r>
           </m:sup>
         </m:sSubSup>
@@ -16361,22 +15972,11 @@
                                     </m:sub>
                                     <m:sup>
                                       <m:r>
-                                        <m:t>g</m:t>
-                                      </m:r>
-                                      <m:r>
-                                        <m:t>r</m:t>
-                                      </m:r>
-                                      <m:r>
-                                        <m:t>o</m:t>
-                                      </m:r>
-                                      <m:r>
-                                        <m:t>w</m:t>
-                                      </m:r>
-                                      <m:r>
-                                        <m:t>t</m:t>
-                                      </m:r>
-                                      <m:r>
-                                        <m:t>h</m:t>
+                                        <m:rPr>
+                                          <m:nor/>
+                                          <m:sty m:val="b"/>
+                                        </m:rPr>
+                                        <m:t>growth</m:t>
                                       </m:r>
                                     </m:sup>
                                   </m:sSubSup>
@@ -16648,28 +16248,11 @@
                                     </m:sub>
                                     <m:sup>
                                       <m:r>
-                                        <m:t>r</m:t>
-                                      </m:r>
-                                      <m:r>
-                                        <m:t>e</m:t>
-                                      </m:r>
-                                      <m:r>
-                                        <m:t>p</m:t>
-                                      </m:r>
-                                      <m:r>
-                                        <m:t>r</m:t>
-                                      </m:r>
-                                      <m:r>
-                                        <m:t>o</m:t>
-                                      </m:r>
-                                      <m:r>
-                                        <m:t>d</m:t>
-                                      </m:r>
-                                      <m:r>
                                         <m:rPr>
-                                          <m:sty m:val="p"/>
+                                          <m:nor/>
+                                          <m:sty m:val="b"/>
                                         </m:rPr>
-                                        <m:t>.</m:t>
+                                        <m:t>reprod.</m:t>
                                       </m:r>
                                     </m:sup>
                                   </m:sSubSup>
@@ -43952,16 +43535,11 @@
                   </m:e>
                   <m:sub>
                     <m:r>
-                      <m:t>r</m:t>
-                    </m:r>
-                    <m:r>
-                      <m:t>e</m:t>
-                    </m:r>
-                    <m:r>
-                      <m:t>e</m:t>
-                    </m:r>
-                    <m:r>
-                      <m:t>f</m:t>
+                      <m:rPr>
+                        <m:nor/>
+                        <m:sty m:val="b"/>
+                      </m:rPr>
+                      <m:t>reef</m:t>
                     </m:r>
                   </m:sub>
                 </m:sSub>
@@ -44697,16 +44275,11 @@
                           </m:e>
                           <m:sup>
                             <m:r>
-                              <m:t>c</m:t>
-                            </m:r>
-                            <m:r>
-                              <m:t>o</m:t>
-                            </m:r>
-                            <m:r>
-                              <m:t>m</m:t>
-                            </m:r>
-                            <m:r>
-                              <m:t>p</m:t>
+                              <m:rPr>
+                                <m:nor/>
+                                <m:sty m:val="b"/>
+                              </m:rPr>
+                              <m:t>comp</m:t>
                             </m:r>
                           </m:sup>
                         </m:sSup>
@@ -44739,16 +44312,11 @@
                       </m:e>
                       <m:sup>
                         <m:r>
-                          <m:t>c</m:t>
-                        </m:r>
-                        <m:r>
-                          <m:t>o</m:t>
-                        </m:r>
-                        <m:r>
-                          <m:t>m</m:t>
-                        </m:r>
-                        <m:r>
-                          <m:t>p</m:t>
+                          <m:rPr>
+                            <m:nor/>
+                            <m:sty m:val="b"/>
+                          </m:rPr>
+                          <m:t>comp</m:t>
                         </m:r>
                       </m:sup>
                     </m:sSup>
@@ -44893,16 +44461,11 @@
           </m:e>
           <m:sup>
             <m:r>
-              <m:t>c</m:t>
-            </m:r>
-            <m:r>
-              <m:t>o</m:t>
-            </m:r>
-            <m:r>
-              <m:t>m</m:t>
-            </m:r>
-            <m:r>
-              <m:t>p</m:t>
+              <m:rPr>
+                <m:nor/>
+                <m:sty m:val="b"/>
+              </m:rPr>
+              <m:t>comp</m:t>
             </m:r>
           </m:sup>
         </m:sSup>
@@ -44978,16 +44541,11 @@
           </m:sub>
           <m:sup>
             <m:r>
-              <m:t>p</m:t>
-            </m:r>
-            <m:r>
-              <m:t>e</m:t>
-            </m:r>
-            <m:r>
-              <m:t>a</m:t>
-            </m:r>
-            <m:r>
-              <m:t>k</m:t>
+              <m:rPr>
+                <m:nor/>
+                <m:sty m:val="b"/>
+              </m:rPr>
+              <m:t>peak</m:t>
             </m:r>
           </m:sup>
         </m:sSubSup>
@@ -45015,22 +44573,11 @@
           </m:sub>
           <m:sup>
             <m:r>
-              <m:t>t</m:t>
-            </m:r>
-            <m:r>
-              <m:t>r</m:t>
-            </m:r>
-            <m:r>
-              <m:t>o</m:t>
-            </m:r>
-            <m:r>
-              <m:t>u</m:t>
-            </m:r>
-            <m:r>
-              <m:t>g</m:t>
-            </m:r>
-            <m:r>
-              <m:t>h</m:t>
+              <m:rPr>
+                <m:nor/>
+                <m:sty m:val="b"/>
+              </m:rPr>
+              <m:t>trough</m:t>
             </m:r>
           </m:sup>
         </m:sSubSup>
@@ -45382,16 +44929,11 @@
                   </m:e>
                   <m:sub>
                     <m:r>
-                      <m:t>r</m:t>
-                    </m:r>
-                    <m:r>
-                      <m:t>e</m:t>
-                    </m:r>
-                    <m:r>
-                      <m:t>e</m:t>
-                    </m:r>
-                    <m:r>
-                      <m:t>f</m:t>
+                      <m:rPr>
+                        <m:nor/>
+                        <m:sty m:val="b"/>
+                      </m:rPr>
+                      <m:t>reef</m:t>
                     </m:r>
                   </m:sub>
                 </m:sSub>
@@ -45424,16 +44966,11 @@
                   </m:e>
                   <m:sub>
                     <m:r>
-                      <m:t>p</m:t>
-                    </m:r>
-                    <m:r>
-                      <m:t>e</m:t>
-                    </m:r>
-                    <m:r>
-                      <m:t>a</m:t>
-                    </m:r>
-                    <m:r>
-                      <m:t>k</m:t>
+                      <m:rPr>
+                        <m:nor/>
+                        <m:sty m:val="b"/>
+                      </m:rPr>
+                      <m:t>peak</m:t>
                     </m:r>
                   </m:sub>
                 </m:sSub>
@@ -45466,22 +45003,11 @@
                   </m:e>
                   <m:sub>
                     <m:r>
-                      <m:t>t</m:t>
-                    </m:r>
-                    <m:r>
-                      <m:t>r</m:t>
-                    </m:r>
-                    <m:r>
-                      <m:t>o</m:t>
-                    </m:r>
-                    <m:r>
-                      <m:t>u</m:t>
-                    </m:r>
-                    <m:r>
-                      <m:t>g</m:t>
-                    </m:r>
-                    <m:r>
-                      <m:t>h</m:t>
+                      <m:rPr>
+                        <m:nor/>
+                        <m:sty m:val="b"/>
+                      </m:rPr>
+                      <m:t>trough</m:t>
                     </m:r>
                   </m:sub>
                 </m:sSub>
@@ -45680,16 +45206,11 @@
           </m:e>
           <m:sup>
             <m:r>
-              <m:t>b</m:t>
-            </m:r>
-            <m:r>
-              <m:t>a</m:t>
-            </m:r>
-            <m:r>
-              <m:t>s</m:t>
-            </m:r>
-            <m:r>
-              <m:t>e</m:t>
+              <m:rPr>
+                <m:nor/>
+                <m:sty m:val="b"/>
+              </m:rPr>
+              <m:t>base</m:t>
             </m:r>
           </m:sup>
         </m:sSup>
@@ -45712,13 +45233,11 @@
           </m:e>
           <m:sup>
             <m:r>
-              <m:t>m</m:t>
-            </m:r>
-            <m:r>
-              <m:t>i</m:t>
-            </m:r>
-            <m:r>
-              <m:t>x</m:t>
+              <m:rPr>
+                <m:nor/>
+                <m:sty m:val="b"/>
+              </m:rPr>
+              <m:t>mix</m:t>
             </m:r>
           </m:sup>
         </m:sSup>
@@ -45739,7 +45258,7 @@
           <wp:inline>
             <wp:extent cx="5731510" cy="4298632"/>
             <wp:effectExtent b="0" l="0" r="0" t="0"/>
-            <wp:docPr descr="Figure S3. Effective DHW as a function of surface DHW, at four representative depths, using the calibrated \eta^{base} and \eta^{mix} values. The dotted line shows the 1:1 reference (no attenuation, i.e. surface conditions)." title="" id="229" name="Picture"/>
+            <wp:docPr descr="Figure S3. Effective DHW as a function of surface DHW, at four representative depths, using the calibrated \eta^{\textbf{base}} and \eta^{\textbf{mix}} values. The dotted line shows the 1:1 reference (no attenuation, i.e. surface conditions)." title="" id="229" name="Picture"/>
             <a:graphic>
               <a:graphicData uri="http://schemas.openxmlformats.org/drawingml/2006/picture">
                 <pic:pic>
@@ -45804,16 +45323,11 @@
           </m:e>
           <m:sup>
             <m:r>
-              <m:t>b</m:t>
-            </m:r>
-            <m:r>
-              <m:t>a</m:t>
-            </m:r>
-            <m:r>
-              <m:t>s</m:t>
-            </m:r>
-            <m:r>
-              <m:t>e</m:t>
+              <m:rPr>
+                <m:nor/>
+                <m:sty m:val="b"/>
+              </m:rPr>
+              <m:t>base</m:t>
             </m:r>
           </m:sup>
         </m:sSup>
@@ -45848,13 +45362,11 @@
           </m:e>
           <m:sup>
             <m:r>
-              <m:t>m</m:t>
-            </m:r>
-            <m:r>
-              <m:t>i</m:t>
-            </m:r>
-            <m:r>
-              <m:t>x</m:t>
+              <m:rPr>
+                <m:nor/>
+                <m:sty m:val="b"/>
+              </m:rPr>
+              <m:t>mix</m:t>
             </m:r>
           </m:sup>
         </m:sSup>

</xml_diff>

<commit_message>
Standardize equation citations to "Eq. (N)" / "Eqs. (N) and (M)"
Fixes inconsistent forms scattered through the text (lowercase
"equation (N)", missing period/space as in "Eq(8S)"/"Eq (7)") and a
genuine typo with a missing closing parenthesis, "Eq. (6" instead of
"Eq. (6)".
</commit_message>
<xml_diff>
--- a/paper/paper.docx
+++ b/paper/paper.docx
@@ -7329,7 +7329,7 @@
         </m:r>
       </m:oMath>
       <w:r>
-        <w:t xml:space="preserve">, can be found by using Eq. (6 summed over all its</w:t>
+        <w:t xml:space="preserve">, can be found by using Eq. (6) summed over all its</w:t>
       </w:r>
       <w:r>
         <w:t xml:space="preserve"> </w:t>
@@ -10277,7 +10277,7 @@
         <w:t xml:space="preserve"> </w:t>
       </w:r>
       <w:r>
-        <w:t xml:space="preserve">during the previous timestep (see equation (14) below). Taking the maximum with 1 means</w:t>
+        <w:t xml:space="preserve">during the previous timestep (see Eq. (14) below). Taking the maximum with 1 means</w:t>
       </w:r>
       <w:r>
         <w:t xml:space="preserve"> </w:t>
@@ -13320,7 +13320,7 @@
         </m:sSubSup>
       </m:oMath>
       <w:r>
-        <w:t xml:space="preserve">, the ceiling of the size class it is now assigned to, so that blending across size classes does not push the mean past that size class’s ceiling. The DHW tolerance distributions after the growth event can be written with equations (13) and (17) as:</w:t>
+        <w:t xml:space="preserve">, the ceiling of the size class it is now assigned to, so that blending across size classes does not push the mean past that size class’s ceiling. The DHW tolerance distributions after the growth event can be written with Eqs. (13) and (17) as:</w:t>
       </w:r>
     </w:p>
     <w:tbl>
@@ -14729,7 +14729,7 @@
         <w:t xml:space="preserve"> </w:t>
       </w:r>
       <w:r>
-        <w:t xml:space="preserve">as equation (11):</w:t>
+        <w:t xml:space="preserve">as Eq. (11):</w:t>
       </w:r>
     </w:p>
     <w:tbl>
@@ -15312,7 +15312,7 @@
         <w:t xml:space="preserve"> </w:t>
       </w:r>
       <w:r>
-        <w:t xml:space="preserve">is assumed to have a nominal value of 0.3. Because the heritable shift in equation (19) can push</w:t>
+        <w:t xml:space="preserve">is assumed to have a nominal value of 0.3. Because the heritable shift in Eq. (19) can push</w:t>
       </w:r>
       <w:r>
         <w:t xml:space="preserve"> </w:t>
@@ -15374,7 +15374,7 @@
         <w:t xml:space="preserve"> </w:t>
       </w:r>
       <w:r>
-        <w:t xml:space="preserve">above the source location’s own ceiling, and the connectivity-weighted combination in equation (20) can compound this across source locations,</w:t>
+        <w:t xml:space="preserve">above the source location’s own ceiling, and the connectivity-weighted combination in Eq. (20) can compound this across source locations,</w:t>
       </w:r>
       <w:r>
         <w:t xml:space="preserve"> </w:t>
@@ -37005,7 +37005,7 @@
         <w:t xml:space="preserve"> </w:t>
       </w:r>
       <w:r>
-        <w:t xml:space="preserve">is, in analogy with Eq.(8S), by:</w:t>
+        <w:t xml:space="preserve">is, in analogy with Eq. (8S), by:</w:t>
       </w:r>
     </w:p>
     <w:tbl>
@@ -37837,7 +37837,7 @@
         <w:t xml:space="preserve"> </w:t>
       </w:r>
       <w:r>
-        <w:t xml:space="preserve">and are rescaled by the coral growth and the spatial competition coefficients, as per Eq (7). This section presents details on these two coefficients calculations.</w:t>
+        <w:t xml:space="preserve">and are rescaled by the coral growth and the spatial competition coefficients, as per Eq. (7). This section presents details on these two coefficients calculations.</w:t>
       </w:r>
     </w:p>
     <w:bookmarkStart w:id="213" w:name="low-cover-growth-acceleration"/>
@@ -43855,7 +43855,7 @@
         <w:t xml:space="preserve"> </w:t>
       </w:r>
       <w:r>
-        <w:t xml:space="preserve">rather than linearly. Years with no reporting reefs are excluded from equation (22S).</w:t>
+        <w:t xml:space="preserve">rather than linearly. Years with no reporting reefs are excluded from Eq. (22S).</w:t>
       </w:r>
     </w:p>
     <w:p>
@@ -45246,7 +45246,7 @@
         <w:t xml:space="preserve"> </w:t>
       </w:r>
       <w:r>
-        <w:t xml:space="preserve">values determine how the effective DHW at depth (equation (14)) responds to surface DHW. Figure S3 shows this relationship for a range of depths, using the calibrated parameter values. The depth-refuge effect is strongest at low surface DHW and saturates as surface DHW increases, becoming approximately linear above roughly 10 DHW-weeks.</w:t>
+        <w:t xml:space="preserve">values determine how the effective DHW at depth (Eq. (14)) responds to surface DHW. Figure S3 shows this relationship for a range of depths, using the calibrated parameter values. The depth-refuge effect is strongest at low surface DHW and saturates as surface DHW increases, becoming approximately linear above roughly 10 DHW-weeks.</w:t>
       </w:r>
     </w:p>
     <w:p>

</xml_diff>

<commit_message>
Add bias as a reported performance metric, alongside Delta RMSE and SRCC
Wires the calibration repo's new bias_stats() into calibration_scores.jl,
adds Bias and Mean |Bias| rows to Table S1 (swapped ahead of the spatial/
heat-stress correlation table, now S2), and reports both the signed
median (regional-scale) and mean absolute (per-reef-scale) aggregates -
the signed median alone is misleadingly close to zero since roughly as
many reefs over- as underpredict. Also enlarges Figure 2 to match the
other main-text figures' width.
</commit_message>
<xml_diff>
--- a/paper/paper.docx
+++ b/paper/paper.docx
@@ -866,19 +866,7 @@
         <w:pStyle w:val="BodyText"/>
       </w:pPr>
       <w:r>
-        <w:t xml:space="preserve">Table S1 presents the spatial and heat-stress correlation coefficients (SRCC) with respect to each reef’s performance metric. Positive spatial correlations both along and across the GBR indicate an increase in the performance metric southward and offshore, respectively. For heat-stress correlations, negative correlations indicate a decrease in the performance metrics with increasing DHW. Refer to the</w:t>
-      </w:r>
-      <w:r>
-        <w:t xml:space="preserve"> </w:t>
-      </w:r>
-      <w:r>
-        <w:t xml:space="preserve">“Model calibration and testing”</w:t>
-      </w:r>
-      <w:r>
-        <w:t xml:space="preserve"> </w:t>
-      </w:r>
-      <w:r>
-        <w:t xml:space="preserve">section of the Materials and Methods for further details on how these correlation metrics were calculated.</w:t>
+        <w:t xml:space="preserve">Table S1 presents the bootstrapped median RMSE, ΔRMSE, SRCC and bias for calibration and test reefs, with 95% confidence intervals. Median bias was -0.01 [-0.02, -0.0] for calibration reefs and -0.01 [-0.03, 0.02] for test reefs. Since roughly as many reefs are overpredicted as underpredicted, this signed median is close to zero even though individual reefs can have a substantial bias in either direction; Table S1 therefore also reports the mean absolute bias (0.04 [0.03, 0.04] for calibration reefs and 0.04 [0.03, 0.05] for test reefs), which better reflects the magnitude of a typical reef’s directional error.</w:t>
       </w:r>
     </w:p>
     <w:p>
@@ -886,6 +874,26 @@
         <w:pStyle w:val="BodyText"/>
       </w:pPr>
       <w:r>
+        <w:t xml:space="preserve">Table S2 presents the spatial and heat-stress correlation coefficients (SRCC) with respect to each reef’s performance metric. Positive spatial correlations both along and across the GBR indicate an increase in the performance metric southward and offshore, respectively. For heat-stress correlations, negative correlations indicate a decrease in the performance metrics with increasing DHW. Refer to the</w:t>
+      </w:r>
+      <w:r>
+        <w:t xml:space="preserve"> </w:t>
+      </w:r>
+      <w:r>
+        <w:t xml:space="preserve">“Model calibration and testing”</w:t>
+      </w:r>
+      <w:r>
+        <w:t xml:space="preserve"> </w:t>
+      </w:r>
+      <w:r>
+        <w:t xml:space="preserve">section of the Materials and Methods for further details on how these correlation metrics were calculated.</w:t>
+      </w:r>
+    </w:p>
+    <w:p>
+      <w:pPr>
+        <w:pStyle w:val="BodyText"/>
+      </w:pPr>
+      <w:r>
         <w:t xml:space="preserve">Figures 3 and 4 present the mean relative cover from 2008 to 2022 across each</w:t>
       </w:r>
       <w:r>
@@ -928,9 +936,9 @@
       <w:r>
         <w:drawing>
           <wp:inline>
-            <wp:extent cx="4010025" cy="4778794"/>
+            <wp:extent cx="5394960" cy="6429237"/>
             <wp:effectExtent b="0" l="0" r="0" t="0"/>
-            <wp:docPr descr="Figure 2. Model performance metrics for calibration and test reefs. Positive values are represented by stars and negative values by circles. First column: difference between historic average and model’s RMSE (\mathbf{\Delta RMSE}) for each reef. Positive values indicate the model outperformed the benchmark. The model outperformed the benchmark at 49 of 73 reefs (for calibration) and 15 of 26 reefs (for test). Second column: Spearman’s Rank Correlation Coefficient (SRCC) between model and observation for each reef. Bootstrapped median values with confidence intervals are: for calibration reefs \mathbf{\Delta RMSE}, 0.02 [0.0, 0.03], for test reefs \mathbf{\Delta RMSE}, 0.01 [-0.0, 0.05], for calibration reefs \mathbf{SRCC}, 0.77 [0.67, 0.82], and for test reefs SRCC, 0.78 [0.6, 0.89]." title="" id="16" name="Picture"/>
+            <wp:docPr descr="Figure 2. Model performance metrics for calibration and test reefs. Positive values are represented by stars and negative values by circles. First column: difference between historic average and model’s RMSE (\mathbf{\Delta RMSE}) for each reef. Positive values indicate the model outperformed the benchmark. The model outperformed the benchmark at 50 of 73 reefs (for calibration) and 17 of 26 reefs (for test). Second column: Spearman’s Rank Correlation Coefficient (SRCC) between model and observation for each reef. Bootstrapped median values with confidence intervals are: for calibration reefs \mathbf{\Delta RMSE}, 0.02 [0.01, 0.04], for test reefs \mathbf{\Delta RMSE}, 0.02 [-0.0, 0.05], for calibration reefs \mathbf{SRCC}, 0.77 [0.7, 0.82], and for test reefs SRCC, 0.82 [0.55, 0.89]." title="" id="16" name="Picture"/>
             <a:graphic>
               <a:graphicData uri="http://schemas.openxmlformats.org/drawingml/2006/picture">
                 <pic:pic>
@@ -949,7 +957,7 @@
                   <pic:spPr bwMode="auto">
                     <a:xfrm>
                       <a:off x="0" y="0"/>
-                      <a:ext cx="4010025" cy="4778794"/>
+                      <a:ext cx="5394960" cy="6429237"/>
                     </a:xfrm>
                     <a:prstGeom prst="rect">
                       <a:avLst/>
@@ -1018,7 +1026,7 @@
         </m:r>
       </m:oMath>
       <w:r>
-        <w:t xml:space="preserve">) for each reef. Positive values indicate the model outperformed the benchmark. The model outperformed the benchmark at 49 of 73 reefs (for calibration) and 15 of 26 reefs (for test). Second column: Spearman’s Rank Correlation Coefficient (SRCC) between model and observation for each reef. Bootstrapped median values with confidence intervals are: for calibration reefs</w:t>
+        <w:t xml:space="preserve">) for each reef. Positive values indicate the model outperformed the benchmark. The model outperformed the benchmark at 50 of 73 reefs (for calibration) and 17 of 26 reefs (for test). Second column: Spearman’s Rank Correlation Coefficient (SRCC) between model and observation for each reef. Bootstrapped median values with confidence intervals are: for calibration reefs</w:t>
       </w:r>
       <w:r>
         <w:t xml:space="preserve"> </w:t>
@@ -1056,7 +1064,7 @@
         </m:r>
       </m:oMath>
       <w:r>
-        <w:t xml:space="preserve">, 0.02 [0.0, 0.03], for test reefs</w:t>
+        <w:t xml:space="preserve">, 0.02 [0.01, 0.04], for test reefs</w:t>
       </w:r>
       <w:r>
         <w:t xml:space="preserve"> </w:t>
@@ -1094,7 +1102,7 @@
         </m:r>
       </m:oMath>
       <w:r>
-        <w:t xml:space="preserve">, 0.01 [-0.0, 0.05], for calibration reefs</w:t>
+        <w:t xml:space="preserve">, 0.02 [-0.0, 0.05], for calibration reefs</w:t>
       </w:r>
       <w:r>
         <w:t xml:space="preserve"> </w:t>
@@ -1126,7 +1134,7 @@
         </m:r>
       </m:oMath>
       <w:r>
-        <w:t xml:space="preserve">, 0.77 [0.67, 0.82], and for test reefs SRCC, 0.78 [0.6, 0.89].</w:t>
+        <w:t xml:space="preserve">, 0.77 [0.7, 0.82], and for test reefs SRCC, 0.82 [0.55, 0.89].</w:t>
       </w:r>
     </w:p>
     <w:p>
@@ -1628,7 +1636,7 @@
         <w:pStyle w:val="FirstParagraph"/>
       </w:pPr>
       <w:r>
-        <w:t xml:space="preserve">CoralBlox provides a computationally efficient modelling capability to support rapid screening of potential management approaches. By explicitly representing key ecological processes within a simplified but credible framework, CoralBlox enables stakeholders and reef managers to iteratively explore management options and quickly identify robust strategies under deep uncertainty. CoralBlox balances the need for credible representations of ecological interactions (at reef-regional scales) and computational efficiency to provide timely, actionable insight.</w:t>
+        <w:t xml:space="preserve">CoralBlox provides a computationally efficient modelling capability to support rapid screening of potential management approaches. By explicitly representing key ecological processes within a simplified but credible framework, CoralBlox enables stakeholders and reef managers to iteratively explore management options and quickly identify robust strategies under deep uncertainty. CoralBlox balances the need for credible representations of ecological interactions (at reef-regional scales) and computational efficiency to provide timely, actionable insight. This is reflected in the bias metrics reported in Table S1: CoralBlox is intended to give a good indication of regional coral cover dynamics rather than to precisely predict any individual reef’s trajectory, so the near-zero signed median bias is relevant at the regional scale, while the larger mean absolute bias reflects the expected margin of error at the individual reef scale.</w:t>
       </w:r>
     </w:p>
     <w:p>
@@ -17399,7 +17407,7 @@
         <w:t xml:space="preserve"> </w:t>
       </w:r>
       <w:r>
-        <w:t xml:space="preserve">establishes a benchmark providing a minimum but not sufficient performance threshold for CoralBox. The two performance metrics used are i) the difference between modelled and benchmark Root Mean Squared Errors (RMSE) with respect to the observed data,</w:t>
+        <w:t xml:space="preserve">establishes a benchmark providing a minimum but not sufficient performance threshold for CoralBox. The three performance metrics used are i) the difference between modelled and benchmark Root Mean Squared Errors (RMSE) with respect to the observed data,</w:t>
       </w:r>
       <w:r>
         <w:t xml:space="preserve"> </w:t>
@@ -17519,7 +17527,74 @@
         </m:d>
       </m:oMath>
       <w:r>
-        <w:t xml:space="preserve">, and ii) the Spearman Rank Correlation Coefficient (SRCC) between observed and modelled relative coral cover. Positive ΔRMSE values indicate reefs where CoralBlox outperforms the benchmark. SRCC values provide an indication of alignment in trends between simulation and observations.</w:t>
+        <w:t xml:space="preserve">, ii) the Spearman Rank Correlation Coefficient (SRCC) between observed and modelled relative coral cover, and iii) the bias,</w:t>
+      </w:r>
+      <w:r>
+        <w:t xml:space="preserve"> </w:t>
+      </w:r>
+      <m:oMath>
+        <m:r>
+          <m:t>b</m:t>
+        </m:r>
+        <m:r>
+          <m:t>i</m:t>
+        </m:r>
+        <m:r>
+          <m:t>a</m:t>
+        </m:r>
+        <m:r>
+          <m:t>s</m:t>
+        </m:r>
+        <m:r>
+          <m:rPr>
+            <m:sty m:val="p"/>
+          </m:rPr>
+          <m:t>=</m:t>
+        </m:r>
+        <m:r>
+          <m:t>m</m:t>
+        </m:r>
+        <m:r>
+          <m:t>e</m:t>
+        </m:r>
+        <m:r>
+          <m:t>a</m:t>
+        </m:r>
+        <m:r>
+          <m:t>n</m:t>
+        </m:r>
+        <m:d>
+          <m:dPr>
+            <m:begChr m:val="("/>
+            <m:sepChr m:val=""/>
+            <m:endChr m:val=")"/>
+            <m:grow/>
+          </m:dPr>
+          <m:e>
+            <m:acc>
+              <m:accPr>
+                <m:chr m:val="̂"/>
+              </m:accPr>
+              <m:e>
+                <m:r>
+                  <m:t>y</m:t>
+                </m:r>
+              </m:e>
+            </m:acc>
+            <m:r>
+              <m:rPr>
+                <m:sty m:val="p"/>
+              </m:rPr>
+              <m:t>−</m:t>
+            </m:r>
+            <m:r>
+              <m:t>y</m:t>
+            </m:r>
+          </m:e>
+        </m:d>
+      </m:oMath>
+      <w:r>
+        <w:t xml:space="preserve">. Positive ΔRMSE values indicate reefs where CoralBlox outperforms the benchmark. SRCC values provide an indication of alignment in trends between simulation and observations. Positive bias values indicate CoralBlox overpredicts coral cover on average, negative values indicate underprediction.</w:t>
       </w:r>
     </w:p>
     <w:p>
@@ -17536,7 +17611,7 @@
         <w:t xml:space="preserve">(73)</w:t>
       </w:r>
       <w:r>
-        <w:t xml:space="preserve">. For each location, confidence intervals were obtained by resampling its paired modelled/observed annual values with replacement: locations with five or more years of observations used a circular block bootstrap (block lengths of two to three years, to preserve year-to-year autocorrelation in the error series), while locations with the minimum of four observed years used a standard independent-and-identically-distributed (iid) bootstrap. Both used 2,000 resamples and 95% percentile confidence intervals. The median ΔRMSE and SRCC reported for the calibration and test sets were themselves bootstrapped. This second-stage bootstrap resampled which locations’ point estimates were included and took the median across 2,000 such resamples. Only locations eligible for the block bootstrap were included, so locations with just four years of data contribute a per-location estimate but do not influence the aggregate median’s uncertainty.</w:t>
+        <w:t xml:space="preserve">. For each location, confidence intervals were obtained by resampling its paired modelled/observed annual values with replacement: locations with five or more years of observations used a circular block bootstrap (block lengths of two to three years, to preserve year-to-year autocorrelation in the error series), while locations with the minimum of four observed years used a standard independent-and-identically-distributed (iid) bootstrap. Both used 2,000 resamples and 95% percentile confidence intervals. The median ΔRMSE, SRCC and bias reported for the calibration and test sets were themselves bootstrapped. This second-stage bootstrap resampled which locations’ point estimates were included and took the median across 2,000 such resamples. Only locations eligible for the block bootstrap were included, so locations with just four years of data contribute a per-location estimate but do not influence the aggregate median’s uncertainty.</w:t>
       </w:r>
     </w:p>
     <w:p>
@@ -25203,7 +25278,267 @@
           <w:b/>
           <w:bCs/>
         </w:rPr>
-        <w:t xml:space="preserve">Table S1. Bootstrapped SRCC with 95% confidence intervals between performance metrics and positions along and across the GBR, as well as maximum DHW.</w:t>
+        <w:t xml:space="preserve">Table S1. Bootstrapped median performance metrics and 95% confidence intervals for calibration and test reefs.</w:t>
+      </w:r>
+    </w:p>
+    <w:tbl>
+      <w:tblPr>
+        <w:tblStyle w:val="Table"/>
+        <w:tblW w:type="auto" w:w="0"/>
+        <w:tblLook w:firstRow="1" w:lastRow="0" w:firstColumn="0" w:lastColumn="0" w:noHBand="0" w:noVBand="0" w:val="0020"/>
+        <w:tblCaption w:val="Table S1. Bootstrapped median performance metrics and 95% confidence intervals for calibration and test reefs."/>
+      </w:tblPr>
+      <w:tblGrid>
+        <w:gridCol w:w="2640"/>
+        <w:gridCol w:w="2640"/>
+        <w:gridCol w:w="2640"/>
+      </w:tblGrid>
+      <w:tr>
+        <w:trPr>
+          <w:tblHeader w:val="on"/>
+        </w:trPr>
+        <w:tc>
+          <w:tcPr/>
+          <w:p>
+            <w:pPr>
+              <w:pStyle w:val="Compact"/>
+            </w:pPr>
+          </w:p>
+        </w:tc>
+        <w:tc>
+          <w:tcPr/>
+          <w:p>
+            <w:pPr>
+              <w:pStyle w:val="Compact"/>
+              <w:jc w:val="left"/>
+            </w:pPr>
+            <w:r>
+              <w:t xml:space="preserve">Calibration reefs</w:t>
+            </w:r>
+          </w:p>
+        </w:tc>
+        <w:tc>
+          <w:tcPr/>
+          <w:p>
+            <w:pPr>
+              <w:pStyle w:val="Compact"/>
+              <w:jc w:val="left"/>
+            </w:pPr>
+            <w:r>
+              <w:t xml:space="preserve">Test reefs</w:t>
+            </w:r>
+          </w:p>
+        </w:tc>
+      </w:tr>
+      <w:tr>
+        <w:tc>
+          <w:tcPr/>
+          <w:p>
+            <w:pPr>
+              <w:pStyle w:val="Compact"/>
+              <w:jc w:val="left"/>
+            </w:pPr>
+            <w:r>
+              <w:t xml:space="preserve">RMSE</w:t>
+            </w:r>
+          </w:p>
+        </w:tc>
+        <w:tc>
+          <w:tcPr/>
+          <w:p>
+            <w:pPr>
+              <w:pStyle w:val="Compact"/>
+              <w:jc w:val="left"/>
+            </w:pPr>
+            <w:r>
+              <w:t xml:space="preserve">0.07 [0.06, 0.08]</w:t>
+            </w:r>
+          </w:p>
+        </w:tc>
+        <w:tc>
+          <w:tcPr/>
+          <w:p>
+            <w:pPr>
+              <w:pStyle w:val="Compact"/>
+              <w:jc w:val="left"/>
+            </w:pPr>
+            <w:r>
+              <w:t xml:space="preserve">0.07 [0.06, 0.09]</w:t>
+            </w:r>
+          </w:p>
+        </w:tc>
+      </w:tr>
+      <w:tr>
+        <w:tc>
+          <w:tcPr/>
+          <w:p>
+            <w:pPr>
+              <w:pStyle w:val="Compact"/>
+              <w:jc w:val="left"/>
+            </w:pPr>
+            <w:r>
+              <w:t xml:space="preserve">ΔRMSE</w:t>
+            </w:r>
+          </w:p>
+        </w:tc>
+        <w:tc>
+          <w:tcPr/>
+          <w:p>
+            <w:pPr>
+              <w:pStyle w:val="Compact"/>
+              <w:jc w:val="left"/>
+            </w:pPr>
+            <w:r>
+              <w:t xml:space="preserve">0.02 [0.01, 0.04]</w:t>
+            </w:r>
+          </w:p>
+        </w:tc>
+        <w:tc>
+          <w:tcPr/>
+          <w:p>
+            <w:pPr>
+              <w:pStyle w:val="Compact"/>
+              <w:jc w:val="left"/>
+            </w:pPr>
+            <w:r>
+              <w:t xml:space="preserve">0.02 [-0.0, 0.05]</w:t>
+            </w:r>
+          </w:p>
+        </w:tc>
+      </w:tr>
+      <w:tr>
+        <w:tc>
+          <w:tcPr/>
+          <w:p>
+            <w:pPr>
+              <w:pStyle w:val="Compact"/>
+              <w:jc w:val="left"/>
+            </w:pPr>
+            <w:r>
+              <w:t xml:space="preserve">SRCC</w:t>
+            </w:r>
+          </w:p>
+        </w:tc>
+        <w:tc>
+          <w:tcPr/>
+          <w:p>
+            <w:pPr>
+              <w:pStyle w:val="Compact"/>
+              <w:jc w:val="left"/>
+            </w:pPr>
+            <w:r>
+              <w:t xml:space="preserve">0.77 [0.7, 0.82]</w:t>
+            </w:r>
+          </w:p>
+        </w:tc>
+        <w:tc>
+          <w:tcPr/>
+          <w:p>
+            <w:pPr>
+              <w:pStyle w:val="Compact"/>
+              <w:jc w:val="left"/>
+            </w:pPr>
+            <w:r>
+              <w:t xml:space="preserve">0.82 [0.55, 0.89]</w:t>
+            </w:r>
+          </w:p>
+        </w:tc>
+      </w:tr>
+      <w:tr>
+        <w:tc>
+          <w:tcPr/>
+          <w:p>
+            <w:pPr>
+              <w:pStyle w:val="Compact"/>
+              <w:jc w:val="left"/>
+            </w:pPr>
+            <w:r>
+              <w:t xml:space="preserve">Bias</w:t>
+            </w:r>
+          </w:p>
+        </w:tc>
+        <w:tc>
+          <w:tcPr/>
+          <w:p>
+            <w:pPr>
+              <w:pStyle w:val="Compact"/>
+              <w:jc w:val="left"/>
+            </w:pPr>
+            <w:r>
+              <w:t xml:space="preserve">-0.01 [-0.02, -0.0]</w:t>
+            </w:r>
+          </w:p>
+        </w:tc>
+        <w:tc>
+          <w:tcPr/>
+          <w:p>
+            <w:pPr>
+              <w:pStyle w:val="Compact"/>
+              <w:jc w:val="left"/>
+            </w:pPr>
+            <w:r>
+              <w:t xml:space="preserve">-0.01 [-0.03, 0.02]</w:t>
+            </w:r>
+          </w:p>
+        </w:tc>
+      </w:tr>
+      <w:tr>
+        <w:tc>
+          <w:tcPr/>
+          <w:p>
+            <w:pPr>
+              <w:pStyle w:val="Compact"/>
+              <w:jc w:val="left"/>
+            </w:pPr>
+            <w:r>
+              <w:t xml:space="preserve">Mean |Bias|</w:t>
+            </w:r>
+          </w:p>
+        </w:tc>
+        <w:tc>
+          <w:tcPr/>
+          <w:p>
+            <w:pPr>
+              <w:pStyle w:val="Compact"/>
+              <w:jc w:val="left"/>
+            </w:pPr>
+            <w:r>
+              <w:t xml:space="preserve">0.04 [0.03, 0.04]</w:t>
+            </w:r>
+          </w:p>
+        </w:tc>
+        <w:tc>
+          <w:tcPr/>
+          <w:p>
+            <w:pPr>
+              <w:pStyle w:val="Compact"/>
+              <w:jc w:val="left"/>
+            </w:pPr>
+            <w:r>
+              <w:t xml:space="preserve">0.04 [0.03, 0.05]</w:t>
+            </w:r>
+          </w:p>
+        </w:tc>
+      </w:tr>
+    </w:tbl>
+    <w:p>
+      <w:pPr>
+        <w:pStyle w:val="BodyText"/>
+      </w:pPr>
+      <w:r>
+        <w:t xml:space="preserve"> </w:t>
+      </w:r>
+    </w:p>
+    <w:p>
+      <w:pPr>
+        <w:pStyle w:val="TableCaption"/>
+      </w:pPr>
+      <w:r>
+        <w:rPr>
+          <w:b/>
+          <w:bCs/>
+        </w:rPr>
+        <w:t xml:space="preserve">Table S2. Bootstrapped SRCC with 95% confidence intervals between performance metrics and positions along and across the GBR, as well as maximum DHW.</w:t>
       </w:r>
     </w:p>
     <w:tbl>
@@ -25212,7 +25547,7 @@
         <w:tblW w:type="pct" w:w="5000"/>
         <w:tblLayout w:type="fixed"/>
         <w:tblLook w:firstRow="1" w:lastRow="0" w:firstColumn="0" w:lastColumn="0" w:noHBand="0" w:noVBand="0" w:val="0020"/>
-        <w:tblCaption w:val="Table S1. Bootstrapped SRCC with 95% confidence intervals between performance metrics and positions along and across the GBR, as well as maximum DHW."/>
+        <w:tblCaption w:val="Table S2. Bootstrapped SRCC with 95% confidence intervals between performance metrics and positions along and across the GBR, as well as maximum DHW."/>
       </w:tblPr>
       <w:tblGrid>
         <w:gridCol w:w="1980"/>
@@ -25290,7 +25625,7 @@
               <w:jc w:val="left"/>
             </w:pPr>
             <w:r>
-              <w:t xml:space="preserve">0.36 [0.16, 0.61]</w:t>
+              <w:t xml:space="preserve">0.38 [0.19, 0.6]</w:t>
             </w:r>
           </w:p>
         </w:tc>
@@ -25302,7 +25637,7 @@
               <w:jc w:val="left"/>
             </w:pPr>
             <w:r>
-              <w:t xml:space="preserve">-0.39 [-0.62, -0.2]</w:t>
+              <w:t xml:space="preserve">-0.4 [-0.64, -0.22]</w:t>
             </w:r>
           </w:p>
         </w:tc>
@@ -25314,7 +25649,7 @@
               <w:jc w:val="left"/>
             </w:pPr>
             <w:r>
-              <w:t xml:space="preserve">-0.43 [-0.65, -0.24]</w:t>
+              <w:t xml:space="preserve">-0.42 [-0.63, -0.23]</w:t>
             </w:r>
           </w:p>
         </w:tc>
@@ -25340,7 +25675,7 @@
               <w:jc w:val="left"/>
             </w:pPr>
             <w:r>
-              <w:t xml:space="preserve">0.45 [0.19, 0.83]</w:t>
+              <w:t xml:space="preserve">0.44 [0.2, 0.79]</w:t>
             </w:r>
           </w:p>
         </w:tc>
@@ -25352,7 +25687,7 @@
               <w:jc w:val="left"/>
             </w:pPr>
             <w:r>
-              <w:t xml:space="preserve">-0.39 [-0.76, -0.11]</w:t>
+              <w:t xml:space="preserve">-0.38 [-0.75, -0.13]</w:t>
             </w:r>
           </w:p>
         </w:tc>
@@ -25364,7 +25699,7 @@
               <w:jc w:val="left"/>
             </w:pPr>
             <w:r>
-              <w:t xml:space="preserve">-0.57 [-1.01, -0.32]</w:t>
+              <w:t xml:space="preserve">-0.53 [-0.9, -0.28]</w:t>
             </w:r>
           </w:p>
         </w:tc>
@@ -25390,7 +25725,7 @@
               <w:jc w:val="left"/>
             </w:pPr>
             <w:r>
-              <w:t xml:space="preserve">0.24 [0.03, 0.48]</w:t>
+              <w:t xml:space="preserve">0.24 [0.02, 0.49]</w:t>
             </w:r>
           </w:p>
         </w:tc>
@@ -25402,7 +25737,7 @@
               <w:jc w:val="left"/>
             </w:pPr>
             <w:r>
-              <w:t xml:space="preserve">-0.27 [-0.5, -0.05]</w:t>
+              <w:t xml:space="preserve">-0.26 [-0.5, -0.06]</w:t>
             </w:r>
           </w:p>
         </w:tc>
@@ -25414,7 +25749,7 @@
               <w:jc w:val="left"/>
             </w:pPr>
             <w:r>
-              <w:t xml:space="preserve">-0.46 [-0.68, -0.29]</w:t>
+              <w:t xml:space="preserve">-0.48 [-0.67, -0.3]</w:t>
             </w:r>
           </w:p>
         </w:tc>
@@ -25440,7 +25775,7 @@
               <w:jc w:val="left"/>
             </w:pPr>
             <w:r>
-              <w:t xml:space="preserve">0.5 [0.24, 0.89]</w:t>
+              <w:t xml:space="preserve">0.4 [0.15, 0.78]</w:t>
             </w:r>
           </w:p>
         </w:tc>
@@ -25452,7 +25787,7 @@
               <w:jc w:val="left"/>
             </w:pPr>
             <w:r>
-              <w:t xml:space="preserve">-0.44 [-0.81, -0.16]</w:t>
+              <w:t xml:space="preserve">-0.34 [-0.71, -0.05]</w:t>
             </w:r>
           </w:p>
         </w:tc>
@@ -25464,191 +25799,7 @@
               <w:jc w:val="left"/>
             </w:pPr>
             <w:r>
-              <w:t xml:space="preserve">-0.53 [-0.87, -0.29]</w:t>
-            </w:r>
-          </w:p>
-        </w:tc>
-      </w:tr>
-    </w:tbl>
-    <w:p>
-      <w:pPr>
-        <w:pStyle w:val="BodyText"/>
-      </w:pPr>
-      <w:r>
-        <w:t xml:space="preserve"> </w:t>
-      </w:r>
-    </w:p>
-    <w:p>
-      <w:pPr>
-        <w:pStyle w:val="TableCaption"/>
-      </w:pPr>
-      <w:r>
-        <w:rPr>
-          <w:b/>
-          <w:bCs/>
-        </w:rPr>
-        <w:t xml:space="preserve">Table S2. Bootstrapped median performance metrics and 95% confidence intervals for calibration and test reefs.</w:t>
-      </w:r>
-    </w:p>
-    <w:tbl>
-      <w:tblPr>
-        <w:tblStyle w:val="Table"/>
-        <w:tblW w:type="auto" w:w="0"/>
-        <w:tblLook w:firstRow="1" w:lastRow="0" w:firstColumn="0" w:lastColumn="0" w:noHBand="0" w:noVBand="0" w:val="0020"/>
-        <w:tblCaption w:val="Table S2. Bootstrapped median performance metrics and 95% confidence intervals for calibration and test reefs."/>
-      </w:tblPr>
-      <w:tblGrid>
-        <w:gridCol w:w="2640"/>
-        <w:gridCol w:w="2640"/>
-        <w:gridCol w:w="2640"/>
-      </w:tblGrid>
-      <w:tr>
-        <w:trPr>
-          <w:tblHeader w:val="on"/>
-        </w:trPr>
-        <w:tc>
-          <w:tcPr/>
-          <w:p>
-            <w:pPr>
-              <w:pStyle w:val="Compact"/>
-            </w:pPr>
-          </w:p>
-        </w:tc>
-        <w:tc>
-          <w:tcPr/>
-          <w:p>
-            <w:pPr>
-              <w:pStyle w:val="Compact"/>
-              <w:jc w:val="left"/>
-            </w:pPr>
-            <w:r>
-              <w:t xml:space="preserve">Calibration reefs</w:t>
-            </w:r>
-          </w:p>
-        </w:tc>
-        <w:tc>
-          <w:tcPr/>
-          <w:p>
-            <w:pPr>
-              <w:pStyle w:val="Compact"/>
-              <w:jc w:val="left"/>
-            </w:pPr>
-            <w:r>
-              <w:t xml:space="preserve">Test reefs</w:t>
-            </w:r>
-          </w:p>
-        </w:tc>
-      </w:tr>
-      <w:tr>
-        <w:tc>
-          <w:tcPr/>
-          <w:p>
-            <w:pPr>
-              <w:pStyle w:val="Compact"/>
-              <w:jc w:val="left"/>
-            </w:pPr>
-            <w:r>
-              <w:t xml:space="preserve">RMSE</w:t>
-            </w:r>
-          </w:p>
-        </w:tc>
-        <w:tc>
-          <w:tcPr/>
-          <w:p>
-            <w:pPr>
-              <w:pStyle w:val="Compact"/>
-              <w:jc w:val="left"/>
-            </w:pPr>
-            <w:r>
-              <w:t xml:space="preserve">0.07 [0.06, 0.08]</w:t>
-            </w:r>
-          </w:p>
-        </w:tc>
-        <w:tc>
-          <w:tcPr/>
-          <w:p>
-            <w:pPr>
-              <w:pStyle w:val="Compact"/>
-              <w:jc w:val="left"/>
-            </w:pPr>
-            <w:r>
-              <w:t xml:space="preserve">0.07 [0.06, 0.1]</w:t>
-            </w:r>
-          </w:p>
-        </w:tc>
-      </w:tr>
-      <w:tr>
-        <w:tc>
-          <w:tcPr/>
-          <w:p>
-            <w:pPr>
-              <w:pStyle w:val="Compact"/>
-              <w:jc w:val="left"/>
-            </w:pPr>
-            <w:r>
-              <w:t xml:space="preserve">ΔRMSE</w:t>
-            </w:r>
-          </w:p>
-        </w:tc>
-        <w:tc>
-          <w:tcPr/>
-          <w:p>
-            <w:pPr>
-              <w:pStyle w:val="Compact"/>
-              <w:jc w:val="left"/>
-            </w:pPr>
-            <w:r>
-              <w:t xml:space="preserve">0.02 [0.0, 0.03]</w:t>
-            </w:r>
-          </w:p>
-        </w:tc>
-        <w:tc>
-          <w:tcPr/>
-          <w:p>
-            <w:pPr>
-              <w:pStyle w:val="Compact"/>
-              <w:jc w:val="left"/>
-            </w:pPr>
-            <w:r>
-              <w:t xml:space="preserve">0.01 [-0.0, 0.05]</w:t>
-            </w:r>
-          </w:p>
-        </w:tc>
-      </w:tr>
-      <w:tr>
-        <w:tc>
-          <w:tcPr/>
-          <w:p>
-            <w:pPr>
-              <w:pStyle w:val="Compact"/>
-              <w:jc w:val="left"/>
-            </w:pPr>
-            <w:r>
-              <w:t xml:space="preserve">SRCC</w:t>
-            </w:r>
-          </w:p>
-        </w:tc>
-        <w:tc>
-          <w:tcPr/>
-          <w:p>
-            <w:pPr>
-              <w:pStyle w:val="Compact"/>
-              <w:jc w:val="left"/>
-            </w:pPr>
-            <w:r>
-              <w:t xml:space="preserve">0.77 [0.67, 0.82]</w:t>
-            </w:r>
-          </w:p>
-        </w:tc>
-        <w:tc>
-          <w:tcPr/>
-          <w:p>
-            <w:pPr>
-              <w:pStyle w:val="Compact"/>
-              <w:jc w:val="left"/>
-            </w:pPr>
-            <w:r>
-              <w:t xml:space="preserve">0.78 [0.6, 0.89]</w:t>
+              <w:t xml:space="preserve">-0.48 [-0.81, -0.25]</w:t>
             </w:r>
           </w:p>
         </w:tc>

</xml_diff>

<commit_message>
Select Figure 5 reefs by ΔRMSE instead of raw RMSE, add ΔRMSE/Bias
Raw RMSE ignores each reef's natural variability, so it can mislabel a
volatile reef the model tracks well (e.g. Rebe Reef) as "worst". Reef
selection and all four reported metrics (RMSE, ΔRMSE, SRCC, Bias) are
now computed programmatically in calibration_scores.jl and read live
into the caption rather than hardcoded, matching the selection logic
used to generate the figure itself. Also scales Figure 5's y-axis to
the highest cover value across the four selected reefs instead of a
fixed 0-100%, and fixes a title-overlap regression from the longer
metrics line by splitting it across two lines.
</commit_message>
<xml_diff>
--- a/paper/paper.docx
+++ b/paper/paper.docx
@@ -1272,7 +1272,7 @@
         <w:pStyle w:val="BodyText"/>
       </w:pPr>
       <w:r>
-        <w:t xml:space="preserve">A comparison between modeled and observed relative coral cover for four selected test reefs is presented in Figure 5. The selected reefs (two with the lowest and two the highest RMSE values) show a range of distinct environmental and ecological behaviors, including low and high heat stress, presence or absence of mortality events caused by cyclone or Crown-of-thorns Starfish (COTS) outbreaks, low and high initial coral cover, and distinct initial benthic compositions. Cyclone and storm damage historical data and the lack of a COTS sub-model make validating model processes difficult at reefs significantly impacted by these disturbances. Estimates of mortality for these events are inferred directly from the LTMP to ensure trajectories are aligned.</w:t>
+        <w:t xml:space="preserve">A comparison between modeled and observed relative coral cover for four selected test reefs is presented in Figure 5. The selected reefs (the two with the lowest and two with the highest ΔRMSE) show a range of distinct environmental and ecological behaviors, including low and high heat stress, presence or absence of mortality events caused by cyclone or Crown-of-thorns Starfish (COTS) outbreaks, low and high initial coral cover, and distinct initial benthic compositions. Cyclone and storm damage historical data and the lack of a COTS sub-model make validating model processes difficult at reefs significantly impacted by these disturbances. Estimates of mortality for these events are inferred directly from the LTMP to ensure trajectories are aligned.</w:t>
       </w:r>
     </w:p>
     <w:p>
@@ -1284,7 +1284,7 @@
           <wp:inline>
             <wp:extent cx="5394960" cy="4674557"/>
             <wp:effectExtent b="0" l="0" r="0" t="0"/>
-            <wp:docPr descr="Figure 5. Comparison between modelled and observed coral cover for selected reefs. (A) Centipede Reef (18-088): Model RMSE = 0.17, Benchmark RMSE = 0.04, SRCC = 0.80; (B) Rebe Reef (19-209): Model RMSE = 0.19, Benchmark RMSE = 0.23, SRCC = 0.82; (C) Martin Reef (14-123): Model RMSE = 0.05, Benchmark RMSE = 0.09, SRCC = 0.9; (D) Pompey Reef (No 2) (20-351b): Model RMSE = 0.06, Benchmark RMSE = 0.11, SRCC = 1.0. For each reef, the subplots show the modelled (solid blue line) and observed (red dots) values of relative coral cover; the historical DHW values (red dotted line) and historical mortality events caused by Crown of Thorns Starfish (COTS) and/or cyclone damage (vertical dashed lines); and the modelled relative coral composition." title="" id="25" name="Picture"/>
+            <wp:docPr descr="Figure 5. Comparison between modelled and observed coral cover for selected reefs. (A) McCulloch Reef (No 1) (17-016a): Model RMSE = 0.08, Benchmark RMSE = 0.03, ΔRMSE = -0.06, SRCC = -0.2, Bias = 0.07; (B) Low Islands Reef (16-028): Model RMSE = 0.15, Benchmark RMSE = 0.1, ΔRMSE = -0.05, SRCC = 0.0, Bias = -0.08; (C) Rebe Reef (19-209): Model RMSE = 0.11, Benchmark RMSE = 0.23, ΔRMSE = 0.12, SRCC = 1.0, Bias = -0.05; (D) Ben Reef (20-113): Model RMSE = 0.05, Benchmark RMSE = 0.22, ΔRMSE = 0.17, SRCC = 0.9, Bias = -0.0. For each reef, the subplots show the modelled (solid blue line) and observed (red dots) values of relative coral cover; the historical DHW values (red dotted line) and historical mortality events caused by Crown of Thorns Starfish (COTS) and/or cyclone damage (vertical dashed lines); and the modelled relative coral composition." title="" id="25" name="Picture"/>
             <a:graphic>
               <a:graphicData uri="http://schemas.openxmlformats.org/drawingml/2006/picture">
                 <pic:pic>
@@ -1367,13 +1367,13 @@
           <w:b/>
           <w:bCs/>
         </w:rPr>
-        <w:t xml:space="preserve">Centipede Reef (18-088):</w:t>
-      </w:r>
-      <w:r>
-        <w:t xml:space="preserve"> </w:t>
-      </w:r>
-      <w:r>
-        <w:t xml:space="preserve">Model RMSE = 0.17, Benchmark RMSE = 0.04, SRCC = 0.80; (</w:t>
+        <w:t xml:space="preserve">McCulloch Reef (No 1) (17-016a):</w:t>
+      </w:r>
+      <w:r>
+        <w:t xml:space="preserve"> </w:t>
+      </w:r>
+      <w:r>
+        <w:t xml:space="preserve">Model RMSE = 0.08, Benchmark RMSE = 0.03, ΔRMSE = -0.06, SRCC = -0.2, Bias = 0.07; (</w:t>
       </w:r>
       <w:r>
         <w:rPr>
@@ -1393,13 +1393,13 @@
           <w:b/>
           <w:bCs/>
         </w:rPr>
-        <w:t xml:space="preserve">Rebe Reef (19-209):</w:t>
-      </w:r>
-      <w:r>
-        <w:t xml:space="preserve"> </w:t>
-      </w:r>
-      <w:r>
-        <w:t xml:space="preserve">Model RMSE = 0.19, Benchmark RMSE = 0.23, SRCC = 0.82; (</w:t>
+        <w:t xml:space="preserve">Low Islands Reef (16-028):</w:t>
+      </w:r>
+      <w:r>
+        <w:t xml:space="preserve"> </w:t>
+      </w:r>
+      <w:r>
+        <w:t xml:space="preserve">Model RMSE = 0.15, Benchmark RMSE = 0.1, ΔRMSE = -0.05, SRCC = 0.0, Bias = -0.08; (</w:t>
       </w:r>
       <w:r>
         <w:rPr>
@@ -1419,13 +1419,13 @@
           <w:b/>
           <w:bCs/>
         </w:rPr>
-        <w:t xml:space="preserve">Martin Reef (14-123):</w:t>
-      </w:r>
-      <w:r>
-        <w:t xml:space="preserve"> </w:t>
-      </w:r>
-      <w:r>
-        <w:t xml:space="preserve">Model RMSE = 0.05, Benchmark RMSE = 0.09, SRCC = 0.9; (</w:t>
+        <w:t xml:space="preserve">Rebe Reef (19-209):</w:t>
+      </w:r>
+      <w:r>
+        <w:t xml:space="preserve"> </w:t>
+      </w:r>
+      <w:r>
+        <w:t xml:space="preserve">Model RMSE = 0.11, Benchmark RMSE = 0.23, ΔRMSE = 0.12, SRCC = 1.0, Bias = -0.05; (</w:t>
       </w:r>
       <w:r>
         <w:rPr>
@@ -1445,13 +1445,13 @@
           <w:b/>
           <w:bCs/>
         </w:rPr>
-        <w:t xml:space="preserve">Pompey Reef (No 2) (20-351b):</w:t>
-      </w:r>
-      <w:r>
-        <w:t xml:space="preserve"> </w:t>
-      </w:r>
-      <w:r>
-        <w:t xml:space="preserve">Model RMSE = 0.06, Benchmark RMSE = 0.11, SRCC = 1.0. For each reef, the subplots show the modelled (solid blue line) and observed (red dots) values of relative coral cover; the historical DHW values (red dotted line) and historical mortality events caused by Crown of Thorns Starfish (COTS) and/or cyclone damage (vertical dashed lines); and the modelled relative coral composition.</w:t>
+        <w:t xml:space="preserve">Ben Reef (20-113):</w:t>
+      </w:r>
+      <w:r>
+        <w:t xml:space="preserve"> </w:t>
+      </w:r>
+      <w:r>
+        <w:t xml:space="preserve">Model RMSE = 0.05, Benchmark RMSE = 0.22, ΔRMSE = 0.17, SRCC = 0.9, Bias = -0.0. For each reef, the subplots show the modelled (solid blue line) and observed (red dots) values of relative coral cover; the historical DHW values (red dotted line) and historical mortality events caused by Crown of Thorns Starfish (COTS) and/or cyclone damage (vertical dashed lines); and the modelled relative coral composition.</w:t>
       </w:r>
     </w:p>
     <w:bookmarkEnd w:id="27"/>

</xml_diff>

<commit_message>
Add per-reef bootstrap metric scatter figures S5-S8 to Supplementary
Adds four new figures (calibration/test x RMSE-diff/SRCC) showing the
full per-reef bootstrap distribution behind Table S1's aggregates, via
a new paper-styled plotting helper (legend below with no border, no
gridlines, colorblind-safe palette, reef ID x-axis, y=0 reference line,
median absolute bias instead of mean - more robust to the right-skew a
few poorly-fit reefs introduce, consistent with using median everywhere
else in this paper). Also clarifies that Figures 3/4's shaded intervals
are a cross-reef percentile spread, not a bootstrap CI, since most reef
groups (as few as 2 test reefs) are too small for meaningful resampling.
</commit_message>
<xml_diff>
--- a/paper/paper.docx
+++ b/paper/paper.docx
@@ -858,7 +858,7 @@
         <w:t xml:space="preserve"> </w:t>
       </w:r>
       <w:r>
-        <w:t xml:space="preserve">section of the Materials and Methods for further details.</w:t>
+        <w:t xml:space="preserve">section of the Materials and Methods for further details. Table S1 presents the bootstrapped median RMSE, ΔRMSE, SRCC, median bias and median absolute bias for calibration and test reefs, with 95% confidence intervals. The full distribution of scores underpinning Figure 2 and Table S1 is presented in Figures S5-S8.</w:t>
       </w:r>
     </w:p>
     <w:p>
@@ -866,7 +866,19 @@
         <w:pStyle w:val="BodyText"/>
       </w:pPr>
       <w:r>
-        <w:t xml:space="preserve">Table S1 presents the bootstrapped median RMSE, ΔRMSE, SRCC and bias for calibration and test reefs, with 95% confidence intervals. Median bias was -0.01 [-0.02, -0.0] for calibration reefs and -0.01 [-0.03, 0.02] for test reefs. Since roughly as many reefs are overpredicted as underpredicted, this signed median is close to zero even though individual reefs can have a substantial bias in either direction; Table S1 therefore also reports the mean absolute bias (0.04 [0.03, 0.04] for calibration reefs and 0.04 [0.03, 0.05] for test reefs), which better reflects the magnitude of a typical reef’s directional error.</w:t>
+        <w:t xml:space="preserve">Table S2 presents the spatial and heat-stress correlation coefficients (SRCC) with respect to each reef’s performance metric. Positive spatial correlations both along and across the GBR indicate an increase in the performance metric southward and offshore, respectively. For heat-stress correlations, negative correlations indicate a decrease in the performance metrics with increasing DHW. Refer to the</w:t>
+      </w:r>
+      <w:r>
+        <w:t xml:space="preserve"> </w:t>
+      </w:r>
+      <w:r>
+        <w:t xml:space="preserve">“Model calibration and testing”</w:t>
+      </w:r>
+      <w:r>
+        <w:t xml:space="preserve"> </w:t>
+      </w:r>
+      <w:r>
+        <w:t xml:space="preserve">section of the Materials and Methods for further details on how these correlation metrics were calculated.</w:t>
       </w:r>
     </w:p>
     <w:p>
@@ -874,26 +886,6 @@
         <w:pStyle w:val="BodyText"/>
       </w:pPr>
       <w:r>
-        <w:t xml:space="preserve">Table S2 presents the spatial and heat-stress correlation coefficients (SRCC) with respect to each reef’s performance metric. Positive spatial correlations both along and across the GBR indicate an increase in the performance metric southward and offshore, respectively. For heat-stress correlations, negative correlations indicate a decrease in the performance metrics with increasing DHW. Refer to the</w:t>
-      </w:r>
-      <w:r>
-        <w:t xml:space="preserve"> </w:t>
-      </w:r>
-      <w:r>
-        <w:t xml:space="preserve">“Model calibration and testing”</w:t>
-      </w:r>
-      <w:r>
-        <w:t xml:space="preserve"> </w:t>
-      </w:r>
-      <w:r>
-        <w:t xml:space="preserve">section of the Materials and Methods for further details on how these correlation metrics were calculated.</w:t>
-      </w:r>
-    </w:p>
-    <w:p>
-      <w:pPr>
-        <w:pStyle w:val="BodyText"/>
-      </w:pPr>
-      <w:r>
         <w:t xml:space="preserve">Figures 3 and 4 present the mean relative cover from 2008 to 2022 across each</w:t>
       </w:r>
       <w:r>
@@ -926,7 +918,7 @@
         <w:t xml:space="preserve"> </w:t>
       </w:r>
       <w:r>
-        <w:t xml:space="preserve">is also indicated.</w:t>
+        <w:t xml:space="preserve">is also indicated. Unlike the other performance metrics reported in this study, these reef-group-level trends are not assessed via bootstrap resampling since most reef groups have too few reefs for meaningful resampling (as few as two reefs in some test reef groups). The shaded intervals in these figures show the 2.5th-97.5th percentile range of cover across the reefs within each group.</w:t>
       </w:r>
     </w:p>
     <w:p>
@@ -1146,7 +1138,7 @@
           <wp:inline>
             <wp:extent cx="5400000" cy="4985228"/>
             <wp:effectExtent b="0" l="0" r="0" t="0"/>
-            <wp:docPr descr="Figure 3. Observed versus modelled relative coral cover for calibration reefs aggregated by reef group. Shaded intervals show confidence intervals." title="" id="19" name="Picture"/>
+            <wp:docPr descr="Figure 3. Observed versus modelled relative coral cover for calibration reefs aggregated by reef group. Shaded intervals show the 2.5th-97.5th percentile range of cover across reefs within each group." title="" id="19" name="Picture"/>
             <a:graphic>
               <a:graphicData uri="http://schemas.openxmlformats.org/drawingml/2006/picture">
                 <pic:pic>
@@ -1199,7 +1191,7 @@
         <w:t xml:space="preserve"> </w:t>
       </w:r>
       <w:r>
-        <w:t xml:space="preserve">Shaded intervals show confidence intervals.</w:t>
+        <w:t xml:space="preserve">Shaded intervals show the 2.5th-97.5th percentile range of cover across reefs within each group.</w:t>
       </w:r>
     </w:p>
     <w:p>
@@ -1211,7 +1203,7 @@
           <wp:inline>
             <wp:extent cx="5394960" cy="4980576"/>
             <wp:effectExtent b="0" l="0" r="0" t="0"/>
-            <wp:docPr descr="Figure 4. Observed versus modelled relative coral cover for test reefs aggregated by reef group. Shaded intervals show confidence intervals." title="" id="22" name="Picture"/>
+            <wp:docPr descr="Figure 4. Observed versus modelled relative coral cover for test reefs aggregated by reef group. Shaded intervals show the 2.5th-97.5th percentile range of cover across reefs within each group." title="" id="22" name="Picture"/>
             <a:graphic>
               <a:graphicData uri="http://schemas.openxmlformats.org/drawingml/2006/picture">
                 <pic:pic>
@@ -1264,7 +1256,7 @@
         <w:t xml:space="preserve"> </w:t>
       </w:r>
       <w:r>
-        <w:t xml:space="preserve">Shaded intervals show confidence intervals.</w:t>
+        <w:t xml:space="preserve">Shaded intervals show the 2.5th-97.5th percentile range of cover across reefs within each group.</w:t>
       </w:r>
     </w:p>
     <w:p>
@@ -1636,7 +1628,7 @@
         <w:pStyle w:val="FirstParagraph"/>
       </w:pPr>
       <w:r>
-        <w:t xml:space="preserve">CoralBlox provides a computationally efficient modelling capability to support rapid screening of potential management approaches. By explicitly representing key ecological processes within a simplified but credible framework, CoralBlox enables stakeholders and reef managers to iteratively explore management options and quickly identify robust strategies under deep uncertainty. CoralBlox balances the need for credible representations of ecological interactions (at reef-regional scales) and computational efficiency to provide timely, actionable insight. This is reflected in the bias metrics reported in Table S1: CoralBlox is intended to give a good indication of regional coral cover dynamics rather than to precisely predict any individual reef’s trajectory, so the near-zero signed median bias is relevant at the regional scale, while the larger mean absolute bias reflects the expected margin of error at the individual reef scale.</w:t>
+        <w:t xml:space="preserve">CoralBlox provides a computationally efficient modelling capability to support rapid screening of potential management approaches. By explicitly representing key ecological processes within a simplified but credible framework, CoralBlox enables stakeholders and reef managers to iteratively explore management options and quickly identify robust strategies under deep uncertainty. CoralBlox balances the need for credible representations of ecological interactions (at reef-regional scales) and computational efficiency to provide timely, actionable insight. This is reflected in the bias metrics reported in Table S1: CoralBlox is intended to give a good indication of regional coral cover dynamics rather than to precisely predict any individual reef’s trajectory, so the near-zero signed median bias is relevant at the regional scale, while the larger median absolute bias reflects the expected margin of error at the individual reef scale.</w:t>
       </w:r>
     </w:p>
     <w:p>
@@ -25229,7 +25221,7 @@
     </w:p>
     <w:bookmarkEnd w:id="208"/>
     <w:bookmarkEnd w:id="209"/>
-    <w:bookmarkStart w:id="237" w:name="supplementary-materials"/>
+    <w:bookmarkStart w:id="250" w:name="supplementary-materials"/>
     <w:p>
       <w:pPr>
         <w:pStyle w:val="Heading1"/>
@@ -25491,7 +25483,7 @@
               <w:jc w:val="left"/>
             </w:pPr>
             <w:r>
-              <w:t xml:space="preserve">Mean |Bias|</w:t>
+              <w:t xml:space="preserve">|Bias|</w:t>
             </w:r>
           </w:p>
         </w:tc>
@@ -25503,7 +25495,7 @@
               <w:jc w:val="left"/>
             </w:pPr>
             <w:r>
-              <w:t xml:space="preserve">0.04 [0.03, 0.04]</w:t>
+              <w:t xml:space="preserve">0.03 [0.02, 0.04]</w:t>
             </w:r>
           </w:p>
         </w:tc>
@@ -25515,7 +25507,7 @@
               <w:jc w:val="left"/>
             </w:pPr>
             <w:r>
-              <w:t xml:space="preserve">0.04 [0.03, 0.05]</w:t>
+              <w:t xml:space="preserve">0.03 [0.02, 0.06]</w:t>
             </w:r>
           </w:p>
         </w:tc>
@@ -46526,7 +46518,261 @@
       </w:r>
     </w:p>
     <w:bookmarkEnd w:id="236"/>
-    <w:bookmarkEnd w:id="237"/>
+    <w:bookmarkStart w:id="249" w:name="per-reef-performance-metrics"/>
+    <w:p>
+      <w:pPr>
+        <w:pStyle w:val="Heading2"/>
+      </w:pPr>
+      <w:r>
+        <w:t xml:space="preserve">7.7 Per-reef performance metrics</w:t>
+      </w:r>
+    </w:p>
+    <w:p>
+      <w:pPr>
+        <w:pStyle w:val="FirstParagraph"/>
+      </w:pPr>
+      <w:r>
+        <w:t xml:space="preserve">Figures S5-S8 show the full per-reef distributions underlying the aggregate values reported in Table S1: bootstrapped ΔRMSE and SRCC, each with its own 95% confidence interval, for every calibration and test reef, sorted by value. Values and confidence intervals for reefs with 5 or more observed years were computed using a block bootstrap, and for reefs with 4 observed years using an iid bootstrap. We also show the aggregate bootstrapped median with its own 95% confidence interval.</w:t>
+      </w:r>
+    </w:p>
+    <w:p>
+      <w:pPr>
+        <w:pStyle w:val="CaptionedFigure"/>
+      </w:pPr>
+      <w:r>
+        <w:drawing>
+          <wp:inline>
+            <wp:extent cx="5731510" cy="4298632"/>
+            <wp:effectExtent b="0" l="0" r="0" t="0"/>
+            <wp:docPr descr="Figure S5. Bootstrapped ΔRMSE (benchmark − model RMSE) for each calibration reef." title="" id="238" name="Picture"/>
+            <a:graphic>
+              <a:graphicData uri="http://schemas.openxmlformats.org/drawingml/2006/picture">
+                <pic:pic>
+                  <pic:nvPicPr>
+                    <pic:cNvPr descr="../figures/S05_rmse_diff_calibration.png" id="239" name="Picture"/>
+                    <pic:cNvPicPr>
+                      <a:picLocks noChangeArrowheads="1" noChangeAspect="1"/>
+                    </pic:cNvPicPr>
+                  </pic:nvPicPr>
+                  <pic:blipFill>
+                    <a:blip r:embed="rId237"/>
+                    <a:stretch>
+                      <a:fillRect/>
+                    </a:stretch>
+                  </pic:blipFill>
+                  <pic:spPr bwMode="auto">
+                    <a:xfrm>
+                      <a:off x="0" y="0"/>
+                      <a:ext cx="5731510" cy="4298632"/>
+                    </a:xfrm>
+                    <a:prstGeom prst="rect">
+                      <a:avLst/>
+                    </a:prstGeom>
+                    <a:noFill/>
+                    <a:ln w="9525">
+                      <a:noFill/>
+                      <a:headEnd/>
+                      <a:tailEnd/>
+                    </a:ln>
+                  </pic:spPr>
+                </pic:pic>
+              </a:graphicData>
+            </a:graphic>
+          </wp:inline>
+        </w:drawing>
+      </w:r>
+    </w:p>
+    <w:p>
+      <w:pPr>
+        <w:pStyle w:val="ImageCaption"/>
+      </w:pPr>
+      <w:r>
+        <w:rPr>
+          <w:b/>
+          <w:bCs/>
+        </w:rPr>
+        <w:t xml:space="preserve">Figure S5. Bootstrapped ΔRMSE (benchmark − model RMSE) for each calibration reef.</w:t>
+      </w:r>
+    </w:p>
+    <w:p>
+      <w:pPr>
+        <w:pStyle w:val="CaptionedFigure"/>
+      </w:pPr>
+      <w:r>
+        <w:drawing>
+          <wp:inline>
+            <wp:extent cx="5731510" cy="4298632"/>
+            <wp:effectExtent b="0" l="0" r="0" t="0"/>
+            <wp:docPr descr="Figure S6. Bootstrapped ΔRMSE (benchmark − model RMSE) for each test reef." title="" id="241" name="Picture"/>
+            <a:graphic>
+              <a:graphicData uri="http://schemas.openxmlformats.org/drawingml/2006/picture">
+                <pic:pic>
+                  <pic:nvPicPr>
+                    <pic:cNvPr descr="../figures/S06_rmse_diff_test.png" id="242" name="Picture"/>
+                    <pic:cNvPicPr>
+                      <a:picLocks noChangeArrowheads="1" noChangeAspect="1"/>
+                    </pic:cNvPicPr>
+                  </pic:nvPicPr>
+                  <pic:blipFill>
+                    <a:blip r:embed="rId240"/>
+                    <a:stretch>
+                      <a:fillRect/>
+                    </a:stretch>
+                  </pic:blipFill>
+                  <pic:spPr bwMode="auto">
+                    <a:xfrm>
+                      <a:off x="0" y="0"/>
+                      <a:ext cx="5731510" cy="4298632"/>
+                    </a:xfrm>
+                    <a:prstGeom prst="rect">
+                      <a:avLst/>
+                    </a:prstGeom>
+                    <a:noFill/>
+                    <a:ln w="9525">
+                      <a:noFill/>
+                      <a:headEnd/>
+                      <a:tailEnd/>
+                    </a:ln>
+                  </pic:spPr>
+                </pic:pic>
+              </a:graphicData>
+            </a:graphic>
+          </wp:inline>
+        </w:drawing>
+      </w:r>
+    </w:p>
+    <w:p>
+      <w:pPr>
+        <w:pStyle w:val="ImageCaption"/>
+      </w:pPr>
+      <w:r>
+        <w:rPr>
+          <w:b/>
+          <w:bCs/>
+        </w:rPr>
+        <w:t xml:space="preserve">Figure S6. Bootstrapped ΔRMSE (benchmark − model RMSE) for each test reef.</w:t>
+      </w:r>
+    </w:p>
+    <w:p>
+      <w:pPr>
+        <w:pStyle w:val="CaptionedFigure"/>
+      </w:pPr>
+      <w:r>
+        <w:drawing>
+          <wp:inline>
+            <wp:extent cx="5731510" cy="4298632"/>
+            <wp:effectExtent b="0" l="0" r="0" t="0"/>
+            <wp:docPr descr="Figure S7. Bootstrapped SRCC for each calibration reef." title="" id="244" name="Picture"/>
+            <a:graphic>
+              <a:graphicData uri="http://schemas.openxmlformats.org/drawingml/2006/picture">
+                <pic:pic>
+                  <pic:nvPicPr>
+                    <pic:cNvPr descr="../figures/S07_srcc_calibration.png" id="245" name="Picture"/>
+                    <pic:cNvPicPr>
+                      <a:picLocks noChangeArrowheads="1" noChangeAspect="1"/>
+                    </pic:cNvPicPr>
+                  </pic:nvPicPr>
+                  <pic:blipFill>
+                    <a:blip r:embed="rId243"/>
+                    <a:stretch>
+                      <a:fillRect/>
+                    </a:stretch>
+                  </pic:blipFill>
+                  <pic:spPr bwMode="auto">
+                    <a:xfrm>
+                      <a:off x="0" y="0"/>
+                      <a:ext cx="5731510" cy="4298632"/>
+                    </a:xfrm>
+                    <a:prstGeom prst="rect">
+                      <a:avLst/>
+                    </a:prstGeom>
+                    <a:noFill/>
+                    <a:ln w="9525">
+                      <a:noFill/>
+                      <a:headEnd/>
+                      <a:tailEnd/>
+                    </a:ln>
+                  </pic:spPr>
+                </pic:pic>
+              </a:graphicData>
+            </a:graphic>
+          </wp:inline>
+        </w:drawing>
+      </w:r>
+    </w:p>
+    <w:p>
+      <w:pPr>
+        <w:pStyle w:val="ImageCaption"/>
+      </w:pPr>
+      <w:r>
+        <w:rPr>
+          <w:b/>
+          <w:bCs/>
+        </w:rPr>
+        <w:t xml:space="preserve">Figure S7. Bootstrapped SRCC for each calibration reef.</w:t>
+      </w:r>
+    </w:p>
+    <w:p>
+      <w:pPr>
+        <w:pStyle w:val="CaptionedFigure"/>
+      </w:pPr>
+      <w:r>
+        <w:drawing>
+          <wp:inline>
+            <wp:extent cx="5731510" cy="4298632"/>
+            <wp:effectExtent b="0" l="0" r="0" t="0"/>
+            <wp:docPr descr="Figure S8. Bootstrapped SRCC for each test reef." title="" id="247" name="Picture"/>
+            <a:graphic>
+              <a:graphicData uri="http://schemas.openxmlformats.org/drawingml/2006/picture">
+                <pic:pic>
+                  <pic:nvPicPr>
+                    <pic:cNvPr descr="../figures/S08_srcc_test.png" id="248" name="Picture"/>
+                    <pic:cNvPicPr>
+                      <a:picLocks noChangeArrowheads="1" noChangeAspect="1"/>
+                    </pic:cNvPicPr>
+                  </pic:nvPicPr>
+                  <pic:blipFill>
+                    <a:blip r:embed="rId246"/>
+                    <a:stretch>
+                      <a:fillRect/>
+                    </a:stretch>
+                  </pic:blipFill>
+                  <pic:spPr bwMode="auto">
+                    <a:xfrm>
+                      <a:off x="0" y="0"/>
+                      <a:ext cx="5731510" cy="4298632"/>
+                    </a:xfrm>
+                    <a:prstGeom prst="rect">
+                      <a:avLst/>
+                    </a:prstGeom>
+                    <a:noFill/>
+                    <a:ln w="9525">
+                      <a:noFill/>
+                      <a:headEnd/>
+                      <a:tailEnd/>
+                    </a:ln>
+                  </pic:spPr>
+                </pic:pic>
+              </a:graphicData>
+            </a:graphic>
+          </wp:inline>
+        </w:drawing>
+      </w:r>
+    </w:p>
+    <w:p>
+      <w:pPr>
+        <w:pStyle w:val="ImageCaption"/>
+      </w:pPr>
+      <w:r>
+        <w:rPr>
+          <w:b/>
+          <w:bCs/>
+        </w:rPr>
+        <w:t xml:space="preserve">Figure S8. Bootstrapped SRCC for each test reef.</w:t>
+      </w:r>
+    </w:p>
+    <w:bookmarkEnd w:id="249"/>
+    <w:bookmarkEnd w:id="250"/>
     <w:sectPr>
       <w:footnotePr>
         <w:numRestart w:val="eachSect"/>

</xml_diff>

<commit_message>
Add AI usage declarations to Methods and Acknowledgements
Declares AI-assisted code writing (model, calibration, analysis) in
Materials and Methods, and AI-assisted manuscript drafting/figure
generation in Acknowledgements, per Science Advances' AI usage policy.

Co-Authored-By: Claude Sonnet 5 <noreply@anthropic.com>
</commit_message>
<xml_diff>
--- a/paper/paper.docx
+++ b/paper/paper.docx
@@ -17641,6 +17641,14 @@
         <w:t xml:space="preserve">. For the heat-stress correlations, we calculated the SRCC between each reefs’ performance metric and the maximum cumulative thermal exposure, measured in DHW.</w:t>
       </w:r>
     </w:p>
+    <w:p>
+      <w:pPr>
+        <w:pStyle w:val="BodyText"/>
+      </w:pPr>
+      <w:r>
+        <w:t xml:space="preserve">AI-assisted tools (Claude Sonnet 5 and Claude Opus 5, Anthropic) were used during the development of this study to write and refine code for the CoralBlox and ADRIA model implementations, the calibration pipeline, and the analysis scripts used to compute the performance metrics reported here (ΔRMSE, SRCC, bias, and their bootstrapped confidence intervals). All AI-assisted code was reviewed, tested, and validated by the authors against the model formulation described above prior to use.</w:t>
+      </w:r>
+    </w:p>
     <w:bookmarkEnd w:id="44"/>
     <w:bookmarkEnd w:id="45"/>
     <w:bookmarkStart w:id="200" w:name="references"/>
@@ -24964,7 +24972,7 @@
     <w:bookmarkEnd w:id="198"/>
     <w:bookmarkEnd w:id="199"/>
     <w:bookmarkEnd w:id="200"/>
-    <w:bookmarkStart w:id="209" w:name="acknowledgements"/>
+    <w:bookmarkStart w:id="210" w:name="acknowledgements"/>
     <w:p>
       <w:pPr>
         <w:pStyle w:val="Heading1"/>
@@ -25220,23 +25228,13 @@
       </w:r>
     </w:p>
     <w:bookmarkEnd w:id="208"/>
-    <w:bookmarkEnd w:id="209"/>
-    <w:bookmarkStart w:id="250" w:name="supplementary-materials"/>
-    <w:p>
-      <w:pPr>
-        <w:pStyle w:val="Heading1"/>
-      </w:pPr>
-      <w:r>
-        <w:t xml:space="preserve">7. Supplementary Materials</w:t>
-      </w:r>
-    </w:p>
-    <w:bookmarkStart w:id="210" w:name="parameter-values"/>
+    <w:bookmarkStart w:id="209" w:name="ai-usage"/>
     <w:p>
       <w:pPr>
         <w:pStyle w:val="Heading2"/>
       </w:pPr>
       <w:r>
-        <w:t xml:space="preserve">7.1 Parameter values</w:t>
+        <w:t xml:space="preserve">6.5 AI Usage</w:t>
       </w:r>
     </w:p>
     <w:p>
@@ -25244,6 +25242,34 @@
         <w:pStyle w:val="FirstParagraph"/>
       </w:pPr>
       <w:r>
+        <w:t xml:space="preserve">We acknowledge the use of AI-assisted tools (Claude Sonnet 5 and Claude Opus 5, Anthropic) in preparing this manuscript: drafting and revising portions of the text, generating the Quarto code used to render the manuscript and its figures, and producing the plots and performance metrics presented in the Results and Supplementary Materials. All AI-assisted content was reviewed and verified by the authors.</w:t>
+      </w:r>
+    </w:p>
+    <w:bookmarkEnd w:id="209"/>
+    <w:bookmarkEnd w:id="210"/>
+    <w:bookmarkStart w:id="251" w:name="supplementary-materials"/>
+    <w:p>
+      <w:pPr>
+        <w:pStyle w:val="Heading1"/>
+      </w:pPr>
+      <w:r>
+        <w:t xml:space="preserve">7. Supplementary Materials</w:t>
+      </w:r>
+    </w:p>
+    <w:bookmarkStart w:id="211" w:name="parameter-values"/>
+    <w:p>
+      <w:pPr>
+        <w:pStyle w:val="Heading2"/>
+      </w:pPr>
+      <w:r>
+        <w:t xml:space="preserve">7.1 Parameter values</w:t>
+      </w:r>
+    </w:p>
+    <w:p>
+      <w:pPr>
+        <w:pStyle w:val="FirstParagraph"/>
+      </w:pPr>
+      <w:r>
         <w:rPr>
           <w:b/>
           <w:bCs/>
@@ -25251,8 +25277,8 @@
         <w:t xml:space="preserve">Heritability = 0.3</w:t>
       </w:r>
     </w:p>
-    <w:bookmarkEnd w:id="210"/>
-    <w:bookmarkStart w:id="211" w:name="tables"/>
+    <w:bookmarkEnd w:id="211"/>
+    <w:bookmarkStart w:id="212" w:name="tables"/>
     <w:p>
       <w:pPr>
         <w:pStyle w:val="Heading2"/>
@@ -32198,8 +32224,8 @@
         </w:tc>
       </w:tr>
     </w:tbl>
-    <w:bookmarkEnd w:id="211"/>
-    <w:bookmarkStart w:id="212" w:name="coral-block-movement"/>
+    <w:bookmarkEnd w:id="212"/>
+    <w:bookmarkStart w:id="213" w:name="coral-block-movement"/>
     <w:p>
       <w:pPr>
         <w:pStyle w:val="Heading2"/>
@@ -37909,8 +37935,8 @@
         </w:tc>
       </w:tr>
     </w:tbl>
-    <w:bookmarkEnd w:id="212"/>
-    <w:bookmarkStart w:id="218" w:name="coral-growth-and-mortality"/>
+    <w:bookmarkEnd w:id="213"/>
+    <w:bookmarkStart w:id="219" w:name="coral-growth-and-mortality"/>
     <w:p>
       <w:pPr>
         <w:pStyle w:val="Heading2"/>
@@ -37983,7 +38009,7 @@
         <w:t xml:space="preserve">and are rescaled by the coral growth and the spatial competition coefficients, as per Eq. (7). This section presents details on these two coefficients calculations.</w:t>
       </w:r>
     </w:p>
-    <w:bookmarkStart w:id="213" w:name="low-cover-growth-acceleration"/>
+    <w:bookmarkStart w:id="214" w:name="low-cover-growth-acceleration"/>
     <w:p>
       <w:pPr>
         <w:pStyle w:val="Heading3"/>
@@ -38442,8 +38468,8 @@
         <w:t xml:space="preserve">.</w:t>
       </w:r>
     </w:p>
-    <w:bookmarkEnd w:id="213"/>
-    <w:bookmarkStart w:id="214" w:name="coral-growth-and-spatial-competition"/>
+    <w:bookmarkEnd w:id="214"/>
+    <w:bookmarkStart w:id="215" w:name="coral-growth-and-spatial-competition"/>
     <w:p>
       <w:pPr>
         <w:pStyle w:val="Heading3"/>
@@ -39448,8 +39474,8 @@
         <w:t xml:space="preserve">.</w:t>
       </w:r>
     </w:p>
-    <w:bookmarkEnd w:id="214"/>
-    <w:bookmarkStart w:id="215" w:name="projected-cover"/>
+    <w:bookmarkEnd w:id="215"/>
+    <w:bookmarkStart w:id="216" w:name="projected-cover"/>
     <w:p>
       <w:pPr>
         <w:pStyle w:val="Heading3"/>
@@ -40079,8 +40105,8 @@
         </w:tc>
       </w:tr>
     </w:tbl>
-    <w:bookmarkEnd w:id="215"/>
-    <w:bookmarkStart w:id="216" w:name="adjusted-projected-cover"/>
+    <w:bookmarkEnd w:id="216"/>
+    <w:bookmarkStart w:id="217" w:name="adjusted-projected-cover"/>
     <w:p>
       <w:pPr>
         <w:pStyle w:val="Heading3"/>
@@ -41818,8 +41844,8 @@
         <w:t xml:space="preserve">, which means the adjusted projected cover will never outgrow the habitable area.</w:t>
       </w:r>
     </w:p>
-    <w:bookmarkEnd w:id="216"/>
-    <w:bookmarkStart w:id="217" w:name="spatial-competition-coefficient"/>
+    <w:bookmarkEnd w:id="217"/>
+    <w:bookmarkStart w:id="218" w:name="spatial-competition-coefficient"/>
     <w:p>
       <w:pPr>
         <w:pStyle w:val="Heading3"/>
@@ -43190,9 +43216,9 @@
         </w:tc>
       </w:tr>
     </w:tbl>
-    <w:bookmarkEnd w:id="217"/>
     <w:bookmarkEnd w:id="218"/>
-    <w:bookmarkStart w:id="232" w:name="model-calibration-and-testing-1"/>
+    <w:bookmarkEnd w:id="219"/>
+    <w:bookmarkStart w:id="233" w:name="model-calibration-and-testing-1"/>
     <w:p>
       <w:pPr>
         <w:pStyle w:val="Heading2"/>
@@ -43227,7 +43253,7 @@
         <w:t xml:space="preserve">. The parameter bound settings, data split and objective function are described in more detail in the following sections</w:t>
       </w:r>
     </w:p>
-    <w:bookmarkStart w:id="222" w:name="data-split-and-reef-groups"/>
+    <w:bookmarkStart w:id="223" w:name="data-split-and-reef-groups"/>
     <w:p>
       <w:pPr>
         <w:pStyle w:val="Heading3"/>
@@ -43270,18 +43296,18 @@
           <wp:inline>
             <wp:extent cx="3493698" cy="4425642"/>
             <wp:effectExtent b="0" l="0" r="0" t="0"/>
-            <wp:docPr descr="A map of the country AI-generated content may be incorrect." title="" id="220" name="Picture"/>
+            <wp:docPr descr="A map of the country AI-generated content may be incorrect." title="" id="221" name="Picture"/>
             <a:graphic>
               <a:graphicData uri="http://schemas.openxmlformats.org/drawingml/2006/picture">
                 <pic:pic>
                   <pic:nvPicPr>
-                    <pic:cNvPr descr="media/image7.png" id="221" name="Picture"/>
+                    <pic:cNvPr descr="media/image7.png" id="222" name="Picture"/>
                     <pic:cNvPicPr>
                       <a:picLocks noChangeArrowheads="1" noChangeAspect="1"/>
                     </pic:cNvPicPr>
                   </pic:nvPicPr>
                   <pic:blipFill>
-                    <a:blip r:embed="rId219"/>
+                    <a:blip r:embed="rId220"/>
                     <a:stretch>
                       <a:fillRect/>
                     </a:stretch>
@@ -43320,8 +43346,8 @@
         <w:t xml:space="preserve">Figure S1. Each of the 12 reef groups used in the calibration.</w:t>
       </w:r>
     </w:p>
-    <w:bookmarkEnd w:id="222"/>
-    <w:bookmarkStart w:id="223" w:name="objective-function"/>
+    <w:bookmarkEnd w:id="223"/>
+    <w:bookmarkStart w:id="224" w:name="objective-function"/>
     <w:p>
       <w:pPr>
         <w:pStyle w:val="Heading3"/>
@@ -45203,8 +45229,8 @@
         <w:t xml:space="preserve">Candidate parameter sets that violate parameter-bound constraints or produce an invalid model run (e.g. a negative recruitment scale factor) are assigned a large fixed penalty instead of being scored by the equations above.</w:t>
       </w:r>
     </w:p>
-    <w:bookmarkEnd w:id="223"/>
-    <w:bookmarkStart w:id="227" w:name="disturbances-datasets"/>
+    <w:bookmarkEnd w:id="224"/>
+    <w:bookmarkStart w:id="228" w:name="disturbances-datasets"/>
     <w:p>
       <w:pPr>
         <w:pStyle w:val="Heading3"/>
@@ -45264,18 +45290,18 @@
           <wp:inline>
             <wp:extent cx="5731510" cy="4298632"/>
             <wp:effectExtent b="0" l="0" r="0" t="0"/>
-            <wp:docPr descr="Figure S2. Degree heating weeks (DHW) trajectories for each reef group along the GBR. Individual lines correspond to values at individual reefs within a reef group." title="" id="225" name="Picture"/>
+            <wp:docPr descr="Figure S2. Degree heating weeks (DHW) trajectories for each reef group along the GBR. Individual lines correspond to values at individual reefs within a reef group." title="" id="226" name="Picture"/>
             <a:graphic>
               <a:graphicData uri="http://schemas.openxmlformats.org/drawingml/2006/picture">
                 <pic:pic>
                   <pic:nvPicPr>
-                    <pic:cNvPr descr="../figures/S02_dhw_per_reef_group.png" id="226" name="Picture"/>
+                    <pic:cNvPr descr="../figures/S02_dhw_per_reef_group.png" id="227" name="Picture"/>
                     <pic:cNvPicPr>
                       <a:picLocks noChangeArrowheads="1" noChangeAspect="1"/>
                     </pic:cNvPicPr>
                   </pic:nvPicPr>
                   <pic:blipFill>
-                    <a:blip r:embed="rId224"/>
+                    <a:blip r:embed="rId225"/>
                     <a:stretch>
                       <a:fillRect/>
                     </a:stretch>
@@ -45320,8 +45346,8 @@
         <w:t xml:space="preserve">Individual lines correspond to values at individual reefs within a reef group.</w:t>
       </w:r>
     </w:p>
-    <w:bookmarkEnd w:id="227"/>
-    <w:bookmarkStart w:id="231" w:name="depth-attenuation-of-dhw"/>
+    <w:bookmarkEnd w:id="228"/>
+    <w:bookmarkStart w:id="232" w:name="depth-attenuation-of-dhw"/>
     <w:p>
       <w:pPr>
         <w:pStyle w:val="Heading3"/>
@@ -45401,18 +45427,18 @@
           <wp:inline>
             <wp:extent cx="5731510" cy="4298632"/>
             <wp:effectExtent b="0" l="0" r="0" t="0"/>
-            <wp:docPr descr="Figure S3. Effective DHW as a function of surface DHW, at four representative depths, using the calibrated \eta^{\textbf{base}} and \eta^{\textbf{mix}} values. The dotted line shows the 1:1 reference (no attenuation, i.e. surface conditions)." title="" id="229" name="Picture"/>
+            <wp:docPr descr="Figure S3. Effective DHW as a function of surface DHW, at four representative depths, using the calibrated \eta^{\textbf{base}} and \eta^{\textbf{mix}} values. The dotted line shows the 1:1 reference (no attenuation, i.e. surface conditions)." title="" id="230" name="Picture"/>
             <a:graphic>
               <a:graphicData uri="http://schemas.openxmlformats.org/drawingml/2006/picture">
                 <pic:pic>
                   <pic:nvPicPr>
-                    <pic:cNvPr descr="../figures/S03_effective_dhw_depth_attenuation.png" id="230" name="Picture"/>
+                    <pic:cNvPr descr="../figures/S03_effective_dhw_depth_attenuation.png" id="231" name="Picture"/>
                     <pic:cNvPicPr>
                       <a:picLocks noChangeArrowheads="1" noChangeAspect="1"/>
                     </pic:cNvPicPr>
                   </pic:nvPicPr>
                   <pic:blipFill>
-                    <a:blip r:embed="rId228"/>
+                    <a:blip r:embed="rId229"/>
                     <a:stretch>
                       <a:fillRect/>
                     </a:stretch>
@@ -45535,9 +45561,9 @@
         <w:t xml:space="preserve">The dotted line shows the 1:1 reference (no attenuation, i.e. surface conditions).</w:t>
       </w:r>
     </w:p>
-    <w:bookmarkEnd w:id="231"/>
     <w:bookmarkEnd w:id="232"/>
-    <w:bookmarkStart w:id="236" w:name="convergence-analysis"/>
+    <w:bookmarkEnd w:id="233"/>
+    <w:bookmarkStart w:id="237" w:name="convergence-analysis"/>
     <w:p>
       <w:pPr>
         <w:pStyle w:val="Heading2"/>
@@ -45555,18 +45581,18 @@
           <wp:inline>
             <wp:extent cx="5731510" cy="5731510"/>
             <wp:effectExtent b="0" l="0" r="0" t="0"/>
-            <wp:docPr descr="Figure S4. Convergence analysis for each DHW range and metric." title="" id="234" name="Picture"/>
+            <wp:docPr descr="Figure S4. Convergence analysis for each DHW range and metric." title="" id="235" name="Picture"/>
             <a:graphic>
               <a:graphicData uri="http://schemas.openxmlformats.org/drawingml/2006/picture">
                 <pic:pic>
                   <pic:nvPicPr>
-                    <pic:cNvPr descr="media/image9.png" id="235" name="Picture"/>
+                    <pic:cNvPr descr="media/image9.png" id="236" name="Picture"/>
                     <pic:cNvPicPr>
                       <a:picLocks noChangeArrowheads="1" noChangeAspect="1"/>
                     </pic:cNvPicPr>
                   </pic:nvPicPr>
                   <pic:blipFill>
-                    <a:blip r:embed="rId233"/>
+                    <a:blip r:embed="rId234"/>
                     <a:stretch>
                       <a:fillRect/>
                     </a:stretch>
@@ -46517,8 +46543,8 @@
         <w:t xml:space="preserve">* - The last size class is assumed to have linear extension = 0.</w:t>
       </w:r>
     </w:p>
-    <w:bookmarkEnd w:id="236"/>
-    <w:bookmarkStart w:id="249" w:name="per-reef-performance-metrics"/>
+    <w:bookmarkEnd w:id="237"/>
+    <w:bookmarkStart w:id="250" w:name="per-reef-performance-metrics"/>
     <w:p>
       <w:pPr>
         <w:pStyle w:val="Heading2"/>
@@ -46544,18 +46570,18 @@
           <wp:inline>
             <wp:extent cx="5731510" cy="4298632"/>
             <wp:effectExtent b="0" l="0" r="0" t="0"/>
-            <wp:docPr descr="Figure S5. Bootstrapped ΔRMSE (benchmark − model RMSE) for each calibration reef." title="" id="238" name="Picture"/>
+            <wp:docPr descr="Figure S5. Bootstrapped ΔRMSE (benchmark − model RMSE) for each calibration reef." title="" id="239" name="Picture"/>
             <a:graphic>
               <a:graphicData uri="http://schemas.openxmlformats.org/drawingml/2006/picture">
                 <pic:pic>
                   <pic:nvPicPr>
-                    <pic:cNvPr descr="../figures/S05_rmse_diff_calibration.png" id="239" name="Picture"/>
+                    <pic:cNvPr descr="../figures/S05_rmse_diff_calibration.png" id="240" name="Picture"/>
                     <pic:cNvPicPr>
                       <a:picLocks noChangeArrowheads="1" noChangeAspect="1"/>
                     </pic:cNvPicPr>
                   </pic:nvPicPr>
                   <pic:blipFill>
-                    <a:blip r:embed="rId237"/>
+                    <a:blip r:embed="rId238"/>
                     <a:stretch>
                       <a:fillRect/>
                     </a:stretch>
@@ -46603,18 +46629,18 @@
           <wp:inline>
             <wp:extent cx="5731510" cy="4298632"/>
             <wp:effectExtent b="0" l="0" r="0" t="0"/>
-            <wp:docPr descr="Figure S6. Bootstrapped ΔRMSE (benchmark − model RMSE) for each test reef." title="" id="241" name="Picture"/>
+            <wp:docPr descr="Figure S6. Bootstrapped ΔRMSE (benchmark − model RMSE) for each test reef." title="" id="242" name="Picture"/>
             <a:graphic>
               <a:graphicData uri="http://schemas.openxmlformats.org/drawingml/2006/picture">
                 <pic:pic>
                   <pic:nvPicPr>
-                    <pic:cNvPr descr="../figures/S06_rmse_diff_test.png" id="242" name="Picture"/>
+                    <pic:cNvPr descr="../figures/S06_rmse_diff_test.png" id="243" name="Picture"/>
                     <pic:cNvPicPr>
                       <a:picLocks noChangeArrowheads="1" noChangeAspect="1"/>
                     </pic:cNvPicPr>
                   </pic:nvPicPr>
                   <pic:blipFill>
-                    <a:blip r:embed="rId240"/>
+                    <a:blip r:embed="rId241"/>
                     <a:stretch>
                       <a:fillRect/>
                     </a:stretch>
@@ -46662,18 +46688,18 @@
           <wp:inline>
             <wp:extent cx="5731510" cy="4298632"/>
             <wp:effectExtent b="0" l="0" r="0" t="0"/>
-            <wp:docPr descr="Figure S7. Bootstrapped SRCC for each calibration reef." title="" id="244" name="Picture"/>
+            <wp:docPr descr="Figure S7. Bootstrapped SRCC for each calibration reef." title="" id="245" name="Picture"/>
             <a:graphic>
               <a:graphicData uri="http://schemas.openxmlformats.org/drawingml/2006/picture">
                 <pic:pic>
                   <pic:nvPicPr>
-                    <pic:cNvPr descr="../figures/S07_srcc_calibration.png" id="245" name="Picture"/>
+                    <pic:cNvPr descr="../figures/S07_srcc_calibration.png" id="246" name="Picture"/>
                     <pic:cNvPicPr>
                       <a:picLocks noChangeArrowheads="1" noChangeAspect="1"/>
                     </pic:cNvPicPr>
                   </pic:nvPicPr>
                   <pic:blipFill>
-                    <a:blip r:embed="rId243"/>
+                    <a:blip r:embed="rId244"/>
                     <a:stretch>
                       <a:fillRect/>
                     </a:stretch>
@@ -46721,18 +46747,18 @@
           <wp:inline>
             <wp:extent cx="5731510" cy="4298632"/>
             <wp:effectExtent b="0" l="0" r="0" t="0"/>
-            <wp:docPr descr="Figure S8. Bootstrapped SRCC for each test reef." title="" id="247" name="Picture"/>
+            <wp:docPr descr="Figure S8. Bootstrapped SRCC for each test reef." title="" id="248" name="Picture"/>
             <a:graphic>
               <a:graphicData uri="http://schemas.openxmlformats.org/drawingml/2006/picture">
                 <pic:pic>
                   <pic:nvPicPr>
-                    <pic:cNvPr descr="../figures/S08_srcc_test.png" id="248" name="Picture"/>
+                    <pic:cNvPr descr="../figures/S08_srcc_test.png" id="249" name="Picture"/>
                     <pic:cNvPicPr>
                       <a:picLocks noChangeArrowheads="1" noChangeAspect="1"/>
                     </pic:cNvPicPr>
                   </pic:nvPicPr>
                   <pic:blipFill>
-                    <a:blip r:embed="rId246"/>
+                    <a:blip r:embed="rId247"/>
                     <a:stretch>
                       <a:fillRect/>
                     </a:stretch>
@@ -46771,8 +46797,8 @@
         <w:t xml:space="preserve">Figure S8. Bootstrapped SRCC for each test reef.</w:t>
       </w:r>
     </w:p>
-    <w:bookmarkEnd w:id="249"/>
     <w:bookmarkEnd w:id="250"/>
+    <w:bookmarkEnd w:id="251"/>
     <w:sectPr>
       <w:footnotePr>
         <w:numRestart w:val="eachSect"/>

</xml_diff>

<commit_message>
Add AI usage declarations and reproducible variable list
Adds AI usage declarations to Materials and Methods and Acknowledgements
per Science Advances' AI policy, fixes the fecundity exponent symbol
(b_g -> p_g) to avoid colliding with the coral block index b, and adds
a Quarto-generated variable_list.qmd/docx to replace the legacy manually
maintained variable list, cross-checked against actual manuscript usage
(coral cover vs. area, connectivity vs. transition matrix, mortality vs.
survival scale factor, dropped a dead Gamma entry).

Co-Authored-By: Claude Sonnet 5 <noreply@anthropic.com>
</commit_message>
<xml_diff>
--- a/paper/paper.docx
+++ b/paper/paper.docx
@@ -8045,7 +8045,7 @@
                         <m:sSub>
                           <m:e>
                             <m:r>
-                              <m:t>b</m:t>
+                              <m:t>p</m:t>
                             </m:r>
                           </m:e>
                           <m:sub>
@@ -8118,7 +8118,7 @@
         <m:sSub>
           <m:e>
             <m:r>
-              <m:t>b</m:t>
+              <m:t>p</m:t>
             </m:r>
           </m:e>
           <m:sub>

</xml_diff>

<commit_message>
Document ReefMod-GBR data source for model runs
</commit_message>
<xml_diff>
--- a/paper/paper.docx
+++ b/paper/paper.docx
@@ -24972,7 +24972,7 @@
     <w:bookmarkEnd w:id="198"/>
     <w:bookmarkEnd w:id="199"/>
     <w:bookmarkEnd w:id="200"/>
-    <w:bookmarkStart w:id="210" w:name="acknowledgements"/>
+    <w:bookmarkStart w:id="211" w:name="acknowledgements"/>
     <w:p>
       <w:pPr>
         <w:pStyle w:val="Heading1"/>
@@ -25115,7 +25115,7 @@
       </w:r>
     </w:p>
     <w:bookmarkEnd w:id="203"/>
-    <w:bookmarkStart w:id="208" w:name="data-and-materials-availability"/>
+    <w:bookmarkStart w:id="209" w:name="data-and-materials-availability"/>
     <w:p>
       <w:pPr>
         <w:pStyle w:val="Heading2"/>
@@ -25205,7 +25205,30 @@
         <w:pStyle w:val="BodyText"/>
       </w:pPr>
       <w:r>
-        <w:t xml:space="preserve">Mortality rates accounting for mortalities caused by cyclones and/or COTS that are used in the calibration were derived from the AIMS LTMP disturbance data.</w:t>
+        <w:t xml:space="preserve">To run the model, we used data from the ReefMod-GBR model</w:t>
+      </w:r>
+      <w:r>
+        <w:t xml:space="preserve"> </w:t>
+      </w:r>
+      <w:r>
+        <w:t xml:space="preserve">(35)</w:t>
+      </w:r>
+      <w:r>
+        <w:t xml:space="preserve">, freely and openly available at</w:t>
+      </w:r>
+      <w:r>
+        <w:t xml:space="preserve"> </w:t>
+      </w:r>
+      <w:hyperlink r:id="rId207">
+        <w:r>
+          <w:rPr>
+            <w:rStyle w:val="Hyperlink"/>
+          </w:rPr>
+          <w:t xml:space="preserve">https://github.com/ymbozec/REEFMOD.7.2_GBR</w:t>
+        </w:r>
+      </w:hyperlink>
+      <w:r>
+        <w:t xml:space="preserve">. This data is available upon request; please send enquiries to y.bozec@uq.edu.au. Further details are available in the calibration code repository referenced above.</w:t>
       </w:r>
     </w:p>
     <w:p>
@@ -25213,9 +25236,17 @@
         <w:pStyle w:val="BodyText"/>
       </w:pPr>
       <w:r>
+        <w:t xml:space="preserve">Mortality rates accounting for mortalities caused by cyclones and/or COTS that are used in the calibration were derived from the AIMS LTMP disturbance data.</w:t>
+      </w:r>
+    </w:p>
+    <w:p>
+      <w:pPr>
+        <w:pStyle w:val="BodyText"/>
+      </w:pPr>
+      <w:r>
         <w:t xml:space="preserve">Observed annual maximum degree heating weeks (DHWs) data was derived from daily DHWs provided by the NOAA CoralTempv3.1 product at (</w:t>
       </w:r>
-      <w:hyperlink r:id="rId207">
+      <w:hyperlink r:id="rId208">
         <w:r>
           <w:rPr>
             <w:rStyle w:val="Hyperlink"/>
@@ -25227,8 +25258,8 @@
         <w:t xml:space="preserve">). Annual values are based on 1 July from the year prior to 30 June.</w:t>
       </w:r>
     </w:p>
-    <w:bookmarkEnd w:id="208"/>
-    <w:bookmarkStart w:id="209" w:name="ai-usage"/>
+    <w:bookmarkEnd w:id="209"/>
+    <w:bookmarkStart w:id="210" w:name="ai-usage"/>
     <w:p>
       <w:pPr>
         <w:pStyle w:val="Heading2"/>
@@ -25245,9 +25276,9 @@
         <w:t xml:space="preserve">We acknowledge the use of AI-assisted tools (Claude Sonnet 5 and Claude Opus 5, Anthropic) in preparing this manuscript: drafting and revising portions of the text, generating the Quarto code used to render the manuscript and its figures, and producing the plots and performance metrics presented in the Results and Supplementary Materials. All AI-assisted content was reviewed and verified by the authors.</w:t>
       </w:r>
     </w:p>
-    <w:bookmarkEnd w:id="209"/>
     <w:bookmarkEnd w:id="210"/>
-    <w:bookmarkStart w:id="251" w:name="supplementary-materials"/>
+    <w:bookmarkEnd w:id="211"/>
+    <w:bookmarkStart w:id="252" w:name="supplementary-materials"/>
     <w:p>
       <w:pPr>
         <w:pStyle w:val="Heading1"/>
@@ -25256,7 +25287,7 @@
         <w:t xml:space="preserve">7. Supplementary Materials</w:t>
       </w:r>
     </w:p>
-    <w:bookmarkStart w:id="211" w:name="parameter-values"/>
+    <w:bookmarkStart w:id="212" w:name="parameter-values"/>
     <w:p>
       <w:pPr>
         <w:pStyle w:val="Heading2"/>
@@ -25277,8 +25308,8 @@
         <w:t xml:space="preserve">Heritability = 0.3</w:t>
       </w:r>
     </w:p>
-    <w:bookmarkEnd w:id="211"/>
-    <w:bookmarkStart w:id="212" w:name="tables"/>
+    <w:bookmarkEnd w:id="212"/>
+    <w:bookmarkStart w:id="213" w:name="tables"/>
     <w:p>
       <w:pPr>
         <w:pStyle w:val="Heading2"/>
@@ -32224,8 +32255,8 @@
         </w:tc>
       </w:tr>
     </w:tbl>
-    <w:bookmarkEnd w:id="212"/>
-    <w:bookmarkStart w:id="213" w:name="coral-block-movement"/>
+    <w:bookmarkEnd w:id="213"/>
+    <w:bookmarkStart w:id="214" w:name="coral-block-movement"/>
     <w:p>
       <w:pPr>
         <w:pStyle w:val="Heading2"/>
@@ -37935,8 +37966,8 @@
         </w:tc>
       </w:tr>
     </w:tbl>
-    <w:bookmarkEnd w:id="213"/>
-    <w:bookmarkStart w:id="219" w:name="coral-growth-and-mortality"/>
+    <w:bookmarkEnd w:id="214"/>
+    <w:bookmarkStart w:id="220" w:name="coral-growth-and-mortality"/>
     <w:p>
       <w:pPr>
         <w:pStyle w:val="Heading2"/>
@@ -38009,7 +38040,7 @@
         <w:t xml:space="preserve">and are rescaled by the coral growth and the spatial competition coefficients, as per Eq. (7). This section presents details on these two coefficients calculations.</w:t>
       </w:r>
     </w:p>
-    <w:bookmarkStart w:id="214" w:name="low-cover-growth-acceleration"/>
+    <w:bookmarkStart w:id="215" w:name="low-cover-growth-acceleration"/>
     <w:p>
       <w:pPr>
         <w:pStyle w:val="Heading3"/>
@@ -38468,8 +38499,8 @@
         <w:t xml:space="preserve">.</w:t>
       </w:r>
     </w:p>
-    <w:bookmarkEnd w:id="214"/>
-    <w:bookmarkStart w:id="215" w:name="coral-growth-and-spatial-competition"/>
+    <w:bookmarkEnd w:id="215"/>
+    <w:bookmarkStart w:id="216" w:name="coral-growth-and-spatial-competition"/>
     <w:p>
       <w:pPr>
         <w:pStyle w:val="Heading3"/>
@@ -39474,8 +39505,8 @@
         <w:t xml:space="preserve">.</w:t>
       </w:r>
     </w:p>
-    <w:bookmarkEnd w:id="215"/>
-    <w:bookmarkStart w:id="216" w:name="projected-cover"/>
+    <w:bookmarkEnd w:id="216"/>
+    <w:bookmarkStart w:id="217" w:name="projected-cover"/>
     <w:p>
       <w:pPr>
         <w:pStyle w:val="Heading3"/>
@@ -40105,8 +40136,8 @@
         </w:tc>
       </w:tr>
     </w:tbl>
-    <w:bookmarkEnd w:id="216"/>
-    <w:bookmarkStart w:id="217" w:name="adjusted-projected-cover"/>
+    <w:bookmarkEnd w:id="217"/>
+    <w:bookmarkStart w:id="218" w:name="adjusted-projected-cover"/>
     <w:p>
       <w:pPr>
         <w:pStyle w:val="Heading3"/>
@@ -41844,8 +41875,8 @@
         <w:t xml:space="preserve">, which means the adjusted projected cover will never outgrow the habitable area.</w:t>
       </w:r>
     </w:p>
-    <w:bookmarkEnd w:id="217"/>
-    <w:bookmarkStart w:id="218" w:name="spatial-competition-coefficient"/>
+    <w:bookmarkEnd w:id="218"/>
+    <w:bookmarkStart w:id="219" w:name="spatial-competition-coefficient"/>
     <w:p>
       <w:pPr>
         <w:pStyle w:val="Heading3"/>
@@ -43216,9 +43247,9 @@
         </w:tc>
       </w:tr>
     </w:tbl>
-    <w:bookmarkEnd w:id="218"/>
     <w:bookmarkEnd w:id="219"/>
-    <w:bookmarkStart w:id="233" w:name="model-calibration-and-testing-1"/>
+    <w:bookmarkEnd w:id="220"/>
+    <w:bookmarkStart w:id="234" w:name="model-calibration-and-testing-1"/>
     <w:p>
       <w:pPr>
         <w:pStyle w:val="Heading2"/>
@@ -43253,7 +43284,7 @@
         <w:t xml:space="preserve">. The parameter bound settings, data split and objective function are described in more detail in the following sections</w:t>
       </w:r>
     </w:p>
-    <w:bookmarkStart w:id="223" w:name="data-split-and-reef-groups"/>
+    <w:bookmarkStart w:id="224" w:name="data-split-and-reef-groups"/>
     <w:p>
       <w:pPr>
         <w:pStyle w:val="Heading3"/>
@@ -43296,18 +43327,18 @@
           <wp:inline>
             <wp:extent cx="3493698" cy="4425642"/>
             <wp:effectExtent b="0" l="0" r="0" t="0"/>
-            <wp:docPr descr="A map of the country AI-generated content may be incorrect." title="" id="221" name="Picture"/>
+            <wp:docPr descr="A map of the country AI-generated content may be incorrect." title="" id="222" name="Picture"/>
             <a:graphic>
               <a:graphicData uri="http://schemas.openxmlformats.org/drawingml/2006/picture">
                 <pic:pic>
                   <pic:nvPicPr>
-                    <pic:cNvPr descr="media/image7.png" id="222" name="Picture"/>
+                    <pic:cNvPr descr="media/image7.png" id="223" name="Picture"/>
                     <pic:cNvPicPr>
                       <a:picLocks noChangeArrowheads="1" noChangeAspect="1"/>
                     </pic:cNvPicPr>
                   </pic:nvPicPr>
                   <pic:blipFill>
-                    <a:blip r:embed="rId220"/>
+                    <a:blip r:embed="rId221"/>
                     <a:stretch>
                       <a:fillRect/>
                     </a:stretch>
@@ -43346,8 +43377,8 @@
         <w:t xml:space="preserve">Figure S1. Each of the 12 reef groups used in the calibration.</w:t>
       </w:r>
     </w:p>
-    <w:bookmarkEnd w:id="223"/>
-    <w:bookmarkStart w:id="224" w:name="objective-function"/>
+    <w:bookmarkEnd w:id="224"/>
+    <w:bookmarkStart w:id="225" w:name="objective-function"/>
     <w:p>
       <w:pPr>
         <w:pStyle w:val="Heading3"/>
@@ -45229,8 +45260,8 @@
         <w:t xml:space="preserve">Candidate parameter sets that violate parameter-bound constraints or produce an invalid model run (e.g. a negative recruitment scale factor) are assigned a large fixed penalty instead of being scored by the equations above.</w:t>
       </w:r>
     </w:p>
-    <w:bookmarkEnd w:id="224"/>
-    <w:bookmarkStart w:id="228" w:name="disturbances-datasets"/>
+    <w:bookmarkEnd w:id="225"/>
+    <w:bookmarkStart w:id="229" w:name="disturbances-datasets"/>
     <w:p>
       <w:pPr>
         <w:pStyle w:val="Heading3"/>
@@ -45290,18 +45321,18 @@
           <wp:inline>
             <wp:extent cx="5731510" cy="4298632"/>
             <wp:effectExtent b="0" l="0" r="0" t="0"/>
-            <wp:docPr descr="Figure S2. Degree heating weeks (DHW) trajectories for each reef group along the GBR. Individual lines correspond to values at individual reefs within a reef group." title="" id="226" name="Picture"/>
+            <wp:docPr descr="Figure S2. Degree heating weeks (DHW) trajectories for each reef group along the GBR. Individual lines correspond to values at individual reefs within a reef group." title="" id="227" name="Picture"/>
             <a:graphic>
               <a:graphicData uri="http://schemas.openxmlformats.org/drawingml/2006/picture">
                 <pic:pic>
                   <pic:nvPicPr>
-                    <pic:cNvPr descr="../figures/S02_dhw_per_reef_group.png" id="227" name="Picture"/>
+                    <pic:cNvPr descr="../figures/S02_dhw_per_reef_group.png" id="228" name="Picture"/>
                     <pic:cNvPicPr>
                       <a:picLocks noChangeArrowheads="1" noChangeAspect="1"/>
                     </pic:cNvPicPr>
                   </pic:nvPicPr>
                   <pic:blipFill>
-                    <a:blip r:embed="rId225"/>
+                    <a:blip r:embed="rId226"/>
                     <a:stretch>
                       <a:fillRect/>
                     </a:stretch>
@@ -45346,8 +45377,8 @@
         <w:t xml:space="preserve">Individual lines correspond to values at individual reefs within a reef group.</w:t>
       </w:r>
     </w:p>
-    <w:bookmarkEnd w:id="228"/>
-    <w:bookmarkStart w:id="232" w:name="depth-attenuation-of-dhw"/>
+    <w:bookmarkEnd w:id="229"/>
+    <w:bookmarkStart w:id="233" w:name="depth-attenuation-of-dhw"/>
     <w:p>
       <w:pPr>
         <w:pStyle w:val="Heading3"/>
@@ -45427,18 +45458,18 @@
           <wp:inline>
             <wp:extent cx="5731510" cy="4298632"/>
             <wp:effectExtent b="0" l="0" r="0" t="0"/>
-            <wp:docPr descr="Figure S3. Effective DHW as a function of surface DHW, at four representative depths, using the calibrated \eta^{\textbf{base}} and \eta^{\textbf{mix}} values. The dotted line shows the 1:1 reference (no attenuation, i.e. surface conditions)." title="" id="230" name="Picture"/>
+            <wp:docPr descr="Figure S3. Effective DHW as a function of surface DHW, at four representative depths, using the calibrated \eta^{\textbf{base}} and \eta^{\textbf{mix}} values. The dotted line shows the 1:1 reference (no attenuation, i.e. surface conditions)." title="" id="231" name="Picture"/>
             <a:graphic>
               <a:graphicData uri="http://schemas.openxmlformats.org/drawingml/2006/picture">
                 <pic:pic>
                   <pic:nvPicPr>
-                    <pic:cNvPr descr="../figures/S03_effective_dhw_depth_attenuation.png" id="231" name="Picture"/>
+                    <pic:cNvPr descr="../figures/S03_effective_dhw_depth_attenuation.png" id="232" name="Picture"/>
                     <pic:cNvPicPr>
                       <a:picLocks noChangeArrowheads="1" noChangeAspect="1"/>
                     </pic:cNvPicPr>
                   </pic:nvPicPr>
                   <pic:blipFill>
-                    <a:blip r:embed="rId229"/>
+                    <a:blip r:embed="rId230"/>
                     <a:stretch>
                       <a:fillRect/>
                     </a:stretch>
@@ -45561,9 +45592,9 @@
         <w:t xml:space="preserve">The dotted line shows the 1:1 reference (no attenuation, i.e. surface conditions).</w:t>
       </w:r>
     </w:p>
-    <w:bookmarkEnd w:id="232"/>
     <w:bookmarkEnd w:id="233"/>
-    <w:bookmarkStart w:id="237" w:name="convergence-analysis"/>
+    <w:bookmarkEnd w:id="234"/>
+    <w:bookmarkStart w:id="238" w:name="convergence-analysis"/>
     <w:p>
       <w:pPr>
         <w:pStyle w:val="Heading2"/>
@@ -45581,18 +45612,18 @@
           <wp:inline>
             <wp:extent cx="5731510" cy="5731510"/>
             <wp:effectExtent b="0" l="0" r="0" t="0"/>
-            <wp:docPr descr="Figure S4. Convergence analysis for each DHW range and metric." title="" id="235" name="Picture"/>
+            <wp:docPr descr="Figure S4. Convergence analysis for each DHW range and metric." title="" id="236" name="Picture"/>
             <a:graphic>
               <a:graphicData uri="http://schemas.openxmlformats.org/drawingml/2006/picture">
                 <pic:pic>
                   <pic:nvPicPr>
-                    <pic:cNvPr descr="media/image9.png" id="236" name="Picture"/>
+                    <pic:cNvPr descr="media/image9.png" id="237" name="Picture"/>
                     <pic:cNvPicPr>
                       <a:picLocks noChangeArrowheads="1" noChangeAspect="1"/>
                     </pic:cNvPicPr>
                   </pic:nvPicPr>
                   <pic:blipFill>
-                    <a:blip r:embed="rId234"/>
+                    <a:blip r:embed="rId235"/>
                     <a:stretch>
                       <a:fillRect/>
                     </a:stretch>
@@ -46543,8 +46574,8 @@
         <w:t xml:space="preserve">* - The last size class is assumed to have linear extension = 0.</w:t>
       </w:r>
     </w:p>
-    <w:bookmarkEnd w:id="237"/>
-    <w:bookmarkStart w:id="250" w:name="per-reef-performance-metrics"/>
+    <w:bookmarkEnd w:id="238"/>
+    <w:bookmarkStart w:id="251" w:name="per-reef-performance-metrics"/>
     <w:p>
       <w:pPr>
         <w:pStyle w:val="Heading2"/>
@@ -46570,18 +46601,18 @@
           <wp:inline>
             <wp:extent cx="5731510" cy="4298632"/>
             <wp:effectExtent b="0" l="0" r="0" t="0"/>
-            <wp:docPr descr="Figure S5. Bootstrapped ΔRMSE (benchmark − model RMSE) for each calibration reef." title="" id="239" name="Picture"/>
+            <wp:docPr descr="Figure S5. Bootstrapped ΔRMSE (benchmark − model RMSE) for each calibration reef." title="" id="240" name="Picture"/>
             <a:graphic>
               <a:graphicData uri="http://schemas.openxmlformats.org/drawingml/2006/picture">
                 <pic:pic>
                   <pic:nvPicPr>
-                    <pic:cNvPr descr="../figures/S05_rmse_diff_calibration.png" id="240" name="Picture"/>
+                    <pic:cNvPr descr="../figures/S05_rmse_diff_calibration.png" id="241" name="Picture"/>
                     <pic:cNvPicPr>
                       <a:picLocks noChangeArrowheads="1" noChangeAspect="1"/>
                     </pic:cNvPicPr>
                   </pic:nvPicPr>
                   <pic:blipFill>
-                    <a:blip r:embed="rId238"/>
+                    <a:blip r:embed="rId239"/>
                     <a:stretch>
                       <a:fillRect/>
                     </a:stretch>
@@ -46629,18 +46660,18 @@
           <wp:inline>
             <wp:extent cx="5731510" cy="4298632"/>
             <wp:effectExtent b="0" l="0" r="0" t="0"/>
-            <wp:docPr descr="Figure S6. Bootstrapped ΔRMSE (benchmark − model RMSE) for each test reef." title="" id="242" name="Picture"/>
+            <wp:docPr descr="Figure S6. Bootstrapped ΔRMSE (benchmark − model RMSE) for each test reef." title="" id="243" name="Picture"/>
             <a:graphic>
               <a:graphicData uri="http://schemas.openxmlformats.org/drawingml/2006/picture">
                 <pic:pic>
                   <pic:nvPicPr>
-                    <pic:cNvPr descr="../figures/S06_rmse_diff_test.png" id="243" name="Picture"/>
+                    <pic:cNvPr descr="../figures/S06_rmse_diff_test.png" id="244" name="Picture"/>
                     <pic:cNvPicPr>
                       <a:picLocks noChangeArrowheads="1" noChangeAspect="1"/>
                     </pic:cNvPicPr>
                   </pic:nvPicPr>
                   <pic:blipFill>
-                    <a:blip r:embed="rId241"/>
+                    <a:blip r:embed="rId242"/>
                     <a:stretch>
                       <a:fillRect/>
                     </a:stretch>
@@ -46688,18 +46719,18 @@
           <wp:inline>
             <wp:extent cx="5731510" cy="4298632"/>
             <wp:effectExtent b="0" l="0" r="0" t="0"/>
-            <wp:docPr descr="Figure S7. Bootstrapped SRCC for each calibration reef." title="" id="245" name="Picture"/>
+            <wp:docPr descr="Figure S7. Bootstrapped SRCC for each calibration reef." title="" id="246" name="Picture"/>
             <a:graphic>
               <a:graphicData uri="http://schemas.openxmlformats.org/drawingml/2006/picture">
                 <pic:pic>
                   <pic:nvPicPr>
-                    <pic:cNvPr descr="../figures/S07_srcc_calibration.png" id="246" name="Picture"/>
+                    <pic:cNvPr descr="../figures/S07_srcc_calibration.png" id="247" name="Picture"/>
                     <pic:cNvPicPr>
                       <a:picLocks noChangeArrowheads="1" noChangeAspect="1"/>
                     </pic:cNvPicPr>
                   </pic:nvPicPr>
                   <pic:blipFill>
-                    <a:blip r:embed="rId244"/>
+                    <a:blip r:embed="rId245"/>
                     <a:stretch>
                       <a:fillRect/>
                     </a:stretch>
@@ -46747,18 +46778,18 @@
           <wp:inline>
             <wp:extent cx="5731510" cy="4298632"/>
             <wp:effectExtent b="0" l="0" r="0" t="0"/>
-            <wp:docPr descr="Figure S8. Bootstrapped SRCC for each test reef." title="" id="248" name="Picture"/>
+            <wp:docPr descr="Figure S8. Bootstrapped SRCC for each test reef." title="" id="249" name="Picture"/>
             <a:graphic>
               <a:graphicData uri="http://schemas.openxmlformats.org/drawingml/2006/picture">
                 <pic:pic>
                   <pic:nvPicPr>
-                    <pic:cNvPr descr="../figures/S08_srcc_test.png" id="249" name="Picture"/>
+                    <pic:cNvPr descr="../figures/S08_srcc_test.png" id="250" name="Picture"/>
                     <pic:cNvPicPr>
                       <a:picLocks noChangeArrowheads="1" noChangeAspect="1"/>
                     </pic:cNvPicPr>
                   </pic:nvPicPr>
                   <pic:blipFill>
-                    <a:blip r:embed="rId247"/>
+                    <a:blip r:embed="rId248"/>
                     <a:stretch>
                       <a:fillRect/>
                     </a:stretch>
@@ -46797,8 +46828,8 @@
         <w:t xml:space="preserve">Figure S8. Bootstrapped SRCC for each test reef.</w:t>
       </w:r>
     </w:p>
-    <w:bookmarkEnd w:id="250"/>
     <w:bookmarkEnd w:id="251"/>
+    <w:bookmarkEnd w:id="252"/>
     <w:sectPr>
       <w:footnotePr>
         <w:numRestart w:val="eachSect"/>

</xml_diff>